<commit_message>
docs(db): add EER model and relational schema of the app database
Add the Entity-Relationship model required by the faculty guide, drawn in
draw.io (docs/diagrams/skincare_eer.drawio, PNG exports alongside):

- page 1: EER model in Chen notation, 16 entities, weak entity
  ROUTINE_STEP, composite/multivalued/derived attributes and a disjoint,
  total specialization of PHOTO into ANALYSIS_PHOTO and PROGRESS_PHOTO
- page 2: relational schema mapped from it (24 tables, crow's foot)

The diagram is generated by docs/tools/build_er_diagram.py. Thesis
chapter 4 gets an introduction and section 4.1 with both figures; the
journal records the modelling decisions.
</commit_message>
<xml_diff>
--- a/docs/Teza_Licenta.docx
+++ b/docs/Teza_Licenta.docx
@@ -379,6 +379,16 @@
       </w:pPr>
       <w:r>
         <w:t>Capitolul 4. Proiectarea sistemului și arhitectura</w:t>
+        <w:tab/>
+        <w:t>5</w:t>
+      </w:r>
+    </w:p>
+    <w:p>
+      <w:pPr>
+        <w:pStyle w:val="toc2"/>
+      </w:pPr>
+      <w:r>
+        <w:t>4.1 Modelul conceptual al datelor: diagrama Entitate-Legătură extinsă (EER)</w:t>
         <w:tab/>
         <w:t>5</w:t>
       </w:r>
@@ -1212,13 +1222,210 @@
     </w:p>
     <w:p>
       <w:pPr>
+        <w:ind w:firstLine="709"/>
         <w:jc w:val="both"/>
       </w:pPr>
       <w:r>
+        <w:t>Acest capitol descrie proiectarea aplicației: modelul conceptual al datelor, arhitectura componentelor (aplicația mobilă, API-ul, serviciul de inferență și stocarea) și interfața de programare (API). Secțiunea 4.1 prezintă modelul conceptual al datelor și transformarea lui într-o schemă relațională; arhitectura, modelul fizic în MongoDB și proiectarea API-ului vor fi descrise în secțiunile următoare.</w:t>
+      </w:r>
+    </w:p>
+    <w:p>
+      <w:pPr>
+        <w:pStyle w:val="Heading2"/>
+      </w:pPr>
+      <w:r>
+        <w:t>4.1 Modelul conceptual al datelor: diagrama Entitate-Legătură extinsă (EER)</w:t>
+      </w:r>
+    </w:p>
+    <w:p>
+      <w:pPr>
+        <w:ind w:firstLine="709"/>
+        <w:jc w:val="both"/>
+      </w:pPr>
+      <w:r>
+        <w:t xml:space="preserve">Modelul Entitate-Legătură (Entity-Relationship, ER), propus de Chen [39], descrie datele unei aplicații independent de sistemul de gestiune a bazei de date care le va stoca. Elementele lui sunt: entitatea, adică o categorie de obiecte despre care se rețin date (de exemplu USER; o instanță a entității este un utilizator concret), desenată ca dreptunghi; atributul, o proprietate a entității (de exemplu email), desenat ca elipsă; cheia, atributul ale cărui valori identifică în mod unic fiecare instanță (de exemplu user_id), scrisă subliniat; și legătura (relationship), o asociere între entități (de exemplu PERFORMS: un utilizator efectuează analize), desenată ca romb. Modelul Entitate-Legătură extins (Enhanced ER, EER) adaugă concepte de tip clasă-subclasă, în special specializarea și generalizarea, cu moștenirea atributelor [40]. Diagrama a fost realizată în draw.io [41], în notația Chen, cu denumirile în limba engleză pentru a fi identice cu cele din cod. Sursa editabilă este </w:t>
+      </w:r>
+      <w:r>
         <w:rPr>
-          <w:highlight w:val="yellow"/>
+          <w:rFonts w:ascii="Courier New" w:hAnsi="Courier New" w:eastAsia="Courier New" w:cs="Courier New"/>
+          <w:sz w:val="21"/>
         </w:rPr>
-        <w:t>[De redactat: diagrame, modelul de date MongoDB, proiectarea API-ului.]</w:t>
+        <w:t>docs/diagrams/skincare_eer.drawio</w:t>
+      </w:r>
+      <w:r>
+        <w:t xml:space="preserve"> (pagina „EER model” pentru Figura 4.1 și pagina „Relational schema” pentru Figura 4.2), iar imaginile exportate se află în același director. Fișierul este generat de scriptul </w:t>
+      </w:r>
+      <w:r>
+        <w:rPr>
+          <w:rFonts w:ascii="Courier New" w:hAnsi="Courier New" w:eastAsia="Courier New" w:cs="Courier New"/>
+          <w:sz w:val="21"/>
+        </w:rPr>
+        <w:t>docs/tools/build_er_diagram.py</w:t>
+      </w:r>
+      <w:r>
+        <w:t>, astfel încât modificările modelului rămân reproductibile.</w:t>
+      </w:r>
+    </w:p>
+    <w:p>
+      <w:pPr>
+        <w:ind w:firstLine="709"/>
+        <w:jc w:val="both"/>
+      </w:pPr>
+      <w:r>
+        <w:t>Notația folosită are următoarele semnificații. Raportul de cardinalitate indică numărul maxim de instanțe ale unei entități care se pot asocia cu o instanță a celeilalte: 1:1 (unu la unu), 1:N (unu la mai mulți) sau M:N (mai mulți la mai mulți); valorile 1, N și M sunt scrise pe liniile legăturii. Participarea arată dacă fiecare instanță trebuie să ia parte la legătură: linia dublă marchează participarea totală (de exemplu, orice analiză aparține unui utilizator), iar linia simplă participarea parțială (un utilizator poate să nu aibă nicio analiză). O entitate slabă nu are o cheie proprie și este identificată prin entitatea de care aparține (proprietarul) împreună cu o cheie parțială; se desenează cu dreptunghi dublu, iar legătura care o identifică cu romb dublu. În model, ROUTINE_STEP este entitate slabă: pasul 3 are sens doar în interiorul unei rutine anume, deci cheia lui este (routine_id, step_no), unde step_no este cheia parțială (subliniată punctat). Un atribut compus are subatribute (full_name = first_name + last_name; skin_profile = skin_type, main_concern, climate). Un atribut multivalorat poate avea mai multe valori pentru aceeași instanță (variantele de răspuns options ale unei întrebări, funcțiile functions și marcajele de risc flags ale unui ingredient) și se desenează cu elipsă dublă. Un atribut derivat nu se stochează, ci se calculează din alte date (age_range din date_of_birth, total_duration ca sumă a duratelor pașilor unei rutine, safety_score din scorurile ingredientelor unui produs) și se desenează cu elipsă punctată.</w:t>
+      </w:r>
+    </w:p>
+    <w:p>
+      <w:pPr>
+        <w:ind w:firstLine="0"/>
+        <w:jc w:val="center"/>
+      </w:pPr>
+      <w:r>
+        <w:drawing>
+          <wp:inline xmlns:a="http://schemas.openxmlformats.org/drawingml/2006/main" xmlns:pic="http://schemas.openxmlformats.org/drawingml/2006/picture">
+            <wp:extent cx="5760000" cy="4170065"/>
+            <wp:docPr id="1" name="Picture 1"/>
+            <wp:cNvGraphicFramePr>
+              <a:graphicFrameLocks noChangeAspect="1"/>
+            </wp:cNvGraphicFramePr>
+            <a:graphic>
+              <a:graphicData uri="http://schemas.openxmlformats.org/drawingml/2006/picture">
+                <pic:pic>
+                  <pic:nvPicPr>
+                    <pic:cNvPr id="0" name="eer_model.png"/>
+                    <pic:cNvPicPr/>
+                  </pic:nvPicPr>
+                  <pic:blipFill>
+                    <a:blip r:embed="rId15"/>
+                    <a:stretch>
+                      <a:fillRect/>
+                    </a:stretch>
+                  </pic:blipFill>
+                  <pic:spPr>
+                    <a:xfrm>
+                      <a:off x="0" y="0"/>
+                      <a:ext cx="5760000" cy="4170065"/>
+                    </a:xfrm>
+                    <a:prstGeom prst="rect"/>
+                  </pic:spPr>
+                </pic:pic>
+              </a:graphicData>
+            </a:graphic>
+          </wp:inline>
+        </w:drawing>
+      </w:r>
+    </w:p>
+    <w:p>
+      <w:pPr>
+        <w:pStyle w:val="Caption"/>
+        <w:jc w:val="center"/>
+      </w:pPr>
+      <w:r>
+        <w:t>Figura 4.1. Diagrama Entitate-Legătură extinsă (EER) a aplicației, în notația Chen; componenta EER este specializarea disjunctă și totală a entității PHOTO.</w:t>
+      </w:r>
+    </w:p>
+    <w:p>
+      <w:pPr>
+        <w:ind w:firstLine="709"/>
+        <w:jc w:val="both"/>
+      </w:pPr>
+      <w:r>
+        <w:t>Entitățile au fost stabilite pornind de la modelul de date din planul tezei (colecțiile users, consents, refresh_tokens, skin_analyses, products, ingredients, routines și daily_logs) și de la ecranele proiectate în Figma (chestionarul de analiză, alegerea zonelor feței, rezultatele, detaliile produsului cu scorul de siguranță, constructorul de rutine, jurnalul zilnic și setările de confidențialitate). Cele 16 entități formează patru grupuri: contul și securitatea (USER, CONSENT pentru consimțămintele GDPR, REFRESH_TOKEN pentru sesiunile de autentificare, REMINDER pentru mementourile de dimineață și seară), analiza pielii (SKIN_ANALYSIS, QUESTION, FACE_ZONE, SKIN_CONCERN), fotografiile (PHOTO cu subclasele ANALYSIS_PHOTO și PROGRESS_PHOTO) și produsele cu rutinele (PRODUCT, INGREDIENT, ROUTINE, ROUTINE_STEP, DAILY_LOG).</w:t>
+      </w:r>
+    </w:p>
+    <w:p>
+      <w:pPr>
+        <w:ind w:firstLine="709"/>
+        <w:jc w:val="both"/>
+      </w:pPr>
+      <w:r>
+        <w:t>Legăturile reflectă direct metodologia din capitolul 5. ANSWERS (M:N între SKIN_ANALYSIS și QUESTION) are atributele answer_value și is_missing: o întrebare la care utilizatorul nu a răspuns este înregistrată explicit ca lipsă, la fel ca masca de valori lipsă a modelului (secțiunea 5.5), în loc să fie completată cu o valoare inventată. PREDICTS (M:N între SKIN_ANALYSIS și SKIN_CONCERN) are atributele probability și rank, deoarece modelul întoarce o probabilitate pentru fiecare categorie din secțiunea 5.4; atributul is_uncertain al analizei marchează cazurile cu încredere scăzută, pentru care aplicația recomandă consultarea unui specialist. ASSESSES (M:N între SKIN_ANALYSIS și FACE_ZONE) reține pentru fiecare zonă a feței constatarea (finding) și gradul ei (severity); harta facială pe mai multe zone este o funcționalitate opțională (stretch), de aceea participarea este parțială, iar legătura poate rămâne goală în MVP fără ca schema să se schimbe. CONTAINS (M:N între PRODUCT și INGREDIENT) păstrează în atributul position ordinea din lista INCI (International Nomenclature of Cosmetic Ingredients, denumirile standard ale ingredientelor cosmetice), care pe etichetă este descrescătoare după concentrație. RECORDS_USE (M:N între DAILY_LOG și PRODUCT) reține perioada (AM sau PM) și momentul folosirii fiecărui produs. BASED_ON leagă opțional o rutină de analiza din care a fost generată, iar USES leagă opțional un pas de rutină de un produs concret din catalog.</w:t>
+      </w:r>
+    </w:p>
+    <w:p>
+      <w:pPr>
+        <w:ind w:firstLine="709"/>
+        <w:jc w:val="both"/>
+      </w:pPr>
+      <w:r>
+        <w:t>Componenta EER a modelului este specializarea entității PHOTO. Specializarea împarte o entitate generală (superclasa) în subclase care moștenesc toate atributele și legăturile superclasei și au, în plus, atribute și legături proprii. Specializarea este disjunctă (cercul marcat cu d): o fotografie aparține unei singure subclase. Este totală (linie dublă între PHOTO și cerc): orice fotografie este fie fotografie de analiză, fie fotografie de progres. Simbolul de submulțime de pe fiecare linie arată sensul moștenirii. Ambele tipuri au aceleași atribute de stocare (photo_id, object_key, content_type, captured_at): fotografia stă criptată în stocarea de obiecte din UE, iar baza de date reține doar cheia obiectului. Diferă însă prin rest: ANALYSIS_PHOTO are shot_type și heatmap_key (harta Grad-CAM, secțiunea 5.9) și aparține unei analize (DEPICTS, o analiză are una sau mai multe fotografii, ca în SCIN), iar PROGRESS_PHOTO are caption și documentează o zi din jurnal (DOCUMENTS, 1:1). Avantajul practic este că dreptul la ștergere din GDPR se poate aplica tuturor fotografiilor unui utilizator printr-o singură entitate.</w:t>
+      </w:r>
+    </w:p>
+    <w:p>
+      <w:pPr>
+        <w:ind w:firstLine="0"/>
+        <w:jc w:val="center"/>
+      </w:pPr>
+      <w:r>
+        <w:drawing>
+          <wp:inline xmlns:a="http://schemas.openxmlformats.org/drawingml/2006/main" xmlns:pic="http://schemas.openxmlformats.org/drawingml/2006/picture">
+            <wp:extent cx="5760000" cy="2199273"/>
+            <wp:docPr id="2" name="Picture 2"/>
+            <wp:cNvGraphicFramePr>
+              <a:graphicFrameLocks noChangeAspect="1"/>
+            </wp:cNvGraphicFramePr>
+            <a:graphic>
+              <a:graphicData uri="http://schemas.openxmlformats.org/drawingml/2006/picture">
+                <pic:pic>
+                  <pic:nvPicPr>
+                    <pic:cNvPr id="0" name="relational_schema.png"/>
+                    <pic:cNvPicPr/>
+                  </pic:nvPicPr>
+                  <pic:blipFill>
+                    <a:blip r:embed="rId16"/>
+                    <a:stretch>
+                      <a:fillRect/>
+                    </a:stretch>
+                  </pic:blipFill>
+                  <pic:spPr>
+                    <a:xfrm>
+                      <a:off x="0" y="0"/>
+                      <a:ext cx="5760000" cy="2199273"/>
+                    </a:xfrm>
+                    <a:prstGeom prst="rect"/>
+                  </pic:spPr>
+                </pic:pic>
+              </a:graphicData>
+            </a:graphic>
+          </wp:inline>
+        </w:drawing>
+      </w:r>
+    </w:p>
+    <w:p>
+      <w:pPr>
+        <w:pStyle w:val="Caption"/>
+        <w:jc w:val="center"/>
+      </w:pPr>
+      <w:r>
+        <w:t>Figura 4.2. Schema relațională obținută din modelul EER (24 de tabele, notația crow's foot).</w:t>
+      </w:r>
+    </w:p>
+    <w:p>
+      <w:pPr>
+        <w:ind w:firstLine="709"/>
+        <w:jc w:val="both"/>
+      </w:pPr>
+      <w:r>
+        <w:t>Pentru a verifica modelul, el a fost transformat în modelul relațional (Figura 4.2), după regulile clasice de trecere de la EER la tabele [40]. În modelul relațional datele sunt păstrate în tabele (relații) formate din rânduri și coloane; cheia primară (PK) este coloana sau grupul de coloane care identifică unic fiecare rând, cheia străină (FK) este o coloană care conține cheia primară a unui rând din alt tabel, iar UQ marchează o constrângere de unicitate. Legăturile dintre tabele sunt desenate în notația „crow's foot”: liniuța înseamnă exact unu, cercul înseamnă opțional, iar „piciorul de cioară” (bifurcația) înseamnă mai mulți. Regulile aplicate au fost: fiecare entitate puternică devine un tabel, cu cheia ei drept cheie primară; atributele compuse se descompun în coloane simple; atributele derivate nu se stochează; la o legătură 1:N cheia străină se pune în tabelul de pe partea N (de exemplu SKIN_ANALYSIS.user_id); o legătură M:N devine un tabel de legătură care conține cheile ambelor entități și atributele legăturii (ANSWER, ZONE_ASSESSMENT, PREDICTION, PRODUCT_USE, PRODUCT_INGREDIENT); fiecare atribut multivalorat devine un tabel separat (QUESTION_OPTION, INGREDIENT_FUNCTION, INGREDIENT_FLAG); entitatea slabă ROUTINE_STEP primește cheia compusă (routine_id, step_no); legătura 1:1 DOCUMENTS devine o cheie străină unică (PROGRESS_PHOTO.log_id); iar specializarea lui PHOTO devine câte un tabel pentru superclasă și pentru fiecare subclasă, în care photo_id este simultan cheie primară și cheie străină, iar coloana photo_kind indică subclasa. Rezultatul are 24 de tabele.</w:t>
+      </w:r>
+    </w:p>
+    <w:p>
+      <w:pPr>
+        <w:ind w:firstLine="709"/>
+        <w:jc w:val="both"/>
+      </w:pPr>
+      <w:r>
+        <w:t xml:space="preserve">Modelul conceptual nu depinde de baza de date aleasă. Implementarea folosește MongoDB, o bază de date orientată pe documente, deci schema relațională servește ca verificare a modelului și ca reper, nu ca implementare. În MongoDB, datele citite mereu împreună cu entitatea proprietar sunt incluse (embedded) în documentul acesteia: răspunsurile, predicțiile și evaluările pe zone în documentul analizei, pașii în documentul rutinei, produsele folosite în documentul zilei din jurnal. Entitățile de referință partajate (produse, ingrediente, întrebări, categorii de probleme ale pielii) rămân colecții separate, referite prin identificator. Constrângerile de unicitate devin indexuri unice (email, barcode, inci_name și perechea user_id, log_date). Modelul fizic MongoDB, cu indexurile și regulile de validare, va fi descris în secțiunea următoare. Limitare: entitatea QUESTION urmează deocamdată întrebările SCIN mapate în </w:t>
+      </w:r>
+      <w:r>
+        <w:rPr>
+          <w:rFonts w:ascii="Courier New" w:hAnsi="Courier New" w:eastAsia="Courier New" w:cs="Courier New"/>
+          <w:sz w:val="21"/>
+        </w:rPr>
+        <w:t>ml/features/field_mapping.md</w:t>
+      </w:r>
+      <w:r>
+        <w:t>, deoarece chestionarul final din aplicație nu este încă implementat.</w:t>
       </w:r>
     </w:p>
     <w:p>
@@ -6775,6 +6982,36 @@
         <w:t>[38] D. H. Wolpert, Stacked generalization, Neural Networks 5(2), 1992. https://doi.org/10.1016/S0893-6080(05)80023-1</w:t>
       </w:r>
     </w:p>
+    <w:p>
+      <w:pPr>
+        <w:spacing w:after="120" w:line="276" w:lineRule="auto"/>
+        <w:ind w:left="567" w:hanging="567"/>
+        <w:jc w:val="left"/>
+      </w:pPr>
+      <w:r>
+        <w:t>[39] P. P. Chen, The Entity-Relationship Model: Toward a Unified View of Data, ACM Transactions on Database Systems 1(1), 9-36, 1976. https://doi.org/10.1145/320434.320440</w:t>
+      </w:r>
+    </w:p>
+    <w:p>
+      <w:pPr>
+        <w:spacing w:after="120" w:line="276" w:lineRule="auto"/>
+        <w:ind w:left="567" w:hanging="567"/>
+        <w:jc w:val="left"/>
+      </w:pPr>
+      <w:r>
+        <w:t>[40] T. J. Teorey, D. Yang, J. P. Fry, A Logical Design Methodology for Relational Databases Using the Extended Entity-Relationship Model, ACM Computing Surveys 18(2), 197-222, 1986. https://doi.org/10.1145/7474.7475</w:t>
+      </w:r>
+    </w:p>
+    <w:p>
+      <w:pPr>
+        <w:spacing w:after="120" w:line="276" w:lineRule="auto"/>
+        <w:ind w:left="567" w:hanging="567"/>
+        <w:jc w:val="left"/>
+      </w:pPr>
+      <w:r>
+        <w:t>[41] draw.io (diagrams.net), instrument de realizare a diagramelor, JGraph Ltd. https://www.drawio.com/</w:t>
+      </w:r>
+    </w:p>
     <w:sectPr>
       <w:footerReference w:type="default" r:id="rId13"/>
       <w:headerReference w:type="default" r:id="rId14"/>

</xml_diff>

<commit_message>
docs(pm): add the project scope statement and the WBS
Add the planning documents asked for in the Software Project Management
course, built from the project charter:

- Enuntul_domeniului_Giotina.docx: scope statement with the ten course
  sections (purpose, SMART objectives, product and high-level
  requirements, nine deliverables, in and out of scope, verifiable
  acceptance criteria, constraints, assumptions, approvals) plus
  strategy and effort annexes
- WBS_Giotina.docx: coded WBS (10 level-2 branches, 44 work packages,
  1,256 h), indented table with status, 100% rule check, dictionary for
  four packages and the activities of package 1.6.2
- diagrams/wbs.puml with PNG and SVG renders (PlantUML)

Everything is generated by docs/tools/build_scope_wbs.py. The thesis
gets Annex A with Figure A.1; the journal records the decisions.
</commit_message>
<xml_diff>
--- a/docs/Teza_Licenta.docx
+++ b/docs/Teza_Licenta.docx
@@ -611,6 +611,16 @@
         <w:t>Anexe</w:t>
         <w:tab/>
         <w:t>17</w:t>
+      </w:r>
+    </w:p>
+    <w:p>
+      <w:pPr>
+        <w:pStyle w:val="toc2"/>
+      </w:pPr>
+      <w:r>
+        <w:t>Anexa A. Planificarea proiectului: enunțul domeniului și WBS</w:t>
+        <w:tab/>
+        <w:t/>
       </w:r>
     </w:p>
     <w:p>
@@ -6596,6 +6606,99 @@
     </w:p>
     <w:p>
       <w:pPr>
+        <w:pStyle w:val="Heading2"/>
+      </w:pPr>
+      <w:r>
+        <w:t>Anexa A. Planificarea proiectului: enunțul domeniului și WBS</w:t>
+      </w:r>
+    </w:p>
+    <w:p>
+      <w:pPr>
+        <w:ind w:firstLine="709"/>
+        <w:jc w:val="both"/>
+      </w:pPr>
+      <w:r>
+        <w:t>Proiectul a fost planificat după procesele de management al domeniului din ghidul PMBOK [42]. Domeniul proiectului înseamnă tot lucrul necesar pentru a produce livrabilele, și numai acesta. Planificarea are trei documente: carta proiectului (care autorizează proiectul și fixează obiectivele de nivel înalt), enunțul domeniului (scope statement) și structura de descompunere a lucrărilor (Work Breakdown Structure, WBS) cu dicționarul ei. Ultimele două, împreună cu enunțul, formează baza de referință a domeniului: după aprobare, orice schimbare de domeniu se face doar printr-o cerere de schimbare analizată ca impact asupra timpului, efortului și calității.</w:t>
+      </w:r>
+    </w:p>
+    <w:p>
+      <w:pPr>
+        <w:ind w:firstLine="709"/>
+        <w:jc w:val="both"/>
+      </w:pPr>
+      <w:r>
+        <w:t>Enunțul domeniului (fișierul docs/Enuntul_domeniului_Giotina.docx) descrie scopul proiectului, obiectivele SMART (specifice, măsurabile, realizabile, relevante și încadrate în timp), produsul și cerințele de nivel înalt, nouă livrabile, domeniul inclus și cel exclus, criteriile de acceptare verificabile ale fiecărui livrabil, constrângerile, ipotezele și aprobările. Excluderile scrise explicit (diagnosticul medical, monetizarea, teleconsultația, publicarea în magazinele de aplicații, mentenanța după susținere și funcțiile „stretch”) sunt prima apărare împotriva extinderii necontrolate a domeniului (scope creep). Constrângerile (limite impuse, de exemplu termenele și licența SCIN) sunt separate de ipoteze (lucruri considerate adevărate fără a fi dovedite, de exemplu disponibilitatea a cel puțin cinci testeri beta), deoarece o ipoteză falsă devine un risc.</w:t>
+      </w:r>
+    </w:p>
+    <w:p>
+      <w:pPr>
+        <w:ind w:firstLine="709"/>
+        <w:jc w:val="both"/>
+      </w:pPr>
+      <w:r>
+        <w:t>WBS-ul (Figura A.1, fișierul docs/WBS_Giotina.docx) este descompunerea ierarhică a lucrului în livrabile, nu în activități. Nivelul 1 este proiectul, nivelul 2 sunt cele 10 livrabile majore (managementul proiectului, cercetarea și cerințele, proiectarea, componenta ML, backend-ul, aplicația mobilă, testarea, articolul, teza și livrarea aplicației), iar nivelul 3 sunt cele 44 pachete de lucru. Un pachet de lucru este elementul cel mai de jos al WBS-ului, pentru care efortul se estimează, se atribuie unei persoane și se verifică printr-un rezultat clar. Codul fiecărui element începe cu codul părintelui (de exemplu 1.4 → 1.4.3), iar pachetele respectă regula 8/80 (între 8 și 80 de ore de efort). Efortul total estimat este de 1256 de ore, dintre care 260 pentru componenta ML. WBS-ul respectă regula 100%: ramurile acoperă tot lucrul din enunț, inclusiv managementul proiectului, iar fiecare lucru apare o singură dată (de exemplu, testele unitare aparțin pachetului componentei testate, iar ramura de testare conține doar testele de integrare, end-to-end, de securitate și beta). Diagrama a fost realizată în PlantUML [43], iar culoarea pachetelor arată starea lor la 15.10.2026.</w:t>
+      </w:r>
+    </w:p>
+    <w:p>
+      <w:pPr>
+        <w:ind w:firstLine="0"/>
+        <w:jc w:val="center"/>
+      </w:pPr>
+      <w:r>
+        <w:drawing>
+          <wp:inline xmlns:a="http://schemas.openxmlformats.org/drawingml/2006/main" xmlns:pic="http://schemas.openxmlformats.org/drawingml/2006/picture">
+            <wp:extent cx="5760000" cy="1508468"/>
+            <wp:docPr id="3" name="Picture 3"/>
+            <wp:cNvGraphicFramePr>
+              <a:graphicFrameLocks noChangeAspect="1"/>
+            </wp:cNvGraphicFramePr>
+            <a:graphic>
+              <a:graphicData uri="http://schemas.openxmlformats.org/drawingml/2006/picture">
+                <pic:pic>
+                  <pic:nvPicPr>
+                    <pic:cNvPr id="0" name="wbs.png"/>
+                    <pic:cNvPicPr/>
+                  </pic:nvPicPr>
+                  <pic:blipFill>
+                    <a:blip r:embed="rId17"/>
+                    <a:stretch>
+                      <a:fillRect/>
+                    </a:stretch>
+                  </pic:blipFill>
+                  <pic:spPr>
+                    <a:xfrm>
+                      <a:off x="0" y="0"/>
+                      <a:ext cx="5760000" cy="1508468"/>
+                    </a:xfrm>
+                    <a:prstGeom prst="rect"/>
+                  </pic:spPr>
+                </pic:pic>
+              </a:graphicData>
+            </a:graphic>
+          </wp:inline>
+        </w:drawing>
+      </w:r>
+    </w:p>
+    <w:p>
+      <w:pPr>
+        <w:pStyle w:val="Caption"/>
+        <w:jc w:val="center"/>
+      </w:pPr>
+      <w:r>
+        <w:t>Figura A.1. Structura de descompunere a lucrărilor (WBS) a proiectului, cu efortul estimat pe fiecare element (verde = realizat, galben = în lucru, alb = planificat). Versiunea la scară mare este docs/diagrams/wbs.svg.</w:t>
+      </w:r>
+    </w:p>
+    <w:p>
+      <w:pPr>
+        <w:ind w:firstLine="709"/>
+        <w:jc w:val="both"/>
+      </w:pPr>
+      <w:r>
+        <w:t>Dicționarul WBS conține fișele a patru pachete de lucru (1.4.3, 1.4.4, 1.5.1 și 1.6.2), fiecare cu descrierea lucrului, criteriile de acceptare, responsabilul după matricea RACI (R = execută, A = răspunde, C = consultat, I = informat), efortul, dependențele și riscurile. Pentru pachetul 1.6.2 (fluxul de analiză a pielii, 48 de ore) au fost derivate șapte activități, a căror sumă este egală cu efortul pachetului; abia la acest nivel apar verbele și ordinea lucrului, care trec apoi în calendarul proiectului (diagrama Gantt).</w:t>
+      </w:r>
+    </w:p>
+    <w:p>
+      <w:pPr>
         <w:pStyle w:val="Heading1"/>
       </w:pPr>
       <w:r>
@@ -7010,6 +7113,26 @@
       </w:pPr>
       <w:r>
         <w:t>[41] draw.io (diagrams.net), instrument de realizare a diagramelor, JGraph Ltd. https://www.drawio.com/</w:t>
+      </w:r>
+    </w:p>
+    <w:p>
+      <w:pPr>
+        <w:spacing w:after="120" w:line="276" w:lineRule="auto"/>
+        <w:ind w:left="567" w:hanging="567"/>
+        <w:jc w:val="left"/>
+      </w:pPr>
+      <w:r>
+        <w:t>[42] Project Management Institute, A Guide to the Project Management Body of Knowledge (PMBOK Guide), ediția a 6-a, 2017. https://www.pmi.org/pmbok-guide-standards/foundational/pmbok</w:t>
+      </w:r>
+    </w:p>
+    <w:p>
+      <w:pPr>
+        <w:spacing w:after="120" w:line="276" w:lineRule="auto"/>
+        <w:ind w:left="567" w:hanging="567"/>
+        <w:jc w:val="left"/>
+      </w:pPr>
+      <w:r>
+        <w:t>[43] PlantUML, Work Breakdown Structure (WBS) diagram, documentație. https://plantuml.com/wbs-diagram</w:t>
       </w:r>
     </w:p>
     <w:sectPr>

</xml_diff>

<commit_message>
docs(ui): redesign the app interface in Figma and add thesis section 4.2
Rebuild the Lumière prototype as v2 on a small design system (colour
variables, text styles, components, line icons): 36 screens across
onboarding, skin check, products, routine and profile, with one accent
colour, list-based layout and no decorative gradients or shadows.

Add two screens that follow from the ML results: a photo-quality stop
and an out-of-scope result that shows no score. Status colours were
darkened to pass WCAG AA contrast.

Thesis: new section 4.2 with Table 4.1 (flows vs MVP requirements) and
Figure 4.3 (eight v2 screens). Journal updated.
</commit_message>
<xml_diff>
--- a/docs/Teza_Licenta.docx
+++ b/docs/Teza_Licenta.docx
@@ -391,6 +391,16 @@
         <w:t>4.1 Modelul conceptual al datelor: diagrama Entitate-Legătură extinsă (EER)</w:t>
         <w:tab/>
         <w:t>5</w:t>
+      </w:r>
+    </w:p>
+    <w:p>
+      <w:pPr>
+        <w:pStyle w:val="toc2"/>
+      </w:pPr>
+      <w:r>
+        <w:t>4.2 Interfața utilizator: prototipul Figma, versiunea 2</w:t>
+        <w:tab/>
+        <w:t>6</w:t>
       </w:r>
     </w:p>
     <w:p>
@@ -1440,6 +1450,339 @@
     </w:p>
     <w:p>
       <w:pPr>
+        <w:pStyle w:val="Heading2"/>
+      </w:pPr>
+      <w:r>
+        <w:t>4.2 Interfața utilizator: prototipul Figma, versiunea 2</w:t>
+      </w:r>
+    </w:p>
+    <w:p>
+      <w:pPr>
+        <w:ind w:firstLine="709"/>
+        <w:jc w:val="both"/>
+      </w:pPr>
+      <w:r>
+        <w:t>Prototipul interfeței este realizat în Figma, un instrument de proiectare a interfețelor în care fiecare ecran este un cadru (frame) cu straturi editabile. Prima versiune, „Lumière v1” (34 de ecrane), acoperea fluxurile aplicației, dar folosea multe elemente pe care practicienii le asociază cu interfețele generate automat de instrumente AI: pete de gradient estompate în fundal, cuvinte cursive accentuate în mijlocul titlurilor, câte un card cu umbră pentru fiecare bloc, o bară de navigare flotantă cu un buton central ridicat, o grilă 2 × 2 de funcții pe ecranul de start, sclipiri decorative și patru culori de accent pastel care concurau între ele [50]. Versiunea 2 păstrează identitatea roz a aplicației, dar elimină decorul care nu transmite informație și construiește ierarhia prin tipografie, spațiere și contrast. Versiunea 1 rămâne în același fișier, pe pagina „Lumière v1 · Archive”, pentru comparație.</w:t>
+      </w:r>
+    </w:p>
+    <w:p>
+      <w:pPr>
+        <w:ind w:firstLine="709"/>
+        <w:jc w:val="both"/>
+      </w:pPr>
+      <w:r>
+        <w:t>Noua versiune este construită pe un sistem de design, adică un set de reguli și de piese reutilizabile din care se compun toate ecranele. În Figma, sistemul are trei niveluri. Variabilele (design tokens) sunt valori cu nume: 18 culori (de exemplu color/accent sau color/ink), 6 pași de spațiere (4-32 px) și 3 raze de colț (10, 14 și 18 px). Stilurile de text sunt 12 combinații fixe de font, mărime și înălțime de rând (de exemplu Title 26/32 px sau Body 15/22 px). Componentele sunt elemente reutilizabile cu variante: bara de stare, bara de navigare cu 5 file, butonul (Primary, Secondary, Ghost, Danger, Inverse), eticheta selectabilă (chip), câmpul de text (normal, activ, eroare), caseta de bifare, butonul radio, comutatorul, miniatura de produs (tub, flacon cu pompă, borcan, pipetă), sigla și 38 de pictograme de 24 px. Ecranele folosesc instanțe ale acestor componente și auto layout (aranjarea automată a elementelor pe rânduri sau coloane, cu distanțe fixe), astfel încât o modificare făcută într-o componentă sau într-o variabilă se propagă în toate ecranele.</w:t>
+      </w:r>
+    </w:p>
+    <w:p>
+      <w:pPr>
+        <w:ind w:firstLine="709"/>
+        <w:jc w:val="both"/>
+      </w:pPr>
+      <w:r>
+        <w:t>Culoarea are un singur accent, „Peony” #BF3F68, folosit numai pentru acțiuni și pentru elementele selectate; fundalul este alb cald (#FFF8F6), suprafețele sunt albe, iar textul este aproape negru (#2A1E22). Verdele, chihlimbarul și roșul apar doar la scorurile ingredientelor și la avertismente. Toate combinațiile de text au fost verificate cu raportul de contrast din WCAG 2.2 [51], adică raportul dintre luminanțele relative ale celor două culori (de la 1:1, fără contrast, la 21:1, negru pe alb); nivelul AA cere cel puțin 4,5:1 pentru textul normal. Accentul pe alb are 5,09:1, textul secundar pe fundal 5,81:1, iar textul principal 15,31:1. Verificarea a găsit două culori de stare sub prag pe fundalurile lor colorate (verde 4,38:1, chihlimbar 3,96:1); ele au fost închise la #356B4E (5,39:1) și #8C5710 (5,34:1). Tipografia folosește Young Serif doar pentru titlurile ecranelor [53] și Hanken Grotesk pentru restul textului [54]; ambele fonturi au licența SIL Open Font License, deci pot fi incluse în aplicație. Ecranele au margini laterale de 20 px și o scară de spațiere cu pași de 8 px, iar conținutul este grupat în liste cu linii de separare subțiri, fără umbre. Navigarea principală folosește o bară standard cu cinci file (Today, Skin, Scan, Routine, Me), după convențiile platformei iOS [52].</w:t>
+      </w:r>
+    </w:p>
+    <w:p>
+      <w:pPr>
+        <w:ind w:firstLine="709"/>
+        <w:jc w:val="both"/>
+      </w:pPr>
+      <w:r>
+        <w:t>Tabelul 4.1 arată cum acoperă cele 36 de ecrane cerințele MVP din planul lucrării. Ecranele lungi (de exemplu rezultatul analizei) sunt desenate la lungimea completă de derulare, ca să se vadă tot conținutul. Figura 4.3 prezintă opt ecrane reprezentative.</w:t>
+      </w:r>
+    </w:p>
+    <w:p>
+      <w:pPr>
+        <w:pStyle w:val="Caption"/>
+        <w:jc w:val="center"/>
+      </w:pPr>
+      <w:r>
+        <w:t>Tabelul 4.1. Fluxurile prototipului v2 și cerințele MVP acoperite.</w:t>
+      </w:r>
+    </w:p>
+    <w:tbl>
+      <w:tblPr>
+        <w:tblStyle w:val="TableGrid"/>
+        <w:tblW w:type="auto" w:w="0"/>
+        <w:tblLook w:firstColumn="1" w:firstRow="1" w:lastColumn="0" w:lastRow="0" w:noHBand="0" w:noVBand="1" w:val="04A0"/>
+      </w:tblPr>
+      <w:tblGrid>
+        <w:gridCol w:w="3024"/>
+        <w:gridCol w:w="3024"/>
+        <w:gridCol w:w="3024"/>
+      </w:tblGrid>
+      <w:tr>
+        <w:tc>
+          <w:tcPr>
+            <w:tcW w:type="dxa" w:w="3024"/>
+          </w:tcPr>
+          <w:p>
+            <w:r>
+              <w:rPr>
+                <w:b/>
+              </w:rPr>
+              <w:t>Flux</w:t>
+            </w:r>
+          </w:p>
+        </w:tc>
+        <w:tc>
+          <w:tcPr>
+            <w:tcW w:type="dxa" w:w="3024"/>
+          </w:tcPr>
+          <w:p>
+            <w:r>
+              <w:rPr>
+                <w:b/>
+              </w:rPr>
+              <w:t>Ecrane</w:t>
+            </w:r>
+          </w:p>
+        </w:tc>
+        <w:tc>
+          <w:tcPr>
+            <w:tcW w:type="dxa" w:w="3024"/>
+          </w:tcPr>
+          <w:p>
+            <w:r>
+              <w:rPr>
+                <w:b/>
+              </w:rPr>
+              <w:t>Cerințe acoperite</w:t>
+            </w:r>
+          </w:p>
+        </w:tc>
+      </w:tr>
+      <w:tr>
+        <w:tc>
+          <w:tcPr>
+            <w:tcW w:type="dxa" w:w="3024"/>
+          </w:tcPr>
+          <w:p>
+            <w:r>
+              <w:t>Cont și integrare</w:t>
+            </w:r>
+          </w:p>
+        </w:tc>
+        <w:tc>
+          <w:tcPr>
+            <w:tcW w:type="dxa" w:w="3024"/>
+          </w:tcPr>
+          <w:p>
+            <w:r>
+              <w:t>01-07</w:t>
+            </w:r>
+          </w:p>
+        </w:tc>
+        <w:tc>
+          <w:tcPr>
+            <w:tcW w:type="dxa" w:w="3024"/>
+          </w:tcPr>
+          <w:p>
+            <w:r>
+              <w:t>creare cont, autentificare, verificare email, resetare parolă, consimțământ GDPR explicit înainte de prima analiză, profil de piele</w:t>
+            </w:r>
+          </w:p>
+        </w:tc>
+      </w:tr>
+      <w:tr>
+        <w:tc>
+          <w:tcPr>
+            <w:tcW w:type="dxa" w:w="3024"/>
+          </w:tcPr>
+          <w:p>
+            <w:r>
+              <w:t>Analiza pielii</w:t>
+            </w:r>
+          </w:p>
+        </w:tc>
+        <w:tc>
+          <w:tcPr>
+            <w:tcW w:type="dxa" w:w="3024"/>
+          </w:tcPr>
+          <w:p>
+            <w:r>
+              <w:t>10-24</w:t>
+            </w:r>
+          </w:p>
+        </w:tc>
+        <w:tc>
+          <w:tcPr>
+            <w:tcW w:type="dxa" w:w="3024"/>
+          </w:tcPr>
+          <w:p>
+            <w:r>
+              <w:t>fotografie pe zone și chestionar de 5 întrebări (oricare poate fi omisă), rezultat cu încredere calibrată și hartă Grad-CAM, abținere („nu putem spune”), fotografie neutilizabilă, caz în afara domeniului, istoric</w:t>
+            </w:r>
+          </w:p>
+        </w:tc>
+      </w:tr>
+      <w:tr>
+        <w:tc>
+          <w:tcPr>
+            <w:tcW w:type="dxa" w:w="3024"/>
+          </w:tcPr>
+          <w:p>
+            <w:r>
+              <w:t>Produse și ingrediente</w:t>
+            </w:r>
+          </w:p>
+        </w:tc>
+        <w:tc>
+          <w:tcPr>
+            <w:tcW w:type="dxa" w:w="3024"/>
+          </w:tcPr>
+          <w:p>
+            <w:r>
+              <w:t>30-34</w:t>
+            </w:r>
+          </w:p>
+        </w:tc>
+        <w:tc>
+          <w:tcPr>
+            <w:tcW w:type="dxa" w:w="3024"/>
+          </w:tcPr>
+          <w:p>
+            <w:r>
+              <w:t>scanare cod de bare, decodarea și scorul fiecărui ingredient, produs negăsit (lipirea listei INCI), catalog</w:t>
+            </w:r>
+          </w:p>
+        </w:tc>
+      </w:tr>
+      <w:tr>
+        <w:tc>
+          <w:tcPr>
+            <w:tcW w:type="dxa" w:w="3024"/>
+          </w:tcPr>
+          <w:p>
+            <w:r>
+              <w:t>Rutină și monitorizare</w:t>
+            </w:r>
+          </w:p>
+        </w:tc>
+        <w:tc>
+          <w:tcPr>
+            <w:tcW w:type="dxa" w:w="3024"/>
+          </w:tcPr>
+          <w:p>
+            <w:r>
+              <w:t>40-44</w:t>
+            </w:r>
+          </w:p>
+        </w:tc>
+        <w:tc>
+          <w:tcPr>
+            <w:tcW w:type="dxa" w:w="3024"/>
+          </w:tcPr>
+          <w:p>
+            <w:r>
+              <w:t>rutină de dimineață și de seară pe trei niveluri, jurnal zilnic, fotografii de progres (neanalizate), memento-uri locale</w:t>
+            </w:r>
+          </w:p>
+        </w:tc>
+      </w:tr>
+      <w:tr>
+        <w:tc>
+          <w:tcPr>
+            <w:tcW w:type="dxa" w:w="3024"/>
+          </w:tcPr>
+          <w:p>
+            <w:r>
+              <w:t>Profil, confidențialitate, legal</w:t>
+            </w:r>
+          </w:p>
+        </w:tc>
+        <w:tc>
+          <w:tcPr>
+            <w:tcW w:type="dxa" w:w="3024"/>
+          </w:tcPr>
+          <w:p>
+            <w:r>
+              <w:t>50-53</w:t>
+            </w:r>
+          </w:p>
+        </w:tc>
+        <w:tc>
+          <w:tcPr>
+            <w:tcW w:type="dxa" w:w="3024"/>
+          </w:tcPr>
+          <w:p>
+            <w:r>
+              <w:t>retragerea consimțământului, export JSON, ștergerea contului, avertismentul non-medical și limitările modelului</w:t>
+            </w:r>
+          </w:p>
+        </w:tc>
+      </w:tr>
+    </w:tbl>
+    <w:p>
+      <w:pPr>
+        <w:ind w:firstLine="0"/>
+        <w:jc w:val="center"/>
+      </w:pPr>
+      <w:r>
+        <w:drawing>
+          <wp:inline xmlns:a="http://schemas.openxmlformats.org/drawingml/2006/main" xmlns:pic="http://schemas.openxmlformats.org/drawingml/2006/picture">
+            <wp:extent cx="5400000" cy="5854091"/>
+            <wp:docPr id="13" name="Picture 13"/>
+            <wp:cNvGraphicFramePr>
+              <a:graphicFrameLocks noChangeAspect="1"/>
+            </wp:cNvGraphicFramePr>
+            <a:graphic>
+              <a:graphicData uri="http://schemas.openxmlformats.org/drawingml/2006/picture">
+                <pic:pic>
+                  <pic:nvPicPr>
+                    <pic:cNvPr id="0" name="ui_redesign_v2.png"/>
+                    <pic:cNvPicPr/>
+                  </pic:nvPicPr>
+                  <pic:blipFill>
+                    <a:blip r:embed="rId26"/>
+                    <a:stretch>
+                      <a:fillRect/>
+                    </a:stretch>
+                  </pic:blipFill>
+                  <pic:spPr>
+                    <a:xfrm>
+                      <a:off x="0" y="0"/>
+                      <a:ext cx="5400000" cy="5854091"/>
+                    </a:xfrm>
+                    <a:prstGeom prst="rect"/>
+                  </pic:spPr>
+                </pic:pic>
+              </a:graphicData>
+            </a:graphic>
+          </wp:inline>
+        </w:drawing>
+      </w:r>
+    </w:p>
+    <w:p>
+      <w:pPr>
+        <w:pStyle w:val="Caption"/>
+        <w:jc w:val="center"/>
+      </w:pPr>
+      <w:r>
+        <w:t>Figura 4.3. Opt ecrane din versiunea 2 a interfeței: (a) start, (b) Today, (c) alegerea zonei, (d) rezultat cu hartă Grad-CAM, (e) caz în afara domeniului, (f) detaliu produs, (g) rutină, (h) confidențialitate și date.</w:t>
+      </w:r>
+    </w:p>
+    <w:p>
+      <w:pPr>
+        <w:ind w:firstLine="709"/>
+        <w:jc w:val="both"/>
+      </w:pPr>
+      <w:r>
+        <w:t>Două ecrane sunt noi și vin direct din rezultatele capitolelor 5 și 8. Ecranul 23 („fotografie greu de citit”) oprește analiza înainte de orice rezultat dacă fotografia este neclară sau prea întunecată; motivul este că primul dermatolog a considerat 38,3% dintre imaginile SCIN de calitate insuficientă (secțiunea 5.3.5). Ecranul 24 („în afara a ceea ce verifică Lumière”) nu afișează niciun scor și trimite utilizatorul la medic, deoarece experimentul E4 a arătat că încrederea modelului nu este un filtru de siguranță: DINOv2 a dat o etichetă benignă sigură pentru 79,5% dintre leziunile maligne din DDI (secțiunea 8.11). Ecranul 21 implementează abținerea cu pragul τ, iar ecranul 20 afișează încrederea calibrată și harta Grad-CAM (secțiunile 8.11-8.12). Textele nu folosesc niciodată cuvintele „diagnostic” sau „tratament”; un rezultat „poate indica” o problemă, iar fiecare ecran de rezultat repetă că aplicația nu este un dispozitiv medical.</w:t>
+      </w:r>
+    </w:p>
+    <w:p>
+      <w:pPr>
+        <w:ind w:firstLine="709"/>
+        <w:jc w:val="both"/>
+      </w:pPr>
+      <w:r>
+        <w:t>Limitări ale prototipului: produsele sunt reprezentate prin ilustrații plate în locul fotografiilor reale, fotografiile de progres sunt înlocuitori, legăturile interactive dintre ecrane (modul prototip din Figma) nu au fost încă refăcute pentru versiunea 2, iar testarea cu utilizatori este planificată pentru luna a noua.</w:t>
+      </w:r>
+    </w:p>
+    <w:p>
+      <w:pPr>
         <w:pStyle w:val="Heading1"/>
       </w:pPr>
       <w:r>
@@ -9943,6 +10286,56 @@
       </w:pPr>
       <w:r>
         <w:t>[49] T. Darcet, M. Oquab, J. Mairal, P. Bojanowski, Vision Transformers Need Registers, ICLR 2024. https://arxiv.org/abs/2309.16588</w:t>
+      </w:r>
+    </w:p>
+    <w:p>
+      <w:pPr>
+        <w:spacing w:after="120" w:line="276" w:lineRule="auto"/>
+        <w:ind w:left="567" w:hanging="567"/>
+        <w:jc w:val="left"/>
+      </w:pPr>
+      <w:r>
+        <w:t>[50] The Fountain Institute, 7 Signs a UI Has Been Vibe Coded (And How to Avoid Them). https://www.thefountaininstitute.com/blog/signs-vibe-coded-ui</w:t>
+      </w:r>
+    </w:p>
+    <w:p>
+      <w:pPr>
+        <w:spacing w:after="120" w:line="276" w:lineRule="auto"/>
+        <w:ind w:left="567" w:hanging="567"/>
+        <w:jc w:val="left"/>
+      </w:pPr>
+      <w:r>
+        <w:t>[51] W3C, Web Content Accessibility Guidelines (WCAG) 2.2, 2023. https://www.w3.org/TR/WCAG22/</w:t>
+      </w:r>
+    </w:p>
+    <w:p>
+      <w:pPr>
+        <w:spacing w:after="120" w:line="276" w:lineRule="auto"/>
+        <w:ind w:left="567" w:hanging="567"/>
+        <w:jc w:val="left"/>
+      </w:pPr>
+      <w:r>
+        <w:t>[52] Apple, Human Interface Guidelines: Tab bars. https://developer.apple.com/design/human-interface-guidelines/tab-bars</w:t>
+      </w:r>
+    </w:p>
+    <w:p>
+      <w:pPr>
+        <w:spacing w:after="120" w:line="276" w:lineRule="auto"/>
+        <w:ind w:left="567" w:hanging="567"/>
+        <w:jc w:val="left"/>
+      </w:pPr>
+      <w:r>
+        <w:t>[53] Google Fonts, Young Serif (SIL Open Font License 1.1). https://fonts.google.com/specimen/Young+Serif</w:t>
+      </w:r>
+    </w:p>
+    <w:p>
+      <w:pPr>
+        <w:spacing w:after="120" w:line="276" w:lineRule="auto"/>
+        <w:ind w:left="567" w:hanging="567"/>
+        <w:jc w:val="left"/>
+      </w:pPr>
+      <w:r>
+        <w:t>[54] Google Fonts, Hanken Grotesk (SIL Open Font License 1.1). https://fonts.google.com/specimen/Hanken+Grotesk</w:t>
       </w:r>
     </w:p>
     <w:sectPr>

</xml_diff>

<commit_message>
docs(ui): wire the v2 screens into a click-through prototype
Link buttons, list rows, back arrows and the tab bar so the whole app
can be walked through in Figma's prototype mode, with eight named
flows including three edge cases. Bottom buttons and the tab bar stay
fixed on screens taller than the phone.

Thesis 4.2 describes the prototype; journal updated.
</commit_message>
<xml_diff>
--- a/docs/Teza_Licenta.docx
+++ b/docs/Teza_Licenta.docx
@@ -1778,7 +1778,16 @@
         <w:jc w:val="both"/>
       </w:pPr>
       <w:r>
-        <w:t>Limitări ale prototipului: produsele sunt reprezentate prin ilustrații plate în locul fotografiilor reale, fotografiile de progres sunt înlocuitori, legăturile interactive dintre ecrane (modul prototip din Figma) nu au fost încă refăcute pentru versiunea 2, iar testarea cu utilizatori este planificată pentru luna a noua.</w:t>
+        <w:t>Ecranele sunt legate într-un prototip interactiv (modul Prototype din Figma), în care fiecare buton, rând de listă și filă a barei de navigare deschide ecranul corespunzător: 105 legături între ecrane, 25 de legături în componenta barei de navigare (moștenite de toate ecranele) și opt fluxuri cu nume (integrare, analiza pielii, produse, rutină, profil și trei cazuri-limită: rezultat nesigur, fotografie neutilizabilă, caz în afara domeniului). Tranzițiile sunt alese după tipul ecranului: alunecare laterală pentru pașii următori, apariție de jos pentru camera foto și consimțământ, estompare pentru schimbarea filei, iar ecranul de analiză trece singur la rezultat după 2,5 secunde. Pe ecranele mai lungi decât telefonul, butoanele de jos și bara de navigare sunt fixate, astfel încât rămân pe loc când conținutul derulează.</w:t>
+      </w:r>
+    </w:p>
+    <w:p>
+      <w:pPr>
+        <w:ind w:firstLine="709"/>
+        <w:jc w:val="both"/>
+      </w:pPr>
+      <w:r>
+        <w:t>Limitări ale prototipului: produsele sunt reprezentate prin ilustrații plate în locul fotografiilor reale, iar fotografiile de progres sunt înlocuitori; testarea cu utilizatori este planificată pentru luna a noua.</w:t>
       </w:r>
     </w:p>
     <w:p>

</xml_diff>

<commit_message>
docs(ui): give the app design more warmth with photos and a pastel palette
Add real placeholder photography (free Unsplash photos), a pastel colour
family that codes concerns, routine steps, ingredient functions and
moods, a soft shadow for photo and product cards and a raised scan
button, so the interface stays clean without feeling bare.

Thesis 4.2 describes the warmer layer and the photo sources; Figure 4.3
shows the updated screens. Journal updated.
</commit_message>
<xml_diff>
--- a/docs/Teza_Licenta.docx
+++ b/docs/Teza_Licenta.docx
@@ -1489,6 +1489,15 @@
         <w:jc w:val="both"/>
       </w:pPr>
       <w:r>
+        <w:t>După o primă evaluare, interfața a fost considerată prea austeră, așa că peste același sistem de design a fost adăugat un strat vizual mai cald (versiunea 3), pornind de la imaginile de inspirație colectate de autoare (Pinterest) și de la concepte similare de pe Dribbble [56]. Schimbările sunt trei. Primul, fotografia: ecranul de start, ecranul Today, analiza, produsele și fotografiile de progres folosesc fotografii reale, cu fețe de tonuri de piele diferite, ceea ce se potrivește cu tema de echitate a lucrării. Al doilea, o familie de culori pastelate (roz, piersică, galben pal, mentă, lila și albastru pal), fiecare cu o nuanță închisă pentru text; ele codifică un sens și nu decorează: tipul problemei din rezultat, categoria pasului din rutină (curățare, tonifiere, tratament, hidratare, protecție), funcția ingredientului, starea pielii din jurnal și acțiunile rapide. Toate cele șase perechi text pe fundal au contrast între 5,45:1 și 6,27:1, deci peste pragul AA. Peony rămâne singura culoare pentru acțiuni. Al treilea, adâncimea și forma: o umbră roz discretă numai pe cardurile cu fotografie și pe cele de produs, colțuri mai rotunde (20 px) și un buton central rotund pentru scanare în bara de navigare, deoarece scanarea este o acțiune principală. Catalogul devine o grilă de carduri cu fotografie, iar pagina de produs începe cu o fotografie mare.</w:t>
+      </w:r>
+    </w:p>
+    <w:p>
+      <w:pPr>
+        <w:ind w:firstLine="709"/>
+        <w:jc w:val="both"/>
+      </w:pPr>
+      <w:r>
         <w:t>Tabelul 4.1 arată cum acoperă cele 36 de ecrane cerințele MVP din planul lucrării. Ecranele lungi (de exemplu rezultatul analizei) sunt desenate la lungimea completă de derulare, ca să se vadă tot conținutul. Figura 4.3 prezintă opt ecrane reprezentative.</w:t>
       </w:r>
     </w:p>
@@ -1760,7 +1769,7 @@
         <w:jc w:val="center"/>
       </w:pPr>
       <w:r>
-        <w:t>Figura 4.3. Opt ecrane din versiunea 2 a interfeței: (a) start, (b) Today, (c) alegerea zonei, (d) rezultat cu hartă Grad-CAM, (e) caz în afara domeniului, (f) detaliu produs, (g) rutină, (h) confidențialitate și date.</w:t>
+        <w:t>Figura 4.3. Opt ecrane din versiunea 3 a interfeței: (a) start, (b) Today, (c) camera, (d) rezultat cu hartă Grad-CAM, (e) detaliu produs, (f) catalog, (g) rutină, (h) profil.</w:t>
       </w:r>
     </w:p>
     <w:p>
@@ -1787,7 +1796,7 @@
         <w:jc w:val="both"/>
       </w:pPr>
       <w:r>
-        <w:t>Limitări ale prototipului: produsele sunt reprezentate prin ilustrații plate în locul fotografiilor reale, iar fotografiile de progres sunt înlocuitori; testarea cu utilizatori este planificată pentru luna a noua.</w:t>
+        <w:t>Limitări ale prototipului: fotografiile sunt înlocuitori: 11 fotografii gratuite de pe Unsplash, folosite conform licenței Unsplash [55], și două portrete generate în Figma; aplicația finală va folosi imaginile produselor din Open Beauty Facts sau de la producători, iar fotografiile utilizatorilor rămân private; testarea cu utilizatori este planificată pentru luna a noua.</w:t>
       </w:r>
     </w:p>
     <w:p>
@@ -10345,6 +10354,26 @@
       </w:pPr>
       <w:r>
         <w:t>[54] Google Fonts, Hanken Grotesk (SIL Open Font License 1.1). https://fonts.google.com/specimen/Hanken+Grotesk</w:t>
+      </w:r>
+    </w:p>
+    <w:p>
+      <w:pPr>
+        <w:spacing w:after="120" w:line="276" w:lineRule="auto"/>
+        <w:ind w:left="567" w:hanging="567"/>
+        <w:jc w:val="left"/>
+      </w:pPr>
+      <w:r>
+        <w:t>[55] Unsplash, Unsplash License. https://unsplash.com/license</w:t>
+      </w:r>
+    </w:p>
+    <w:p>
+      <w:pPr>
+        <w:spacing w:after="120" w:line="276" w:lineRule="auto"/>
+        <w:ind w:left="567" w:hanging="567"/>
+        <w:jc w:val="left"/>
+      </w:pPr>
+      <w:r>
+        <w:t>[56] N. Laraswati, Skincare Routine App (concept), Dribbble. https://dribbble.com/shots/27646924-Skincare-Routine-App</w:t>
       </w:r>
     </w:p>
     <w:sectPr>

</xml_diff>

<commit_message>
docs(ui): add layered details: analysis overlay and pop-out products
Show the face photo on the result with real landmark points, the face
outline, a scan frame, the Grad-CAM heat and callout labels, and the
confidence as a ring gauge. Cut-out products now rise out of their
cards on Today, the catalogue, the product page and the welcome photo,
and the log-in photo carries an overlapping round button.

Thesis 4.2 and Figure 4.3 updated; journal updated.
</commit_message>
<xml_diff>
--- a/docs/Teza_Licenta.docx
+++ b/docs/Teza_Licenta.docx
@@ -1498,6 +1498,15 @@
         <w:jc w:val="both"/>
       </w:pPr>
       <w:r>
+        <w:t>Pentru un aspect mai bogat, câteva elemente au fost construite în straturi, după modelele găsite pe Pinterest de autoare și în căutările ulterioare. Rezultatul analizei afișează fotografia cu un strat de analiză: cele 478 de repere faciale (landmarks) detectate de MediaPipe Face Landmarker [58], același model folosit în pipeline-ul ML (secțiunea 5.7), conturul feței, un cadru de scanare, harta Grad-CAM pe obraji și linii de legătură către etichete semitransparente („obrazul stâng, influență mare”). Stratul arată numai informații pe care sistemul le calculează cu adevărat; nu sunt afișate scoruri inventate de tipul „hidratare 72%”, pe care modelul nu le măsoară. Încrederea calibrată este afișată ca un inel (gauge). Produsele apar decupate, fără fundal, și ies din conturul cardurilor (raftul din ecranul Today, catalogul, pagina de produs, ecranul de start); decuparea a fost făcută local cu biblioteca rembg [57], pe fotografiile gratuite de pe Unsplash, deci fără costuri suplimentare. Ecranul de autentificare folosește suprapunerea unei fotografii cu un buton rotund așezat pe marginea ei.</w:t>
+      </w:r>
+    </w:p>
+    <w:p>
+      <w:pPr>
+        <w:ind w:firstLine="709"/>
+        <w:jc w:val="both"/>
+      </w:pPr>
+      <w:r>
         <w:t>Tabelul 4.1 arată cum acoperă cele 36 de ecrane cerințele MVP din planul lucrării. Ecranele lungi (de exemplu rezultatul analizei) sunt desenate la lungimea completă de derulare, ca să se vadă tot conținutul. Figura 4.3 prezintă opt ecrane reprezentative.</w:t>
       </w:r>
     </w:p>
@@ -10374,6 +10383,26 @@
       </w:pPr>
       <w:r>
         <w:t>[56] N. Laraswati, Skincare Routine App (concept), Dribbble. https://dribbble.com/shots/27646924-Skincare-Routine-App</w:t>
+      </w:r>
+    </w:p>
+    <w:p>
+      <w:pPr>
+        <w:spacing w:after="120" w:line="276" w:lineRule="auto"/>
+        <w:ind w:left="567" w:hanging="567"/>
+        <w:jc w:val="left"/>
+      </w:pPr>
+      <w:r>
+        <w:t>[57] D. Gatis, rembg: a tool to remove image backgrounds (model IS-Net general use). https://github.com/danielgatis/rembg</w:t>
+      </w:r>
+    </w:p>
+    <w:p>
+      <w:pPr>
+        <w:spacing w:after="120" w:line="276" w:lineRule="auto"/>
+        <w:ind w:left="567" w:hanging="567"/>
+        <w:jc w:val="left"/>
+      </w:pPr>
+      <w:r>
+        <w:t>[58] Google, MediaPipe Face Landmarker. https://ai.google.dev/edge/mediapipe/solutions/vision/face_landmarker</w:t>
       </w:r>
     </w:p>
     <w:sectPr>

</xml_diff>

<commit_message>
feat(ml): one statistics procedure for every contrast and generated result assets (Task 4.4)
- stats_tests.py recomputes the 31 main contrasts (E1, E2, E5, E7, E4
  AURC, out-of-scope detectors) from the per-seed results: difference
  per seed, 95% t interval over seeds, paired t and Wilcoxon, Holm
  within each family and over all contrasts. The 20 contrasts already
  stored by the experiment runners are checked and all agree.
- With Holm over all 31, 12 stay significant; PanDerm-Large (+0.047)
  and the pooled-training loss (-0.035) no longer pass, and the DINOv2
  gain (+0.032) has a seed-level interval that includes 0.
- make_report_assets.py rebuilds 8 result tables (CSV + Markdown,
  optional decimal comma) and collects 6 figures in reports/assets/.
- tests for the tone analysis, the contrasts and the table export.
- thesis 8.8 gets Table 8.11 (macro-F1 by tone) and the statistics
  paragraph (53 pages); task plan and journal updated for 4.1 and 4.4.
</commit_message>
<xml_diff>
--- a/docs/Teza_Licenta.docx
+++ b/docs/Teza_Licenta.docx
@@ -299,7 +299,7 @@
         </w:rPr>
         <w:fldChar w:fldCharType="separate"/>
       </w:r>
-      <w:hyperlink w:anchor="_Toc243938989" w:history="1">
+      <w:hyperlink w:anchor="_Toc243940977" w:history="1">
         <w:r>
           <w:rPr>
             <w:rStyle w:val="Hyperlink"/>
@@ -326,7 +326,7 @@
             <w:noProof/>
             <w:webHidden/>
           </w:rPr>
-          <w:instrText xml:space="preserve"> PAGEREF _Toc243938989 \h </w:instrText>
+          <w:instrText xml:space="preserve"> PAGEREF _Toc243940977 \h </w:instrText>
         </w:r>
         <w:r>
           <w:rPr>
@@ -373,7 +373,7 @@
           <w14:ligatures w14:val="standardContextual"/>
         </w:rPr>
       </w:pPr>
-      <w:hyperlink w:anchor="_Toc243938990" w:history="1">
+      <w:hyperlink w:anchor="_Toc243940978" w:history="1">
         <w:r>
           <w:rPr>
             <w:rStyle w:val="Hyperlink"/>
@@ -400,7 +400,7 @@
             <w:noProof/>
             <w:webHidden/>
           </w:rPr>
-          <w:instrText xml:space="preserve"> PAGEREF _Toc243938990 \h </w:instrText>
+          <w:instrText xml:space="preserve"> PAGEREF _Toc243940978 \h </w:instrText>
         </w:r>
         <w:r>
           <w:rPr>
@@ -447,7 +447,7 @@
           <w14:ligatures w14:val="standardContextual"/>
         </w:rPr>
       </w:pPr>
-      <w:hyperlink w:anchor="_Toc243938991" w:history="1">
+      <w:hyperlink w:anchor="_Toc243940979" w:history="1">
         <w:r>
           <w:rPr>
             <w:rStyle w:val="Hyperlink"/>
@@ -474,7 +474,7 @@
             <w:noProof/>
             <w:webHidden/>
           </w:rPr>
-          <w:instrText xml:space="preserve"> PAGEREF _Toc243938991 \h </w:instrText>
+          <w:instrText xml:space="preserve"> PAGEREF _Toc243940979 \h </w:instrText>
         </w:r>
         <w:r>
           <w:rPr>
@@ -521,7 +521,7 @@
           <w14:ligatures w14:val="standardContextual"/>
         </w:rPr>
       </w:pPr>
-      <w:hyperlink w:anchor="_Toc243938992" w:history="1">
+      <w:hyperlink w:anchor="_Toc243940980" w:history="1">
         <w:r>
           <w:rPr>
             <w:rStyle w:val="Hyperlink"/>
@@ -548,7 +548,7 @@
             <w:noProof/>
             <w:webHidden/>
           </w:rPr>
-          <w:instrText xml:space="preserve"> PAGEREF _Toc243938992 \h </w:instrText>
+          <w:instrText xml:space="preserve"> PAGEREF _Toc243940980 \h </w:instrText>
         </w:r>
         <w:r>
           <w:rPr>
@@ -595,7 +595,7 @@
           <w14:ligatures w14:val="standardContextual"/>
         </w:rPr>
       </w:pPr>
-      <w:hyperlink w:anchor="_Toc243938993" w:history="1">
+      <w:hyperlink w:anchor="_Toc243940981" w:history="1">
         <w:r>
           <w:rPr>
             <w:rStyle w:val="Hyperlink"/>
@@ -622,7 +622,7 @@
             <w:noProof/>
             <w:webHidden/>
           </w:rPr>
-          <w:instrText xml:space="preserve"> PAGEREF _Toc243938993 \h </w:instrText>
+          <w:instrText xml:space="preserve"> PAGEREF _Toc243940981 \h </w:instrText>
         </w:r>
         <w:r>
           <w:rPr>
@@ -669,7 +669,7 @@
           <w14:ligatures w14:val="standardContextual"/>
         </w:rPr>
       </w:pPr>
-      <w:hyperlink w:anchor="_Toc243938994" w:history="1">
+      <w:hyperlink w:anchor="_Toc243940982" w:history="1">
         <w:r>
           <w:rPr>
             <w:rStyle w:val="Hyperlink"/>
@@ -696,7 +696,7 @@
             <w:noProof/>
             <w:webHidden/>
           </w:rPr>
-          <w:instrText xml:space="preserve"> PAGEREF _Toc243938994 \h </w:instrText>
+          <w:instrText xml:space="preserve"> PAGEREF _Toc243940982 \h </w:instrText>
         </w:r>
         <w:r>
           <w:rPr>
@@ -743,7 +743,7 @@
           <w14:ligatures w14:val="standardContextual"/>
         </w:rPr>
       </w:pPr>
-      <w:hyperlink w:anchor="_Toc243938995" w:history="1">
+      <w:hyperlink w:anchor="_Toc243940983" w:history="1">
         <w:r>
           <w:rPr>
             <w:rStyle w:val="Hyperlink"/>
@@ -770,7 +770,7 @@
             <w:noProof/>
             <w:webHidden/>
           </w:rPr>
-          <w:instrText xml:space="preserve"> PAGEREF _Toc243938995 \h </w:instrText>
+          <w:instrText xml:space="preserve"> PAGEREF _Toc243940983 \h </w:instrText>
         </w:r>
         <w:r>
           <w:rPr>
@@ -817,7 +817,7 @@
           <w14:ligatures w14:val="standardContextual"/>
         </w:rPr>
       </w:pPr>
-      <w:hyperlink w:anchor="_Toc243938996" w:history="1">
+      <w:hyperlink w:anchor="_Toc243940984" w:history="1">
         <w:r>
           <w:rPr>
             <w:rStyle w:val="Hyperlink"/>
@@ -844,7 +844,7 @@
             <w:noProof/>
             <w:webHidden/>
           </w:rPr>
-          <w:instrText xml:space="preserve"> PAGEREF _Toc243938996 \h </w:instrText>
+          <w:instrText xml:space="preserve"> PAGEREF _Toc243940984 \h </w:instrText>
         </w:r>
         <w:r>
           <w:rPr>
@@ -891,7 +891,7 @@
           <w14:ligatures w14:val="standardContextual"/>
         </w:rPr>
       </w:pPr>
-      <w:hyperlink w:anchor="_Toc243938997" w:history="1">
+      <w:hyperlink w:anchor="_Toc243940985" w:history="1">
         <w:r>
           <w:rPr>
             <w:rStyle w:val="Hyperlink"/>
@@ -918,7 +918,7 @@
             <w:noProof/>
             <w:webHidden/>
           </w:rPr>
-          <w:instrText xml:space="preserve"> PAGEREF _Toc243938997 \h </w:instrText>
+          <w:instrText xml:space="preserve"> PAGEREF _Toc243940985 \h </w:instrText>
         </w:r>
         <w:r>
           <w:rPr>
@@ -965,7 +965,7 @@
           <w14:ligatures w14:val="standardContextual"/>
         </w:rPr>
       </w:pPr>
-      <w:hyperlink w:anchor="_Toc243938998" w:history="1">
+      <w:hyperlink w:anchor="_Toc243940986" w:history="1">
         <w:r>
           <w:rPr>
             <w:rStyle w:val="Hyperlink"/>
@@ -992,7 +992,7 @@
             <w:noProof/>
             <w:webHidden/>
           </w:rPr>
-          <w:instrText xml:space="preserve"> PAGEREF _Toc243938998 \h </w:instrText>
+          <w:instrText xml:space="preserve"> PAGEREF _Toc243940986 \h </w:instrText>
         </w:r>
         <w:r>
           <w:rPr>
@@ -1039,7 +1039,7 @@
           <w14:ligatures w14:val="standardContextual"/>
         </w:rPr>
       </w:pPr>
-      <w:hyperlink w:anchor="_Toc243938999" w:history="1">
+      <w:hyperlink w:anchor="_Toc243940987" w:history="1">
         <w:r>
           <w:rPr>
             <w:rStyle w:val="Hyperlink"/>
@@ -1066,7 +1066,7 @@
             <w:noProof/>
             <w:webHidden/>
           </w:rPr>
-          <w:instrText xml:space="preserve"> PAGEREF _Toc243938999 \h </w:instrText>
+          <w:instrText xml:space="preserve"> PAGEREF _Toc243940987 \h </w:instrText>
         </w:r>
         <w:r>
           <w:rPr>
@@ -1113,7 +1113,7 @@
           <w14:ligatures w14:val="standardContextual"/>
         </w:rPr>
       </w:pPr>
-      <w:hyperlink w:anchor="_Toc243939000" w:history="1">
+      <w:hyperlink w:anchor="_Toc243940988" w:history="1">
         <w:r>
           <w:rPr>
             <w:rStyle w:val="Hyperlink"/>
@@ -1140,7 +1140,7 @@
             <w:noProof/>
             <w:webHidden/>
           </w:rPr>
-          <w:instrText xml:space="preserve"> PAGEREF _Toc243939000 \h </w:instrText>
+          <w:instrText xml:space="preserve"> PAGEREF _Toc243940988 \h </w:instrText>
         </w:r>
         <w:r>
           <w:rPr>
@@ -1187,7 +1187,7 @@
           <w14:ligatures w14:val="standardContextual"/>
         </w:rPr>
       </w:pPr>
-      <w:hyperlink w:anchor="_Toc243939001" w:history="1">
+      <w:hyperlink w:anchor="_Toc243940989" w:history="1">
         <w:r>
           <w:rPr>
             <w:rStyle w:val="Hyperlink"/>
@@ -1214,7 +1214,7 @@
             <w:noProof/>
             <w:webHidden/>
           </w:rPr>
-          <w:instrText xml:space="preserve"> PAGEREF _Toc243939001 \h </w:instrText>
+          <w:instrText xml:space="preserve"> PAGEREF _Toc243940989 \h </w:instrText>
         </w:r>
         <w:r>
           <w:rPr>
@@ -1261,7 +1261,7 @@
           <w14:ligatures w14:val="standardContextual"/>
         </w:rPr>
       </w:pPr>
-      <w:hyperlink w:anchor="_Toc243939002" w:history="1">
+      <w:hyperlink w:anchor="_Toc243940990" w:history="1">
         <w:r>
           <w:rPr>
             <w:rStyle w:val="Hyperlink"/>
@@ -1288,7 +1288,7 @@
             <w:noProof/>
             <w:webHidden/>
           </w:rPr>
-          <w:instrText xml:space="preserve"> PAGEREF _Toc243939002 \h </w:instrText>
+          <w:instrText xml:space="preserve"> PAGEREF _Toc243940990 \h </w:instrText>
         </w:r>
         <w:r>
           <w:rPr>
@@ -1335,7 +1335,7 @@
           <w14:ligatures w14:val="standardContextual"/>
         </w:rPr>
       </w:pPr>
-      <w:hyperlink w:anchor="_Toc243939003" w:history="1">
+      <w:hyperlink w:anchor="_Toc243940991" w:history="1">
         <w:r>
           <w:rPr>
             <w:rStyle w:val="Hyperlink"/>
@@ -1362,7 +1362,7 @@
             <w:noProof/>
             <w:webHidden/>
           </w:rPr>
-          <w:instrText xml:space="preserve"> PAGEREF _Toc243939003 \h </w:instrText>
+          <w:instrText xml:space="preserve"> PAGEREF _Toc243940991 \h </w:instrText>
         </w:r>
         <w:r>
           <w:rPr>
@@ -1409,7 +1409,7 @@
           <w14:ligatures w14:val="standardContextual"/>
         </w:rPr>
       </w:pPr>
-      <w:hyperlink w:anchor="_Toc243939004" w:history="1">
+      <w:hyperlink w:anchor="_Toc243940992" w:history="1">
         <w:r>
           <w:rPr>
             <w:rStyle w:val="Hyperlink"/>
@@ -1436,7 +1436,7 @@
             <w:noProof/>
             <w:webHidden/>
           </w:rPr>
-          <w:instrText xml:space="preserve"> PAGEREF _Toc243939004 \h </w:instrText>
+          <w:instrText xml:space="preserve"> PAGEREF _Toc243940992 \h </w:instrText>
         </w:r>
         <w:r>
           <w:rPr>
@@ -1483,7 +1483,7 @@
           <w14:ligatures w14:val="standardContextual"/>
         </w:rPr>
       </w:pPr>
-      <w:hyperlink w:anchor="_Toc243939005" w:history="1">
+      <w:hyperlink w:anchor="_Toc243940993" w:history="1">
         <w:r>
           <w:rPr>
             <w:rStyle w:val="Hyperlink"/>
@@ -1510,7 +1510,7 @@
             <w:noProof/>
             <w:webHidden/>
           </w:rPr>
-          <w:instrText xml:space="preserve"> PAGEREF _Toc243939005 \h </w:instrText>
+          <w:instrText xml:space="preserve"> PAGEREF _Toc243940993 \h </w:instrText>
         </w:r>
         <w:r>
           <w:rPr>
@@ -1557,7 +1557,7 @@
           <w14:ligatures w14:val="standardContextual"/>
         </w:rPr>
       </w:pPr>
-      <w:hyperlink w:anchor="_Toc243939006" w:history="1">
+      <w:hyperlink w:anchor="_Toc243940994" w:history="1">
         <w:r>
           <w:rPr>
             <w:rStyle w:val="Hyperlink"/>
@@ -1584,7 +1584,7 @@
             <w:noProof/>
             <w:webHidden/>
           </w:rPr>
-          <w:instrText xml:space="preserve"> PAGEREF _Toc243939006 \h </w:instrText>
+          <w:instrText xml:space="preserve"> PAGEREF _Toc243940994 \h </w:instrText>
         </w:r>
         <w:r>
           <w:rPr>
@@ -1631,7 +1631,7 @@
           <w14:ligatures w14:val="standardContextual"/>
         </w:rPr>
       </w:pPr>
-      <w:hyperlink w:anchor="_Toc243939007" w:history="1">
+      <w:hyperlink w:anchor="_Toc243940995" w:history="1">
         <w:r>
           <w:rPr>
             <w:rStyle w:val="Hyperlink"/>
@@ -1658,7 +1658,7 @@
             <w:noProof/>
             <w:webHidden/>
           </w:rPr>
-          <w:instrText xml:space="preserve"> PAGEREF _Toc243939007 \h </w:instrText>
+          <w:instrText xml:space="preserve"> PAGEREF _Toc243940995 \h </w:instrText>
         </w:r>
         <w:r>
           <w:rPr>
@@ -1705,7 +1705,7 @@
           <w14:ligatures w14:val="standardContextual"/>
         </w:rPr>
       </w:pPr>
-      <w:hyperlink w:anchor="_Toc243939008" w:history="1">
+      <w:hyperlink w:anchor="_Toc243940996" w:history="1">
         <w:r>
           <w:rPr>
             <w:rStyle w:val="Hyperlink"/>
@@ -1732,7 +1732,7 @@
             <w:noProof/>
             <w:webHidden/>
           </w:rPr>
-          <w:instrText xml:space="preserve"> PAGEREF _Toc243939008 \h </w:instrText>
+          <w:instrText xml:space="preserve"> PAGEREF _Toc243940996 \h </w:instrText>
         </w:r>
         <w:r>
           <w:rPr>
@@ -1779,7 +1779,7 @@
           <w14:ligatures w14:val="standardContextual"/>
         </w:rPr>
       </w:pPr>
-      <w:hyperlink w:anchor="_Toc243939009" w:history="1">
+      <w:hyperlink w:anchor="_Toc243940997" w:history="1">
         <w:r>
           <w:rPr>
             <w:rStyle w:val="Hyperlink"/>
@@ -1806,7 +1806,7 @@
             <w:noProof/>
             <w:webHidden/>
           </w:rPr>
-          <w:instrText xml:space="preserve"> PAGEREF _Toc243939009 \h </w:instrText>
+          <w:instrText xml:space="preserve"> PAGEREF _Toc243940997 \h </w:instrText>
         </w:r>
         <w:r>
           <w:rPr>
@@ -1853,7 +1853,7 @@
           <w14:ligatures w14:val="standardContextual"/>
         </w:rPr>
       </w:pPr>
-      <w:hyperlink w:anchor="_Toc243939010" w:history="1">
+      <w:hyperlink w:anchor="_Toc243940998" w:history="1">
         <w:r>
           <w:rPr>
             <w:rStyle w:val="Hyperlink"/>
@@ -1880,7 +1880,7 @@
             <w:noProof/>
             <w:webHidden/>
           </w:rPr>
-          <w:instrText xml:space="preserve"> PAGEREF _Toc243939010 \h </w:instrText>
+          <w:instrText xml:space="preserve"> PAGEREF _Toc243940998 \h </w:instrText>
         </w:r>
         <w:r>
           <w:rPr>
@@ -1927,7 +1927,7 @@
           <w14:ligatures w14:val="standardContextual"/>
         </w:rPr>
       </w:pPr>
-      <w:hyperlink w:anchor="_Toc243939011" w:history="1">
+      <w:hyperlink w:anchor="_Toc243940999" w:history="1">
         <w:r>
           <w:rPr>
             <w:rStyle w:val="Hyperlink"/>
@@ -1954,7 +1954,7 @@
             <w:noProof/>
             <w:webHidden/>
           </w:rPr>
-          <w:instrText xml:space="preserve"> PAGEREF _Toc243939011 \h </w:instrText>
+          <w:instrText xml:space="preserve"> PAGEREF _Toc243940999 \h </w:instrText>
         </w:r>
         <w:r>
           <w:rPr>
@@ -2001,7 +2001,7 @@
           <w14:ligatures w14:val="standardContextual"/>
         </w:rPr>
       </w:pPr>
-      <w:hyperlink w:anchor="_Toc243939012" w:history="1">
+      <w:hyperlink w:anchor="_Toc243941000" w:history="1">
         <w:r>
           <w:rPr>
             <w:rStyle w:val="Hyperlink"/>
@@ -2028,7 +2028,7 @@
             <w:noProof/>
             <w:webHidden/>
           </w:rPr>
-          <w:instrText xml:space="preserve"> PAGEREF _Toc243939012 \h </w:instrText>
+          <w:instrText xml:space="preserve"> PAGEREF _Toc243941000 \h </w:instrText>
         </w:r>
         <w:r>
           <w:rPr>
@@ -2075,7 +2075,7 @@
           <w14:ligatures w14:val="standardContextual"/>
         </w:rPr>
       </w:pPr>
-      <w:hyperlink w:anchor="_Toc243939013" w:history="1">
+      <w:hyperlink w:anchor="_Toc243941001" w:history="1">
         <w:r>
           <w:rPr>
             <w:rStyle w:val="Hyperlink"/>
@@ -2102,7 +2102,7 @@
             <w:noProof/>
             <w:webHidden/>
           </w:rPr>
-          <w:instrText xml:space="preserve"> PAGEREF _Toc243939013 \h </w:instrText>
+          <w:instrText xml:space="preserve"> PAGEREF _Toc243941001 \h </w:instrText>
         </w:r>
         <w:r>
           <w:rPr>
@@ -2149,7 +2149,7 @@
           <w14:ligatures w14:val="standardContextual"/>
         </w:rPr>
       </w:pPr>
-      <w:hyperlink w:anchor="_Toc243939014" w:history="1">
+      <w:hyperlink w:anchor="_Toc243941002" w:history="1">
         <w:r>
           <w:rPr>
             <w:rStyle w:val="Hyperlink"/>
@@ -2176,7 +2176,7 @@
             <w:noProof/>
             <w:webHidden/>
           </w:rPr>
-          <w:instrText xml:space="preserve"> PAGEREF _Toc243939014 \h </w:instrText>
+          <w:instrText xml:space="preserve"> PAGEREF _Toc243941002 \h </w:instrText>
         </w:r>
         <w:r>
           <w:rPr>
@@ -2223,7 +2223,7 @@
           <w14:ligatures w14:val="standardContextual"/>
         </w:rPr>
       </w:pPr>
-      <w:hyperlink w:anchor="_Toc243939015" w:history="1">
+      <w:hyperlink w:anchor="_Toc243941003" w:history="1">
         <w:r>
           <w:rPr>
             <w:rStyle w:val="Hyperlink"/>
@@ -2250,7 +2250,7 @@
             <w:noProof/>
             <w:webHidden/>
           </w:rPr>
-          <w:instrText xml:space="preserve"> PAGEREF _Toc243939015 \h </w:instrText>
+          <w:instrText xml:space="preserve"> PAGEREF _Toc243941003 \h </w:instrText>
         </w:r>
         <w:r>
           <w:rPr>
@@ -2297,7 +2297,7 @@
           <w14:ligatures w14:val="standardContextual"/>
         </w:rPr>
       </w:pPr>
-      <w:hyperlink w:anchor="_Toc243939016" w:history="1">
+      <w:hyperlink w:anchor="_Toc243941004" w:history="1">
         <w:r>
           <w:rPr>
             <w:rStyle w:val="Hyperlink"/>
@@ -2324,7 +2324,7 @@
             <w:noProof/>
             <w:webHidden/>
           </w:rPr>
-          <w:instrText xml:space="preserve"> PAGEREF _Toc243939016 \h </w:instrText>
+          <w:instrText xml:space="preserve"> PAGEREF _Toc243941004 \h </w:instrText>
         </w:r>
         <w:r>
           <w:rPr>
@@ -2371,7 +2371,7 @@
           <w14:ligatures w14:val="standardContextual"/>
         </w:rPr>
       </w:pPr>
-      <w:hyperlink w:anchor="_Toc243939017" w:history="1">
+      <w:hyperlink w:anchor="_Toc243941005" w:history="1">
         <w:r>
           <w:rPr>
             <w:rStyle w:val="Hyperlink"/>
@@ -2398,7 +2398,7 @@
             <w:noProof/>
             <w:webHidden/>
           </w:rPr>
-          <w:instrText xml:space="preserve"> PAGEREF _Toc243939017 \h </w:instrText>
+          <w:instrText xml:space="preserve"> PAGEREF _Toc243941005 \h </w:instrText>
         </w:r>
         <w:r>
           <w:rPr>
@@ -2445,7 +2445,7 @@
           <w14:ligatures w14:val="standardContextual"/>
         </w:rPr>
       </w:pPr>
-      <w:hyperlink w:anchor="_Toc243939018" w:history="1">
+      <w:hyperlink w:anchor="_Toc243941006" w:history="1">
         <w:r>
           <w:rPr>
             <w:rStyle w:val="Hyperlink"/>
@@ -2472,7 +2472,7 @@
             <w:noProof/>
             <w:webHidden/>
           </w:rPr>
-          <w:instrText xml:space="preserve"> PAGEREF _Toc243939018 \h </w:instrText>
+          <w:instrText xml:space="preserve"> PAGEREF _Toc243941006 \h </w:instrText>
         </w:r>
         <w:r>
           <w:rPr>
@@ -2519,7 +2519,7 @@
           <w14:ligatures w14:val="standardContextual"/>
         </w:rPr>
       </w:pPr>
-      <w:hyperlink w:anchor="_Toc243939019" w:history="1">
+      <w:hyperlink w:anchor="_Toc243941007" w:history="1">
         <w:r>
           <w:rPr>
             <w:rStyle w:val="Hyperlink"/>
@@ -2546,7 +2546,7 @@
             <w:noProof/>
             <w:webHidden/>
           </w:rPr>
-          <w:instrText xml:space="preserve"> PAGEREF _Toc243939019 \h </w:instrText>
+          <w:instrText xml:space="preserve"> PAGEREF _Toc243941007 \h </w:instrText>
         </w:r>
         <w:r>
           <w:rPr>
@@ -2593,7 +2593,7 @@
           <w14:ligatures w14:val="standardContextual"/>
         </w:rPr>
       </w:pPr>
-      <w:hyperlink w:anchor="_Toc243939020" w:history="1">
+      <w:hyperlink w:anchor="_Toc243941008" w:history="1">
         <w:r>
           <w:rPr>
             <w:rStyle w:val="Hyperlink"/>
@@ -2620,7 +2620,7 @@
             <w:noProof/>
             <w:webHidden/>
           </w:rPr>
-          <w:instrText xml:space="preserve"> PAGEREF _Toc243939020 \h </w:instrText>
+          <w:instrText xml:space="preserve"> PAGEREF _Toc243941008 \h </w:instrText>
         </w:r>
         <w:r>
           <w:rPr>
@@ -2667,7 +2667,7 @@
           <w14:ligatures w14:val="standardContextual"/>
         </w:rPr>
       </w:pPr>
-      <w:hyperlink w:anchor="_Toc243939021" w:history="1">
+      <w:hyperlink w:anchor="_Toc243941009" w:history="1">
         <w:r>
           <w:rPr>
             <w:rStyle w:val="Hyperlink"/>
@@ -2694,7 +2694,7 @@
             <w:noProof/>
             <w:webHidden/>
           </w:rPr>
-          <w:instrText xml:space="preserve"> PAGEREF _Toc243939021 \h </w:instrText>
+          <w:instrText xml:space="preserve"> PAGEREF _Toc243941009 \h </w:instrText>
         </w:r>
         <w:r>
           <w:rPr>
@@ -2714,7 +2714,7 @@
             <w:noProof/>
             <w:webHidden/>
           </w:rPr>
-          <w:t>36</w:t>
+          <w:t>37</w:t>
         </w:r>
         <w:r>
           <w:rPr>
@@ -2741,7 +2741,7 @@
           <w14:ligatures w14:val="standardContextual"/>
         </w:rPr>
       </w:pPr>
-      <w:hyperlink w:anchor="_Toc243939022" w:history="1">
+      <w:hyperlink w:anchor="_Toc243941010" w:history="1">
         <w:r>
           <w:rPr>
             <w:rStyle w:val="Hyperlink"/>
@@ -2768,7 +2768,7 @@
             <w:noProof/>
             <w:webHidden/>
           </w:rPr>
-          <w:instrText xml:space="preserve"> PAGEREF _Toc243939022 \h </w:instrText>
+          <w:instrText xml:space="preserve"> PAGEREF _Toc243941010 \h </w:instrText>
         </w:r>
         <w:r>
           <w:rPr>
@@ -2788,7 +2788,7 @@
             <w:noProof/>
             <w:webHidden/>
           </w:rPr>
-          <w:t>37</w:t>
+          <w:t>38</w:t>
         </w:r>
         <w:r>
           <w:rPr>
@@ -2815,7 +2815,7 @@
           <w14:ligatures w14:val="standardContextual"/>
         </w:rPr>
       </w:pPr>
-      <w:hyperlink w:anchor="_Toc243939023" w:history="1">
+      <w:hyperlink w:anchor="_Toc243941011" w:history="1">
         <w:r>
           <w:rPr>
             <w:rStyle w:val="Hyperlink"/>
@@ -2842,7 +2842,7 @@
             <w:noProof/>
             <w:webHidden/>
           </w:rPr>
-          <w:instrText xml:space="preserve"> PAGEREF _Toc243939023 \h </w:instrText>
+          <w:instrText xml:space="preserve"> PAGEREF _Toc243941011 \h </w:instrText>
         </w:r>
         <w:r>
           <w:rPr>
@@ -2862,7 +2862,7 @@
             <w:noProof/>
             <w:webHidden/>
           </w:rPr>
-          <w:t>37</w:t>
+          <w:t>38</w:t>
         </w:r>
         <w:r>
           <w:rPr>
@@ -2889,7 +2889,7 @@
           <w14:ligatures w14:val="standardContextual"/>
         </w:rPr>
       </w:pPr>
-      <w:hyperlink w:anchor="_Toc243939024" w:history="1">
+      <w:hyperlink w:anchor="_Toc243941012" w:history="1">
         <w:r>
           <w:rPr>
             <w:rStyle w:val="Hyperlink"/>
@@ -2916,7 +2916,7 @@
             <w:noProof/>
             <w:webHidden/>
           </w:rPr>
-          <w:instrText xml:space="preserve"> PAGEREF _Toc243939024 \h </w:instrText>
+          <w:instrText xml:space="preserve"> PAGEREF _Toc243941012 \h </w:instrText>
         </w:r>
         <w:r>
           <w:rPr>
@@ -2936,7 +2936,7 @@
             <w:noProof/>
             <w:webHidden/>
           </w:rPr>
-          <w:t>40</w:t>
+          <w:t>41</w:t>
         </w:r>
         <w:r>
           <w:rPr>
@@ -2989,7 +2989,7 @@
       <w:r>
         <w:fldChar w:fldCharType="separate"/>
       </w:r>
-      <w:hyperlink w:anchor="_Toc243939025" w:history="1">
+      <w:hyperlink w:anchor="_Toc243941013" w:history="1">
         <w:r>
           <w:rPr>
             <w:rStyle w:val="Hyperlink"/>
@@ -3016,7 +3016,7 @@
             <w:noProof/>
             <w:webHidden/>
           </w:rPr>
-          <w:instrText xml:space="preserve"> PAGEREF _Toc243939025 \h </w:instrText>
+          <w:instrText xml:space="preserve"> PAGEREF _Toc243941013 \h </w:instrText>
         </w:r>
         <w:r>
           <w:rPr>
@@ -3063,7 +3063,7 @@
           <w14:ligatures w14:val="standardContextual"/>
         </w:rPr>
       </w:pPr>
-      <w:hyperlink w:anchor="_Toc243939026" w:history="1">
+      <w:hyperlink w:anchor="_Toc243941014" w:history="1">
         <w:r>
           <w:rPr>
             <w:rStyle w:val="Hyperlink"/>
@@ -3090,7 +3090,7 @@
             <w:noProof/>
             <w:webHidden/>
           </w:rPr>
-          <w:instrText xml:space="preserve"> PAGEREF _Toc243939026 \h </w:instrText>
+          <w:instrText xml:space="preserve"> PAGEREF _Toc243941014 \h </w:instrText>
         </w:r>
         <w:r>
           <w:rPr>
@@ -3137,7 +3137,7 @@
           <w14:ligatures w14:val="standardContextual"/>
         </w:rPr>
       </w:pPr>
-      <w:hyperlink w:anchor="_Toc243939027" w:history="1">
+      <w:hyperlink w:anchor="_Toc243941015" w:history="1">
         <w:r>
           <w:rPr>
             <w:rStyle w:val="Hyperlink"/>
@@ -3164,7 +3164,7 @@
             <w:noProof/>
             <w:webHidden/>
           </w:rPr>
-          <w:instrText xml:space="preserve"> PAGEREF _Toc243939027 \h </w:instrText>
+          <w:instrText xml:space="preserve"> PAGEREF _Toc243941015 \h </w:instrText>
         </w:r>
         <w:r>
           <w:rPr>
@@ -3211,7 +3211,7 @@
           <w14:ligatures w14:val="standardContextual"/>
         </w:rPr>
       </w:pPr>
-      <w:hyperlink w:anchor="_Toc243939028" w:history="1">
+      <w:hyperlink w:anchor="_Toc243941016" w:history="1">
         <w:r>
           <w:rPr>
             <w:rStyle w:val="Hyperlink"/>
@@ -3238,7 +3238,7 @@
             <w:noProof/>
             <w:webHidden/>
           </w:rPr>
-          <w:instrText xml:space="preserve"> PAGEREF _Toc243939028 \h </w:instrText>
+          <w:instrText xml:space="preserve"> PAGEREF _Toc243941016 \h </w:instrText>
         </w:r>
         <w:r>
           <w:rPr>
@@ -3285,7 +3285,7 @@
           <w14:ligatures w14:val="standardContextual"/>
         </w:rPr>
       </w:pPr>
-      <w:hyperlink w:anchor="_Toc243939029" w:history="1">
+      <w:hyperlink w:anchor="_Toc243941017" w:history="1">
         <w:r>
           <w:rPr>
             <w:rStyle w:val="Hyperlink"/>
@@ -3312,7 +3312,7 @@
             <w:noProof/>
             <w:webHidden/>
           </w:rPr>
-          <w:instrText xml:space="preserve"> PAGEREF _Toc243939029 \h </w:instrText>
+          <w:instrText xml:space="preserve"> PAGEREF _Toc243941017 \h </w:instrText>
         </w:r>
         <w:r>
           <w:rPr>
@@ -3359,7 +3359,7 @@
           <w14:ligatures w14:val="standardContextual"/>
         </w:rPr>
       </w:pPr>
-      <w:hyperlink w:anchor="_Toc243939030" w:history="1">
+      <w:hyperlink w:anchor="_Toc243941018" w:history="1">
         <w:r>
           <w:rPr>
             <w:rStyle w:val="Hyperlink"/>
@@ -3386,7 +3386,7 @@
             <w:noProof/>
             <w:webHidden/>
           </w:rPr>
-          <w:instrText xml:space="preserve"> PAGEREF _Toc243939030 \h </w:instrText>
+          <w:instrText xml:space="preserve"> PAGEREF _Toc243941018 \h </w:instrText>
         </w:r>
         <w:r>
           <w:rPr>
@@ -3433,7 +3433,7 @@
           <w14:ligatures w14:val="standardContextual"/>
         </w:rPr>
       </w:pPr>
-      <w:hyperlink w:anchor="_Toc243939031" w:history="1">
+      <w:hyperlink w:anchor="_Toc243941019" w:history="1">
         <w:r>
           <w:rPr>
             <w:rStyle w:val="Hyperlink"/>
@@ -3460,7 +3460,7 @@
             <w:noProof/>
             <w:webHidden/>
           </w:rPr>
-          <w:instrText xml:space="preserve"> PAGEREF _Toc243939031 \h </w:instrText>
+          <w:instrText xml:space="preserve"> PAGEREF _Toc243941019 \h </w:instrText>
         </w:r>
         <w:r>
           <w:rPr>
@@ -3507,7 +3507,7 @@
           <w14:ligatures w14:val="standardContextual"/>
         </w:rPr>
       </w:pPr>
-      <w:hyperlink w:anchor="_Toc243939032" w:history="1">
+      <w:hyperlink w:anchor="_Toc243941020" w:history="1">
         <w:r>
           <w:rPr>
             <w:rStyle w:val="Hyperlink"/>
@@ -3534,7 +3534,7 @@
             <w:noProof/>
             <w:webHidden/>
           </w:rPr>
-          <w:instrText xml:space="preserve"> PAGEREF _Toc243939032 \h </w:instrText>
+          <w:instrText xml:space="preserve"> PAGEREF _Toc243941020 \h </w:instrText>
         </w:r>
         <w:r>
           <w:rPr>
@@ -3581,7 +3581,7 @@
           <w14:ligatures w14:val="standardContextual"/>
         </w:rPr>
       </w:pPr>
-      <w:hyperlink w:anchor="_Toc243939033" w:history="1">
+      <w:hyperlink w:anchor="_Toc243941021" w:history="1">
         <w:r>
           <w:rPr>
             <w:rStyle w:val="Hyperlink"/>
@@ -3608,7 +3608,7 @@
             <w:noProof/>
             <w:webHidden/>
           </w:rPr>
-          <w:instrText xml:space="preserve"> PAGEREF _Toc243939033 \h </w:instrText>
+          <w:instrText xml:space="preserve"> PAGEREF _Toc243941021 \h </w:instrText>
         </w:r>
         <w:r>
           <w:rPr>
@@ -3655,7 +3655,7 @@
           <w14:ligatures w14:val="standardContextual"/>
         </w:rPr>
       </w:pPr>
-      <w:hyperlink w:anchor="_Toc243939034" w:history="1">
+      <w:hyperlink w:anchor="_Toc243941022" w:history="1">
         <w:r>
           <w:rPr>
             <w:rStyle w:val="Hyperlink"/>
@@ -3682,7 +3682,7 @@
             <w:noProof/>
             <w:webHidden/>
           </w:rPr>
-          <w:instrText xml:space="preserve"> PAGEREF _Toc243939034 \h </w:instrText>
+          <w:instrText xml:space="preserve"> PAGEREF _Toc243941022 \h </w:instrText>
         </w:r>
         <w:r>
           <w:rPr>
@@ -3729,7 +3729,7 @@
           <w14:ligatures w14:val="standardContextual"/>
         </w:rPr>
       </w:pPr>
-      <w:hyperlink w:anchor="_Toc243939035" w:history="1">
+      <w:hyperlink w:anchor="_Toc243941023" w:history="1">
         <w:r>
           <w:rPr>
             <w:rStyle w:val="Hyperlink"/>
@@ -3756,7 +3756,7 @@
             <w:noProof/>
             <w:webHidden/>
           </w:rPr>
-          <w:instrText xml:space="preserve"> PAGEREF _Toc243939035 \h </w:instrText>
+          <w:instrText xml:space="preserve"> PAGEREF _Toc243941023 \h </w:instrText>
         </w:r>
         <w:r>
           <w:rPr>
@@ -3803,7 +3803,7 @@
           <w14:ligatures w14:val="standardContextual"/>
         </w:rPr>
       </w:pPr>
-      <w:hyperlink w:anchor="_Toc243939036" w:history="1">
+      <w:hyperlink w:anchor="_Toc243941024" w:history="1">
         <w:r>
           <w:rPr>
             <w:rStyle w:val="Hyperlink"/>
@@ -3830,7 +3830,7 @@
             <w:noProof/>
             <w:webHidden/>
           </w:rPr>
-          <w:instrText xml:space="preserve"> PAGEREF _Toc243939036 \h </w:instrText>
+          <w:instrText xml:space="preserve"> PAGEREF _Toc243941024 \h </w:instrText>
         </w:r>
         <w:r>
           <w:rPr>
@@ -3877,7 +3877,7 @@
           <w14:ligatures w14:val="standardContextual"/>
         </w:rPr>
       </w:pPr>
-      <w:hyperlink w:anchor="_Toc243939037" w:history="1">
+      <w:hyperlink w:anchor="_Toc243941025" w:history="1">
         <w:r>
           <w:rPr>
             <w:rStyle w:val="Hyperlink"/>
@@ -3904,7 +3904,7 @@
             <w:noProof/>
             <w:webHidden/>
           </w:rPr>
-          <w:instrText xml:space="preserve"> PAGEREF _Toc243939037 \h </w:instrText>
+          <w:instrText xml:space="preserve"> PAGEREF _Toc243941025 \h </w:instrText>
         </w:r>
         <w:r>
           <w:rPr>
@@ -3934,23 +3934,6 @@
           <w:fldChar w:fldCharType="end"/>
         </w:r>
       </w:hyperlink>
-    </w:p>
-    <w:p>
-      <w:pPr>
-        <w:spacing w:after="0"/>
-      </w:pPr>
-      <w:r>
-        <w:fldChar w:fldCharType="end"/>
-      </w:r>
-    </w:p>
-    <w:p>
-      <w:pPr>
-        <w:pStyle w:val="FrontHeading"/>
-      </w:pPr>
-      <w:r>
-        <w:lastRenderedPageBreak/>
-        <w:t>Lista figurilor</w:t>
-      </w:r>
     </w:p>
     <w:p>
       <w:pPr>
@@ -3968,22 +3951,13 @@
           <w14:ligatures w14:val="standardContextual"/>
         </w:rPr>
       </w:pPr>
-      <w:r>
-        <w:fldChar w:fldCharType="begin"/>
-      </w:r>
-      <w:r>
-        <w:instrText xml:space="preserve"> TOC \h \z \c "Figura" </w:instrText>
-      </w:r>
-      <w:r>
-        <w:fldChar w:fldCharType="separate"/>
-      </w:r>
-      <w:hyperlink w:anchor="_Toc243939038" w:history="1">
+      <w:hyperlink w:anchor="_Toc243941026" w:history="1">
         <w:r>
           <w:rPr>
             <w:rStyle w:val="Hyperlink"/>
             <w:noProof/>
           </w:rPr>
-          <w:t>Figura 4.1. Diagrama Entitate-Legătură extinsă (EER) a aplicației, în notația Chen; componenta EER este specializarea disjunctă și totală a entității PHOTO.</w:t>
+          <w:t>Tabelul 8.11. Macro-F1 pe grupe de ton (medii pe zece seed-uri; SCIN: cazurile de test ale fiecărui seed; Fitzpatrick17k: evaluare zero-shot pe 4.012 imagini; * = sub 30 de cazuri de test pe seed în SCIN, doar descriptiv).</w:t>
         </w:r>
         <w:r>
           <w:rPr>
@@ -4004,7 +3978,7 @@
             <w:noProof/>
             <w:webHidden/>
           </w:rPr>
-          <w:instrText xml:space="preserve"> PAGEREF _Toc243939038 \h </w:instrText>
+          <w:instrText xml:space="preserve"> PAGEREF _Toc243941026 \h </w:instrText>
         </w:r>
         <w:r>
           <w:rPr>
@@ -4024,7 +3998,7 @@
             <w:noProof/>
             <w:webHidden/>
           </w:rPr>
-          <w:t>6</w:t>
+          <w:t>35</w:t>
         </w:r>
         <w:r>
           <w:rPr>
@@ -4034,6 +4008,23 @@
           <w:fldChar w:fldCharType="end"/>
         </w:r>
       </w:hyperlink>
+    </w:p>
+    <w:p>
+      <w:pPr>
+        <w:spacing w:after="0"/>
+      </w:pPr>
+      <w:r>
+        <w:fldChar w:fldCharType="end"/>
+      </w:r>
+    </w:p>
+    <w:p>
+      <w:pPr>
+        <w:pStyle w:val="FrontHeading"/>
+      </w:pPr>
+      <w:r>
+        <w:lastRenderedPageBreak/>
+        <w:t>Lista figurilor</w:t>
+      </w:r>
     </w:p>
     <w:p>
       <w:pPr>
@@ -4051,13 +4042,22 @@
           <w14:ligatures w14:val="standardContextual"/>
         </w:rPr>
       </w:pPr>
-      <w:hyperlink w:anchor="_Toc243939039" w:history="1">
+      <w:r>
+        <w:fldChar w:fldCharType="begin"/>
+      </w:r>
+      <w:r>
+        <w:instrText xml:space="preserve"> TOC \h \z \c "Figura" </w:instrText>
+      </w:r>
+      <w:r>
+        <w:fldChar w:fldCharType="separate"/>
+      </w:r>
+      <w:hyperlink w:anchor="_Toc243941027" w:history="1">
         <w:r>
           <w:rPr>
             <w:rStyle w:val="Hyperlink"/>
             <w:noProof/>
           </w:rPr>
-          <w:t>Figura 4.2. Schema relațională obținută din modelul EER (26 de tabele în forma normală Boyce-Codd, notația crow's foot).</w:t>
+          <w:t>Figura 4.1. Diagrama Entitate-Legătură extinsă (EER) a aplicației, în notația Chen; componenta EER este specializarea disjunctă și totală a entității PHOTO.</w:t>
         </w:r>
         <w:r>
           <w:rPr>
@@ -4078,7 +4078,7 @@
             <w:noProof/>
             <w:webHidden/>
           </w:rPr>
-          <w:instrText xml:space="preserve"> PAGEREF _Toc243939039 \h </w:instrText>
+          <w:instrText xml:space="preserve"> PAGEREF _Toc243941027 \h </w:instrText>
         </w:r>
         <w:r>
           <w:rPr>
@@ -4098,7 +4098,7 @@
             <w:noProof/>
             <w:webHidden/>
           </w:rPr>
-          <w:t>7</w:t>
+          <w:t>6</w:t>
         </w:r>
         <w:r>
           <w:rPr>
@@ -4125,13 +4125,13 @@
           <w14:ligatures w14:val="standardContextual"/>
         </w:rPr>
       </w:pPr>
-      <w:hyperlink w:anchor="_Toc243939040" w:history="1">
+      <w:hyperlink w:anchor="_Toc243941028" w:history="1">
         <w:r>
           <w:rPr>
             <w:rStyle w:val="Hyperlink"/>
             <w:noProof/>
           </w:rPr>
-          <w:t>Figura 4.3. Opt ecrane ale interfeței: (a) start, (b) Today, (c) camera, (d) rezultat cu hartă Grad-CAM, (e) detaliu produs, (f) catalog, (g) rutină, (h) profil.</w:t>
+          <w:t>Figura 4.2. Schema relațională obținută din modelul EER (26 de tabele în forma normală Boyce-Codd, notația crow's foot).</w:t>
         </w:r>
         <w:r>
           <w:rPr>
@@ -4152,7 +4152,7 @@
             <w:noProof/>
             <w:webHidden/>
           </w:rPr>
-          <w:instrText xml:space="preserve"> PAGEREF _Toc243939040 \h </w:instrText>
+          <w:instrText xml:space="preserve"> PAGEREF _Toc243941028 \h </w:instrText>
         </w:r>
         <w:r>
           <w:rPr>
@@ -4172,7 +4172,7 @@
             <w:noProof/>
             <w:webHidden/>
           </w:rPr>
-          <w:t>10</w:t>
+          <w:t>7</w:t>
         </w:r>
         <w:r>
           <w:rPr>
@@ -4199,13 +4199,13 @@
           <w14:ligatures w14:val="standardContextual"/>
         </w:rPr>
       </w:pPr>
-      <w:hyperlink w:anchor="_Toc243939041" w:history="1">
+      <w:hyperlink w:anchor="_Toc243941029" w:history="1">
         <w:r>
           <w:rPr>
             <w:rStyle w:val="Hyperlink"/>
             <w:noProof/>
           </w:rPr>
-          <w:t>Figura 8.1. Macro-F1 pe testul SCIN în funcție de proporția de răspunsuri ascunse (medie și interval de 95%); linia întreruptă este modelul doar cu fotografie.</w:t>
+          <w:t>Figura 4.3. Opt ecrane ale interfeței: (a) start, (b) Today, (c) camera, (d) rezultat cu hartă Grad-CAM, (e) detaliu produs, (f) catalog, (g) rutină, (h) profil.</w:t>
         </w:r>
         <w:r>
           <w:rPr>
@@ -4226,7 +4226,7 @@
             <w:noProof/>
             <w:webHidden/>
           </w:rPr>
-          <w:instrText xml:space="preserve"> PAGEREF _Toc243939041 \h </w:instrText>
+          <w:instrText xml:space="preserve"> PAGEREF _Toc243941029 \h </w:instrText>
         </w:r>
         <w:r>
           <w:rPr>
@@ -4246,7 +4246,7 @@
             <w:noProof/>
             <w:webHidden/>
           </w:rPr>
-          <w:t>26</w:t>
+          <w:t>10</w:t>
         </w:r>
         <w:r>
           <w:rPr>
@@ -4273,13 +4273,13 @@
           <w14:ligatures w14:val="standardContextual"/>
         </w:rPr>
       </w:pPr>
-      <w:hyperlink w:anchor="_Toc243939042" w:history="1">
+      <w:hyperlink w:anchor="_Toc243941030" w:history="1">
         <w:r>
           <w:rPr>
             <w:rStyle w:val="Hyperlink"/>
             <w:noProof/>
           </w:rPr>
-          <w:t>Figura 8.2. Curba risc-acoperire pe testul SCIN: rata de eroare când se păstrează doar cele mai sigure x% dintre cazuri.</w:t>
+          <w:t>Figura 8.1. Macro-F1 pe testul SCIN în funcție de proporția de răspunsuri ascunse (medie și interval de 95%); linia întreruptă este modelul doar cu fotografie.</w:t>
         </w:r>
         <w:r>
           <w:rPr>
@@ -4300,7 +4300,7 @@
             <w:noProof/>
             <w:webHidden/>
           </w:rPr>
-          <w:instrText xml:space="preserve"> PAGEREF _Toc243939042 \h </w:instrText>
+          <w:instrText xml:space="preserve"> PAGEREF _Toc243941030 \h </w:instrText>
         </w:r>
         <w:r>
           <w:rPr>
@@ -4320,7 +4320,7 @@
             <w:noProof/>
             <w:webHidden/>
           </w:rPr>
-          <w:t>30</w:t>
+          <w:t>26</w:t>
         </w:r>
         <w:r>
           <w:rPr>
@@ -4347,13 +4347,13 @@
           <w14:ligatures w14:val="standardContextual"/>
         </w:rPr>
       </w:pPr>
-      <w:hyperlink w:anchor="_Toc243939043" w:history="1">
+      <w:hyperlink w:anchor="_Toc243941031" w:history="1">
         <w:r>
           <w:rPr>
             <w:rStyle w:val="Hyperlink"/>
             <w:noProof/>
           </w:rPr>
-          <w:t>Figura A.1. Structura de descompunere a lucrărilor (WBS) a proiectului, cu efortul estimat pe fiecare element.</w:t>
+          <w:t>Figura 8.2. Curba risc-acoperire pe testul SCIN: rata de eroare când se păstrează doar cele mai sigure x% dintre cazuri.</w:t>
         </w:r>
         <w:r>
           <w:rPr>
@@ -4374,7 +4374,7 @@
             <w:noProof/>
             <w:webHidden/>
           </w:rPr>
-          <w:instrText xml:space="preserve"> PAGEREF _Toc243939043 \h </w:instrText>
+          <w:instrText xml:space="preserve"> PAGEREF _Toc243941031 \h </w:instrText>
         </w:r>
         <w:r>
           <w:rPr>
@@ -4394,7 +4394,7 @@
             <w:noProof/>
             <w:webHidden/>
           </w:rPr>
-          <w:t>38</w:t>
+          <w:t>30</w:t>
         </w:r>
         <w:r>
           <w:rPr>
@@ -4421,13 +4421,13 @@
           <w14:ligatures w14:val="standardContextual"/>
         </w:rPr>
       </w:pPr>
-      <w:hyperlink w:anchor="_Toc243939044" w:history="1">
+      <w:hyperlink w:anchor="_Toc243941032" w:history="1">
         <w:r>
           <w:rPr>
             <w:rStyle w:val="Hyperlink"/>
             <w:noProof/>
           </w:rPr>
-          <w:t>Figura A.2. Structura de defalcare a riscurilor (RBS), cu scorul P × I al fiecărui risc și pachetele WBS afectate.</w:t>
+          <w:t>Figura A.1. Structura de descompunere a lucrărilor (WBS) a proiectului, cu efortul estimat pe fiecare element.</w:t>
         </w:r>
         <w:r>
           <w:rPr>
@@ -4448,7 +4448,7 @@
             <w:noProof/>
             <w:webHidden/>
           </w:rPr>
-          <w:instrText xml:space="preserve"> PAGEREF _Toc243939044 \h </w:instrText>
+          <w:instrText xml:space="preserve"> PAGEREF _Toc243941032 \h </w:instrText>
         </w:r>
         <w:r>
           <w:rPr>
@@ -4468,7 +4468,7 @@
             <w:noProof/>
             <w:webHidden/>
           </w:rPr>
-          <w:t>38</w:t>
+          <w:t>39</w:t>
         </w:r>
         <w:r>
           <w:rPr>
@@ -4495,12 +4495,86 @@
           <w14:ligatures w14:val="standardContextual"/>
         </w:rPr>
       </w:pPr>
-      <w:hyperlink w:anchor="_Toc243939045" w:history="1">
+      <w:hyperlink w:anchor="_Toc243941033" w:history="1">
         <w:r>
           <w:rPr>
             <w:rStyle w:val="Hyperlink"/>
             <w:noProof/>
           </w:rPr>
+          <w:t>Figura A.2. Structura de defalcare a riscurilor (RBS), cu scorul P × I al fiecărui risc și pachetele WBS afectate.</w:t>
+        </w:r>
+        <w:r>
+          <w:rPr>
+            <w:noProof/>
+            <w:webHidden/>
+          </w:rPr>
+          <w:tab/>
+        </w:r>
+        <w:r>
+          <w:rPr>
+            <w:noProof/>
+            <w:webHidden/>
+          </w:rPr>
+          <w:fldChar w:fldCharType="begin"/>
+        </w:r>
+        <w:r>
+          <w:rPr>
+            <w:noProof/>
+            <w:webHidden/>
+          </w:rPr>
+          <w:instrText xml:space="preserve"> PAGEREF _Toc243941033 \h </w:instrText>
+        </w:r>
+        <w:r>
+          <w:rPr>
+            <w:noProof/>
+            <w:webHidden/>
+          </w:rPr>
+        </w:r>
+        <w:r>
+          <w:rPr>
+            <w:noProof/>
+            <w:webHidden/>
+          </w:rPr>
+          <w:fldChar w:fldCharType="separate"/>
+        </w:r>
+        <w:r>
+          <w:rPr>
+            <w:noProof/>
+            <w:webHidden/>
+          </w:rPr>
+          <w:t>39</w:t>
+        </w:r>
+        <w:r>
+          <w:rPr>
+            <w:noProof/>
+            <w:webHidden/>
+          </w:rPr>
+          <w:fldChar w:fldCharType="end"/>
+        </w:r>
+      </w:hyperlink>
+    </w:p>
+    <w:p>
+      <w:pPr>
+        <w:pStyle w:val="TableofFigures"/>
+        <w:tabs>
+          <w:tab w:val="right" w:leader="dot" w:pos="9061"/>
+        </w:tabs>
+        <w:rPr>
+          <w:rFonts w:asciiTheme="minorHAnsi" w:eastAsiaTheme="minorEastAsia" w:hAnsiTheme="minorHAnsi" w:cstheme="minorBidi"/>
+          <w:noProof/>
+          <w:color w:val="auto"/>
+          <w:kern w:val="2"/>
+          <w:szCs w:val="24"/>
+          <w:lang w:val="en-US" w:eastAsia="en-US"/>
+          <w14:ligatures w14:val="standardContextual"/>
+        </w:rPr>
+      </w:pPr>
+      <w:hyperlink w:anchor="_Toc243941034" w:history="1">
+        <w:r>
+          <w:rPr>
+            <w:rStyle w:val="Hyperlink"/>
+            <w:noProof/>
+          </w:rPr>
           <w:t>Figura A.3. Matricea probabilitate × impact cu cele zece riscuri și ordinea lor de prioritate.</w:t>
         </w:r>
         <w:r>
@@ -4522,7 +4596,7 @@
             <w:noProof/>
             <w:webHidden/>
           </w:rPr>
-          <w:instrText xml:space="preserve"> PAGEREF _Toc243939045 \h </w:instrText>
+          <w:instrText xml:space="preserve"> PAGEREF _Toc243941034 \h </w:instrText>
         </w:r>
         <w:r>
           <w:rPr>
@@ -4542,7 +4616,7 @@
             <w:noProof/>
             <w:webHidden/>
           </w:rPr>
-          <w:t>39</w:t>
+          <w:t>40</w:t>
         </w:r>
         <w:r>
           <w:rPr>
@@ -5126,7 +5200,7 @@
       <w:pPr>
         <w:pStyle w:val="Heading1"/>
       </w:pPr>
-      <w:bookmarkStart w:id="0" w:name="_Toc243938989"/>
+      <w:bookmarkStart w:id="0" w:name="_Toc243940977"/>
       <w:r>
         <w:lastRenderedPageBreak/>
         <w:t>Capitolul 1. Introducere</w:t>
@@ -5137,7 +5211,7 @@
       <w:pPr>
         <w:pStyle w:val="Heading2"/>
       </w:pPr>
-      <w:bookmarkStart w:id="1" w:name="_Toc243938990"/>
+      <w:bookmarkStart w:id="1" w:name="_Toc243940978"/>
       <w:r>
         <w:t>1.1 Motivație</w:t>
       </w:r>
@@ -5173,7 +5247,7 @@
       <w:pPr>
         <w:pStyle w:val="Heading2"/>
       </w:pPr>
-      <w:bookmarkStart w:id="2" w:name="_Toc243938991"/>
+      <w:bookmarkStart w:id="2" w:name="_Toc243940979"/>
       <w:r>
         <w:t>1.2 Formularea problemei</w:t>
       </w:r>
@@ -5229,7 +5303,7 @@
       <w:pPr>
         <w:pStyle w:val="Heading2"/>
       </w:pPr>
-      <w:bookmarkStart w:id="3" w:name="_Toc243938992"/>
+      <w:bookmarkStart w:id="3" w:name="_Toc243940980"/>
       <w:r>
         <w:t>1.3 Obiective</w:t>
       </w:r>
@@ -5247,7 +5321,7 @@
       <w:pPr>
         <w:pStyle w:val="Heading2"/>
       </w:pPr>
-      <w:bookmarkStart w:id="4" w:name="_Toc243938993"/>
+      <w:bookmarkStart w:id="4" w:name="_Toc243940981"/>
       <w:r>
         <w:t>1.4 Contribuții</w:t>
       </w:r>
@@ -5265,7 +5339,7 @@
       <w:pPr>
         <w:pStyle w:val="Heading2"/>
       </w:pPr>
-      <w:bookmarkStart w:id="5" w:name="_Toc243938994"/>
+      <w:bookmarkStart w:id="5" w:name="_Toc243940982"/>
       <w:r>
         <w:t>1.5 Structura lucrării</w:t>
       </w:r>
@@ -5283,7 +5357,7 @@
       <w:pPr>
         <w:pStyle w:val="Heading1"/>
       </w:pPr>
-      <w:bookmarkStart w:id="6" w:name="_Toc243938995"/>
+      <w:bookmarkStart w:id="6" w:name="_Toc243940983"/>
       <w:r>
         <w:lastRenderedPageBreak/>
         <w:t>Capitolul 2. Fundamente teoretice și lucrări conexe</w:t>
@@ -5302,7 +5376,7 @@
       <w:pPr>
         <w:pStyle w:val="Heading1"/>
       </w:pPr>
-      <w:bookmarkStart w:id="7" w:name="_Toc243938996"/>
+      <w:bookmarkStart w:id="7" w:name="_Toc243940984"/>
       <w:r>
         <w:lastRenderedPageBreak/>
         <w:t>Capitolul 3. Cerințe</w:t>
@@ -5321,7 +5395,7 @@
       <w:pPr>
         <w:pStyle w:val="Heading1"/>
       </w:pPr>
-      <w:bookmarkStart w:id="8" w:name="_Toc243938997"/>
+      <w:bookmarkStart w:id="8" w:name="_Toc243940985"/>
       <w:r>
         <w:lastRenderedPageBreak/>
         <w:t>Capitolul 4. Proiectarea sistemului și arhitectura</w:t>
@@ -5340,7 +5414,7 @@
       <w:pPr>
         <w:pStyle w:val="Heading2"/>
       </w:pPr>
-      <w:bookmarkStart w:id="9" w:name="_Toc243938998"/>
+      <w:bookmarkStart w:id="9" w:name="_Toc243940986"/>
       <w:r>
         <w:t>4.1 Modelul conceptual al datelor: diagrama Entitate-Legătură extinsă (EER)</w:t>
       </w:r>
@@ -5441,7 +5515,7 @@
         <w:pStyle w:val="Caption"/>
         <w:jc w:val="center"/>
       </w:pPr>
-      <w:bookmarkStart w:id="10" w:name="_Toc243939038"/>
+      <w:bookmarkStart w:id="10" w:name="_Toc243941027"/>
       <w:r>
         <w:t>Figura 4.</w:t>
       </w:r>
@@ -5547,7 +5621,7 @@
         <w:pStyle w:val="Caption"/>
         <w:jc w:val="center"/>
       </w:pPr>
-      <w:bookmarkStart w:id="11" w:name="_Toc243939039"/>
+      <w:bookmarkStart w:id="11" w:name="_Toc243941028"/>
       <w:r>
         <w:t>Figura 4.</w:t>
       </w:r>
@@ -5624,7 +5698,7 @@
       <w:pPr>
         <w:pStyle w:val="Heading2"/>
       </w:pPr>
-      <w:bookmarkStart w:id="12" w:name="_Toc243938999"/>
+      <w:bookmarkStart w:id="12" w:name="_Toc243940987"/>
       <w:r>
         <w:t>4.2 Interfața utilizator</w:t>
       </w:r>
@@ -5689,7 +5763,7 @@
       <w:pPr>
         <w:pStyle w:val="Caption"/>
       </w:pPr>
-      <w:bookmarkStart w:id="13" w:name="_Toc243939025"/>
+      <w:bookmarkStart w:id="13" w:name="_Toc243941013"/>
       <w:r>
         <w:t>Tabelul 4.</w:t>
       </w:r>
@@ -5989,7 +6063,7 @@
         <w:pStyle w:val="Caption"/>
         <w:jc w:val="center"/>
       </w:pPr>
-      <w:bookmarkStart w:id="14" w:name="_Toc243939040"/>
+      <w:bookmarkStart w:id="14" w:name="_Toc243941029"/>
       <w:r>
         <w:t>Figura 4.</w:t>
       </w:r>
@@ -6040,7 +6114,7 @@
       <w:pPr>
         <w:pStyle w:val="Heading1"/>
       </w:pPr>
-      <w:bookmarkStart w:id="15" w:name="_Toc243939000"/>
+      <w:bookmarkStart w:id="15" w:name="_Toc243940988"/>
       <w:r>
         <w:lastRenderedPageBreak/>
         <w:t>Capitolul 5. Metodologia AI/ML</w:t>
@@ -6059,7 +6133,7 @@
       <w:pPr>
         <w:pStyle w:val="Heading2"/>
       </w:pPr>
-      <w:bookmarkStart w:id="16" w:name="_Toc243939001"/>
+      <w:bookmarkStart w:id="16" w:name="_Toc243940989"/>
       <w:r>
         <w:t>5.1 Setul de date SCIN și scalele de ton al pielii</w:t>
       </w:r>
@@ -6142,7 +6216,7 @@
       <w:pPr>
         <w:pStyle w:val="Heading2"/>
       </w:pPr>
-      <w:bookmarkStart w:id="17" w:name="_Toc243939002"/>
+      <w:bookmarkStart w:id="17" w:name="_Toc243940990"/>
       <w:r>
         <w:lastRenderedPageBreak/>
         <w:t>5.2 Auditul datelor</w:t>
@@ -6181,7 +6255,7 @@
       <w:pPr>
         <w:pStyle w:val="Caption"/>
       </w:pPr>
-      <w:bookmarkStart w:id="18" w:name="_Toc243939026"/>
+      <w:bookmarkStart w:id="18" w:name="_Toc243941014"/>
       <w:r>
         <w:t>Tabelul 5.</w:t>
       </w:r>
@@ -6742,7 +6816,7 @@
       <w:pPr>
         <w:pStyle w:val="Heading2"/>
       </w:pPr>
-      <w:bookmarkStart w:id="19" w:name="_Toc243939003"/>
+      <w:bookmarkStart w:id="19" w:name="_Toc243940991"/>
       <w:r>
         <w:t>5.3 Categoriile țintă</w:t>
       </w:r>
@@ -6784,7 +6858,7 @@
       <w:pPr>
         <w:pStyle w:val="Caption"/>
       </w:pPr>
-      <w:bookmarkStart w:id="20" w:name="_Toc243939027"/>
+      <w:bookmarkStart w:id="20" w:name="_Toc243941015"/>
       <w:r>
         <w:t>Tabelul 5.</w:t>
       </w:r>
@@ -7423,7 +7497,7 @@
       <w:pPr>
         <w:pStyle w:val="Heading2"/>
       </w:pPr>
-      <w:bookmarkStart w:id="21" w:name="_Toc243939004"/>
+      <w:bookmarkStart w:id="21" w:name="_Toc243940992"/>
       <w:r>
         <w:t>5.4 Codificarea chestionarului și masca de valori lipsă</w:t>
       </w:r>
@@ -7441,7 +7515,7 @@
       <w:pPr>
         <w:pStyle w:val="Heading2"/>
       </w:pPr>
-      <w:bookmarkStart w:id="22" w:name="_Toc243939005"/>
+      <w:bookmarkStart w:id="22" w:name="_Toc243940993"/>
       <w:r>
         <w:lastRenderedPageBreak/>
         <w:t>5.5 Împărțirea și preprocesarea datelor</w:t>
@@ -7486,7 +7560,7 @@
       <w:pPr>
         <w:pStyle w:val="Heading2"/>
       </w:pPr>
-      <w:bookmarkStart w:id="23" w:name="_Toc243939006"/>
+      <w:bookmarkStart w:id="23" w:name="_Toc243940994"/>
       <w:r>
         <w:t>5.6 Modelele</w:t>
       </w:r>
@@ -7591,7 +7665,7 @@
       <w:pPr>
         <w:pStyle w:val="Heading2"/>
       </w:pPr>
-      <w:bookmarkStart w:id="24" w:name="_Toc243939007"/>
+      <w:bookmarkStart w:id="24" w:name="_Toc243940995"/>
       <w:r>
         <w:lastRenderedPageBreak/>
         <w:t>5.7 Protocolul de evaluare</w:t>
@@ -7656,7 +7730,7 @@
       <w:pPr>
         <w:pStyle w:val="Heading2"/>
       </w:pPr>
-      <w:bookmarkStart w:id="25" w:name="_Toc243939008"/>
+      <w:bookmarkStart w:id="25" w:name="_Toc243940996"/>
       <w:r>
         <w:t>5.8 Date externe și encodere preantrenate</w:t>
       </w:r>
@@ -7727,7 +7801,7 @@
       <w:pPr>
         <w:pStyle w:val="Heading2"/>
       </w:pPr>
-      <w:bookmarkStart w:id="26" w:name="_Toc243939009"/>
+      <w:bookmarkStart w:id="26" w:name="_Toc243940997"/>
       <w:r>
         <w:lastRenderedPageBreak/>
         <w:t>5.9 Explicabilitate (Grad-CAM)</w:t>
@@ -7746,7 +7820,7 @@
       <w:pPr>
         <w:pStyle w:val="Heading1"/>
       </w:pPr>
-      <w:bookmarkStart w:id="27" w:name="_Toc243939010"/>
+      <w:bookmarkStart w:id="27" w:name="_Toc243940998"/>
       <w:r>
         <w:lastRenderedPageBreak/>
         <w:t>Capitolul 6. Implementare</w:t>
@@ -7765,7 +7839,7 @@
       <w:pPr>
         <w:pStyle w:val="Heading1"/>
       </w:pPr>
-      <w:bookmarkStart w:id="28" w:name="_Toc243939011"/>
+      <w:bookmarkStart w:id="28" w:name="_Toc243940999"/>
       <w:r>
         <w:lastRenderedPageBreak/>
         <w:t>Capitolul 7. Securitate și GDPR</w:t>
@@ -7784,7 +7858,7 @@
       <w:pPr>
         <w:pStyle w:val="Heading1"/>
       </w:pPr>
-      <w:bookmarkStart w:id="29" w:name="_Toc243939012"/>
+      <w:bookmarkStart w:id="29" w:name="_Toc243941000"/>
       <w:r>
         <w:lastRenderedPageBreak/>
         <w:t>Capitolul 8. Testare și evaluare</w:t>
@@ -7803,7 +7877,7 @@
       <w:pPr>
         <w:pStyle w:val="Heading2"/>
       </w:pPr>
-      <w:bookmarkStart w:id="30" w:name="_Toc243939013"/>
+      <w:bookmarkStart w:id="30" w:name="_Toc243941001"/>
       <w:r>
         <w:t>8.1 Aduce chestionarul un câștig? (E1)</w:t>
       </w:r>
@@ -7821,7 +7895,7 @@
       <w:pPr>
         <w:pStyle w:val="Caption"/>
       </w:pPr>
-      <w:bookmarkStart w:id="31" w:name="_Toc243939028"/>
+      <w:bookmarkStart w:id="31" w:name="_Toc243941016"/>
       <w:r>
         <w:t>Tabelul 8.</w:t>
       </w:r>
@@ -8306,7 +8380,7 @@
       <w:pPr>
         <w:pStyle w:val="Heading2"/>
       </w:pPr>
-      <w:bookmarkStart w:id="32" w:name="_Toc243939014"/>
+      <w:bookmarkStart w:id="32" w:name="_Toc243941002"/>
       <w:r>
         <w:t>8.2 De ce nu ajută chestionarul?</w:t>
       </w:r>
@@ -8348,7 +8422,7 @@
       <w:pPr>
         <w:pStyle w:val="Caption"/>
       </w:pPr>
-      <w:bookmarkStart w:id="33" w:name="_Toc243939029"/>
+      <w:bookmarkStart w:id="33" w:name="_Toc243941017"/>
       <w:r>
         <w:t>Tabelul 8.</w:t>
       </w:r>
@@ -8748,7 +8822,7 @@
       <w:pPr>
         <w:pStyle w:val="Heading2"/>
       </w:pPr>
-      <w:bookmarkStart w:id="34" w:name="_Toc243939015"/>
+      <w:bookmarkStart w:id="34" w:name="_Toc243941003"/>
       <w:r>
         <w:lastRenderedPageBreak/>
         <w:t>8.3 Răspunsuri lipsă (E2)</w:t>
@@ -8767,7 +8841,7 @@
       <w:pPr>
         <w:pStyle w:val="Caption"/>
       </w:pPr>
-      <w:bookmarkStart w:id="35" w:name="_Toc243939030"/>
+      <w:bookmarkStart w:id="35" w:name="_Toc243941018"/>
       <w:r>
         <w:t>Tabelul 8.</w:t>
       </w:r>
@@ -9242,7 +9316,7 @@
         <w:pStyle w:val="Caption"/>
         <w:jc w:val="center"/>
       </w:pPr>
-      <w:bookmarkStart w:id="36" w:name="_Toc243939041"/>
+      <w:bookmarkStart w:id="36" w:name="_Toc243941030"/>
       <w:r>
         <w:t>Figura 8.</w:t>
       </w:r>
@@ -9281,7 +9355,7 @@
       <w:pPr>
         <w:pStyle w:val="Heading2"/>
       </w:pPr>
-      <w:bookmarkStart w:id="37" w:name="_Toc243939016"/>
+      <w:bookmarkStart w:id="37" w:name="_Toc243941004"/>
       <w:r>
         <w:t>8.4 Date suplimentare și test extern (E7)</w:t>
       </w:r>
@@ -9308,7 +9382,7 @@
       <w:pPr>
         <w:pStyle w:val="Caption"/>
       </w:pPr>
-      <w:bookmarkStart w:id="38" w:name="_Toc243939031"/>
+      <w:bookmarkStart w:id="38" w:name="_Toc243941019"/>
       <w:r>
         <w:lastRenderedPageBreak/>
         <w:t>Tabelul 8.</w:t>
@@ -9585,7 +9659,7 @@
       <w:pPr>
         <w:pStyle w:val="Heading2"/>
       </w:pPr>
-      <w:bookmarkStart w:id="39" w:name="_Toc243939017"/>
+      <w:bookmarkStart w:id="39" w:name="_Toc243941005"/>
       <w:r>
         <w:t>8.5 Encodere preantrenate (E5)</w:t>
       </w:r>
@@ -9603,7 +9677,7 @@
       <w:pPr>
         <w:pStyle w:val="Caption"/>
       </w:pPr>
-      <w:bookmarkStart w:id="40" w:name="_Toc243939032"/>
+      <w:bookmarkStart w:id="40" w:name="_Toc243941020"/>
       <w:r>
         <w:lastRenderedPageBreak/>
         <w:t>Tabelul 8.</w:t>
@@ -10089,7 +10163,7 @@
       <w:pPr>
         <w:pStyle w:val="Heading2"/>
       </w:pPr>
-      <w:bookmarkStart w:id="41" w:name="_Toc243939018"/>
+      <w:bookmarkStart w:id="41" w:name="_Toc243941006"/>
       <w:r>
         <w:t>8.6 Calibrarea încrederii și abținerea (E4)</w:t>
       </w:r>
@@ -10107,7 +10181,7 @@
       <w:pPr>
         <w:pStyle w:val="Caption"/>
       </w:pPr>
-      <w:bookmarkStart w:id="42" w:name="_Toc243939033"/>
+      <w:bookmarkStart w:id="42" w:name="_Toc243941021"/>
       <w:r>
         <w:t>Tabelul 8.</w:t>
       </w:r>
@@ -10590,7 +10664,7 @@
         <w:pStyle w:val="Caption"/>
         <w:jc w:val="center"/>
       </w:pPr>
-      <w:bookmarkStart w:id="43" w:name="_Toc243939042"/>
+      <w:bookmarkStart w:id="43" w:name="_Toc243941031"/>
       <w:r>
         <w:t>Figura 8.</w:t>
       </w:r>
@@ -10629,7 +10703,7 @@
       <w:pPr>
         <w:pStyle w:val="Caption"/>
       </w:pPr>
-      <w:bookmarkStart w:id="44" w:name="_Toc243939034"/>
+      <w:bookmarkStart w:id="44" w:name="_Toc243941022"/>
       <w:r>
         <w:t>Tabelul 8.</w:t>
       </w:r>
@@ -11074,7 +11148,7 @@
       <w:pPr>
         <w:pStyle w:val="Caption"/>
       </w:pPr>
-      <w:bookmarkStart w:id="45" w:name="_Toc243939035"/>
+      <w:bookmarkStart w:id="45" w:name="_Toc243941023"/>
       <w:r>
         <w:t>Tabelul 8.</w:t>
       </w:r>
@@ -11478,7 +11552,7 @@
       <w:pPr>
         <w:pStyle w:val="Caption"/>
       </w:pPr>
-      <w:bookmarkStart w:id="46" w:name="_Toc243939036"/>
+      <w:bookmarkStart w:id="46" w:name="_Toc243941024"/>
       <w:r>
         <w:t>Tabelul 8.</w:t>
       </w:r>
@@ -11988,7 +12062,7 @@
       <w:pPr>
         <w:pStyle w:val="Heading2"/>
       </w:pPr>
-      <w:bookmarkStart w:id="47" w:name="_Toc243939019"/>
+      <w:bookmarkStart w:id="47" w:name="_Toc243941007"/>
       <w:r>
         <w:t>8.7 Explicabilitate (Grad-CAM)</w:t>
       </w:r>
@@ -12006,7 +12080,7 @@
       <w:pPr>
         <w:pStyle w:val="Caption"/>
       </w:pPr>
-      <w:bookmarkStart w:id="48" w:name="_Toc243939037"/>
+      <w:bookmarkStart w:id="48" w:name="_Toc243941025"/>
       <w:r>
         <w:t>Tabelul 8.</w:t>
       </w:r>
@@ -12290,7 +12364,7 @@
       <w:pPr>
         <w:pStyle w:val="Heading2"/>
       </w:pPr>
-      <w:bookmarkStart w:id="49" w:name="_Toc243939020"/>
+      <w:bookmarkStart w:id="49" w:name="_Toc243941008"/>
       <w:r>
         <w:t>8.8 Sinteza rezultatelor și modelul ales pentru aplicație</w:t>
       </w:r>
@@ -12310,6 +12384,599 @@
       </w:pPr>
       <w:r>
         <w:lastRenderedPageBreak/>
+        <w:t>Tabelul 8.11 reunește rezultatele pe tonuri de piele ale modelelor principale (RQ3; ml/analyze_fairness.py folosește predicțiile salvate, fără reantrenare). Pe SCIN, modelul cu imagine este cel mai slab pe eMST 4–6 (0,457). Modelul ales pentru aplicație, DINOv2 cu sondă, ridică acest grup la 0,532 (+0,075 [+0,023; +0,119], nesemnificativ după corecția Holm), iar DermLIP la 0,577 (+0,120, semnificativ). Ascunderea tuturor răspunsurilor din chestionar costă cel mult 0,023 macro-F1 în grupurile cu cel puțin 30 de cazuri de test (fuziunea FiLM pe eMST 4–6, cu un interval care include 0); singura pierdere semnificativă este de 0,015 (concatenarea cu dropout pe eMST 1–3). Grupurile eFST V–VI (circa 23 de cazuri pe seed) și eMST 7–10 (circa 11) sunt prea mici pentru concluzii și sunt raportate doar descriptiv. Pe Fitzpatrick17k, cu aceleași 4.012 imagini pentru toate seed-urile, diferența dintre cel mai bun și cel mai slab grup scade de la 0,100 (imagine) la 0,068 (DINOv2), iar DINOv2 câștigă în fiecare grup (+0,105 până la +0,153, toate semnificative); cel mai slab grup rămâne însă eFST V–VI. Modelul ales reduce deci decalajul dintre tonuri, fără să-l elimine.</w:t>
+      </w:r>
+    </w:p>
+    <w:p>
+      <w:pPr>
+        <w:pStyle w:val="Caption"/>
+      </w:pPr>
+      <w:bookmarkStart w:id="50" w:name="_Toc243941026"/>
+      <w:r>
+        <w:t>Tabelul 8.</w:t>
+      </w:r>
+      <w:r>
+        <w:fldChar w:fldCharType="begin"/>
+      </w:r>
+      <w:r>
+        <w:instrText xml:space="preserve"> SEQ Tabelul \* ARABIC </w:instrText>
+      </w:r>
+      <w:r>
+        <w:fldChar w:fldCharType="separate"/>
+      </w:r>
+      <w:r>
+        <w:rPr>
+          <w:noProof/>
+        </w:rPr>
+        <w:t>11</w:t>
+      </w:r>
+      <w:r>
+        <w:fldChar w:fldCharType="end"/>
+      </w:r>
+      <w:r>
+        <w:t>. Macro-F1 pe grupe de ton (medii pe zece seed-uri; SCIN: cazurile de test ale fiecărui seed; Fitzpatrick17k: evaluare zero-shot pe 4.012 imagini; * = sub 30 de cazuri de test pe seed în SCIN, doar descriptiv).</w:t>
+      </w:r>
+      <w:bookmarkEnd w:id="50"/>
+    </w:p>
+    <w:tbl>
+      <w:tblPr>
+        <w:tblStyle w:val="TableGrid"/>
+        <w:tblW w:w="0" w:type="auto"/>
+        <w:tblLook w:val="04A0" w:firstRow="1" w:lastRow="0" w:firstColumn="1" w:lastColumn="0" w:noHBand="0" w:noVBand="1"/>
+      </w:tblPr>
+      <w:tblGrid>
+        <w:gridCol w:w="1683"/>
+        <w:gridCol w:w="1264"/>
+        <w:gridCol w:w="1265"/>
+        <w:gridCol w:w="1265"/>
+        <w:gridCol w:w="1270"/>
+        <w:gridCol w:w="1270"/>
+        <w:gridCol w:w="1270"/>
+      </w:tblGrid>
+      <w:tr>
+        <w:tc>
+          <w:tcPr>
+            <w:tcW w:w="1296" w:type="dxa"/>
+          </w:tcPr>
+          <w:p>
+            <w:r>
+              <w:rPr>
+                <w:b/>
+              </w:rPr>
+              <w:t>Model</w:t>
+            </w:r>
+          </w:p>
+        </w:tc>
+        <w:tc>
+          <w:tcPr>
+            <w:tcW w:w="1296" w:type="dxa"/>
+          </w:tcPr>
+          <w:p>
+            <w:r>
+              <w:rPr>
+                <w:b/>
+              </w:rPr>
+              <w:t>eFST I–II</w:t>
+            </w:r>
+          </w:p>
+        </w:tc>
+        <w:tc>
+          <w:tcPr>
+            <w:tcW w:w="1296" w:type="dxa"/>
+          </w:tcPr>
+          <w:p>
+            <w:r>
+              <w:rPr>
+                <w:b/>
+              </w:rPr>
+              <w:t>eFST III–IV</w:t>
+            </w:r>
+          </w:p>
+        </w:tc>
+        <w:tc>
+          <w:tcPr>
+            <w:tcW w:w="1296" w:type="dxa"/>
+          </w:tcPr>
+          <w:p>
+            <w:r>
+              <w:rPr>
+                <w:b/>
+              </w:rPr>
+              <w:t>eFST V–VI*</w:t>
+            </w:r>
+          </w:p>
+        </w:tc>
+        <w:tc>
+          <w:tcPr>
+            <w:tcW w:w="1296" w:type="dxa"/>
+          </w:tcPr>
+          <w:p>
+            <w:r>
+              <w:rPr>
+                <w:b/>
+              </w:rPr>
+              <w:t>eMST 1–3</w:t>
+            </w:r>
+          </w:p>
+        </w:tc>
+        <w:tc>
+          <w:tcPr>
+            <w:tcW w:w="1296" w:type="dxa"/>
+          </w:tcPr>
+          <w:p>
+            <w:r>
+              <w:rPr>
+                <w:b/>
+              </w:rPr>
+              <w:t>eMST 4–6</w:t>
+            </w:r>
+          </w:p>
+        </w:tc>
+        <w:tc>
+          <w:tcPr>
+            <w:tcW w:w="1296" w:type="dxa"/>
+          </w:tcPr>
+          <w:p>
+            <w:r>
+              <w:rPr>
+                <w:b/>
+              </w:rPr>
+              <w:t>eMST 7–10*</w:t>
+            </w:r>
+          </w:p>
+        </w:tc>
+      </w:tr>
+      <w:tr>
+        <w:tc>
+          <w:tcPr>
+            <w:tcW w:w="1296" w:type="dxa"/>
+          </w:tcPr>
+          <w:p>
+            <w:r>
+              <w:t>SCIN: imagine (EfficientNet-B0)</w:t>
+            </w:r>
+          </w:p>
+        </w:tc>
+        <w:tc>
+          <w:tcPr>
+            <w:tcW w:w="1296" w:type="dxa"/>
+          </w:tcPr>
+          <w:p>
+            <w:r>
+              <w:t>0,513</w:t>
+            </w:r>
+          </w:p>
+        </w:tc>
+        <w:tc>
+          <w:tcPr>
+            <w:tcW w:w="1296" w:type="dxa"/>
+          </w:tcPr>
+          <w:p>
+            <w:r>
+              <w:t>0,553</w:t>
+            </w:r>
+          </w:p>
+        </w:tc>
+        <w:tc>
+          <w:tcPr>
+            <w:tcW w:w="1296" w:type="dxa"/>
+          </w:tcPr>
+          <w:p>
+            <w:r>
+              <w:t>0,496</w:t>
+            </w:r>
+          </w:p>
+        </w:tc>
+        <w:tc>
+          <w:tcPr>
+            <w:tcW w:w="1296" w:type="dxa"/>
+          </w:tcPr>
+          <w:p>
+            <w:r>
+              <w:t>0,534</w:t>
+            </w:r>
+          </w:p>
+        </w:tc>
+        <w:tc>
+          <w:tcPr>
+            <w:tcW w:w="1296" w:type="dxa"/>
+          </w:tcPr>
+          <w:p>
+            <w:r>
+              <w:t>0,457</w:t>
+            </w:r>
+          </w:p>
+        </w:tc>
+        <w:tc>
+          <w:tcPr>
+            <w:tcW w:w="1296" w:type="dxa"/>
+          </w:tcPr>
+          <w:p>
+            <w:r>
+              <w:t>0,678</w:t>
+            </w:r>
+          </w:p>
+        </w:tc>
+      </w:tr>
+      <w:tr>
+        <w:tc>
+          <w:tcPr>
+            <w:tcW w:w="1296" w:type="dxa"/>
+          </w:tcPr>
+          <w:p>
+            <w:r>
+              <w:t>SCIN: fuziune FiLM</w:t>
+            </w:r>
+          </w:p>
+        </w:tc>
+        <w:tc>
+          <w:tcPr>
+            <w:tcW w:w="1296" w:type="dxa"/>
+          </w:tcPr>
+          <w:p>
+            <w:r>
+              <w:t>0,500</w:t>
+            </w:r>
+          </w:p>
+        </w:tc>
+        <w:tc>
+          <w:tcPr>
+            <w:tcW w:w="1296" w:type="dxa"/>
+          </w:tcPr>
+          <w:p>
+            <w:r>
+              <w:t>0,549</w:t>
+            </w:r>
+          </w:p>
+        </w:tc>
+        <w:tc>
+          <w:tcPr>
+            <w:tcW w:w="1296" w:type="dxa"/>
+          </w:tcPr>
+          <w:p>
+            <w:r>
+              <w:t>0,572</w:t>
+            </w:r>
+          </w:p>
+        </w:tc>
+        <w:tc>
+          <w:tcPr>
+            <w:tcW w:w="1296" w:type="dxa"/>
+          </w:tcPr>
+          <w:p>
+            <w:r>
+              <w:t>0,527</w:t>
+            </w:r>
+          </w:p>
+        </w:tc>
+        <w:tc>
+          <w:tcPr>
+            <w:tcW w:w="1296" w:type="dxa"/>
+          </w:tcPr>
+          <w:p>
+            <w:r>
+              <w:t>0,494</w:t>
+            </w:r>
+          </w:p>
+        </w:tc>
+        <w:tc>
+          <w:tcPr>
+            <w:tcW w:w="1296" w:type="dxa"/>
+          </w:tcPr>
+          <w:p>
+            <w:r>
+              <w:t>0,702</w:t>
+            </w:r>
+          </w:p>
+        </w:tc>
+      </w:tr>
+      <w:tr>
+        <w:tc>
+          <w:tcPr>
+            <w:tcW w:w="1296" w:type="dxa"/>
+          </w:tcPr>
+          <w:p>
+            <w:r>
+              <w:t>SCIN: DINOv2 + sondă (aplicație)</w:t>
+            </w:r>
+          </w:p>
+        </w:tc>
+        <w:tc>
+          <w:tcPr>
+            <w:tcW w:w="1296" w:type="dxa"/>
+          </w:tcPr>
+          <w:p>
+            <w:r>
+              <w:t>0,537</w:t>
+            </w:r>
+          </w:p>
+        </w:tc>
+        <w:tc>
+          <w:tcPr>
+            <w:tcW w:w="1296" w:type="dxa"/>
+          </w:tcPr>
+          <w:p>
+            <w:r>
+              <w:t>0,560</w:t>
+            </w:r>
+          </w:p>
+        </w:tc>
+        <w:tc>
+          <w:tcPr>
+            <w:tcW w:w="1296" w:type="dxa"/>
+          </w:tcPr>
+          <w:p>
+            <w:r>
+              <w:t>0,605</w:t>
+            </w:r>
+          </w:p>
+        </w:tc>
+        <w:tc>
+          <w:tcPr>
+            <w:tcW w:w="1296" w:type="dxa"/>
+          </w:tcPr>
+          <w:p>
+            <w:r>
+              <w:t>0,564</w:t>
+            </w:r>
+          </w:p>
+        </w:tc>
+        <w:tc>
+          <w:tcPr>
+            <w:tcW w:w="1296" w:type="dxa"/>
+          </w:tcPr>
+          <w:p>
+            <w:r>
+              <w:t>0,532</w:t>
+            </w:r>
+          </w:p>
+        </w:tc>
+        <w:tc>
+          <w:tcPr>
+            <w:tcW w:w="1296" w:type="dxa"/>
+          </w:tcPr>
+          <w:p>
+            <w:r>
+              <w:t>0,659</w:t>
+            </w:r>
+          </w:p>
+        </w:tc>
+      </w:tr>
+      <w:tr>
+        <w:tc>
+          <w:tcPr>
+            <w:tcW w:w="1296" w:type="dxa"/>
+          </w:tcPr>
+          <w:p>
+            <w:r>
+              <w:t>SCIN: DermLIP + sondă</w:t>
+            </w:r>
+          </w:p>
+        </w:tc>
+        <w:tc>
+          <w:tcPr>
+            <w:tcW w:w="1296" w:type="dxa"/>
+          </w:tcPr>
+          <w:p>
+            <w:r>
+              <w:t>0,594</w:t>
+            </w:r>
+          </w:p>
+        </w:tc>
+        <w:tc>
+          <w:tcPr>
+            <w:tcW w:w="1296" w:type="dxa"/>
+          </w:tcPr>
+          <w:p>
+            <w:r>
+              <w:t>0,612</w:t>
+            </w:r>
+          </w:p>
+        </w:tc>
+        <w:tc>
+          <w:tcPr>
+            <w:tcW w:w="1296" w:type="dxa"/>
+          </w:tcPr>
+          <w:p>
+            <w:r>
+              <w:t>0,636</w:t>
+            </w:r>
+          </w:p>
+        </w:tc>
+        <w:tc>
+          <w:tcPr>
+            <w:tcW w:w="1296" w:type="dxa"/>
+          </w:tcPr>
+          <w:p>
+            <w:r>
+              <w:t>0,619</w:t>
+            </w:r>
+          </w:p>
+        </w:tc>
+        <w:tc>
+          <w:tcPr>
+            <w:tcW w:w="1296" w:type="dxa"/>
+          </w:tcPr>
+          <w:p>
+            <w:r>
+              <w:t>0,577</w:t>
+            </w:r>
+          </w:p>
+        </w:tc>
+        <w:tc>
+          <w:tcPr>
+            <w:tcW w:w="1296" w:type="dxa"/>
+          </w:tcPr>
+          <w:p>
+            <w:r>
+              <w:t>0,673</w:t>
+            </w:r>
+          </w:p>
+        </w:tc>
+      </w:tr>
+      <w:tr>
+        <w:tc>
+          <w:tcPr>
+            <w:tcW w:w="1296" w:type="dxa"/>
+          </w:tcPr>
+          <w:p>
+            <w:r>
+              <w:t xml:space="preserve">Fitzpatrick17k: </w:t>
+            </w:r>
+            <w:r>
+              <w:lastRenderedPageBreak/>
+              <w:t>imagine</w:t>
+            </w:r>
+          </w:p>
+        </w:tc>
+        <w:tc>
+          <w:tcPr>
+            <w:tcW w:w="1296" w:type="dxa"/>
+          </w:tcPr>
+          <w:p>
+            <w:r>
+              <w:lastRenderedPageBreak/>
+              <w:t>0,412</w:t>
+            </w:r>
+          </w:p>
+        </w:tc>
+        <w:tc>
+          <w:tcPr>
+            <w:tcW w:w="1296" w:type="dxa"/>
+          </w:tcPr>
+          <w:p>
+            <w:r>
+              <w:t>0,371</w:t>
+            </w:r>
+          </w:p>
+        </w:tc>
+        <w:tc>
+          <w:tcPr>
+            <w:tcW w:w="1296" w:type="dxa"/>
+          </w:tcPr>
+          <w:p>
+            <w:r>
+              <w:t>0,312</w:t>
+            </w:r>
+          </w:p>
+        </w:tc>
+        <w:tc>
+          <w:tcPr>
+            <w:tcW w:w="1296" w:type="dxa"/>
+          </w:tcPr>
+          <w:p>
+            <w:r>
+              <w:t>-</w:t>
+            </w:r>
+          </w:p>
+        </w:tc>
+        <w:tc>
+          <w:tcPr>
+            <w:tcW w:w="1296" w:type="dxa"/>
+          </w:tcPr>
+          <w:p>
+            <w:r>
+              <w:t>-</w:t>
+            </w:r>
+          </w:p>
+        </w:tc>
+        <w:tc>
+          <w:tcPr>
+            <w:tcW w:w="1296" w:type="dxa"/>
+          </w:tcPr>
+          <w:p>
+            <w:r>
+              <w:t>-</w:t>
+            </w:r>
+          </w:p>
+        </w:tc>
+      </w:tr>
+      <w:tr>
+        <w:tc>
+          <w:tcPr>
+            <w:tcW w:w="1296" w:type="dxa"/>
+          </w:tcPr>
+          <w:p>
+            <w:r>
+              <w:t>Fitzpatrick17k: DINOv2 + sondă</w:t>
+            </w:r>
+          </w:p>
+        </w:tc>
+        <w:tc>
+          <w:tcPr>
+            <w:tcW w:w="1296" w:type="dxa"/>
+          </w:tcPr>
+          <w:p>
+            <w:r>
+              <w:t>0,517</w:t>
+            </w:r>
+          </w:p>
+        </w:tc>
+        <w:tc>
+          <w:tcPr>
+            <w:tcW w:w="1296" w:type="dxa"/>
+          </w:tcPr>
+          <w:p>
+            <w:r>
+              <w:t>0,524</w:t>
+            </w:r>
+          </w:p>
+        </w:tc>
+        <w:tc>
+          <w:tcPr>
+            <w:tcW w:w="1296" w:type="dxa"/>
+          </w:tcPr>
+          <w:p>
+            <w:r>
+              <w:t>0,460</w:t>
+            </w:r>
+          </w:p>
+        </w:tc>
+        <w:tc>
+          <w:tcPr>
+            <w:tcW w:w="1296" w:type="dxa"/>
+          </w:tcPr>
+          <w:p>
+            <w:r>
+              <w:t>-</w:t>
+            </w:r>
+          </w:p>
+        </w:tc>
+        <w:tc>
+          <w:tcPr>
+            <w:tcW w:w="1296" w:type="dxa"/>
+          </w:tcPr>
+          <w:p>
+            <w:r>
+              <w:t>-</w:t>
+            </w:r>
+          </w:p>
+        </w:tc>
+        <w:tc>
+          <w:tcPr>
+            <w:tcW w:w="1296" w:type="dxa"/>
+          </w:tcPr>
+          <w:p>
+            <w:r>
+              <w:t>-</w:t>
+            </w:r>
+          </w:p>
+        </w:tc>
+      </w:tr>
+    </w:tbl>
+    <w:p>
+      <w:pPr>
+        <w:ind w:firstLine="709"/>
+      </w:pPr>
+      <w:r>
+        <w:t>Toate cele 31 de comparații principale ale lucrării sunt recalculate într-un singur loc (ml/stats_tests.py), cu aceeași procedură: diferența pe fiecare seed, intervalul t de 95% pe seed-uri, testul t pereche și testul Wilcoxon, apoi corecția Holm atât în interiorul fiecărei familii (o întrebare de cercetare sau un experiment), cât și pe toate comparațiile împreună. Cele 20 de comparații pe care scripturile experimentelor le salvaseră deja sunt reproduse (aceeași medie și aceeași valoare p). Cu corecția pe toate cele 31 de comparații rămân semnificative 12: pierderile chestionarului singur și ale sondelor pe ImageNet, câștigul sondei DermLIP (+0,084), scăderea AURC pentru cele trei sonde și diferențele dintre detectoarele din Secțiunea 8.6. Câștigul PanDerm-Large (+0,047) și pierderea antrenării combinate cu Fitzpatrick17k (−0,035) nu mai trec pragul, iar pentru DINOv2 (+0,032) intervalul pe cazuri exclude 0, dar intervalul pe seed-uri nu ([−0,018; +0,082]): avantajul lui în macro-F1 este probabil, dar nu sigur, iar alegerea lui se sprijină în principal pe calibrare, pe acuratețea selectivă și pe licență. Tabelele și figurile din acest capitol sunt generate direct din rezultatele salvate de ml/make_report_assets.py.</w:t>
+      </w:r>
+    </w:p>
+    <w:p>
+      <w:pPr>
+        <w:ind w:firstLine="709"/>
+      </w:pPr>
+      <w:r>
         <w:t>Modelul livrat în aplicație este DINOv2 ViT-B/14 cu sondă liniară, încredere calibrată și prag τ, ales pentru licența Apache 2.0, acuratețea selectivă de 0,676 și cea mai mică eroare de calibrare după scalare (0,061); modelul folosește doar fotografia, deoarece chestionarul nu a adus câștig. Din rezultatul extern rezultă două cerințe: aplicația declară permanent că nu evaluează leziuni suspecte (alunițe care se schimbă, leziuni care sângerează) și trimite direct la medic pentru ele, iar detectorul k-NN de imagini din afara domeniului (Secțiunea 8.6) oprește o parte dintre fotografiile neobișnuite, dar nu recunoaște afecțiunile necunoscute fotografiate cu telefonul, deci avertizarea și întrebările de alarmă rămân obligatorii.</w:t>
       </w:r>
     </w:p>
@@ -12317,12 +12984,12 @@
       <w:pPr>
         <w:pStyle w:val="Heading1"/>
       </w:pPr>
-      <w:bookmarkStart w:id="50" w:name="_Toc243939021"/>
+      <w:bookmarkStart w:id="51" w:name="_Toc243941009"/>
       <w:r>
         <w:lastRenderedPageBreak/>
         <w:t>Capitolul 9. Concluzii și direcții viitoare</w:t>
       </w:r>
-      <w:bookmarkEnd w:id="50"/>
+      <w:bookmarkEnd w:id="51"/>
     </w:p>
     <w:p>
       <w:r>
@@ -12336,12 +13003,12 @@
       <w:pPr>
         <w:pStyle w:val="Heading1"/>
       </w:pPr>
-      <w:bookmarkStart w:id="51" w:name="_Toc243939022"/>
+      <w:bookmarkStart w:id="52" w:name="_Toc243941010"/>
       <w:r>
         <w:lastRenderedPageBreak/>
         <w:t>Anexe</w:t>
       </w:r>
-      <w:bookmarkEnd w:id="51"/>
+      <w:bookmarkEnd w:id="52"/>
     </w:p>
     <w:p>
       <w:r>
@@ -12355,11 +13022,11 @@
       <w:pPr>
         <w:pStyle w:val="Heading2"/>
       </w:pPr>
-      <w:bookmarkStart w:id="52" w:name="_Toc243939023"/>
+      <w:bookmarkStart w:id="53" w:name="_Toc243941011"/>
       <w:r>
         <w:t>Anexa A. Planificarea proiectului: enunțul domeniului, WBS și riscurile</w:t>
       </w:r>
-      <w:bookmarkEnd w:id="52"/>
+      <w:bookmarkEnd w:id="53"/>
     </w:p>
     <w:p>
       <w:pPr>
@@ -12465,7 +13132,7 @@
         <w:pStyle w:val="Caption"/>
         <w:jc w:val="center"/>
       </w:pPr>
-      <w:bookmarkStart w:id="53" w:name="_Toc243939043"/>
+      <w:bookmarkStart w:id="54" w:name="_Toc243941032"/>
       <w:r>
         <w:lastRenderedPageBreak/>
         <w:t>Figura A.</w:t>
@@ -12491,7 +13158,7 @@
       <w:r>
         <w:t>. Structura de descompunere a lucrărilor (WBS) a proiectului, cu efortul estimat pe fiecare element.</w:t>
       </w:r>
-      <w:bookmarkEnd w:id="53"/>
+      <w:bookmarkEnd w:id="54"/>
     </w:p>
     <w:p>
       <w:pPr>
@@ -12570,7 +13237,7 @@
         <w:pStyle w:val="Caption"/>
         <w:jc w:val="center"/>
       </w:pPr>
-      <w:bookmarkStart w:id="54" w:name="_Toc243939044"/>
+      <w:bookmarkStart w:id="55" w:name="_Toc243941033"/>
       <w:r>
         <w:t>Figura A.</w:t>
       </w:r>
@@ -12595,7 +13262,7 @@
       <w:r>
         <w:t>. Structura de defalcare a riscurilor (RBS), cu scorul P × I al fiecărui risc și pachetele WBS afectate.</w:t>
       </w:r>
-      <w:bookmarkEnd w:id="54"/>
+      <w:bookmarkEnd w:id="55"/>
     </w:p>
     <w:p>
       <w:pPr>
@@ -12656,7 +13323,7 @@
         <w:pStyle w:val="Caption"/>
         <w:jc w:val="center"/>
       </w:pPr>
-      <w:bookmarkStart w:id="55" w:name="_Toc243939045"/>
+      <w:bookmarkStart w:id="56" w:name="_Toc243941034"/>
       <w:r>
         <w:t>Figura A.</w:t>
       </w:r>
@@ -12681,18 +13348,18 @@
       <w:r>
         <w:t>. Matricea probabilitate × impact cu cele zece riscuri și ordinea lor de prioritate.</w:t>
       </w:r>
-      <w:bookmarkEnd w:id="55"/>
+      <w:bookmarkEnd w:id="56"/>
     </w:p>
     <w:p>
       <w:pPr>
         <w:pStyle w:val="Heading1"/>
       </w:pPr>
-      <w:bookmarkStart w:id="56" w:name="_Toc243939024"/>
+      <w:bookmarkStart w:id="57" w:name="_Toc243941012"/>
       <w:r>
         <w:lastRenderedPageBreak/>
         <w:t>Bibliografie</w:t>
       </w:r>
-      <w:bookmarkEnd w:id="56"/>
+      <w:bookmarkEnd w:id="57"/>
     </w:p>
     <w:p>
       <w:pPr>

</xml_diff>

<commit_message>
feat(ml): export the app model to ONNX and freeze the results for reproducibility (Task 4.5)
- export_model.py: DINOv2 ViT-B/14 + linear probe of split seed 0, temperature
  and kNN out-of-scope score in one ONNX graph; T, tau and the kNN threshold
  refitted on fp32 validation features; checks against PyTorch, the stored E5
  predictions and the E4 numbers (results/export/export_check.md)
- serving.py: preprocessing and decision rule for the API without PyTorch,
  tested equal to the evaluation transform
- run_all.sh, requirements-lock.txt and results_registry.py: every reported
  number mapped to its results file, command, seeds, config and checkpoints;
  all thesis tables rebuilt and compared with the stored results
- run_e1.py --name, so the E5 tables are written directly instead of renamed
- model card; thesis section 6.1 with Table 6.1, citations renumbered by
  first appearance; journal and task plan updated
</commit_message>
<xml_diff>
--- a/docs/Teza_Licenta.docx
+++ b/docs/Teza_Licenta.docx
@@ -299,7 +299,7 @@
         </w:rPr>
         <w:fldChar w:fldCharType="separate"/>
       </w:r>
-      <w:hyperlink w:anchor="_Toc243940977" w:history="1">
+      <w:hyperlink w:anchor="_Toc244034957" w:history="1">
         <w:r>
           <w:rPr>
             <w:rStyle w:val="Hyperlink"/>
@@ -326,7 +326,7 @@
             <w:noProof/>
             <w:webHidden/>
           </w:rPr>
-          <w:instrText xml:space="preserve"> PAGEREF _Toc243940977 \h </w:instrText>
+          <w:instrText xml:space="preserve"> PAGEREF _Toc244034957 \h </w:instrText>
         </w:r>
         <w:r>
           <w:rPr>
@@ -373,7 +373,7 @@
           <w14:ligatures w14:val="standardContextual"/>
         </w:rPr>
       </w:pPr>
-      <w:hyperlink w:anchor="_Toc243940978" w:history="1">
+      <w:hyperlink w:anchor="_Toc244034958" w:history="1">
         <w:r>
           <w:rPr>
             <w:rStyle w:val="Hyperlink"/>
@@ -400,7 +400,7 @@
             <w:noProof/>
             <w:webHidden/>
           </w:rPr>
-          <w:instrText xml:space="preserve"> PAGEREF _Toc243940978 \h </w:instrText>
+          <w:instrText xml:space="preserve"> PAGEREF _Toc244034958 \h </w:instrText>
         </w:r>
         <w:r>
           <w:rPr>
@@ -447,7 +447,7 @@
           <w14:ligatures w14:val="standardContextual"/>
         </w:rPr>
       </w:pPr>
-      <w:hyperlink w:anchor="_Toc243940979" w:history="1">
+      <w:hyperlink w:anchor="_Toc244034959" w:history="1">
         <w:r>
           <w:rPr>
             <w:rStyle w:val="Hyperlink"/>
@@ -474,7 +474,7 @@
             <w:noProof/>
             <w:webHidden/>
           </w:rPr>
-          <w:instrText xml:space="preserve"> PAGEREF _Toc243940979 \h </w:instrText>
+          <w:instrText xml:space="preserve"> PAGEREF _Toc244034959 \h </w:instrText>
         </w:r>
         <w:r>
           <w:rPr>
@@ -521,7 +521,7 @@
           <w14:ligatures w14:val="standardContextual"/>
         </w:rPr>
       </w:pPr>
-      <w:hyperlink w:anchor="_Toc243940980" w:history="1">
+      <w:hyperlink w:anchor="_Toc244034960" w:history="1">
         <w:r>
           <w:rPr>
             <w:rStyle w:val="Hyperlink"/>
@@ -548,7 +548,7 @@
             <w:noProof/>
             <w:webHidden/>
           </w:rPr>
-          <w:instrText xml:space="preserve"> PAGEREF _Toc243940980 \h </w:instrText>
+          <w:instrText xml:space="preserve"> PAGEREF _Toc244034960 \h </w:instrText>
         </w:r>
         <w:r>
           <w:rPr>
@@ -595,7 +595,7 @@
           <w14:ligatures w14:val="standardContextual"/>
         </w:rPr>
       </w:pPr>
-      <w:hyperlink w:anchor="_Toc243940981" w:history="1">
+      <w:hyperlink w:anchor="_Toc244034961" w:history="1">
         <w:r>
           <w:rPr>
             <w:rStyle w:val="Hyperlink"/>
@@ -622,7 +622,7 @@
             <w:noProof/>
             <w:webHidden/>
           </w:rPr>
-          <w:instrText xml:space="preserve"> PAGEREF _Toc243940981 \h </w:instrText>
+          <w:instrText xml:space="preserve"> PAGEREF _Toc244034961 \h </w:instrText>
         </w:r>
         <w:r>
           <w:rPr>
@@ -669,7 +669,7 @@
           <w14:ligatures w14:val="standardContextual"/>
         </w:rPr>
       </w:pPr>
-      <w:hyperlink w:anchor="_Toc243940982" w:history="1">
+      <w:hyperlink w:anchor="_Toc244034962" w:history="1">
         <w:r>
           <w:rPr>
             <w:rStyle w:val="Hyperlink"/>
@@ -696,7 +696,7 @@
             <w:noProof/>
             <w:webHidden/>
           </w:rPr>
-          <w:instrText xml:space="preserve"> PAGEREF _Toc243940982 \h </w:instrText>
+          <w:instrText xml:space="preserve"> PAGEREF _Toc244034962 \h </w:instrText>
         </w:r>
         <w:r>
           <w:rPr>
@@ -743,7 +743,7 @@
           <w14:ligatures w14:val="standardContextual"/>
         </w:rPr>
       </w:pPr>
-      <w:hyperlink w:anchor="_Toc243940983" w:history="1">
+      <w:hyperlink w:anchor="_Toc244034963" w:history="1">
         <w:r>
           <w:rPr>
             <w:rStyle w:val="Hyperlink"/>
@@ -770,7 +770,7 @@
             <w:noProof/>
             <w:webHidden/>
           </w:rPr>
-          <w:instrText xml:space="preserve"> PAGEREF _Toc243940983 \h </w:instrText>
+          <w:instrText xml:space="preserve"> PAGEREF _Toc244034963 \h </w:instrText>
         </w:r>
         <w:r>
           <w:rPr>
@@ -817,7 +817,7 @@
           <w14:ligatures w14:val="standardContextual"/>
         </w:rPr>
       </w:pPr>
-      <w:hyperlink w:anchor="_Toc243940984" w:history="1">
+      <w:hyperlink w:anchor="_Toc244034964" w:history="1">
         <w:r>
           <w:rPr>
             <w:rStyle w:val="Hyperlink"/>
@@ -844,7 +844,7 @@
             <w:noProof/>
             <w:webHidden/>
           </w:rPr>
-          <w:instrText xml:space="preserve"> PAGEREF _Toc243940984 \h </w:instrText>
+          <w:instrText xml:space="preserve"> PAGEREF _Toc244034964 \h </w:instrText>
         </w:r>
         <w:r>
           <w:rPr>
@@ -891,7 +891,7 @@
           <w14:ligatures w14:val="standardContextual"/>
         </w:rPr>
       </w:pPr>
-      <w:hyperlink w:anchor="_Toc243940985" w:history="1">
+      <w:hyperlink w:anchor="_Toc244034965" w:history="1">
         <w:r>
           <w:rPr>
             <w:rStyle w:val="Hyperlink"/>
@@ -918,7 +918,7 @@
             <w:noProof/>
             <w:webHidden/>
           </w:rPr>
-          <w:instrText xml:space="preserve"> PAGEREF _Toc243940985 \h </w:instrText>
+          <w:instrText xml:space="preserve"> PAGEREF _Toc244034965 \h </w:instrText>
         </w:r>
         <w:r>
           <w:rPr>
@@ -965,7 +965,7 @@
           <w14:ligatures w14:val="standardContextual"/>
         </w:rPr>
       </w:pPr>
-      <w:hyperlink w:anchor="_Toc243940986" w:history="1">
+      <w:hyperlink w:anchor="_Toc244034966" w:history="1">
         <w:r>
           <w:rPr>
             <w:rStyle w:val="Hyperlink"/>
@@ -992,7 +992,7 @@
             <w:noProof/>
             <w:webHidden/>
           </w:rPr>
-          <w:instrText xml:space="preserve"> PAGEREF _Toc243940986 \h </w:instrText>
+          <w:instrText xml:space="preserve"> PAGEREF _Toc244034966 \h </w:instrText>
         </w:r>
         <w:r>
           <w:rPr>
@@ -1039,7 +1039,7 @@
           <w14:ligatures w14:val="standardContextual"/>
         </w:rPr>
       </w:pPr>
-      <w:hyperlink w:anchor="_Toc243940987" w:history="1">
+      <w:hyperlink w:anchor="_Toc244034967" w:history="1">
         <w:r>
           <w:rPr>
             <w:rStyle w:val="Hyperlink"/>
@@ -1066,7 +1066,7 @@
             <w:noProof/>
             <w:webHidden/>
           </w:rPr>
-          <w:instrText xml:space="preserve"> PAGEREF _Toc243940987 \h </w:instrText>
+          <w:instrText xml:space="preserve"> PAGEREF _Toc244034967 \h </w:instrText>
         </w:r>
         <w:r>
           <w:rPr>
@@ -1113,7 +1113,7 @@
           <w14:ligatures w14:val="standardContextual"/>
         </w:rPr>
       </w:pPr>
-      <w:hyperlink w:anchor="_Toc243940988" w:history="1">
+      <w:hyperlink w:anchor="_Toc244034968" w:history="1">
         <w:r>
           <w:rPr>
             <w:rStyle w:val="Hyperlink"/>
@@ -1140,7 +1140,7 @@
             <w:noProof/>
             <w:webHidden/>
           </w:rPr>
-          <w:instrText xml:space="preserve"> PAGEREF _Toc243940988 \h </w:instrText>
+          <w:instrText xml:space="preserve"> PAGEREF _Toc244034968 \h </w:instrText>
         </w:r>
         <w:r>
           <w:rPr>
@@ -1187,7 +1187,7 @@
           <w14:ligatures w14:val="standardContextual"/>
         </w:rPr>
       </w:pPr>
-      <w:hyperlink w:anchor="_Toc243940989" w:history="1">
+      <w:hyperlink w:anchor="_Toc244034969" w:history="1">
         <w:r>
           <w:rPr>
             <w:rStyle w:val="Hyperlink"/>
@@ -1214,7 +1214,7 @@
             <w:noProof/>
             <w:webHidden/>
           </w:rPr>
-          <w:instrText xml:space="preserve"> PAGEREF _Toc243940989 \h </w:instrText>
+          <w:instrText xml:space="preserve"> PAGEREF _Toc244034969 \h </w:instrText>
         </w:r>
         <w:r>
           <w:rPr>
@@ -1261,7 +1261,7 @@
           <w14:ligatures w14:val="standardContextual"/>
         </w:rPr>
       </w:pPr>
-      <w:hyperlink w:anchor="_Toc243940990" w:history="1">
+      <w:hyperlink w:anchor="_Toc244034970" w:history="1">
         <w:r>
           <w:rPr>
             <w:rStyle w:val="Hyperlink"/>
@@ -1288,7 +1288,7 @@
             <w:noProof/>
             <w:webHidden/>
           </w:rPr>
-          <w:instrText xml:space="preserve"> PAGEREF _Toc243940990 \h </w:instrText>
+          <w:instrText xml:space="preserve"> PAGEREF _Toc244034970 \h </w:instrText>
         </w:r>
         <w:r>
           <w:rPr>
@@ -1335,7 +1335,7 @@
           <w14:ligatures w14:val="standardContextual"/>
         </w:rPr>
       </w:pPr>
-      <w:hyperlink w:anchor="_Toc243940991" w:history="1">
+      <w:hyperlink w:anchor="_Toc244034971" w:history="1">
         <w:r>
           <w:rPr>
             <w:rStyle w:val="Hyperlink"/>
@@ -1362,7 +1362,7 @@
             <w:noProof/>
             <w:webHidden/>
           </w:rPr>
-          <w:instrText xml:space="preserve"> PAGEREF _Toc243940991 \h </w:instrText>
+          <w:instrText xml:space="preserve"> PAGEREF _Toc244034971 \h </w:instrText>
         </w:r>
         <w:r>
           <w:rPr>
@@ -1409,7 +1409,7 @@
           <w14:ligatures w14:val="standardContextual"/>
         </w:rPr>
       </w:pPr>
-      <w:hyperlink w:anchor="_Toc243940992" w:history="1">
+      <w:hyperlink w:anchor="_Toc244034972" w:history="1">
         <w:r>
           <w:rPr>
             <w:rStyle w:val="Hyperlink"/>
@@ -1436,7 +1436,7 @@
             <w:noProof/>
             <w:webHidden/>
           </w:rPr>
-          <w:instrText xml:space="preserve"> PAGEREF _Toc243940992 \h </w:instrText>
+          <w:instrText xml:space="preserve"> PAGEREF _Toc244034972 \h </w:instrText>
         </w:r>
         <w:r>
           <w:rPr>
@@ -1483,7 +1483,7 @@
           <w14:ligatures w14:val="standardContextual"/>
         </w:rPr>
       </w:pPr>
-      <w:hyperlink w:anchor="_Toc243940993" w:history="1">
+      <w:hyperlink w:anchor="_Toc244034973" w:history="1">
         <w:r>
           <w:rPr>
             <w:rStyle w:val="Hyperlink"/>
@@ -1510,7 +1510,7 @@
             <w:noProof/>
             <w:webHidden/>
           </w:rPr>
-          <w:instrText xml:space="preserve"> PAGEREF _Toc243940993 \h </w:instrText>
+          <w:instrText xml:space="preserve"> PAGEREF _Toc244034973 \h </w:instrText>
         </w:r>
         <w:r>
           <w:rPr>
@@ -1557,7 +1557,7 @@
           <w14:ligatures w14:val="standardContextual"/>
         </w:rPr>
       </w:pPr>
-      <w:hyperlink w:anchor="_Toc243940994" w:history="1">
+      <w:hyperlink w:anchor="_Toc244034974" w:history="1">
         <w:r>
           <w:rPr>
             <w:rStyle w:val="Hyperlink"/>
@@ -1584,7 +1584,7 @@
             <w:noProof/>
             <w:webHidden/>
           </w:rPr>
-          <w:instrText xml:space="preserve"> PAGEREF _Toc243940994 \h </w:instrText>
+          <w:instrText xml:space="preserve"> PAGEREF _Toc244034974 \h </w:instrText>
         </w:r>
         <w:r>
           <w:rPr>
@@ -1631,7 +1631,7 @@
           <w14:ligatures w14:val="standardContextual"/>
         </w:rPr>
       </w:pPr>
-      <w:hyperlink w:anchor="_Toc243940995" w:history="1">
+      <w:hyperlink w:anchor="_Toc244034975" w:history="1">
         <w:r>
           <w:rPr>
             <w:rStyle w:val="Hyperlink"/>
@@ -1658,7 +1658,7 @@
             <w:noProof/>
             <w:webHidden/>
           </w:rPr>
-          <w:instrText xml:space="preserve"> PAGEREF _Toc243940995 \h </w:instrText>
+          <w:instrText xml:space="preserve"> PAGEREF _Toc244034975 \h </w:instrText>
         </w:r>
         <w:r>
           <w:rPr>
@@ -1705,7 +1705,7 @@
           <w14:ligatures w14:val="standardContextual"/>
         </w:rPr>
       </w:pPr>
-      <w:hyperlink w:anchor="_Toc243940996" w:history="1">
+      <w:hyperlink w:anchor="_Toc244034976" w:history="1">
         <w:r>
           <w:rPr>
             <w:rStyle w:val="Hyperlink"/>
@@ -1732,7 +1732,7 @@
             <w:noProof/>
             <w:webHidden/>
           </w:rPr>
-          <w:instrText xml:space="preserve"> PAGEREF _Toc243940996 \h </w:instrText>
+          <w:instrText xml:space="preserve"> PAGEREF _Toc244034976 \h </w:instrText>
         </w:r>
         <w:r>
           <w:rPr>
@@ -1779,7 +1779,7 @@
           <w14:ligatures w14:val="standardContextual"/>
         </w:rPr>
       </w:pPr>
-      <w:hyperlink w:anchor="_Toc243940997" w:history="1">
+      <w:hyperlink w:anchor="_Toc244034977" w:history="1">
         <w:r>
           <w:rPr>
             <w:rStyle w:val="Hyperlink"/>
@@ -1806,7 +1806,7 @@
             <w:noProof/>
             <w:webHidden/>
           </w:rPr>
-          <w:instrText xml:space="preserve"> PAGEREF _Toc243940997 \h </w:instrText>
+          <w:instrText xml:space="preserve"> PAGEREF _Toc244034977 \h </w:instrText>
         </w:r>
         <w:r>
           <w:rPr>
@@ -1853,7 +1853,7 @@
           <w14:ligatures w14:val="standardContextual"/>
         </w:rPr>
       </w:pPr>
-      <w:hyperlink w:anchor="_Toc243940998" w:history="1">
+      <w:hyperlink w:anchor="_Toc244034978" w:history="1">
         <w:r>
           <w:rPr>
             <w:rStyle w:val="Hyperlink"/>
@@ -1880,7 +1880,81 @@
             <w:noProof/>
             <w:webHidden/>
           </w:rPr>
-          <w:instrText xml:space="preserve"> PAGEREF _Toc243940998 \h </w:instrText>
+          <w:instrText xml:space="preserve"> PAGEREF _Toc244034978 \h </w:instrText>
+        </w:r>
+        <w:r>
+          <w:rPr>
+            <w:noProof/>
+            <w:webHidden/>
+          </w:rPr>
+        </w:r>
+        <w:r>
+          <w:rPr>
+            <w:noProof/>
+            <w:webHidden/>
+          </w:rPr>
+          <w:fldChar w:fldCharType="separate"/>
+        </w:r>
+        <w:r>
+          <w:rPr>
+            <w:noProof/>
+            <w:webHidden/>
+          </w:rPr>
+          <w:t>20</w:t>
+        </w:r>
+        <w:r>
+          <w:rPr>
+            <w:noProof/>
+            <w:webHidden/>
+          </w:rPr>
+          <w:fldChar w:fldCharType="end"/>
+        </w:r>
+      </w:hyperlink>
+    </w:p>
+    <w:p>
+      <w:pPr>
+        <w:pStyle w:val="TOC2"/>
+        <w:tabs>
+          <w:tab w:val="right" w:leader="dot" w:pos="9061"/>
+        </w:tabs>
+        <w:rPr>
+          <w:rFonts w:asciiTheme="minorHAnsi" w:eastAsiaTheme="minorEastAsia" w:hAnsiTheme="minorHAnsi" w:cstheme="minorBidi"/>
+          <w:noProof/>
+          <w:color w:val="auto"/>
+          <w:kern w:val="2"/>
+          <w:szCs w:val="24"/>
+          <w:lang w:val="en-US" w:eastAsia="en-US"/>
+          <w14:ligatures w14:val="standardContextual"/>
+        </w:rPr>
+      </w:pPr>
+      <w:hyperlink w:anchor="_Toc244034979" w:history="1">
+        <w:r>
+          <w:rPr>
+            <w:rStyle w:val="Hyperlink"/>
+            <w:noProof/>
+          </w:rPr>
+          <w:t>6.1 Serviciul ML: modelul exportat</w:t>
+        </w:r>
+        <w:r>
+          <w:rPr>
+            <w:noProof/>
+            <w:webHidden/>
+          </w:rPr>
+          <w:tab/>
+        </w:r>
+        <w:r>
+          <w:rPr>
+            <w:noProof/>
+            <w:webHidden/>
+          </w:rPr>
+          <w:fldChar w:fldCharType="begin"/>
+        </w:r>
+        <w:r>
+          <w:rPr>
+            <w:noProof/>
+            <w:webHidden/>
+          </w:rPr>
+          <w:instrText xml:space="preserve"> PAGEREF _Toc244034979 \h </w:instrText>
         </w:r>
         <w:r>
           <w:rPr>
@@ -1927,7 +2001,7 @@
           <w14:ligatures w14:val="standardContextual"/>
         </w:rPr>
       </w:pPr>
-      <w:hyperlink w:anchor="_Toc243940999" w:history="1">
+      <w:hyperlink w:anchor="_Toc244034980" w:history="1">
         <w:r>
           <w:rPr>
             <w:rStyle w:val="Hyperlink"/>
@@ -1954,7 +2028,7 @@
             <w:noProof/>
             <w:webHidden/>
           </w:rPr>
-          <w:instrText xml:space="preserve"> PAGEREF _Toc243940999 \h </w:instrText>
+          <w:instrText xml:space="preserve"> PAGEREF _Toc244034980 \h </w:instrText>
         </w:r>
         <w:r>
           <w:rPr>
@@ -1974,7 +2048,7 @@
             <w:noProof/>
             <w:webHidden/>
           </w:rPr>
-          <w:t>21</w:t>
+          <w:t>22</w:t>
         </w:r>
         <w:r>
           <w:rPr>
@@ -2001,7 +2075,7 @@
           <w14:ligatures w14:val="standardContextual"/>
         </w:rPr>
       </w:pPr>
-      <w:hyperlink w:anchor="_Toc243941000" w:history="1">
+      <w:hyperlink w:anchor="_Toc244034981" w:history="1">
         <w:r>
           <w:rPr>
             <w:rStyle w:val="Hyperlink"/>
@@ -2028,7 +2102,7 @@
             <w:noProof/>
             <w:webHidden/>
           </w:rPr>
-          <w:instrText xml:space="preserve"> PAGEREF _Toc243941000 \h </w:instrText>
+          <w:instrText xml:space="preserve"> PAGEREF _Toc244034981 \h </w:instrText>
         </w:r>
         <w:r>
           <w:rPr>
@@ -2048,7 +2122,7 @@
             <w:noProof/>
             <w:webHidden/>
           </w:rPr>
-          <w:t>22</w:t>
+          <w:t>23</w:t>
         </w:r>
         <w:r>
           <w:rPr>
@@ -2075,7 +2149,7 @@
           <w14:ligatures w14:val="standardContextual"/>
         </w:rPr>
       </w:pPr>
-      <w:hyperlink w:anchor="_Toc243941001" w:history="1">
+      <w:hyperlink w:anchor="_Toc244034982" w:history="1">
         <w:r>
           <w:rPr>
             <w:rStyle w:val="Hyperlink"/>
@@ -2102,7 +2176,7 @@
             <w:noProof/>
             <w:webHidden/>
           </w:rPr>
-          <w:instrText xml:space="preserve"> PAGEREF _Toc243941001 \h </w:instrText>
+          <w:instrText xml:space="preserve"> PAGEREF _Toc244034982 \h </w:instrText>
         </w:r>
         <w:r>
           <w:rPr>
@@ -2122,7 +2196,7 @@
             <w:noProof/>
             <w:webHidden/>
           </w:rPr>
-          <w:t>22</w:t>
+          <w:t>23</w:t>
         </w:r>
         <w:r>
           <w:rPr>
@@ -2149,7 +2223,7 @@
           <w14:ligatures w14:val="standardContextual"/>
         </w:rPr>
       </w:pPr>
-      <w:hyperlink w:anchor="_Toc243941002" w:history="1">
+      <w:hyperlink w:anchor="_Toc244034983" w:history="1">
         <w:r>
           <w:rPr>
             <w:rStyle w:val="Hyperlink"/>
@@ -2176,7 +2250,7 @@
             <w:noProof/>
             <w:webHidden/>
           </w:rPr>
-          <w:instrText xml:space="preserve"> PAGEREF _Toc243941002 \h </w:instrText>
+          <w:instrText xml:space="preserve"> PAGEREF _Toc244034983 \h </w:instrText>
         </w:r>
         <w:r>
           <w:rPr>
@@ -2196,7 +2270,7 @@
             <w:noProof/>
             <w:webHidden/>
           </w:rPr>
-          <w:t>23</w:t>
+          <w:t>24</w:t>
         </w:r>
         <w:r>
           <w:rPr>
@@ -2223,7 +2297,7 @@
           <w14:ligatures w14:val="standardContextual"/>
         </w:rPr>
       </w:pPr>
-      <w:hyperlink w:anchor="_Toc243941003" w:history="1">
+      <w:hyperlink w:anchor="_Toc244034984" w:history="1">
         <w:r>
           <w:rPr>
             <w:rStyle w:val="Hyperlink"/>
@@ -2250,7 +2324,7 @@
             <w:noProof/>
             <w:webHidden/>
           </w:rPr>
-          <w:instrText xml:space="preserve"> PAGEREF _Toc243941003 \h </w:instrText>
+          <w:instrText xml:space="preserve"> PAGEREF _Toc244034984 \h </w:instrText>
         </w:r>
         <w:r>
           <w:rPr>
@@ -2270,7 +2344,7 @@
             <w:noProof/>
             <w:webHidden/>
           </w:rPr>
-          <w:t>25</w:t>
+          <w:t>26</w:t>
         </w:r>
         <w:r>
           <w:rPr>
@@ -2297,7 +2371,7 @@
           <w14:ligatures w14:val="standardContextual"/>
         </w:rPr>
       </w:pPr>
-      <w:hyperlink w:anchor="_Toc243941004" w:history="1">
+      <w:hyperlink w:anchor="_Toc244034985" w:history="1">
         <w:r>
           <w:rPr>
             <w:rStyle w:val="Hyperlink"/>
@@ -2324,7 +2398,7 @@
             <w:noProof/>
             <w:webHidden/>
           </w:rPr>
-          <w:instrText xml:space="preserve"> PAGEREF _Toc243941004 \h </w:instrText>
+          <w:instrText xml:space="preserve"> PAGEREF _Toc244034985 \h </w:instrText>
         </w:r>
         <w:r>
           <w:rPr>
@@ -2344,7 +2418,7 @@
             <w:noProof/>
             <w:webHidden/>
           </w:rPr>
-          <w:t>26</w:t>
+          <w:t>27</w:t>
         </w:r>
         <w:r>
           <w:rPr>
@@ -2371,7 +2445,7 @@
           <w14:ligatures w14:val="standardContextual"/>
         </w:rPr>
       </w:pPr>
-      <w:hyperlink w:anchor="_Toc243941005" w:history="1">
+      <w:hyperlink w:anchor="_Toc244034986" w:history="1">
         <w:r>
           <w:rPr>
             <w:rStyle w:val="Hyperlink"/>
@@ -2398,7 +2472,7 @@
             <w:noProof/>
             <w:webHidden/>
           </w:rPr>
-          <w:instrText xml:space="preserve"> PAGEREF _Toc243941005 \h </w:instrText>
+          <w:instrText xml:space="preserve"> PAGEREF _Toc244034986 \h </w:instrText>
         </w:r>
         <w:r>
           <w:rPr>
@@ -2418,7 +2492,7 @@
             <w:noProof/>
             <w:webHidden/>
           </w:rPr>
-          <w:t>27</w:t>
+          <w:t>28</w:t>
         </w:r>
         <w:r>
           <w:rPr>
@@ -2445,7 +2519,7 @@
           <w14:ligatures w14:val="standardContextual"/>
         </w:rPr>
       </w:pPr>
-      <w:hyperlink w:anchor="_Toc243941006" w:history="1">
+      <w:hyperlink w:anchor="_Toc244034987" w:history="1">
         <w:r>
           <w:rPr>
             <w:rStyle w:val="Hyperlink"/>
@@ -2472,7 +2546,7 @@
             <w:noProof/>
             <w:webHidden/>
           </w:rPr>
-          <w:instrText xml:space="preserve"> PAGEREF _Toc243941006 \h </w:instrText>
+          <w:instrText xml:space="preserve"> PAGEREF _Toc244034987 \h </w:instrText>
         </w:r>
         <w:r>
           <w:rPr>
@@ -2492,7 +2566,7 @@
             <w:noProof/>
             <w:webHidden/>
           </w:rPr>
-          <w:t>29</w:t>
+          <w:t>30</w:t>
         </w:r>
         <w:r>
           <w:rPr>
@@ -2519,7 +2593,7 @@
           <w14:ligatures w14:val="standardContextual"/>
         </w:rPr>
       </w:pPr>
-      <w:hyperlink w:anchor="_Toc243941007" w:history="1">
+      <w:hyperlink w:anchor="_Toc244034988" w:history="1">
         <w:r>
           <w:rPr>
             <w:rStyle w:val="Hyperlink"/>
@@ -2546,7 +2620,7 @@
             <w:noProof/>
             <w:webHidden/>
           </w:rPr>
-          <w:instrText xml:space="preserve"> PAGEREF _Toc243941007 \h </w:instrText>
+          <w:instrText xml:space="preserve"> PAGEREF _Toc244034988 \h </w:instrText>
         </w:r>
         <w:r>
           <w:rPr>
@@ -2566,7 +2640,7 @@
             <w:noProof/>
             <w:webHidden/>
           </w:rPr>
-          <w:t>34</w:t>
+          <w:t>35</w:t>
         </w:r>
         <w:r>
           <w:rPr>
@@ -2593,7 +2667,7 @@
           <w14:ligatures w14:val="standardContextual"/>
         </w:rPr>
       </w:pPr>
-      <w:hyperlink w:anchor="_Toc243941008" w:history="1">
+      <w:hyperlink w:anchor="_Toc244034989" w:history="1">
         <w:r>
           <w:rPr>
             <w:rStyle w:val="Hyperlink"/>
@@ -2620,7 +2694,7 @@
             <w:noProof/>
             <w:webHidden/>
           </w:rPr>
-          <w:instrText xml:space="preserve"> PAGEREF _Toc243941008 \h </w:instrText>
+          <w:instrText xml:space="preserve"> PAGEREF _Toc244034989 \h </w:instrText>
         </w:r>
         <w:r>
           <w:rPr>
@@ -2640,7 +2714,7 @@
             <w:noProof/>
             <w:webHidden/>
           </w:rPr>
-          <w:t>34</w:t>
+          <w:t>35</w:t>
         </w:r>
         <w:r>
           <w:rPr>
@@ -2667,7 +2741,7 @@
           <w14:ligatures w14:val="standardContextual"/>
         </w:rPr>
       </w:pPr>
-      <w:hyperlink w:anchor="_Toc243941009" w:history="1">
+      <w:hyperlink w:anchor="_Toc244034990" w:history="1">
         <w:r>
           <w:rPr>
             <w:rStyle w:val="Hyperlink"/>
@@ -2694,7 +2768,7 @@
             <w:noProof/>
             <w:webHidden/>
           </w:rPr>
-          <w:instrText xml:space="preserve"> PAGEREF _Toc243941009 \h </w:instrText>
+          <w:instrText xml:space="preserve"> PAGEREF _Toc244034990 \h </w:instrText>
         </w:r>
         <w:r>
           <w:rPr>
@@ -2714,7 +2788,7 @@
             <w:noProof/>
             <w:webHidden/>
           </w:rPr>
-          <w:t>37</w:t>
+          <w:t>38</w:t>
         </w:r>
         <w:r>
           <w:rPr>
@@ -2741,7 +2815,7 @@
           <w14:ligatures w14:val="standardContextual"/>
         </w:rPr>
       </w:pPr>
-      <w:hyperlink w:anchor="_Toc243941010" w:history="1">
+      <w:hyperlink w:anchor="_Toc244034991" w:history="1">
         <w:r>
           <w:rPr>
             <w:rStyle w:val="Hyperlink"/>
@@ -2768,7 +2842,7 @@
             <w:noProof/>
             <w:webHidden/>
           </w:rPr>
-          <w:instrText xml:space="preserve"> PAGEREF _Toc243941010 \h </w:instrText>
+          <w:instrText xml:space="preserve"> PAGEREF _Toc244034991 \h </w:instrText>
         </w:r>
         <w:r>
           <w:rPr>
@@ -2788,7 +2862,7 @@
             <w:noProof/>
             <w:webHidden/>
           </w:rPr>
-          <w:t>38</w:t>
+          <w:t>39</w:t>
         </w:r>
         <w:r>
           <w:rPr>
@@ -2815,7 +2889,7 @@
           <w14:ligatures w14:val="standardContextual"/>
         </w:rPr>
       </w:pPr>
-      <w:hyperlink w:anchor="_Toc243941011" w:history="1">
+      <w:hyperlink w:anchor="_Toc244034992" w:history="1">
         <w:r>
           <w:rPr>
             <w:rStyle w:val="Hyperlink"/>
@@ -2842,7 +2916,7 @@
             <w:noProof/>
             <w:webHidden/>
           </w:rPr>
-          <w:instrText xml:space="preserve"> PAGEREF _Toc243941011 \h </w:instrText>
+          <w:instrText xml:space="preserve"> PAGEREF _Toc244034992 \h </w:instrText>
         </w:r>
         <w:r>
           <w:rPr>
@@ -2862,7 +2936,7 @@
             <w:noProof/>
             <w:webHidden/>
           </w:rPr>
-          <w:t>38</w:t>
+          <w:t>39</w:t>
         </w:r>
         <w:r>
           <w:rPr>
@@ -2889,7 +2963,7 @@
           <w14:ligatures w14:val="standardContextual"/>
         </w:rPr>
       </w:pPr>
-      <w:hyperlink w:anchor="_Toc243941012" w:history="1">
+      <w:hyperlink w:anchor="_Toc244034993" w:history="1">
         <w:r>
           <w:rPr>
             <w:rStyle w:val="Hyperlink"/>
@@ -2916,7 +2990,7 @@
             <w:noProof/>
             <w:webHidden/>
           </w:rPr>
-          <w:instrText xml:space="preserve"> PAGEREF _Toc243941012 \h </w:instrText>
+          <w:instrText xml:space="preserve"> PAGEREF _Toc244034993 \h </w:instrText>
         </w:r>
         <w:r>
           <w:rPr>
@@ -2936,7 +3010,7 @@
             <w:noProof/>
             <w:webHidden/>
           </w:rPr>
-          <w:t>41</w:t>
+          <w:t>42</w:t>
         </w:r>
         <w:r>
           <w:rPr>
@@ -3258,7 +3332,7 @@
             <w:noProof/>
             <w:webHidden/>
           </w:rPr>
-          <w:t>22</w:t>
+          <w:t>23</w:t>
         </w:r>
         <w:r>
           <w:rPr>
@@ -3332,7 +3406,7 @@
             <w:noProof/>
             <w:webHidden/>
           </w:rPr>
-          <w:t>24</w:t>
+          <w:t>25</w:t>
         </w:r>
         <w:r>
           <w:rPr>
@@ -3406,7 +3480,7 @@
             <w:noProof/>
             <w:webHidden/>
           </w:rPr>
-          <w:t>25</w:t>
+          <w:t>26</w:t>
         </w:r>
         <w:r>
           <w:rPr>
@@ -3480,7 +3554,7 @@
             <w:noProof/>
             <w:webHidden/>
           </w:rPr>
-          <w:t>27</w:t>
+          <w:t>28</w:t>
         </w:r>
         <w:r>
           <w:rPr>
@@ -3554,7 +3628,7 @@
             <w:noProof/>
             <w:webHidden/>
           </w:rPr>
-          <w:t>28</w:t>
+          <w:t>29</w:t>
         </w:r>
         <w:r>
           <w:rPr>
@@ -3628,7 +3702,7 @@
             <w:noProof/>
             <w:webHidden/>
           </w:rPr>
-          <w:t>29</w:t>
+          <w:t>30</w:t>
         </w:r>
         <w:r>
           <w:rPr>
@@ -3702,7 +3776,7 @@
             <w:noProof/>
             <w:webHidden/>
           </w:rPr>
-          <w:t>30</w:t>
+          <w:t>31</w:t>
         </w:r>
         <w:r>
           <w:rPr>
@@ -3776,7 +3850,7 @@
             <w:noProof/>
             <w:webHidden/>
           </w:rPr>
-          <w:t>31</w:t>
+          <w:t>32</w:t>
         </w:r>
         <w:r>
           <w:rPr>
@@ -3850,7 +3924,7 @@
             <w:noProof/>
             <w:webHidden/>
           </w:rPr>
-          <w:t>33</w:t>
+          <w:t>34</w:t>
         </w:r>
         <w:r>
           <w:rPr>
@@ -3924,7 +3998,7 @@
             <w:noProof/>
             <w:webHidden/>
           </w:rPr>
-          <w:t>34</w:t>
+          <w:t>35</w:t>
         </w:r>
         <w:r>
           <w:rPr>
@@ -3998,7 +4072,7 @@
             <w:noProof/>
             <w:webHidden/>
           </w:rPr>
-          <w:t>35</w:t>
+          <w:t>36</w:t>
         </w:r>
         <w:r>
           <w:rPr>
@@ -4320,7 +4394,7 @@
             <w:noProof/>
             <w:webHidden/>
           </w:rPr>
-          <w:t>26</w:t>
+          <w:t>27</w:t>
         </w:r>
         <w:r>
           <w:rPr>
@@ -4394,7 +4468,7 @@
             <w:noProof/>
             <w:webHidden/>
           </w:rPr>
-          <w:t>30</w:t>
+          <w:t>31</w:t>
         </w:r>
         <w:r>
           <w:rPr>
@@ -4468,7 +4542,7 @@
             <w:noProof/>
             <w:webHidden/>
           </w:rPr>
-          <w:t>39</w:t>
+          <w:t>40</w:t>
         </w:r>
         <w:r>
           <w:rPr>
@@ -4542,7 +4616,7 @@
             <w:noProof/>
             <w:webHidden/>
           </w:rPr>
-          <w:t>39</w:t>
+          <w:t>40</w:t>
         </w:r>
         <w:r>
           <w:rPr>
@@ -4616,7 +4690,7 @@
             <w:noProof/>
             <w:webHidden/>
           </w:rPr>
-          <w:t>40</w:t>
+          <w:t>41</w:t>
         </w:r>
         <w:r>
           <w:rPr>
@@ -5200,7 +5274,7 @@
       <w:pPr>
         <w:pStyle w:val="Heading1"/>
       </w:pPr>
-      <w:bookmarkStart w:id="0" w:name="_Toc243940977"/>
+      <w:bookmarkStart w:id="0" w:name="_Toc244034957"/>
       <w:r>
         <w:lastRenderedPageBreak/>
         <w:t>Capitolul 1. Introducere</w:t>
@@ -5211,7 +5285,7 @@
       <w:pPr>
         <w:pStyle w:val="Heading2"/>
       </w:pPr>
-      <w:bookmarkStart w:id="1" w:name="_Toc243940978"/>
+      <w:bookmarkStart w:id="1" w:name="_Toc244034958"/>
       <w:r>
         <w:t>1.1 Motivație</w:t>
       </w:r>
@@ -5247,7 +5321,7 @@
       <w:pPr>
         <w:pStyle w:val="Heading2"/>
       </w:pPr>
-      <w:bookmarkStart w:id="2" w:name="_Toc243940979"/>
+      <w:bookmarkStart w:id="2" w:name="_Toc244034959"/>
       <w:r>
         <w:t>1.2 Formularea problemei</w:t>
       </w:r>
@@ -5303,7 +5377,7 @@
       <w:pPr>
         <w:pStyle w:val="Heading2"/>
       </w:pPr>
-      <w:bookmarkStart w:id="3" w:name="_Toc243940980"/>
+      <w:bookmarkStart w:id="3" w:name="_Toc244034960"/>
       <w:r>
         <w:t>1.3 Obiective</w:t>
       </w:r>
@@ -5321,7 +5395,7 @@
       <w:pPr>
         <w:pStyle w:val="Heading2"/>
       </w:pPr>
-      <w:bookmarkStart w:id="4" w:name="_Toc243940981"/>
+      <w:bookmarkStart w:id="4" w:name="_Toc244034961"/>
       <w:r>
         <w:t>1.4 Contribuții</w:t>
       </w:r>
@@ -5339,7 +5413,7 @@
       <w:pPr>
         <w:pStyle w:val="Heading2"/>
       </w:pPr>
-      <w:bookmarkStart w:id="5" w:name="_Toc243940982"/>
+      <w:bookmarkStart w:id="5" w:name="_Toc244034962"/>
       <w:r>
         <w:t>1.5 Structura lucrării</w:t>
       </w:r>
@@ -5357,7 +5431,7 @@
       <w:pPr>
         <w:pStyle w:val="Heading1"/>
       </w:pPr>
-      <w:bookmarkStart w:id="6" w:name="_Toc243940983"/>
+      <w:bookmarkStart w:id="6" w:name="_Toc244034963"/>
       <w:r>
         <w:lastRenderedPageBreak/>
         <w:t>Capitolul 2. Fundamente teoretice și lucrări conexe</w:t>
@@ -5376,7 +5450,7 @@
       <w:pPr>
         <w:pStyle w:val="Heading1"/>
       </w:pPr>
-      <w:bookmarkStart w:id="7" w:name="_Toc243940984"/>
+      <w:bookmarkStart w:id="7" w:name="_Toc244034964"/>
       <w:r>
         <w:lastRenderedPageBreak/>
         <w:t>Capitolul 3. Cerințe</w:t>
@@ -5395,7 +5469,7 @@
       <w:pPr>
         <w:pStyle w:val="Heading1"/>
       </w:pPr>
-      <w:bookmarkStart w:id="8" w:name="_Toc243940985"/>
+      <w:bookmarkStart w:id="8" w:name="_Toc244034965"/>
       <w:r>
         <w:lastRenderedPageBreak/>
         <w:t>Capitolul 4. Proiectarea sistemului și arhitectura</w:t>
@@ -5414,7 +5488,7 @@
       <w:pPr>
         <w:pStyle w:val="Heading2"/>
       </w:pPr>
-      <w:bookmarkStart w:id="9" w:name="_Toc243940986"/>
+      <w:bookmarkStart w:id="9" w:name="_Toc244034966"/>
       <w:r>
         <w:t>4.1 Modelul conceptual al datelor: diagrama Entitate-Legătură extinsă (EER)</w:t>
       </w:r>
@@ -5698,7 +5772,7 @@
       <w:pPr>
         <w:pStyle w:val="Heading2"/>
       </w:pPr>
-      <w:bookmarkStart w:id="12" w:name="_Toc243940987"/>
+      <w:bookmarkStart w:id="12" w:name="_Toc244034967"/>
       <w:r>
         <w:t>4.2 Interfața utilizator</w:t>
       </w:r>
@@ -6114,7 +6188,7 @@
       <w:pPr>
         <w:pStyle w:val="Heading1"/>
       </w:pPr>
-      <w:bookmarkStart w:id="15" w:name="_Toc243940988"/>
+      <w:bookmarkStart w:id="15" w:name="_Toc244034968"/>
       <w:r>
         <w:lastRenderedPageBreak/>
         <w:t>Capitolul 5. Metodologia AI/ML</w:t>
@@ -6133,7 +6207,7 @@
       <w:pPr>
         <w:pStyle w:val="Heading2"/>
       </w:pPr>
-      <w:bookmarkStart w:id="16" w:name="_Toc243940989"/>
+      <w:bookmarkStart w:id="16" w:name="_Toc244034969"/>
       <w:r>
         <w:t>5.1 Setul de date SCIN și scalele de ton al pielii</w:t>
       </w:r>
@@ -6216,7 +6290,7 @@
       <w:pPr>
         <w:pStyle w:val="Heading2"/>
       </w:pPr>
-      <w:bookmarkStart w:id="17" w:name="_Toc243940990"/>
+      <w:bookmarkStart w:id="17" w:name="_Toc244034970"/>
       <w:r>
         <w:lastRenderedPageBreak/>
         <w:t>5.2 Auditul datelor</w:t>
@@ -6816,7 +6890,7 @@
       <w:pPr>
         <w:pStyle w:val="Heading2"/>
       </w:pPr>
-      <w:bookmarkStart w:id="19" w:name="_Toc243940991"/>
+      <w:bookmarkStart w:id="19" w:name="_Toc244034971"/>
       <w:r>
         <w:t>5.3 Categoriile țintă</w:t>
       </w:r>
@@ -7497,7 +7571,7 @@
       <w:pPr>
         <w:pStyle w:val="Heading2"/>
       </w:pPr>
-      <w:bookmarkStart w:id="21" w:name="_Toc243940992"/>
+      <w:bookmarkStart w:id="21" w:name="_Toc244034972"/>
       <w:r>
         <w:t>5.4 Codificarea chestionarului și masca de valori lipsă</w:t>
       </w:r>
@@ -7515,7 +7589,7 @@
       <w:pPr>
         <w:pStyle w:val="Heading2"/>
       </w:pPr>
-      <w:bookmarkStart w:id="22" w:name="_Toc243940993"/>
+      <w:bookmarkStart w:id="22" w:name="_Toc244034973"/>
       <w:r>
         <w:lastRenderedPageBreak/>
         <w:t>5.5 Împărțirea și preprocesarea datelor</w:t>
@@ -7560,7 +7634,7 @@
       <w:pPr>
         <w:pStyle w:val="Heading2"/>
       </w:pPr>
-      <w:bookmarkStart w:id="23" w:name="_Toc243940994"/>
+      <w:bookmarkStart w:id="23" w:name="_Toc244034974"/>
       <w:r>
         <w:t>5.6 Modelele</w:t>
       </w:r>
@@ -7665,7 +7739,7 @@
       <w:pPr>
         <w:pStyle w:val="Heading2"/>
       </w:pPr>
-      <w:bookmarkStart w:id="24" w:name="_Toc243940995"/>
+      <w:bookmarkStart w:id="24" w:name="_Toc244034975"/>
       <w:r>
         <w:lastRenderedPageBreak/>
         <w:t>5.7 Protocolul de evaluare</w:t>
@@ -7730,7 +7804,7 @@
       <w:pPr>
         <w:pStyle w:val="Heading2"/>
       </w:pPr>
-      <w:bookmarkStart w:id="25" w:name="_Toc243940996"/>
+      <w:bookmarkStart w:id="25" w:name="_Toc244034976"/>
       <w:r>
         <w:t>5.8 Date externe și encodere preantrenate</w:t>
       </w:r>
@@ -7801,7 +7875,7 @@
       <w:pPr>
         <w:pStyle w:val="Heading2"/>
       </w:pPr>
-      <w:bookmarkStart w:id="26" w:name="_Toc243940997"/>
+      <w:bookmarkStart w:id="26" w:name="_Toc244034977"/>
       <w:r>
         <w:lastRenderedPageBreak/>
         <w:t>5.9 Explicabilitate (Grad-CAM)</w:t>
@@ -7820,7 +7894,7 @@
       <w:pPr>
         <w:pStyle w:val="Heading1"/>
       </w:pPr>
-      <w:bookmarkStart w:id="27" w:name="_Toc243940998"/>
+      <w:bookmarkStart w:id="27" w:name="_Toc244034978"/>
       <w:r>
         <w:lastRenderedPageBreak/>
         <w:t>Capitolul 6. Implementare</w:t>
@@ -7837,14 +7911,398 @@
     </w:p>
     <w:p>
       <w:pPr>
+        <w:pStyle w:val="Heading2"/>
+      </w:pPr>
+      <w:bookmarkStart w:id="28" w:name="_Toc244034979"/>
+      <w:r>
+        <w:t>6.1 Serviciul ML: modelul exportat</w:t>
+      </w:r>
+      <w:bookmarkEnd w:id="28"/>
+    </w:p>
+    <w:p>
+      <w:pPr>
+        <w:spacing w:line="276" w:lineRule="auto"/>
+        <w:ind w:left="567" w:hanging="567"/>
+        <w:jc w:val="left"/>
+      </w:pPr>
+      <w:r>
+        <w:t xml:space="preserve">Modelul ales în secțiunea 8.8 (DINOv2 cu sondă liniară) este pregătit pentru serviciul ML al aplicației prin </w:t>
+      </w:r>
+      <w:r>
+        <w:rPr>
+          <w:rFonts w:ascii="Courier New" w:eastAsia="Courier New" w:hAnsi="Courier New" w:cs="Courier New"/>
+          <w:sz w:val="21"/>
+        </w:rPr>
+        <w:t>ml/export_model.py</w:t>
+      </w:r>
+      <w:r>
+        <w:t>. Exportul folosește formatul ONNX (Open Neural Network Exchange) [50], un format deschis care descrie rețeaua ca un graf de operații matematice, astfel încât serviciul FastAPI o rulează cu biblioteca ONNX Runtime [51], fără PyTorch. Un singur fișier (335 MB) conține, în ordine: normalizarea pixelilor, encoderul DINOv2, standardizarea trăsăturilor, sonda liniară, împărțirea la temperatura T, funcția softmax și scorul k-NN față de cele 1.266 de cazuri de antrenare (detectorul din secțiunea 8.6). Se exportă sonda seed-ului 0, ales printr-o regulă fixată dinainte (seed-ul folosit la dezvoltare), nu după rezultatul pe test; astfel, modelul livrat este exact unul dintre modelele evaluate, iar performanța lui așteptată rămâne media pe zece seed-uri din capitolul 8.</w:t>
+      </w:r>
+    </w:p>
+    <w:p>
+      <w:pPr>
+        <w:spacing w:line="276" w:lineRule="auto"/>
+        <w:ind w:left="567" w:hanging="567"/>
+        <w:jc w:val="left"/>
+      </w:pPr>
+      <w:r>
+        <w:t xml:space="preserve">Pragurile sunt recalculate pe validare din trăsături în precizie completă (numere reale pe 32 de biți, ca în serviciu; experimentele au folosit precizia mixtă, cu o parte din calcule pe 16 biți, pentru viteză). Valorile rămân practic aceleași ca în E4 (Tabelul 6.1), iar pragul k-NN este 0,455 (5% alarme false pe validare). Modulul </w:t>
+      </w:r>
+      <w:r>
+        <w:rPr>
+          <w:rFonts w:ascii="Courier New" w:eastAsia="Courier New" w:hAnsi="Courier New" w:cs="Courier New"/>
+          <w:sz w:val="21"/>
+        </w:rPr>
+        <w:t>ml/serving.py</w:t>
+      </w:r>
+      <w:r>
+        <w:t xml:space="preserve"> aplică decizia în ordinea din secțiunea 8.6: „fotografie neobișnuită” dacă scorul k-NN depășește pragul, „incert, consultați un specialist” dacă încrederea calibrată este sub τ, altfel categoria cu încrederea ei. Preprocesarea din serviciu (micșorare la 448 px, apoi la 518 px și completare cu negru până la un pătrat) este verificată prin teste automate: produce aceeași imagine ca la evaluare.</w:t>
+      </w:r>
+    </w:p>
+    <w:p>
+      <w:pPr>
+        <w:pStyle w:val="Caption"/>
+      </w:pPr>
+      <w:r>
+        <w:t>Tabelul 6.1. Modelul exportat față de rezultatul E4 al aceluiași seed (testul SCIN al seed-ului 0, 270 de cazuri; în paranteză: cu filtrul k-NN).</w:t>
+      </w:r>
+    </w:p>
+    <w:tbl>
+      <w:tblPr>
+        <w:tblStyle w:val="TableGrid"/>
+        <w:tblW w:w="0" w:type="auto"/>
+        <w:tblLook w:val="04A0" w:firstRow="1" w:lastRow="0" w:firstColumn="1" w:lastColumn="0" w:noHBand="0" w:noVBand="1"/>
+      </w:tblPr>
+      <w:tblGrid>
+        <w:gridCol w:w="3024"/>
+        <w:gridCol w:w="3024"/>
+        <w:gridCol w:w="3024"/>
+      </w:tblGrid>
+      <w:tr>
+        <w:tc>
+          <w:tcPr>
+            <w:tcW w:w="3024" w:type="dxa"/>
+          </w:tcPr>
+          <w:p>
+            <w:r>
+              <w:rPr>
+                <w:b/>
+              </w:rPr>
+              <w:t>Mărime</w:t>
+            </w:r>
+          </w:p>
+        </w:tc>
+        <w:tc>
+          <w:tcPr>
+            <w:tcW w:w="3024" w:type="dxa"/>
+          </w:tcPr>
+          <w:p>
+            <w:r>
+              <w:rPr>
+                <w:b/>
+              </w:rPr>
+              <w:t>E4 (PyTorch)</w:t>
+            </w:r>
+          </w:p>
+        </w:tc>
+        <w:tc>
+          <w:tcPr>
+            <w:tcW w:w="3024" w:type="dxa"/>
+          </w:tcPr>
+          <w:p>
+            <w:r>
+              <w:rPr>
+                <w:b/>
+              </w:rPr>
+              <w:t>Model exportat (ONNX)</w:t>
+            </w:r>
+          </w:p>
+        </w:tc>
+      </w:tr>
+      <w:tr>
+        <w:tc>
+          <w:tcPr>
+            <w:tcW w:w="3024" w:type="dxa"/>
+          </w:tcPr>
+          <w:p>
+            <w:r>
+              <w:t>Temperatura T</w:t>
+            </w:r>
+          </w:p>
+        </w:tc>
+        <w:tc>
+          <w:tcPr>
+            <w:tcW w:w="3024" w:type="dxa"/>
+          </w:tcPr>
+          <w:p>
+            <w:r>
+              <w:t>0,857</w:t>
+            </w:r>
+          </w:p>
+        </w:tc>
+        <w:tc>
+          <w:tcPr>
+            <w:tcW w:w="3024" w:type="dxa"/>
+          </w:tcPr>
+          <w:p>
+            <w:r>
+              <w:t>0,857</w:t>
+            </w:r>
+          </w:p>
+        </w:tc>
+      </w:tr>
+      <w:tr>
+        <w:tc>
+          <w:tcPr>
+            <w:tcW w:w="3024" w:type="dxa"/>
+          </w:tcPr>
+          <w:p>
+            <w:r>
+              <w:t>Pragul τ</w:t>
+            </w:r>
+          </w:p>
+        </w:tc>
+        <w:tc>
+          <w:tcPr>
+            <w:tcW w:w="3024" w:type="dxa"/>
+          </w:tcPr>
+          <w:p>
+            <w:r>
+              <w:t>0,487</w:t>
+            </w:r>
+          </w:p>
+        </w:tc>
+        <w:tc>
+          <w:tcPr>
+            <w:tcW w:w="3024" w:type="dxa"/>
+          </w:tcPr>
+          <w:p>
+            <w:r>
+              <w:t>0,488</w:t>
+            </w:r>
+          </w:p>
+        </w:tc>
+      </w:tr>
+      <w:tr>
+        <w:tc>
+          <w:tcPr>
+            <w:tcW w:w="3024" w:type="dxa"/>
+          </w:tcPr>
+          <w:p>
+            <w:r>
+              <w:t>Acuratețe</w:t>
+            </w:r>
+          </w:p>
+        </w:tc>
+        <w:tc>
+          <w:tcPr>
+            <w:tcW w:w="3024" w:type="dxa"/>
+          </w:tcPr>
+          <w:p>
+            <w:r>
+              <w:t>65,2%</w:t>
+            </w:r>
+          </w:p>
+        </w:tc>
+        <w:tc>
+          <w:tcPr>
+            <w:tcW w:w="3024" w:type="dxa"/>
+          </w:tcPr>
+          <w:p>
+            <w:r>
+              <w:t>64,8%</w:t>
+            </w:r>
+          </w:p>
+        </w:tc>
+      </w:tr>
+      <w:tr>
+        <w:tc>
+          <w:tcPr>
+            <w:tcW w:w="3024" w:type="dxa"/>
+          </w:tcPr>
+          <w:p>
+            <w:r>
+              <w:t>Macro-F1</w:t>
+            </w:r>
+          </w:p>
+        </w:tc>
+        <w:tc>
+          <w:tcPr>
+            <w:tcW w:w="3024" w:type="dxa"/>
+          </w:tcPr>
+          <w:p>
+            <w:r>
+              <w:t>0,616</w:t>
+            </w:r>
+          </w:p>
+        </w:tc>
+        <w:tc>
+          <w:tcPr>
+            <w:tcW w:w="3024" w:type="dxa"/>
+          </w:tcPr>
+          <w:p>
+            <w:r>
+              <w:t>0,614</w:t>
+            </w:r>
+          </w:p>
+        </w:tc>
+      </w:tr>
+      <w:tr>
+        <w:tc>
+          <w:tcPr>
+            <w:tcW w:w="3024" w:type="dxa"/>
+          </w:tcPr>
+          <w:p>
+            <w:r>
+              <w:t>Acoperire</w:t>
+            </w:r>
+          </w:p>
+        </w:tc>
+        <w:tc>
+          <w:tcPr>
+            <w:tcW w:w="3024" w:type="dxa"/>
+          </w:tcPr>
+          <w:p>
+            <w:r>
+              <w:t>80,4%</w:t>
+            </w:r>
+          </w:p>
+        </w:tc>
+        <w:tc>
+          <w:tcPr>
+            <w:tcW w:w="3024" w:type="dxa"/>
+          </w:tcPr>
+          <w:p>
+            <w:r>
+              <w:t>80,0% (78,1%)</w:t>
+            </w:r>
+          </w:p>
+        </w:tc>
+      </w:tr>
+      <w:tr>
+        <w:tc>
+          <w:tcPr>
+            <w:tcW w:w="3024" w:type="dxa"/>
+          </w:tcPr>
+          <w:p>
+            <w:r>
+              <w:t>Acuratețe selectivă</w:t>
+            </w:r>
+          </w:p>
+        </w:tc>
+        <w:tc>
+          <w:tcPr>
+            <w:tcW w:w="3024" w:type="dxa"/>
+          </w:tcPr>
+          <w:p>
+            <w:r>
+              <w:t>70,5%</w:t>
+            </w:r>
+          </w:p>
+        </w:tc>
+        <w:tc>
+          <w:tcPr>
+            <w:tcW w:w="3024" w:type="dxa"/>
+          </w:tcPr>
+          <w:p>
+            <w:r>
+              <w:t>70,4% (70,1%)</w:t>
+            </w:r>
+          </w:p>
+        </w:tc>
+      </w:tr>
+    </w:tbl>
+    <w:p>
+      <w:pPr>
+        <w:spacing w:line="276" w:lineRule="auto"/>
+        <w:ind w:left="567" w:hanging="567"/>
+        <w:jc w:val="left"/>
+      </w:pPr>
+      <w:r>
+        <w:lastRenderedPageBreak/>
+        <w:t>ONNX Runtime și PyTorch dau aceleași probabilități până la 6,7 · 10⁻⁶ și aceeași categorie pentru toate cele 270 de cazuri; față de predicțiile salvate în E5, un singur caz își schimbă categoria (acord 99,6%), din cauza diferenței de precizie. Pe procesor, analiza unei fotografii durează circa 1,2 s, cu tot cu citirea imaginii. Rezultatul acestui seed (macro-F1 0,614) este peste media pe zece seed-uri (0,551) datorită împărțirii datelor, nu modelului.</w:t>
+      </w:r>
+    </w:p>
+    <w:p>
+      <w:pPr>
+        <w:spacing w:line="276" w:lineRule="auto"/>
+        <w:ind w:left="567" w:hanging="567"/>
+        <w:jc w:val="left"/>
+      </w:pPr>
+      <w:r>
+        <w:t xml:space="preserve">Pentru reproductibilitate (posibilitatea de a obține din nou aceleași rezultate), versiunile exacte ale celor 163 de pachete Python sunt fixate în </w:t>
+      </w:r>
+      <w:r>
+        <w:rPr>
+          <w:rFonts w:ascii="Courier New" w:eastAsia="Courier New" w:hAnsi="Courier New" w:cs="Courier New"/>
+          <w:sz w:val="21"/>
+        </w:rPr>
+        <w:t>ml/requirements-lock.txt</w:t>
+      </w:r>
+      <w:r>
+        <w:t xml:space="preserve">, iar </w:t>
+      </w:r>
+      <w:r>
+        <w:rPr>
+          <w:rFonts w:ascii="Courier New" w:eastAsia="Courier New" w:hAnsi="Courier New" w:cs="Courier New"/>
+          <w:sz w:val="21"/>
+        </w:rPr>
+        <w:t>ml/run_all.sh</w:t>
+      </w:r>
+      <w:r>
+        <w:t xml:space="preserve"> rulează toți pașii, de la descărcarea datelor până la export, în ordinea corectă. Registrul </w:t>
+      </w:r>
+      <w:r>
+        <w:rPr>
+          <w:rFonts w:ascii="Courier New" w:eastAsia="Courier New" w:hAnsi="Courier New" w:cs="Courier New"/>
+          <w:sz w:val="21"/>
+        </w:rPr>
+        <w:t>ml/results/results_registry.csv</w:t>
+      </w:r>
+      <w:r>
+        <w:t xml:space="preserve"> leagă fiecare dintre cele 337 de valori raportate de fișierul de rezultate din care provine, de comanda care l-a produs, de seed-uri, de configurație și de checkpoint-uri (fișierele cu ponderile salvate ale modelelor); la generare, registrul reconstruiește toate tabelele din rezultatele salvate și se oprește dacă vreunul diferă. Verificarea a găsit o singură abatere: tabelele E5 fuseseră redenumite manual după rulare; </w:t>
+      </w:r>
+      <w:r>
+        <w:rPr>
+          <w:rFonts w:ascii="Courier New" w:eastAsia="Courier New" w:hAnsi="Courier New" w:cs="Courier New"/>
+          <w:sz w:val="21"/>
+        </w:rPr>
+        <w:t>ml/run_e1.py</w:t>
+      </w:r>
+      <w:r>
+        <w:t xml:space="preserve"> are acum opțiunea </w:t>
+      </w:r>
+      <w:r>
+        <w:rPr>
+          <w:rFonts w:ascii="Courier New" w:eastAsia="Courier New" w:hAnsi="Courier New" w:cs="Courier New"/>
+          <w:sz w:val="21"/>
+        </w:rPr>
+        <w:t>--name</w:t>
+      </w:r>
+      <w:r>
+        <w:t xml:space="preserve">, iar reconstrucția dă exact aceleași valori. Fișa modelului (model card) [52], </w:t>
+      </w:r>
+      <w:r>
+        <w:rPr>
+          <w:rFonts w:ascii="Courier New" w:eastAsia="Courier New" w:hAnsi="Courier New" w:cs="Courier New"/>
+          <w:sz w:val="21"/>
+        </w:rPr>
+        <w:t>ml/model_card.md</w:t>
+      </w:r>
+      <w:r>
+        <w:t>, rezumă utilizarea prevăzută (informativă, nu dispozitiv medical), datele, rezultatele pe tonuri de piele și limitele, între care faptul că filtrul k-NN nu recunoaște afecțiunile necunoscute.</w:t>
+      </w:r>
+    </w:p>
+    <w:p>
+      <w:pPr>
         <w:pStyle w:val="Heading1"/>
       </w:pPr>
-      <w:bookmarkStart w:id="28" w:name="_Toc243940999"/>
+      <w:bookmarkStart w:id="29" w:name="_Toc244034980"/>
       <w:r>
         <w:lastRenderedPageBreak/>
         <w:t>Capitolul 7. Securitate și GDPR</w:t>
       </w:r>
-      <w:bookmarkEnd w:id="28"/>
+      <w:bookmarkEnd w:id="29"/>
     </w:p>
     <w:p>
       <w:r>
@@ -7858,12 +8316,12 @@
       <w:pPr>
         <w:pStyle w:val="Heading1"/>
       </w:pPr>
-      <w:bookmarkStart w:id="29" w:name="_Toc243941000"/>
+      <w:bookmarkStart w:id="30" w:name="_Toc244034981"/>
       <w:r>
         <w:lastRenderedPageBreak/>
         <w:t>Capitolul 8. Testare și evaluare</w:t>
       </w:r>
-      <w:bookmarkEnd w:id="29"/>
+      <w:bookmarkEnd w:id="30"/>
     </w:p>
     <w:p>
       <w:pPr>
@@ -7877,11 +8335,11 @@
       <w:pPr>
         <w:pStyle w:val="Heading2"/>
       </w:pPr>
-      <w:bookmarkStart w:id="30" w:name="_Toc243941001"/>
+      <w:bookmarkStart w:id="31" w:name="_Toc244034982"/>
       <w:r>
         <w:t>8.1 Aduce chestionarul un câștig? (E1)</w:t>
       </w:r>
-      <w:bookmarkEnd w:id="30"/>
+      <w:bookmarkEnd w:id="31"/>
     </w:p>
     <w:p>
       <w:pPr>
@@ -7895,7 +8353,7 @@
       <w:pPr>
         <w:pStyle w:val="Caption"/>
       </w:pPr>
-      <w:bookmarkStart w:id="31" w:name="_Toc243941016"/>
+      <w:bookmarkStart w:id="32" w:name="_Toc243941016"/>
       <w:r>
         <w:t>Tabelul 8.</w:t>
       </w:r>
@@ -7920,7 +8378,7 @@
       <w:r>
         <w:t>. Experimentul E1 pe testul SCIN (EfficientNet-B0, pierdere ponderată; diferențe pereche față de modelul doar cu imagine, cu interval bootstrap de 95%).</w:t>
       </w:r>
-      <w:bookmarkEnd w:id="31"/>
+      <w:bookmarkEnd w:id="32"/>
     </w:p>
     <w:tbl>
       <w:tblPr>
@@ -8380,18 +8838,18 @@
       <w:pPr>
         <w:pStyle w:val="Heading2"/>
       </w:pPr>
-      <w:bookmarkStart w:id="32" w:name="_Toc243941002"/>
+      <w:bookmarkStart w:id="33" w:name="_Toc244034983"/>
       <w:r>
         <w:t>8.2 De ce nu ajută chestionarul?</w:t>
       </w:r>
-      <w:bookmarkEnd w:id="32"/>
+      <w:bookmarkEnd w:id="33"/>
     </w:p>
     <w:p>
       <w:pPr>
         <w:ind w:firstLine="709"/>
       </w:pPr>
       <w:r>
-        <w:t>Rezultatul surprinde, deoarece dermatologii SCIN au văzut atât fotografiile, cât și răspunsurile, iar încrederea lor a crescut cu numărul de răspunsuri disponibile [50]. Trei analize pe modelele deja antrenate explică diferența. (1) Chestionarul nu este redundant: o regresie logistică pe trăsăturile modelului cu imagine prezice răspunsurile slab (AUROC [51] între 0,50 și 0,70, unde 0,5 înseamnă ghicire), deci fotografia nu „vede” zona corpului, simptomele sau durata. (2) Erorile sunt corelate: pe cazurile greșite de fotografie, modelul cu chestionar are dreptate doar în 42,6% dintre ele, față de 48,2% în general, deci cazurile grele sunt grele pentru ambele modele. (3) Semnalul este slab și concentrat: ascunderea zonei corpului scade modelul cu chestionar cu 0,125, a duratei cu 0,057 și a simptomelor cu 0,053, iar vârsta și tipul de piele declarat aproape nu contează.</w:t>
+        <w:t>Rezultatul surprinde, deoarece dermatologii SCIN au văzut atât fotografiile, cât și răspunsurile, iar încrederea lor a crescut cu numărul de răspunsuri disponibile [53]. Trei analize pe modelele deja antrenate explică diferența. (1) Chestionarul nu este redundant: o regresie logistică pe trăsăturile modelului cu imagine prezice răspunsurile slab (AUROC [54] între 0,50 și 0,70, unde 0,5 înseamnă ghicire), deci fotografia nu „vede” zona corpului, simptomele sau durata. (2) Erorile sunt corelate: pe cazurile greșite de fotografie, modelul cu chestionar are dreptate doar în 42,6% dintre ele, față de 48,2% în general, deci cazurile grele sunt grele pentru ambele modele. (3) Semnalul este slab și concentrat: ascunderea zonei corpului scade modelul cu chestionar cu 0,125, a duratei cu 0,057 și a simptomelor cu 0,053, iar vârsta și tipul de piele declarat aproape nu contează.</w:t>
       </w:r>
     </w:p>
     <w:p>
@@ -8399,7 +8857,7 @@
         <w:ind w:firstLine="709"/>
       </w:pPr>
       <w:r>
-        <w:t>Pentru a exclude o eroare de metodă, de exemplu ca ramura de imagine să învețe atât de repede încât stratul de fuziune să ignore chestionarul [52], au fost făcute două verificări suplimentare (Tabelul 8.2). Un control pozitiv, adică un test al cărui rezultat corect este cunoscut dinainte, adaugă o întrebare sintetică al cărei răspuns este categoria corectă pentru o proporție a din cazuri și o categorie aleatoare în rest. La a = 0,5, fuziunea câștigă +0,108, deci procedura poate folosi un chestionar informativ; la a = 0,3, când întrebarea are tăria chestionarului real, câștigul este doar +0,005. Stivuirea cu validare încrucișată (</w:t>
+        <w:t>Pentru a exclude o eroare de metodă, de exemplu ca ramura de imagine să învețe atât de repede încât stratul de fuziune să ignore chestionarul [55], au fost făcute două verificări suplimentare (Tabelul 8.2). Un control pozitiv, adică un test al cărui rezultat corect este cunoscut dinainte, adaugă o întrebare sintetică al cărei răspuns este categoria corectă pentru o proporție a din cazuri și o categorie aleatoare în rest. La a = 0,5, fuziunea câștigă +0,108, deci procedura poate folosi un chestionar informativ; la a = 0,3, când întrebarea are tăria chestionarului real, câștigul este doar +0,005. Stivuirea cu validare încrucișată (</w:t>
       </w:r>
       <w:r>
         <w:rPr>
@@ -8415,14 +8873,14 @@
         <w:t>stacking</w:t>
       </w:r>
       <w:r>
-        <w:t>) [53] combină printr-o regresie logistică răspunsurile cu predicțiile fotografiei făcute de modele care nu au văzut cazul respectiv; nici ea nu câștigă din chestionar (−0,005 [−0,020; +0,011]). Chiar o întrebare de aceeași tărie, dar complet independentă de fotografie, ar aduce cel mult +0,017 ± 0,036.</w:t>
+        <w:t>) [56] combină printr-o regresie logistică răspunsurile cu predicțiile fotografiei făcute de modele care nu au văzut cazul respectiv; nici ea nu câștigă din chestionar (−0,005 [−0,020; +0,011]). Chiar o întrebare de aceeași tărie, dar complet independentă de fotografie, ar aduce cel mult +0,017 ± 0,036.</w:t>
       </w:r>
     </w:p>
     <w:p>
       <w:pPr>
         <w:pStyle w:val="Caption"/>
       </w:pPr>
-      <w:bookmarkStart w:id="33" w:name="_Toc243941017"/>
+      <w:bookmarkStart w:id="34" w:name="_Toc243941017"/>
       <w:r>
         <w:t>Tabelul 8.</w:t>
       </w:r>
@@ -8447,7 +8905,7 @@
       <w:r>
         <w:t>. Verificările de metodă: control pozitiv cu întrebare sintetică și stivuire cu validare încrucișată (macro-F1 pe test).</w:t>
       </w:r>
-      <w:bookmarkEnd w:id="33"/>
+      <w:bookmarkEnd w:id="34"/>
     </w:p>
     <w:tbl>
       <w:tblPr>
@@ -8822,12 +9280,12 @@
       <w:pPr>
         <w:pStyle w:val="Heading2"/>
       </w:pPr>
-      <w:bookmarkStart w:id="34" w:name="_Toc243941003"/>
+      <w:bookmarkStart w:id="35" w:name="_Toc244034984"/>
       <w:r>
         <w:lastRenderedPageBreak/>
         <w:t>8.3 Răspunsuri lipsă (E2)</w:t>
       </w:r>
-      <w:bookmarkEnd w:id="34"/>
+      <w:bookmarkEnd w:id="35"/>
     </w:p>
     <w:p>
       <w:pPr>
@@ -8841,7 +9299,7 @@
       <w:pPr>
         <w:pStyle w:val="Caption"/>
       </w:pPr>
-      <w:bookmarkStart w:id="35" w:name="_Toc243941018"/>
+      <w:bookmarkStart w:id="36" w:name="_Toc243941018"/>
       <w:r>
         <w:t>Tabelul 8.</w:t>
       </w:r>
@@ -8866,7 +9324,7 @@
       <w:r>
         <w:t>. Macro-F1 pe test în funcție de proporția r de întrebări ascunse (fuziune prin concatenare; ultima coloană: diferența pereche cu interval de 95%).</w:t>
       </w:r>
-      <w:bookmarkEnd w:id="35"/>
+      <w:bookmarkEnd w:id="36"/>
     </w:p>
     <w:tbl>
       <w:tblPr>
@@ -9316,7 +9774,7 @@
         <w:pStyle w:val="Caption"/>
         <w:jc w:val="center"/>
       </w:pPr>
-      <w:bookmarkStart w:id="36" w:name="_Toc243941030"/>
+      <w:bookmarkStart w:id="37" w:name="_Toc243941030"/>
       <w:r>
         <w:t>Figura 8.</w:t>
       </w:r>
@@ -9341,7 +9799,7 @@
       <w:r>
         <w:t>. Macro-F1 pe testul SCIN în funcție de proporția de răspunsuri ascunse (medie și interval de 95%); linia întreruptă este modelul doar cu fotografie.</w:t>
       </w:r>
-      <w:bookmarkEnd w:id="36"/>
+      <w:bookmarkEnd w:id="37"/>
     </w:p>
     <w:p>
       <w:pPr>
@@ -9355,11 +9813,11 @@
       <w:pPr>
         <w:pStyle w:val="Heading2"/>
       </w:pPr>
-      <w:bookmarkStart w:id="37" w:name="_Toc243941004"/>
+      <w:bookmarkStart w:id="38" w:name="_Toc244034985"/>
       <w:r>
         <w:t>8.4 Date suplimentare și test extern (E7)</w:t>
       </w:r>
-      <w:bookmarkEnd w:id="37"/>
+      <w:bookmarkEnd w:id="38"/>
     </w:p>
     <w:p>
       <w:pPr>
@@ -9382,7 +9840,7 @@
       <w:pPr>
         <w:pStyle w:val="Caption"/>
       </w:pPr>
-      <w:bookmarkStart w:id="38" w:name="_Toc243941019"/>
+      <w:bookmarkStart w:id="39" w:name="_Toc243941019"/>
       <w:r>
         <w:lastRenderedPageBreak/>
         <w:t>Tabelul 8.</w:t>
@@ -9408,7 +9866,7 @@
       <w:r>
         <w:t>. Experimentul E7: antrenarea cu imagini Fitzpatrick17k (diferență pereche față de modelul doar cu fotografie, interval de 95% și seed-uri mai bune).</w:t>
       </w:r>
-      <w:bookmarkEnd w:id="38"/>
+      <w:bookmarkEnd w:id="39"/>
     </w:p>
     <w:tbl>
       <w:tblPr>
@@ -9659,11 +10117,11 @@
       <w:pPr>
         <w:pStyle w:val="Heading2"/>
       </w:pPr>
-      <w:bookmarkStart w:id="39" w:name="_Toc243941005"/>
+      <w:bookmarkStart w:id="40" w:name="_Toc244034986"/>
       <w:r>
         <w:t>8.5 Encodere preantrenate (E5)</w:t>
       </w:r>
-      <w:bookmarkEnd w:id="39"/>
+      <w:bookmarkEnd w:id="40"/>
     </w:p>
     <w:p>
       <w:pPr>
@@ -9677,7 +10135,7 @@
       <w:pPr>
         <w:pStyle w:val="Caption"/>
       </w:pPr>
-      <w:bookmarkStart w:id="40" w:name="_Toc243941020"/>
+      <w:bookmarkStart w:id="41" w:name="_Toc243941020"/>
       <w:r>
         <w:lastRenderedPageBreak/>
         <w:t>Tabelul 8.</w:t>
@@ -9703,7 +10161,7 @@
       <w:r>
         <w:t>. Experimentul E5: encodere înghețate cu sondă liniară pe testul SCIN (diferență pereche față de modelul ajustat fin).</w:t>
       </w:r>
-      <w:bookmarkEnd w:id="40"/>
+      <w:bookmarkEnd w:id="41"/>
     </w:p>
     <w:tbl>
       <w:tblPr>
@@ -10163,11 +10621,11 @@
       <w:pPr>
         <w:pStyle w:val="Heading2"/>
       </w:pPr>
-      <w:bookmarkStart w:id="41" w:name="_Toc243941006"/>
+      <w:bookmarkStart w:id="42" w:name="_Toc244034987"/>
       <w:r>
         <w:t>8.6 Calibrarea încrederii și abținerea (E4)</w:t>
       </w:r>
-      <w:bookmarkEnd w:id="41"/>
+      <w:bookmarkEnd w:id="42"/>
     </w:p>
     <w:p>
       <w:pPr>
@@ -10181,7 +10639,7 @@
       <w:pPr>
         <w:pStyle w:val="Caption"/>
       </w:pPr>
-      <w:bookmarkStart w:id="42" w:name="_Toc243941021"/>
+      <w:bookmarkStart w:id="43" w:name="_Toc243941021"/>
       <w:r>
         <w:t>Tabelul 8.</w:t>
       </w:r>
@@ -10206,7 +10664,7 @@
       <w:r>
         <w:t>. Calibrare și predicție selectivă pe testul SCIN (acoperire țintă 80%, τ ales pe validare).</w:t>
       </w:r>
-      <w:bookmarkEnd w:id="42"/>
+      <w:bookmarkEnd w:id="43"/>
     </w:p>
     <w:tbl>
       <w:tblPr>
@@ -10664,7 +11122,7 @@
         <w:pStyle w:val="Caption"/>
         <w:jc w:val="center"/>
       </w:pPr>
-      <w:bookmarkStart w:id="43" w:name="_Toc243941031"/>
+      <w:bookmarkStart w:id="44" w:name="_Toc243941031"/>
       <w:r>
         <w:t>Figura 8.</w:t>
       </w:r>
@@ -10689,7 +11147,7 @@
       <w:r>
         <w:t>. Curba risc-acoperire pe testul SCIN: rata de eroare când se păstrează doar cele mai sigure x% dintre cazuri.</w:t>
       </w:r>
-      <w:bookmarkEnd w:id="43"/>
+      <w:bookmarkEnd w:id="44"/>
     </w:p>
     <w:p>
       <w:pPr>
@@ -10703,7 +11161,7 @@
       <w:pPr>
         <w:pStyle w:val="Caption"/>
       </w:pPr>
-      <w:bookmarkStart w:id="44" w:name="_Toc243941022"/>
+      <w:bookmarkStart w:id="45" w:name="_Toc243941022"/>
       <w:r>
         <w:t>Tabelul 8.</w:t>
       </w:r>
@@ -10728,7 +11186,7 @@
       <w:r>
         <w:t>. Abținerea pe tonuri de piele pe testul SCIN (diferențe în puncte procentuale, interval bootstrap de 95%).</w:t>
       </w:r>
-      <w:bookmarkEnd w:id="44"/>
+      <w:bookmarkEnd w:id="45"/>
     </w:p>
     <w:tbl>
       <w:tblPr>
@@ -11148,7 +11606,7 @@
       <w:pPr>
         <w:pStyle w:val="Caption"/>
       </w:pPr>
-      <w:bookmarkStart w:id="45" w:name="_Toc243941023"/>
+      <w:bookmarkStart w:id="46" w:name="_Toc243941023"/>
       <w:r>
         <w:t>Tabelul 8.</w:t>
       </w:r>
@@ -11173,7 +11631,7 @@
       <w:r>
         <w:t>. Modelele candidate pe seturile externe, cu T și τ din SCIN (în afara domeniului și pentru leziunile maligne, abținerea este răspunsul corect).</w:t>
       </w:r>
-      <w:bookmarkEnd w:id="45"/>
+      <w:bookmarkEnd w:id="46"/>
     </w:p>
     <w:tbl>
       <w:tblPr>
@@ -11533,7 +11991,7 @@
         <w:ind w:firstLine="709"/>
       </w:pPr>
       <w:r>
-        <w:t>Pentru a corecta această limită a fost testat un detector de imagini din afara domeniului (out-of-distribution detection; ml/ood_detect.py): un scor care spune cât de diferită este o fotografie de toate cazurile de antrenare, calculat înainte ca modelul să aleagă o categorie. Pe trăsăturile DINOv2 au fost comparate trei scoruri: probabilitatea maximă calibrată, folosită ca referință [55]; distanța Mahalanobis până la cea mai apropiată medie de categorie, o distanță care ține cont de cât variază trăsăturile și de cât de corelate sunt, cu o matrice de covarianță comună stabilizată prin metoda Ledoit-Wolf [56, 57]; și distanța cosinus până la al 10-lea cel mai apropiat caz de antrenare (k-NN) [58], detectorul principal, fixat înainte de rulare. Pragul fiecărui seed este ales pe validare astfel încât doar 5% dintre cazurile SCIN obișnuite să fie semnalate; o fotografie primește o categorie doar dacă nu este semnalată și încrederea ei depășește τ. Pe lângă Fitzpatrick17k și DDI, a fost construit un set de control din SCIN: 463 de cazuri ale căror diagnostice diferențiale se află toate în afara celor patru categorii (de exemplu impetigo, herpes zoster, tinea, purpură), fotografiate cu aceleași telefoane (ml/labels/scin_near_ood.csv).</w:t>
+        <w:t>Pentru a corecta această limită a fost testat un detector de imagini din afara domeniului (out-of-distribution detection; ml/ood_detect.py): un scor care spune cât de diferită este o fotografie de toate cazurile de antrenare, calculat înainte ca modelul să aleagă o categorie. Pe trăsăturile DINOv2 au fost comparate trei scoruri: probabilitatea maximă calibrată, folosită ca referință [57]; distanța Mahalanobis până la cea mai apropiată medie de categorie, o distanță care ține cont de cât variază trăsăturile și de cât de corelate sunt, cu o matrice de covarianță comună stabilizată prin metoda Ledoit-Wolf [58, 59]; și distanța cosinus până la al 10-lea cel mai apropiat caz de antrenare (k-NN) [60], detectorul principal, fixat înainte de rulare. Pragul fiecărui seed este ales pe validare astfel încât doar 5% dintre cazurile SCIN obișnuite să fie semnalate; o fotografie primește o categorie doar dacă nu este semnalată și încrederea ei depășește τ. Pe lângă Fitzpatrick17k și DDI, a fost construit un set de control din SCIN: 463 de cazuri ale căror diagnostice diferențiale se află toate în afara celor patru categorii (de exemplu impetigo, herpes zoster, tinea, purpură), fotografiate cu aceleași telefoane (ml/labels/scin_near_ood.csv).</w:t>
       </w:r>
     </w:p>
     <w:p>
@@ -11552,7 +12010,7 @@
       <w:pPr>
         <w:pStyle w:val="Caption"/>
       </w:pPr>
-      <w:bookmarkStart w:id="46" w:name="_Toc243941024"/>
+      <w:bookmarkStart w:id="47" w:name="_Toc243941024"/>
       <w:r>
         <w:t>Tabelul 8.</w:t>
       </w:r>
@@ -11577,7 +12035,7 @@
       <w:r>
         <w:t>. Detectorul de imagini din afara domeniului pe trăsăturile DINOv2 (medii pe zece seed-uri; prag ales pentru 5% alarme false pe validarea SCIN; răspuns sigur = categorie afișată fără recomandarea de a consulta un specialist, mai puțin este mai sigur în afara domeniului).</w:t>
       </w:r>
-      <w:bookmarkEnd w:id="46"/>
+      <w:bookmarkEnd w:id="47"/>
     </w:p>
     <w:tbl>
       <w:tblPr>
@@ -12062,25 +12520,25 @@
       <w:pPr>
         <w:pStyle w:val="Heading2"/>
       </w:pPr>
-      <w:bookmarkStart w:id="47" w:name="_Toc243941007"/>
+      <w:bookmarkStart w:id="48" w:name="_Toc244034988"/>
       <w:r>
         <w:t>8.7 Explicabilitate (Grad-CAM)</w:t>
       </w:r>
-      <w:bookmarkEnd w:id="47"/>
+      <w:bookmarkEnd w:id="48"/>
     </w:p>
     <w:p>
       <w:pPr>
         <w:ind w:firstLine="709"/>
       </w:pPr>
       <w:r>
-        <w:t>Pe cele 2.708 cazuri de test ale fiecărui model (Tabelul 8.10), ambele modele trec în medie verificarea prin randomizare (corelații 0,02–0,10), dar DINOv2 o trece mai consecvent: la 77,5% dintre cazuri corelația după randomizarea clasificatorului este sub 0,3 în valoare absolută, față de 41,7% la EfficientNet-B0. Hărțile DINOv2 sunt mai concentrate, dar privesc mai mult bordura neagră (mediană 0,67 față de 0,25), un efect cunoscut al Vision Transformer-ilor fără token-uri de registru, care stochează informație globală în patch-uri fără conținut [54]. Concentrarea hărților nu diferă între tonurile de piele. În aplicație, harta este afișată doar ca indicație generală; completarea prin reflexie în locul bordurii negre sau varianta DINOv2 cu registre sunt îmbunătățiri propuse.</w:t>
+        <w:t>Pe cele 2.708 cazuri de test ale fiecărui model (Tabelul 8.10), ambele modele trec în medie verificarea prin randomizare (corelații 0,02–0,10), dar DINOv2 o trece mai consecvent: la 77,5% dintre cazuri corelația după randomizarea clasificatorului este sub 0,3 în valoare absolută, față de 41,7% la EfficientNet-B0. Hărțile DINOv2 sunt mai concentrate, dar privesc mai mult bordura neagră (mediană 0,67 față de 0,25), un efect cunoscut al Vision Transformer-ilor fără token-uri de registru, care stochează informație globală în patch-uri fără conținut [61]. Concentrarea hărților nu diferă între tonurile de piele. În aplicație, harta este afișată doar ca indicație generală; completarea prin reflexie în locul bordurii negre sau varianta DINOv2 cu registre sunt îmbunătățiri propuse.</w:t>
       </w:r>
     </w:p>
     <w:p>
       <w:pPr>
         <w:pStyle w:val="Caption"/>
       </w:pPr>
-      <w:bookmarkStart w:id="48" w:name="_Toc243941025"/>
+      <w:bookmarkStart w:id="49" w:name="_Toc243941025"/>
       <w:r>
         <w:t>Tabelul 8.</w:t>
       </w:r>
@@ -12105,7 +12563,7 @@
       <w:r>
         <w:t>. Grad-CAM pe testul SCIN (2.708 cazuri pe model; ρ = corelația Spearman cu harta modelului antrenat).</w:t>
       </w:r>
-      <w:bookmarkEnd w:id="48"/>
+      <w:bookmarkEnd w:id="49"/>
     </w:p>
     <w:tbl>
       <w:tblPr>
@@ -12364,11 +12822,11 @@
       <w:pPr>
         <w:pStyle w:val="Heading2"/>
       </w:pPr>
-      <w:bookmarkStart w:id="49" w:name="_Toc243941008"/>
+      <w:bookmarkStart w:id="50" w:name="_Toc244034989"/>
       <w:r>
         <w:t>8.8 Sinteza rezultatelor și modelul ales pentru aplicație</w:t>
       </w:r>
-      <w:bookmarkEnd w:id="49"/>
+      <w:bookmarkEnd w:id="50"/>
     </w:p>
     <w:p>
       <w:pPr>
@@ -12391,7 +12849,7 @@
       <w:pPr>
         <w:pStyle w:val="Caption"/>
       </w:pPr>
-      <w:bookmarkStart w:id="50" w:name="_Toc243941026"/>
+      <w:bookmarkStart w:id="51" w:name="_Toc243941026"/>
       <w:r>
         <w:t>Tabelul 8.</w:t>
       </w:r>
@@ -12416,7 +12874,7 @@
       <w:r>
         <w:t>. Macro-F1 pe grupe de ton (medii pe zece seed-uri; SCIN: cazurile de test ale fiecărui seed; Fitzpatrick17k: evaluare zero-shot pe 4.012 imagini; * = sub 30 de cazuri de test pe seed în SCIN, doar descriptiv).</w:t>
       </w:r>
-      <w:bookmarkEnd w:id="50"/>
+      <w:bookmarkEnd w:id="51"/>
     </w:p>
     <w:tbl>
       <w:tblPr>
@@ -12977,19 +13435,19 @@
         <w:ind w:firstLine="709"/>
       </w:pPr>
       <w:r>
-        <w:t>Modelul livrat în aplicație este DINOv2 ViT-B/14 cu sondă liniară, încredere calibrată și prag τ, ales pentru licența Apache 2.0, acuratețea selectivă de 0,676 și cea mai mică eroare de calibrare după scalare (0,061); modelul folosește doar fotografia, deoarece chestionarul nu a adus câștig. Din rezultatul extern rezultă două cerințe: aplicația declară permanent că nu evaluează leziuni suspecte (alunițe care se schimbă, leziuni care sângerează) și trimite direct la medic pentru ele, iar detectorul k-NN de imagini din afara domeniului (Secțiunea 8.6) oprește o parte dintre fotografiile neobișnuite, dar nu recunoaște afecțiunile necunoscute fotografiate cu telefonul, deci avertizarea și întrebările de alarmă rămân obligatorii.</w:t>
+        <w:t>Modelul livrat în aplicație este DINOv2 ViT-B/14 cu sondă liniară, încredere calibrată și prag τ, ales pentru licența Apache 2.0, acuratețea selectivă de 0,676 și cea mai mică eroare de calibrare după scalare (0,061); modelul folosește doar fotografia, deoarece chestionarul nu a adus câștig. Din rezultatul extern rezultă două cerințe: aplicația declară permanent că nu evaluează leziuni suspecte (alunițe care se schimbă, leziuni care sângerează) și trimite direct la medic pentru ele, iar detectorul k-NN de imagini din afara domeniului (Secțiunea 8.6) oprește o parte dintre fotografiile neobișnuite, dar nu recunoaște afecțiunile necunoscute fotografiate cu telefonul, deci avertizarea și întrebările de alarmă rămân obligatorii. Exportul modelului și verificarea lui sunt descrise în secțiunea 6.1.</w:t>
       </w:r>
     </w:p>
     <w:p>
       <w:pPr>
         <w:pStyle w:val="Heading1"/>
       </w:pPr>
-      <w:bookmarkStart w:id="51" w:name="_Toc243941009"/>
+      <w:bookmarkStart w:id="52" w:name="_Toc244034990"/>
       <w:r>
         <w:lastRenderedPageBreak/>
         <w:t>Capitolul 9. Concluzii și direcții viitoare</w:t>
       </w:r>
-      <w:bookmarkEnd w:id="51"/>
+      <w:bookmarkEnd w:id="52"/>
     </w:p>
     <w:p>
       <w:r>
@@ -13003,12 +13461,12 @@
       <w:pPr>
         <w:pStyle w:val="Heading1"/>
       </w:pPr>
-      <w:bookmarkStart w:id="52" w:name="_Toc243941010"/>
+      <w:bookmarkStart w:id="53" w:name="_Toc244034991"/>
       <w:r>
         <w:lastRenderedPageBreak/>
         <w:t>Anexe</w:t>
       </w:r>
-      <w:bookmarkEnd w:id="52"/>
+      <w:bookmarkEnd w:id="53"/>
     </w:p>
     <w:p>
       <w:r>
@@ -13022,18 +13480,18 @@
       <w:pPr>
         <w:pStyle w:val="Heading2"/>
       </w:pPr>
-      <w:bookmarkStart w:id="53" w:name="_Toc243941011"/>
+      <w:bookmarkStart w:id="54" w:name="_Toc244034992"/>
       <w:r>
         <w:t>Anexa A. Planificarea proiectului: enunțul domeniului, WBS și riscurile</w:t>
       </w:r>
-      <w:bookmarkEnd w:id="53"/>
+      <w:bookmarkEnd w:id="54"/>
     </w:p>
     <w:p>
       <w:pPr>
         <w:ind w:firstLine="709"/>
       </w:pPr>
       <w:r>
-        <w:t>Proiectul a fost planificat după procesele de management al domeniului din ghidul PMBOK [59]. Domeniul proiectului înseamnă tot lucrul necesar pentru a produce livrabilele, și numai acesta. Enunțul domeniului (</w:t>
+        <w:t>Proiectul a fost planificat după procesele de management al domeniului din ghidul PMBOK [62]. Domeniul proiectului înseamnă tot lucrul necesar pentru a produce livrabilele, și numai acesta. Enunțul domeniului (</w:t>
       </w:r>
       <w:r>
         <w:rPr>
@@ -13079,7 +13537,7 @@
         <w:t>docs/WBS_Giotina.docx</w:t>
       </w:r>
       <w:r>
-        <w:t>) împarte proiectul ierarhic în livrabile, nu în activități [60]. Nivelul 2 conține livrabilele majore, iar ultimul nivel conține pachetele de lucru, elementele pentru care efortul se estimează, se atribuie unui responsabil și se verifică printr-un rezultat clar. Cele 60 de pachete au între 6 și 40 de ore, conform regulii 8/80, iar efortul total de 1.290 de ore, dintre care 280 pentru componenta ML, este egal cu bugetul din enunț; aceasta este regula 100%, în care fiecare lucru apare o singură dată. Toate pachetele au un singur responsabil, autoarea.</w:t>
+        <w:t>) împarte proiectul ierarhic în livrabile, nu în activități [63]. Nivelul 2 conține livrabilele majore, iar ultimul nivel conține pachetele de lucru, elementele pentru care efortul se estimează, se atribuie unui responsabil și se verifică printr-un rezultat clar. Cele 60 de pachete au între 6 și 40 de ore, conform regulii 8/80, iar efortul total de 1.290 de ore, dintre care 280 pentru componenta ML, este egal cu bugetul din enunț; aceasta este regula 100%, în care fiecare lucru apare o singură dată. Toate pachetele au un singur responsabil, autoarea.</w:t>
       </w:r>
     </w:p>
     <w:p>
@@ -13132,7 +13590,7 @@
         <w:pStyle w:val="Caption"/>
         <w:jc w:val="center"/>
       </w:pPr>
-      <w:bookmarkStart w:id="54" w:name="_Toc243941032"/>
+      <w:bookmarkStart w:id="55" w:name="_Toc243941032"/>
       <w:r>
         <w:lastRenderedPageBreak/>
         <w:t>Figura A.</w:t>
@@ -13158,7 +13616,7 @@
       <w:r>
         <w:t>. Structura de descompunere a lucrărilor (WBS) a proiectului, cu efortul estimat pe fiecare element.</w:t>
       </w:r>
-      <w:bookmarkEnd w:id="54"/>
+      <w:bookmarkEnd w:id="55"/>
     </w:p>
     <w:p>
       <w:pPr>
@@ -13237,7 +13695,7 @@
         <w:pStyle w:val="Caption"/>
         <w:jc w:val="center"/>
       </w:pPr>
-      <w:bookmarkStart w:id="55" w:name="_Toc243941033"/>
+      <w:bookmarkStart w:id="56" w:name="_Toc243941033"/>
       <w:r>
         <w:t>Figura A.</w:t>
       </w:r>
@@ -13262,7 +13720,7 @@
       <w:r>
         <w:t>. Structura de defalcare a riscurilor (RBS), cu scorul P × I al fiecărui risc și pachetele WBS afectate.</w:t>
       </w:r>
-      <w:bookmarkEnd w:id="55"/>
+      <w:bookmarkEnd w:id="56"/>
     </w:p>
     <w:p>
       <w:pPr>
@@ -13323,7 +13781,7 @@
         <w:pStyle w:val="Caption"/>
         <w:jc w:val="center"/>
       </w:pPr>
-      <w:bookmarkStart w:id="56" w:name="_Toc243941034"/>
+      <w:bookmarkStart w:id="57" w:name="_Toc243941034"/>
       <w:r>
         <w:t>Figura A.</w:t>
       </w:r>
@@ -13348,18 +13806,18 @@
       <w:r>
         <w:t>. Matricea probabilitate × impact cu cele zece riscuri și ordinea lor de prioritate.</w:t>
       </w:r>
-      <w:bookmarkEnd w:id="56"/>
+      <w:bookmarkEnd w:id="57"/>
     </w:p>
     <w:p>
       <w:pPr>
         <w:pStyle w:val="Heading1"/>
       </w:pPr>
-      <w:bookmarkStart w:id="57" w:name="_Toc243941012"/>
+      <w:bookmarkStart w:id="58" w:name="_Toc244034993"/>
       <w:r>
         <w:lastRenderedPageBreak/>
         <w:t>Bibliografie</w:t>
       </w:r>
-      <w:bookmarkEnd w:id="57"/>
+      <w:bookmarkEnd w:id="58"/>
     </w:p>
     <w:p>
       <w:pPr>
@@ -13861,7 +14319,7 @@
         <w:jc w:val="left"/>
       </w:pPr>
       <w:r>
-        <w:t>[50] A. Ward, J. Li, J. Wang et al., Crowdsourcing Dermatology Images with Google Search Ads: Creating a Real-World Skin Condition Dataset, JAMA Network Open 2024. https://arxiv.org/abs/2402.18545</w:t>
+        <w:t>[50] ONNX: Open Neural Network Exchange, format deschis pentru modele de învățare automată, LF AI &amp; Data Foundation. https://onnx.ai/</w:t>
       </w:r>
     </w:p>
     <w:p>
@@ -13871,7 +14329,7 @@
         <w:jc w:val="left"/>
       </w:pPr>
       <w:r>
-        <w:t>[51] T. Fawcett, An introduction to ROC analysis, Pattern Recognition Letters 27(8), 2006. https://doi.org/10.1016/j.patrec.2005.10.010</w:t>
+        <w:t>[51] Microsoft, ONNX Runtime: motor de inferență pentru modele ONNX, documentație. https://onnxruntime.ai/docs/</w:t>
       </w:r>
     </w:p>
     <w:p>
@@ -13881,7 +14339,7 @@
         <w:jc w:val="left"/>
       </w:pPr>
       <w:r>
-        <w:t>[52] W. Wang, D. Tran, M. Feiszli, What Makes Training Multi-Modal Classification Networks Hard?, CVPR 2020. https://arxiv.org/abs/1905.12681</w:t>
+        <w:t>[52] M. Mitchell, S. Wu, A. Zaldivar, P. Barnes, L. Vasserman, B. Hutchinson, E. Spitzer, I. D. Raji, T. Gebru, Model Cards for Model Reporting, FAT* 2019, 220-229. https://doi.org/10.1145/3287560.3287596</w:t>
       </w:r>
     </w:p>
     <w:p>
@@ -13891,7 +14349,7 @@
         <w:jc w:val="left"/>
       </w:pPr>
       <w:r>
-        <w:t>[53] D. H. Wolpert, Stacked generalization, Neural Networks 5(2), 1992. https://doi.org/10.1016/S0893-6080(05)80023-1</w:t>
+        <w:t>[53] A. Ward, J. Li, J. Wang et al., Crowdsourcing Dermatology Images with Google Search Ads: Creating a Real-World Skin Condition Dataset, JAMA Network Open 2024. https://arxiv.org/abs/2402.18545</w:t>
       </w:r>
     </w:p>
     <w:p>
@@ -13901,7 +14359,7 @@
         <w:jc w:val="left"/>
       </w:pPr>
       <w:r>
-        <w:t>[54] T. Darcet, M. Oquab, J. Mairal, P. Bojanowski, Vision Transformers Need Registers, ICLR 2024. https://arxiv.org/abs/2309.16588</w:t>
+        <w:t>[54] T. Fawcett, An introduction to ROC analysis, Pattern Recognition Letters 27(8), 2006. https://doi.org/10.1016/j.patrec.2005.10.010</w:t>
       </w:r>
     </w:p>
     <w:p>
@@ -13911,7 +14369,7 @@
         <w:jc w:val="left"/>
       </w:pPr>
       <w:r>
-        <w:t>[55] D. Hendrycks, K. Gimpel, A Baseline for Detecting Misclassified and Out-of-Distribution Examples in Neural Networks, ICLR 2017. https://arxiv.org/abs/1610.02136</w:t>
+        <w:t>[55] W. Wang, D. Tran, M. Feiszli, What Makes Training Multi-Modal Classification Networks Hard?, CVPR 2020. https://arxiv.org/abs/1905.12681</w:t>
       </w:r>
     </w:p>
     <w:p>
@@ -13921,7 +14379,7 @@
         <w:jc w:val="left"/>
       </w:pPr>
       <w:r>
-        <w:t>[56] K. Lee, K. Lee, H. Lee, J. Shin, A Simple Unified Framework for Detecting Out-of-Distribution Samples and Adversarial Attacks, NeurIPS 2018. https://arxiv.org/abs/1807.03888</w:t>
+        <w:t>[56] D. H. Wolpert, Stacked generalization, Neural Networks 5(2), 1992. https://doi.org/10.1016/S0893-6080(05)80023-1</w:t>
       </w:r>
     </w:p>
     <w:p>
@@ -13931,7 +14389,7 @@
         <w:jc w:val="left"/>
       </w:pPr>
       <w:r>
-        <w:t>[57] O. Ledoit, M. Wolf, A well-conditioned estimator for large-dimensional covariance matrices, Journal of Multivariate Analysis 88(2), 2004. https://doi.org/10.1016/S0047-259X(03)00096-4</w:t>
+        <w:t>[57] D. Hendrycks, K. Gimpel, A Baseline for Detecting Misclassified and Out-of-Distribution Examples in Neural Networks, ICLR 2017. https://arxiv.org/abs/1610.02136</w:t>
       </w:r>
     </w:p>
     <w:p>
@@ -13941,7 +14399,7 @@
         <w:jc w:val="left"/>
       </w:pPr>
       <w:r>
-        <w:t>[58] Y. Sun, Y. Ming, X. Zhu, Y. Li, Out-of-Distribution Detection with Deep Nearest Neighbors, ICML 2022. https://arxiv.org/abs/2204.06507</w:t>
+        <w:t>[58] K. Lee, K. Lee, H. Lee, J. Shin, A Simple Unified Framework for Detecting Out-of-Distribution Samples and Adversarial Attacks, NeurIPS 2018. https://arxiv.org/abs/1807.03888</w:t>
       </w:r>
     </w:p>
     <w:p>
@@ -13951,7 +14409,7 @@
         <w:jc w:val="left"/>
       </w:pPr>
       <w:r>
-        <w:t>[59] Project Management Institute, A Guide to the Project Management Body of Knowledge (PMBOK Guide), ediția a 6-a, 2017. https://www.pmi.org/pmbok-guide-standards/foundational/pmbok</w:t>
+        <w:t>[59] O. Ledoit, M. Wolf, A well-conditioned estimator for large-dimensional covariance matrices, Journal of Multivariate Analysis 88(2), 2004. https://doi.org/10.1016/S0047-259X(03)00096-4</w:t>
       </w:r>
     </w:p>
     <w:p>
@@ -13961,7 +14419,37 @@
         <w:jc w:val="left"/>
       </w:pPr>
       <w:r>
-        <w:t>[60] K. Schwalbe, Information Technology Project Management, ediția a 9-a, Cengage Learning, 2019</w:t>
+        <w:t>[60] Y. Sun, Y. Ming, X. Zhu, Y. Li, Out-of-Distribution Detection with Deep Nearest Neighbors, ICML 2022. https://arxiv.org/abs/2204.06507</w:t>
+      </w:r>
+    </w:p>
+    <w:p>
+      <w:pPr>
+        <w:spacing w:line="276" w:lineRule="auto"/>
+        <w:ind w:left="567" w:hanging="567"/>
+        <w:jc w:val="left"/>
+      </w:pPr>
+      <w:r>
+        <w:t>[61] T. Darcet, M. Oquab, J. Mairal, P. Bojanowski, Vision Transformers Need Registers, ICLR 2024. https://arxiv.org/abs/2309.16588</w:t>
+      </w:r>
+    </w:p>
+    <w:p>
+      <w:pPr>
+        <w:spacing w:line="276" w:lineRule="auto"/>
+        <w:ind w:left="567" w:hanging="567"/>
+        <w:jc w:val="left"/>
+      </w:pPr>
+      <w:r>
+        <w:t>[62] Project Management Institute, A Guide to the Project Management Body of Knowledge (PMBOK Guide), ediția a 6-a, 2017. https://www.pmi.org/pmbok-guide-standards/foundational/pmbok</w:t>
+      </w:r>
+    </w:p>
+    <w:p>
+      <w:pPr>
+        <w:spacing w:line="276" w:lineRule="auto"/>
+        <w:ind w:left="567" w:hanging="567"/>
+        <w:jc w:val="left"/>
+      </w:pPr>
+      <w:r>
+        <w:t>[63] K. Schwalbe, Information Technology Project Management, ediția a 9-a, Cengage Learning, 2019</w:t>
       </w:r>
     </w:p>
     <w:sectPr>

</xml_diff>

<commit_message>
feat(api): ML inference service for the exported skin-concern model
- api/ml_service/app.py (FastAPI): GET /health and POST /v1/analyze, which
  returns answered / uncertain / unusual_photo with probabilities, the model
  fingerprint and the informational notice
- photos decoded in memory only, EXIF orientation applied; size, pixel-count
  and format limits; optional shared service key checked in constant time;
  no public API docs (internal service)
- 8 tests, including one end-to-end run of the real ONNX model
- README: backend is FastAPI, not Node.js
- thesis 6.1 paragraph and FastAPI reference; journal and task plan updated
</commit_message>
<xml_diff>
--- a/docs/Teza_Licenta.docx
+++ b/docs/Teza_Licenta.docx
@@ -299,7 +299,7 @@
         </w:rPr>
         <w:fldChar w:fldCharType="separate"/>
       </w:r>
-      <w:hyperlink w:anchor="_Toc244034957" w:history="1">
+      <w:hyperlink w:anchor="_Toc244063687" w:history="1">
         <w:r>
           <w:rPr>
             <w:rStyle w:val="Hyperlink"/>
@@ -326,7 +326,7 @@
             <w:noProof/>
             <w:webHidden/>
           </w:rPr>
-          <w:instrText xml:space="preserve"> PAGEREF _Toc244034957 \h </w:instrText>
+          <w:instrText xml:space="preserve"> PAGEREF _Toc244063687 \h </w:instrText>
         </w:r>
         <w:r>
           <w:rPr>
@@ -373,7 +373,7 @@
           <w14:ligatures w14:val="standardContextual"/>
         </w:rPr>
       </w:pPr>
-      <w:hyperlink w:anchor="_Toc244034958" w:history="1">
+      <w:hyperlink w:anchor="_Toc244063688" w:history="1">
         <w:r>
           <w:rPr>
             <w:rStyle w:val="Hyperlink"/>
@@ -400,7 +400,7 @@
             <w:noProof/>
             <w:webHidden/>
           </w:rPr>
-          <w:instrText xml:space="preserve"> PAGEREF _Toc244034958 \h </w:instrText>
+          <w:instrText xml:space="preserve"> PAGEREF _Toc244063688 \h </w:instrText>
         </w:r>
         <w:r>
           <w:rPr>
@@ -447,7 +447,7 @@
           <w14:ligatures w14:val="standardContextual"/>
         </w:rPr>
       </w:pPr>
-      <w:hyperlink w:anchor="_Toc244034959" w:history="1">
+      <w:hyperlink w:anchor="_Toc244063689" w:history="1">
         <w:r>
           <w:rPr>
             <w:rStyle w:val="Hyperlink"/>
@@ -474,7 +474,7 @@
             <w:noProof/>
             <w:webHidden/>
           </w:rPr>
-          <w:instrText xml:space="preserve"> PAGEREF _Toc244034959 \h </w:instrText>
+          <w:instrText xml:space="preserve"> PAGEREF _Toc244063689 \h </w:instrText>
         </w:r>
         <w:r>
           <w:rPr>
@@ -521,7 +521,7 @@
           <w14:ligatures w14:val="standardContextual"/>
         </w:rPr>
       </w:pPr>
-      <w:hyperlink w:anchor="_Toc244034960" w:history="1">
+      <w:hyperlink w:anchor="_Toc244063690" w:history="1">
         <w:r>
           <w:rPr>
             <w:rStyle w:val="Hyperlink"/>
@@ -548,7 +548,7 @@
             <w:noProof/>
             <w:webHidden/>
           </w:rPr>
-          <w:instrText xml:space="preserve"> PAGEREF _Toc244034960 \h </w:instrText>
+          <w:instrText xml:space="preserve"> PAGEREF _Toc244063690 \h </w:instrText>
         </w:r>
         <w:r>
           <w:rPr>
@@ -595,7 +595,7 @@
           <w14:ligatures w14:val="standardContextual"/>
         </w:rPr>
       </w:pPr>
-      <w:hyperlink w:anchor="_Toc244034961" w:history="1">
+      <w:hyperlink w:anchor="_Toc244063691" w:history="1">
         <w:r>
           <w:rPr>
             <w:rStyle w:val="Hyperlink"/>
@@ -622,7 +622,7 @@
             <w:noProof/>
             <w:webHidden/>
           </w:rPr>
-          <w:instrText xml:space="preserve"> PAGEREF _Toc244034961 \h </w:instrText>
+          <w:instrText xml:space="preserve"> PAGEREF _Toc244063691 \h </w:instrText>
         </w:r>
         <w:r>
           <w:rPr>
@@ -669,7 +669,7 @@
           <w14:ligatures w14:val="standardContextual"/>
         </w:rPr>
       </w:pPr>
-      <w:hyperlink w:anchor="_Toc244034962" w:history="1">
+      <w:hyperlink w:anchor="_Toc244063692" w:history="1">
         <w:r>
           <w:rPr>
             <w:rStyle w:val="Hyperlink"/>
@@ -696,7 +696,7 @@
             <w:noProof/>
             <w:webHidden/>
           </w:rPr>
-          <w:instrText xml:space="preserve"> PAGEREF _Toc244034962 \h </w:instrText>
+          <w:instrText xml:space="preserve"> PAGEREF _Toc244063692 \h </w:instrText>
         </w:r>
         <w:r>
           <w:rPr>
@@ -743,7 +743,7 @@
           <w14:ligatures w14:val="standardContextual"/>
         </w:rPr>
       </w:pPr>
-      <w:hyperlink w:anchor="_Toc244034963" w:history="1">
+      <w:hyperlink w:anchor="_Toc244063693" w:history="1">
         <w:r>
           <w:rPr>
             <w:rStyle w:val="Hyperlink"/>
@@ -770,7 +770,7 @@
             <w:noProof/>
             <w:webHidden/>
           </w:rPr>
-          <w:instrText xml:space="preserve"> PAGEREF _Toc244034963 \h </w:instrText>
+          <w:instrText xml:space="preserve"> PAGEREF _Toc244063693 \h </w:instrText>
         </w:r>
         <w:r>
           <w:rPr>
@@ -817,7 +817,7 @@
           <w14:ligatures w14:val="standardContextual"/>
         </w:rPr>
       </w:pPr>
-      <w:hyperlink w:anchor="_Toc244034964" w:history="1">
+      <w:hyperlink w:anchor="_Toc244063694" w:history="1">
         <w:r>
           <w:rPr>
             <w:rStyle w:val="Hyperlink"/>
@@ -844,7 +844,7 @@
             <w:noProof/>
             <w:webHidden/>
           </w:rPr>
-          <w:instrText xml:space="preserve"> PAGEREF _Toc244034964 \h </w:instrText>
+          <w:instrText xml:space="preserve"> PAGEREF _Toc244063694 \h </w:instrText>
         </w:r>
         <w:r>
           <w:rPr>
@@ -891,7 +891,7 @@
           <w14:ligatures w14:val="standardContextual"/>
         </w:rPr>
       </w:pPr>
-      <w:hyperlink w:anchor="_Toc244034965" w:history="1">
+      <w:hyperlink w:anchor="_Toc244063695" w:history="1">
         <w:r>
           <w:rPr>
             <w:rStyle w:val="Hyperlink"/>
@@ -918,7 +918,7 @@
             <w:noProof/>
             <w:webHidden/>
           </w:rPr>
-          <w:instrText xml:space="preserve"> PAGEREF _Toc244034965 \h </w:instrText>
+          <w:instrText xml:space="preserve"> PAGEREF _Toc244063695 \h </w:instrText>
         </w:r>
         <w:r>
           <w:rPr>
@@ -965,7 +965,7 @@
           <w14:ligatures w14:val="standardContextual"/>
         </w:rPr>
       </w:pPr>
-      <w:hyperlink w:anchor="_Toc244034966" w:history="1">
+      <w:hyperlink w:anchor="_Toc244063696" w:history="1">
         <w:r>
           <w:rPr>
             <w:rStyle w:val="Hyperlink"/>
@@ -992,7 +992,7 @@
             <w:noProof/>
             <w:webHidden/>
           </w:rPr>
-          <w:instrText xml:space="preserve"> PAGEREF _Toc244034966 \h </w:instrText>
+          <w:instrText xml:space="preserve"> PAGEREF _Toc244063696 \h </w:instrText>
         </w:r>
         <w:r>
           <w:rPr>
@@ -1039,7 +1039,7 @@
           <w14:ligatures w14:val="standardContextual"/>
         </w:rPr>
       </w:pPr>
-      <w:hyperlink w:anchor="_Toc244034967" w:history="1">
+      <w:hyperlink w:anchor="_Toc244063697" w:history="1">
         <w:r>
           <w:rPr>
             <w:rStyle w:val="Hyperlink"/>
@@ -1066,7 +1066,7 @@
             <w:noProof/>
             <w:webHidden/>
           </w:rPr>
-          <w:instrText xml:space="preserve"> PAGEREF _Toc244034967 \h </w:instrText>
+          <w:instrText xml:space="preserve"> PAGEREF _Toc244063697 \h </w:instrText>
         </w:r>
         <w:r>
           <w:rPr>
@@ -1113,7 +1113,7 @@
           <w14:ligatures w14:val="standardContextual"/>
         </w:rPr>
       </w:pPr>
-      <w:hyperlink w:anchor="_Toc244034968" w:history="1">
+      <w:hyperlink w:anchor="_Toc244063698" w:history="1">
         <w:r>
           <w:rPr>
             <w:rStyle w:val="Hyperlink"/>
@@ -1140,7 +1140,7 @@
             <w:noProof/>
             <w:webHidden/>
           </w:rPr>
-          <w:instrText xml:space="preserve"> PAGEREF _Toc244034968 \h </w:instrText>
+          <w:instrText xml:space="preserve"> PAGEREF _Toc244063698 \h </w:instrText>
         </w:r>
         <w:r>
           <w:rPr>
@@ -1187,7 +1187,7 @@
           <w14:ligatures w14:val="standardContextual"/>
         </w:rPr>
       </w:pPr>
-      <w:hyperlink w:anchor="_Toc244034969" w:history="1">
+      <w:hyperlink w:anchor="_Toc244063699" w:history="1">
         <w:r>
           <w:rPr>
             <w:rStyle w:val="Hyperlink"/>
@@ -1214,7 +1214,7 @@
             <w:noProof/>
             <w:webHidden/>
           </w:rPr>
-          <w:instrText xml:space="preserve"> PAGEREF _Toc244034969 \h </w:instrText>
+          <w:instrText xml:space="preserve"> PAGEREF _Toc244063699 \h </w:instrText>
         </w:r>
         <w:r>
           <w:rPr>
@@ -1261,7 +1261,7 @@
           <w14:ligatures w14:val="standardContextual"/>
         </w:rPr>
       </w:pPr>
-      <w:hyperlink w:anchor="_Toc244034970" w:history="1">
+      <w:hyperlink w:anchor="_Toc244063700" w:history="1">
         <w:r>
           <w:rPr>
             <w:rStyle w:val="Hyperlink"/>
@@ -1288,7 +1288,7 @@
             <w:noProof/>
             <w:webHidden/>
           </w:rPr>
-          <w:instrText xml:space="preserve"> PAGEREF _Toc244034970 \h </w:instrText>
+          <w:instrText xml:space="preserve"> PAGEREF _Toc244063700 \h </w:instrText>
         </w:r>
         <w:r>
           <w:rPr>
@@ -1335,7 +1335,7 @@
           <w14:ligatures w14:val="standardContextual"/>
         </w:rPr>
       </w:pPr>
-      <w:hyperlink w:anchor="_Toc244034971" w:history="1">
+      <w:hyperlink w:anchor="_Toc244063701" w:history="1">
         <w:r>
           <w:rPr>
             <w:rStyle w:val="Hyperlink"/>
@@ -1362,7 +1362,7 @@
             <w:noProof/>
             <w:webHidden/>
           </w:rPr>
-          <w:instrText xml:space="preserve"> PAGEREF _Toc244034971 \h </w:instrText>
+          <w:instrText xml:space="preserve"> PAGEREF _Toc244063701 \h </w:instrText>
         </w:r>
         <w:r>
           <w:rPr>
@@ -1409,7 +1409,7 @@
           <w14:ligatures w14:val="standardContextual"/>
         </w:rPr>
       </w:pPr>
-      <w:hyperlink w:anchor="_Toc244034972" w:history="1">
+      <w:hyperlink w:anchor="_Toc244063702" w:history="1">
         <w:r>
           <w:rPr>
             <w:rStyle w:val="Hyperlink"/>
@@ -1436,7 +1436,7 @@
             <w:noProof/>
             <w:webHidden/>
           </w:rPr>
-          <w:instrText xml:space="preserve"> PAGEREF _Toc244034972 \h </w:instrText>
+          <w:instrText xml:space="preserve"> PAGEREF _Toc244063702 \h </w:instrText>
         </w:r>
         <w:r>
           <w:rPr>
@@ -1483,7 +1483,7 @@
           <w14:ligatures w14:val="standardContextual"/>
         </w:rPr>
       </w:pPr>
-      <w:hyperlink w:anchor="_Toc244034973" w:history="1">
+      <w:hyperlink w:anchor="_Toc244063703" w:history="1">
         <w:r>
           <w:rPr>
             <w:rStyle w:val="Hyperlink"/>
@@ -1510,7 +1510,7 @@
             <w:noProof/>
             <w:webHidden/>
           </w:rPr>
-          <w:instrText xml:space="preserve"> PAGEREF _Toc244034973 \h </w:instrText>
+          <w:instrText xml:space="preserve"> PAGEREF _Toc244063703 \h </w:instrText>
         </w:r>
         <w:r>
           <w:rPr>
@@ -1557,7 +1557,7 @@
           <w14:ligatures w14:val="standardContextual"/>
         </w:rPr>
       </w:pPr>
-      <w:hyperlink w:anchor="_Toc244034974" w:history="1">
+      <w:hyperlink w:anchor="_Toc244063704" w:history="1">
         <w:r>
           <w:rPr>
             <w:rStyle w:val="Hyperlink"/>
@@ -1584,7 +1584,7 @@
             <w:noProof/>
             <w:webHidden/>
           </w:rPr>
-          <w:instrText xml:space="preserve"> PAGEREF _Toc244034974 \h </w:instrText>
+          <w:instrText xml:space="preserve"> PAGEREF _Toc244063704 \h </w:instrText>
         </w:r>
         <w:r>
           <w:rPr>
@@ -1631,7 +1631,7 @@
           <w14:ligatures w14:val="standardContextual"/>
         </w:rPr>
       </w:pPr>
-      <w:hyperlink w:anchor="_Toc244034975" w:history="1">
+      <w:hyperlink w:anchor="_Toc244063705" w:history="1">
         <w:r>
           <w:rPr>
             <w:rStyle w:val="Hyperlink"/>
@@ -1658,7 +1658,7 @@
             <w:noProof/>
             <w:webHidden/>
           </w:rPr>
-          <w:instrText xml:space="preserve"> PAGEREF _Toc244034975 \h </w:instrText>
+          <w:instrText xml:space="preserve"> PAGEREF _Toc244063705 \h </w:instrText>
         </w:r>
         <w:r>
           <w:rPr>
@@ -1705,7 +1705,7 @@
           <w14:ligatures w14:val="standardContextual"/>
         </w:rPr>
       </w:pPr>
-      <w:hyperlink w:anchor="_Toc244034976" w:history="1">
+      <w:hyperlink w:anchor="_Toc244063706" w:history="1">
         <w:r>
           <w:rPr>
             <w:rStyle w:val="Hyperlink"/>
@@ -1732,7 +1732,7 @@
             <w:noProof/>
             <w:webHidden/>
           </w:rPr>
-          <w:instrText xml:space="preserve"> PAGEREF _Toc244034976 \h </w:instrText>
+          <w:instrText xml:space="preserve"> PAGEREF _Toc244063706 \h </w:instrText>
         </w:r>
         <w:r>
           <w:rPr>
@@ -1779,7 +1779,7 @@
           <w14:ligatures w14:val="standardContextual"/>
         </w:rPr>
       </w:pPr>
-      <w:hyperlink w:anchor="_Toc244034977" w:history="1">
+      <w:hyperlink w:anchor="_Toc244063707" w:history="1">
         <w:r>
           <w:rPr>
             <w:rStyle w:val="Hyperlink"/>
@@ -1806,7 +1806,7 @@
             <w:noProof/>
             <w:webHidden/>
           </w:rPr>
-          <w:instrText xml:space="preserve"> PAGEREF _Toc244034977 \h </w:instrText>
+          <w:instrText xml:space="preserve"> PAGEREF _Toc244063707 \h </w:instrText>
         </w:r>
         <w:r>
           <w:rPr>
@@ -1853,7 +1853,7 @@
           <w14:ligatures w14:val="standardContextual"/>
         </w:rPr>
       </w:pPr>
-      <w:hyperlink w:anchor="_Toc244034978" w:history="1">
+      <w:hyperlink w:anchor="_Toc244063708" w:history="1">
         <w:r>
           <w:rPr>
             <w:rStyle w:val="Hyperlink"/>
@@ -1880,7 +1880,7 @@
             <w:noProof/>
             <w:webHidden/>
           </w:rPr>
-          <w:instrText xml:space="preserve"> PAGEREF _Toc244034978 \h </w:instrText>
+          <w:instrText xml:space="preserve"> PAGEREF _Toc244063708 \h </w:instrText>
         </w:r>
         <w:r>
           <w:rPr>
@@ -1927,7 +1927,7 @@
           <w14:ligatures w14:val="standardContextual"/>
         </w:rPr>
       </w:pPr>
-      <w:hyperlink w:anchor="_Toc244034979" w:history="1">
+      <w:hyperlink w:anchor="_Toc244063709" w:history="1">
         <w:r>
           <w:rPr>
             <w:rStyle w:val="Hyperlink"/>
@@ -1954,7 +1954,7 @@
             <w:noProof/>
             <w:webHidden/>
           </w:rPr>
-          <w:instrText xml:space="preserve"> PAGEREF _Toc244034979 \h </w:instrText>
+          <w:instrText xml:space="preserve"> PAGEREF _Toc244063709 \h </w:instrText>
         </w:r>
         <w:r>
           <w:rPr>
@@ -2001,7 +2001,7 @@
           <w14:ligatures w14:val="standardContextual"/>
         </w:rPr>
       </w:pPr>
-      <w:hyperlink w:anchor="_Toc244034980" w:history="1">
+      <w:hyperlink w:anchor="_Toc244063710" w:history="1">
         <w:r>
           <w:rPr>
             <w:rStyle w:val="Hyperlink"/>
@@ -2028,7 +2028,7 @@
             <w:noProof/>
             <w:webHidden/>
           </w:rPr>
-          <w:instrText xml:space="preserve"> PAGEREF _Toc244034980 \h </w:instrText>
+          <w:instrText xml:space="preserve"> PAGEREF _Toc244063710 \h </w:instrText>
         </w:r>
         <w:r>
           <w:rPr>
@@ -2075,7 +2075,7 @@
           <w14:ligatures w14:val="standardContextual"/>
         </w:rPr>
       </w:pPr>
-      <w:hyperlink w:anchor="_Toc244034981" w:history="1">
+      <w:hyperlink w:anchor="_Toc244063711" w:history="1">
         <w:r>
           <w:rPr>
             <w:rStyle w:val="Hyperlink"/>
@@ -2102,7 +2102,7 @@
             <w:noProof/>
             <w:webHidden/>
           </w:rPr>
-          <w:instrText xml:space="preserve"> PAGEREF _Toc244034981 \h </w:instrText>
+          <w:instrText xml:space="preserve"> PAGEREF _Toc244063711 \h </w:instrText>
         </w:r>
         <w:r>
           <w:rPr>
@@ -2149,7 +2149,7 @@
           <w14:ligatures w14:val="standardContextual"/>
         </w:rPr>
       </w:pPr>
-      <w:hyperlink w:anchor="_Toc244034982" w:history="1">
+      <w:hyperlink w:anchor="_Toc244063712" w:history="1">
         <w:r>
           <w:rPr>
             <w:rStyle w:val="Hyperlink"/>
@@ -2176,7 +2176,7 @@
             <w:noProof/>
             <w:webHidden/>
           </w:rPr>
-          <w:instrText xml:space="preserve"> PAGEREF _Toc244034982 \h </w:instrText>
+          <w:instrText xml:space="preserve"> PAGEREF _Toc244063712 \h </w:instrText>
         </w:r>
         <w:r>
           <w:rPr>
@@ -2223,7 +2223,7 @@
           <w14:ligatures w14:val="standardContextual"/>
         </w:rPr>
       </w:pPr>
-      <w:hyperlink w:anchor="_Toc244034983" w:history="1">
+      <w:hyperlink w:anchor="_Toc244063713" w:history="1">
         <w:r>
           <w:rPr>
             <w:rStyle w:val="Hyperlink"/>
@@ -2250,7 +2250,7 @@
             <w:noProof/>
             <w:webHidden/>
           </w:rPr>
-          <w:instrText xml:space="preserve"> PAGEREF _Toc244034983 \h </w:instrText>
+          <w:instrText xml:space="preserve"> PAGEREF _Toc244063713 \h </w:instrText>
         </w:r>
         <w:r>
           <w:rPr>
@@ -2297,7 +2297,7 @@
           <w14:ligatures w14:val="standardContextual"/>
         </w:rPr>
       </w:pPr>
-      <w:hyperlink w:anchor="_Toc244034984" w:history="1">
+      <w:hyperlink w:anchor="_Toc244063714" w:history="1">
         <w:r>
           <w:rPr>
             <w:rStyle w:val="Hyperlink"/>
@@ -2324,7 +2324,7 @@
             <w:noProof/>
             <w:webHidden/>
           </w:rPr>
-          <w:instrText xml:space="preserve"> PAGEREF _Toc244034984 \h </w:instrText>
+          <w:instrText xml:space="preserve"> PAGEREF _Toc244063714 \h </w:instrText>
         </w:r>
         <w:r>
           <w:rPr>
@@ -2371,7 +2371,7 @@
           <w14:ligatures w14:val="standardContextual"/>
         </w:rPr>
       </w:pPr>
-      <w:hyperlink w:anchor="_Toc244034985" w:history="1">
+      <w:hyperlink w:anchor="_Toc244063715" w:history="1">
         <w:r>
           <w:rPr>
             <w:rStyle w:val="Hyperlink"/>
@@ -2398,7 +2398,7 @@
             <w:noProof/>
             <w:webHidden/>
           </w:rPr>
-          <w:instrText xml:space="preserve"> PAGEREF _Toc244034985 \h </w:instrText>
+          <w:instrText xml:space="preserve"> PAGEREF _Toc244063715 \h </w:instrText>
         </w:r>
         <w:r>
           <w:rPr>
@@ -2445,7 +2445,7 @@
           <w14:ligatures w14:val="standardContextual"/>
         </w:rPr>
       </w:pPr>
-      <w:hyperlink w:anchor="_Toc244034986" w:history="1">
+      <w:hyperlink w:anchor="_Toc244063716" w:history="1">
         <w:r>
           <w:rPr>
             <w:rStyle w:val="Hyperlink"/>
@@ -2472,7 +2472,7 @@
             <w:noProof/>
             <w:webHidden/>
           </w:rPr>
-          <w:instrText xml:space="preserve"> PAGEREF _Toc244034986 \h </w:instrText>
+          <w:instrText xml:space="preserve"> PAGEREF _Toc244063716 \h </w:instrText>
         </w:r>
         <w:r>
           <w:rPr>
@@ -2519,7 +2519,7 @@
           <w14:ligatures w14:val="standardContextual"/>
         </w:rPr>
       </w:pPr>
-      <w:hyperlink w:anchor="_Toc244034987" w:history="1">
+      <w:hyperlink w:anchor="_Toc244063717" w:history="1">
         <w:r>
           <w:rPr>
             <w:rStyle w:val="Hyperlink"/>
@@ -2546,7 +2546,7 @@
             <w:noProof/>
             <w:webHidden/>
           </w:rPr>
-          <w:instrText xml:space="preserve"> PAGEREF _Toc244034987 \h </w:instrText>
+          <w:instrText xml:space="preserve"> PAGEREF _Toc244063717 \h </w:instrText>
         </w:r>
         <w:r>
           <w:rPr>
@@ -2593,7 +2593,7 @@
           <w14:ligatures w14:val="standardContextual"/>
         </w:rPr>
       </w:pPr>
-      <w:hyperlink w:anchor="_Toc244034988" w:history="1">
+      <w:hyperlink w:anchor="_Toc244063718" w:history="1">
         <w:r>
           <w:rPr>
             <w:rStyle w:val="Hyperlink"/>
@@ -2620,7 +2620,7 @@
             <w:noProof/>
             <w:webHidden/>
           </w:rPr>
-          <w:instrText xml:space="preserve"> PAGEREF _Toc244034988 \h </w:instrText>
+          <w:instrText xml:space="preserve"> PAGEREF _Toc244063718 \h </w:instrText>
         </w:r>
         <w:r>
           <w:rPr>
@@ -2667,7 +2667,7 @@
           <w14:ligatures w14:val="standardContextual"/>
         </w:rPr>
       </w:pPr>
-      <w:hyperlink w:anchor="_Toc244034989" w:history="1">
+      <w:hyperlink w:anchor="_Toc244063719" w:history="1">
         <w:r>
           <w:rPr>
             <w:rStyle w:val="Hyperlink"/>
@@ -2694,7 +2694,7 @@
             <w:noProof/>
             <w:webHidden/>
           </w:rPr>
-          <w:instrText xml:space="preserve"> PAGEREF _Toc244034989 \h </w:instrText>
+          <w:instrText xml:space="preserve"> PAGEREF _Toc244063719 \h </w:instrText>
         </w:r>
         <w:r>
           <w:rPr>
@@ -2741,7 +2741,7 @@
           <w14:ligatures w14:val="standardContextual"/>
         </w:rPr>
       </w:pPr>
-      <w:hyperlink w:anchor="_Toc244034990" w:history="1">
+      <w:hyperlink w:anchor="_Toc244063720" w:history="1">
         <w:r>
           <w:rPr>
             <w:rStyle w:val="Hyperlink"/>
@@ -2768,7 +2768,7 @@
             <w:noProof/>
             <w:webHidden/>
           </w:rPr>
-          <w:instrText xml:space="preserve"> PAGEREF _Toc244034990 \h </w:instrText>
+          <w:instrText xml:space="preserve"> PAGEREF _Toc244063720 \h </w:instrText>
         </w:r>
         <w:r>
           <w:rPr>
@@ -2815,7 +2815,7 @@
           <w14:ligatures w14:val="standardContextual"/>
         </w:rPr>
       </w:pPr>
-      <w:hyperlink w:anchor="_Toc244034991" w:history="1">
+      <w:hyperlink w:anchor="_Toc244063721" w:history="1">
         <w:r>
           <w:rPr>
             <w:rStyle w:val="Hyperlink"/>
@@ -2842,7 +2842,7 @@
             <w:noProof/>
             <w:webHidden/>
           </w:rPr>
-          <w:instrText xml:space="preserve"> PAGEREF _Toc244034991 \h </w:instrText>
+          <w:instrText xml:space="preserve"> PAGEREF _Toc244063721 \h </w:instrText>
         </w:r>
         <w:r>
           <w:rPr>
@@ -2889,7 +2889,7 @@
           <w14:ligatures w14:val="standardContextual"/>
         </w:rPr>
       </w:pPr>
-      <w:hyperlink w:anchor="_Toc244034992" w:history="1">
+      <w:hyperlink w:anchor="_Toc244063722" w:history="1">
         <w:r>
           <w:rPr>
             <w:rStyle w:val="Hyperlink"/>
@@ -2916,7 +2916,7 @@
             <w:noProof/>
             <w:webHidden/>
           </w:rPr>
-          <w:instrText xml:space="preserve"> PAGEREF _Toc244034992 \h </w:instrText>
+          <w:instrText xml:space="preserve"> PAGEREF _Toc244063722 \h </w:instrText>
         </w:r>
         <w:r>
           <w:rPr>
@@ -2963,7 +2963,7 @@
           <w14:ligatures w14:val="standardContextual"/>
         </w:rPr>
       </w:pPr>
-      <w:hyperlink w:anchor="_Toc244034993" w:history="1">
+      <w:hyperlink w:anchor="_Toc244063723" w:history="1">
         <w:r>
           <w:rPr>
             <w:rStyle w:val="Hyperlink"/>
@@ -2990,7 +2990,7 @@
             <w:noProof/>
             <w:webHidden/>
           </w:rPr>
-          <w:instrText xml:space="preserve"> PAGEREF _Toc244034993 \h </w:instrText>
+          <w:instrText xml:space="preserve"> PAGEREF _Toc244063723 \h </w:instrText>
         </w:r>
         <w:r>
           <w:rPr>
@@ -5274,7 +5274,7 @@
       <w:pPr>
         <w:pStyle w:val="Heading1"/>
       </w:pPr>
-      <w:bookmarkStart w:id="0" w:name="_Toc244034957"/>
+      <w:bookmarkStart w:id="0" w:name="_Toc244063687"/>
       <w:r>
         <w:lastRenderedPageBreak/>
         <w:t>Capitolul 1. Introducere</w:t>
@@ -5285,7 +5285,7 @@
       <w:pPr>
         <w:pStyle w:val="Heading2"/>
       </w:pPr>
-      <w:bookmarkStart w:id="1" w:name="_Toc244034958"/>
+      <w:bookmarkStart w:id="1" w:name="_Toc244063688"/>
       <w:r>
         <w:t>1.1 Motivație</w:t>
       </w:r>
@@ -5321,7 +5321,7 @@
       <w:pPr>
         <w:pStyle w:val="Heading2"/>
       </w:pPr>
-      <w:bookmarkStart w:id="2" w:name="_Toc244034959"/>
+      <w:bookmarkStart w:id="2" w:name="_Toc244063689"/>
       <w:r>
         <w:t>1.2 Formularea problemei</w:t>
       </w:r>
@@ -5377,7 +5377,7 @@
       <w:pPr>
         <w:pStyle w:val="Heading2"/>
       </w:pPr>
-      <w:bookmarkStart w:id="3" w:name="_Toc244034960"/>
+      <w:bookmarkStart w:id="3" w:name="_Toc244063690"/>
       <w:r>
         <w:t>1.3 Obiective</w:t>
       </w:r>
@@ -5395,7 +5395,7 @@
       <w:pPr>
         <w:pStyle w:val="Heading2"/>
       </w:pPr>
-      <w:bookmarkStart w:id="4" w:name="_Toc244034961"/>
+      <w:bookmarkStart w:id="4" w:name="_Toc244063691"/>
       <w:r>
         <w:t>1.4 Contribuții</w:t>
       </w:r>
@@ -5413,7 +5413,7 @@
       <w:pPr>
         <w:pStyle w:val="Heading2"/>
       </w:pPr>
-      <w:bookmarkStart w:id="5" w:name="_Toc244034962"/>
+      <w:bookmarkStart w:id="5" w:name="_Toc244063692"/>
       <w:r>
         <w:t>1.5 Structura lucrării</w:t>
       </w:r>
@@ -5431,7 +5431,7 @@
       <w:pPr>
         <w:pStyle w:val="Heading1"/>
       </w:pPr>
-      <w:bookmarkStart w:id="6" w:name="_Toc244034963"/>
+      <w:bookmarkStart w:id="6" w:name="_Toc244063693"/>
       <w:r>
         <w:lastRenderedPageBreak/>
         <w:t>Capitolul 2. Fundamente teoretice și lucrări conexe</w:t>
@@ -5450,7 +5450,7 @@
       <w:pPr>
         <w:pStyle w:val="Heading1"/>
       </w:pPr>
-      <w:bookmarkStart w:id="7" w:name="_Toc244034964"/>
+      <w:bookmarkStart w:id="7" w:name="_Toc244063694"/>
       <w:r>
         <w:lastRenderedPageBreak/>
         <w:t>Capitolul 3. Cerințe</w:t>
@@ -5469,7 +5469,7 @@
       <w:pPr>
         <w:pStyle w:val="Heading1"/>
       </w:pPr>
-      <w:bookmarkStart w:id="8" w:name="_Toc244034965"/>
+      <w:bookmarkStart w:id="8" w:name="_Toc244063695"/>
       <w:r>
         <w:lastRenderedPageBreak/>
         <w:t>Capitolul 4. Proiectarea sistemului și arhitectura</w:t>
@@ -5488,7 +5488,7 @@
       <w:pPr>
         <w:pStyle w:val="Heading2"/>
       </w:pPr>
-      <w:bookmarkStart w:id="9" w:name="_Toc244034966"/>
+      <w:bookmarkStart w:id="9" w:name="_Toc244063696"/>
       <w:r>
         <w:t>4.1 Modelul conceptual al datelor: diagrama Entitate-Legătură extinsă (EER)</w:t>
       </w:r>
@@ -5772,7 +5772,7 @@
       <w:pPr>
         <w:pStyle w:val="Heading2"/>
       </w:pPr>
-      <w:bookmarkStart w:id="12" w:name="_Toc244034967"/>
+      <w:bookmarkStart w:id="12" w:name="_Toc244063697"/>
       <w:r>
         <w:t>4.2 Interfața utilizator</w:t>
       </w:r>
@@ -6188,7 +6188,7 @@
       <w:pPr>
         <w:pStyle w:val="Heading1"/>
       </w:pPr>
-      <w:bookmarkStart w:id="15" w:name="_Toc244034968"/>
+      <w:bookmarkStart w:id="15" w:name="_Toc244063698"/>
       <w:r>
         <w:lastRenderedPageBreak/>
         <w:t>Capitolul 5. Metodologia AI/ML</w:t>
@@ -6207,7 +6207,7 @@
       <w:pPr>
         <w:pStyle w:val="Heading2"/>
       </w:pPr>
-      <w:bookmarkStart w:id="16" w:name="_Toc244034969"/>
+      <w:bookmarkStart w:id="16" w:name="_Toc244063699"/>
       <w:r>
         <w:t>5.1 Setul de date SCIN și scalele de ton al pielii</w:t>
       </w:r>
@@ -6290,7 +6290,7 @@
       <w:pPr>
         <w:pStyle w:val="Heading2"/>
       </w:pPr>
-      <w:bookmarkStart w:id="17" w:name="_Toc244034970"/>
+      <w:bookmarkStart w:id="17" w:name="_Toc244063700"/>
       <w:r>
         <w:lastRenderedPageBreak/>
         <w:t>5.2 Auditul datelor</w:t>
@@ -6890,7 +6890,7 @@
       <w:pPr>
         <w:pStyle w:val="Heading2"/>
       </w:pPr>
-      <w:bookmarkStart w:id="19" w:name="_Toc244034971"/>
+      <w:bookmarkStart w:id="19" w:name="_Toc244063701"/>
       <w:r>
         <w:t>5.3 Categoriile țintă</w:t>
       </w:r>
@@ -7571,7 +7571,7 @@
       <w:pPr>
         <w:pStyle w:val="Heading2"/>
       </w:pPr>
-      <w:bookmarkStart w:id="21" w:name="_Toc244034972"/>
+      <w:bookmarkStart w:id="21" w:name="_Toc244063702"/>
       <w:r>
         <w:t>5.4 Codificarea chestionarului și masca de valori lipsă</w:t>
       </w:r>
@@ -7589,7 +7589,7 @@
       <w:pPr>
         <w:pStyle w:val="Heading2"/>
       </w:pPr>
-      <w:bookmarkStart w:id="22" w:name="_Toc244034973"/>
+      <w:bookmarkStart w:id="22" w:name="_Toc244063703"/>
       <w:r>
         <w:lastRenderedPageBreak/>
         <w:t>5.5 Împărțirea și preprocesarea datelor</w:t>
@@ -7634,7 +7634,7 @@
       <w:pPr>
         <w:pStyle w:val="Heading2"/>
       </w:pPr>
-      <w:bookmarkStart w:id="23" w:name="_Toc244034974"/>
+      <w:bookmarkStart w:id="23" w:name="_Toc244063704"/>
       <w:r>
         <w:t>5.6 Modelele</w:t>
       </w:r>
@@ -7739,7 +7739,7 @@
       <w:pPr>
         <w:pStyle w:val="Heading2"/>
       </w:pPr>
-      <w:bookmarkStart w:id="24" w:name="_Toc244034975"/>
+      <w:bookmarkStart w:id="24" w:name="_Toc244063705"/>
       <w:r>
         <w:lastRenderedPageBreak/>
         <w:t>5.7 Protocolul de evaluare</w:t>
@@ -7804,7 +7804,7 @@
       <w:pPr>
         <w:pStyle w:val="Heading2"/>
       </w:pPr>
-      <w:bookmarkStart w:id="25" w:name="_Toc244034976"/>
+      <w:bookmarkStart w:id="25" w:name="_Toc244063706"/>
       <w:r>
         <w:t>5.8 Date externe și encodere preantrenate</w:t>
       </w:r>
@@ -7875,7 +7875,7 @@
       <w:pPr>
         <w:pStyle w:val="Heading2"/>
       </w:pPr>
-      <w:bookmarkStart w:id="26" w:name="_Toc244034977"/>
+      <w:bookmarkStart w:id="26" w:name="_Toc244063707"/>
       <w:r>
         <w:lastRenderedPageBreak/>
         <w:t>5.9 Explicabilitate (Grad-CAM)</w:t>
@@ -7894,7 +7894,7 @@
       <w:pPr>
         <w:pStyle w:val="Heading1"/>
       </w:pPr>
-      <w:bookmarkStart w:id="27" w:name="_Toc244034978"/>
+      <w:bookmarkStart w:id="27" w:name="_Toc244063708"/>
       <w:r>
         <w:lastRenderedPageBreak/>
         <w:t>Capitolul 6. Implementare</w:t>
@@ -7913,7 +7913,7 @@
       <w:pPr>
         <w:pStyle w:val="Heading2"/>
       </w:pPr>
-      <w:bookmarkStart w:id="28" w:name="_Toc244034979"/>
+      <w:bookmarkStart w:id="28" w:name="_Toc244063709"/>
       <w:r>
         <w:t>6.1 Serviciul ML: modelul exportat</w:t>
       </w:r>
@@ -7936,7 +7936,7 @@
         <w:t>ml/export_model.py</w:t>
       </w:r>
       <w:r>
-        <w:t>. Exportul folosește formatul ONNX (Open Neural Network Exchange) [50], un format deschis care descrie rețeaua ca un graf de operații matematice, astfel încât serviciul FastAPI o rulează cu biblioteca ONNX Runtime [51], fără PyTorch. Un singur fișier (335 MB) conține, în ordine: normalizarea pixelilor, encoderul DINOv2, standardizarea trăsăturilor, sonda liniară, împărțirea la temperatura T, funcția softmax și scorul k-NN față de cele 1.266 de cazuri de antrenare (detectorul din secțiunea 8.6). Se exportă sonda seed-ului 0, ales printr-o regulă fixată dinainte (seed-ul folosit la dezvoltare), nu după rezultatul pe test; astfel, modelul livrat este exact unul dintre modelele evaluate, iar performanța lui așteptată rămâne media pe zece seed-uri din capitolul 8.</w:t>
+        <w:t>. Exportul folosește formatul ONNX (Open Neural Network Exchange) [50], un format deschis care descrie rețeaua ca un graf de operații matematice, astfel încât serviciul FastAPI [51] o rulează cu biblioteca ONNX Runtime [52], fără PyTorch. Un singur fișier (335 MB) conține, în ordine: normalizarea pixelilor, encoderul DINOv2, standardizarea trăsăturilor, sonda liniară, împărțirea la temperatura T, funcția softmax și scorul k-NN față de cele 1.266 de cazuri de antrenare (detectorul din secțiunea 8.6). Se exportă sonda seed-ului 0, ales printr-o regulă fixată dinainte (seed-ul folosit la dezvoltare), nu după rezultatul pe test; astfel, modelul livrat este exact unul dintre modelele evaluate, iar performanța lui așteptată rămâne media pe zece seed-uri din capitolul 8.</w:t>
       </w:r>
     </w:p>
     <w:p>
@@ -8280,7 +8280,7 @@
         <w:t>--name</w:t>
       </w:r>
       <w:r>
-        <w:t xml:space="preserve">, iar reconstrucția dă exact aceleași valori. Fișa modelului (model card) [52], </w:t>
+        <w:t xml:space="preserve">, iar reconstrucția dă exact aceleași valori. Fișa modelului (model card) [53], </w:t>
       </w:r>
       <w:r>
         <w:rPr>
@@ -8295,9 +8295,39 @@
     </w:p>
     <w:p>
       <w:pPr>
+        <w:spacing w:line="276" w:lineRule="auto"/>
+        <w:ind w:left="567" w:hanging="567"/>
+        <w:jc w:val="left"/>
+      </w:pPr>
+      <w:r>
+        <w:t>Serviciul ML (</w:t>
+      </w:r>
+      <w:r>
+        <w:rPr>
+          <w:rFonts w:ascii="Courier New" w:eastAsia="Courier New" w:hAnsi="Courier New" w:cs="Courier New"/>
+          <w:sz w:val="21"/>
+        </w:rPr>
+        <w:t>api/ml_service/app.py</w:t>
+      </w:r>
+      <w:r>
+        <w:t xml:space="preserve">) este o aplicație FastAPI [51] internă: backend-ul principal o apelează după autentificarea utilizatorului, așa că serviciul nu primește și nu păstrează date despre utilizator. Ruta </w:t>
+      </w:r>
+      <w:r>
+        <w:rPr>
+          <w:rFonts w:ascii="Courier New" w:eastAsia="Courier New" w:hAnsi="Courier New" w:cs="Courier New"/>
+          <w:sz w:val="21"/>
+        </w:rPr>
+        <w:t>POST /v1/analyze</w:t>
+      </w:r>
+      <w:r>
+        <w:t xml:space="preserve"> primește o fotografie, o decodează doar în memorie (fără scriere pe disc și fără jurnalizarea imaginii), o rotește după orientarea EXIF (metadatele prin care telefonul notează cum a fost ținut) și întoarce decizia, probabilitățile, amprenta fișierului modelului și avertismentul permanent că rezultatul este informativ. Sunt refuzate fișierele mai mari de 10 MB, imaginile de peste 40 de milioane de pixeli (protecție împotriva fișierelor construite pentru a epuiza memoria), alte formate decât JPEG, PNG și WebP și cererile fără cheia secretă partajată cu backend-ul. Opt teste automate verifică aceste reguli, iar unul dintre ele rulează modelul real cap la cap.</w:t>
+      </w:r>
+    </w:p>
+    <w:p>
+      <w:pPr>
         <w:pStyle w:val="Heading1"/>
       </w:pPr>
-      <w:bookmarkStart w:id="29" w:name="_Toc244034980"/>
+      <w:bookmarkStart w:id="29" w:name="_Toc244063710"/>
       <w:r>
         <w:lastRenderedPageBreak/>
         <w:t>Capitolul 7. Securitate și GDPR</w:t>
@@ -8316,7 +8346,7 @@
       <w:pPr>
         <w:pStyle w:val="Heading1"/>
       </w:pPr>
-      <w:bookmarkStart w:id="30" w:name="_Toc244034981"/>
+      <w:bookmarkStart w:id="30" w:name="_Toc244063711"/>
       <w:r>
         <w:lastRenderedPageBreak/>
         <w:t>Capitolul 8. Testare și evaluare</w:t>
@@ -8335,7 +8365,7 @@
       <w:pPr>
         <w:pStyle w:val="Heading2"/>
       </w:pPr>
-      <w:bookmarkStart w:id="31" w:name="_Toc244034982"/>
+      <w:bookmarkStart w:id="31" w:name="_Toc244063712"/>
       <w:r>
         <w:t>8.1 Aduce chestionarul un câștig? (E1)</w:t>
       </w:r>
@@ -8838,7 +8868,7 @@
       <w:pPr>
         <w:pStyle w:val="Heading2"/>
       </w:pPr>
-      <w:bookmarkStart w:id="33" w:name="_Toc244034983"/>
+      <w:bookmarkStart w:id="33" w:name="_Toc244063713"/>
       <w:r>
         <w:t>8.2 De ce nu ajută chestionarul?</w:t>
       </w:r>
@@ -8849,7 +8879,7 @@
         <w:ind w:firstLine="709"/>
       </w:pPr>
       <w:r>
-        <w:t>Rezultatul surprinde, deoarece dermatologii SCIN au văzut atât fotografiile, cât și răspunsurile, iar încrederea lor a crescut cu numărul de răspunsuri disponibile [53]. Trei analize pe modelele deja antrenate explică diferența. (1) Chestionarul nu este redundant: o regresie logistică pe trăsăturile modelului cu imagine prezice răspunsurile slab (AUROC [54] între 0,50 și 0,70, unde 0,5 înseamnă ghicire), deci fotografia nu „vede” zona corpului, simptomele sau durata. (2) Erorile sunt corelate: pe cazurile greșite de fotografie, modelul cu chestionar are dreptate doar în 42,6% dintre ele, față de 48,2% în general, deci cazurile grele sunt grele pentru ambele modele. (3) Semnalul este slab și concentrat: ascunderea zonei corpului scade modelul cu chestionar cu 0,125, a duratei cu 0,057 și a simptomelor cu 0,053, iar vârsta și tipul de piele declarat aproape nu contează.</w:t>
+        <w:t>Rezultatul surprinde, deoarece dermatologii SCIN au văzut atât fotografiile, cât și răspunsurile, iar încrederea lor a crescut cu numărul de răspunsuri disponibile [54]. Trei analize pe modelele deja antrenate explică diferența. (1) Chestionarul nu este redundant: o regresie logistică pe trăsăturile modelului cu imagine prezice răspunsurile slab (AUROC [55] între 0,50 și 0,70, unde 0,5 înseamnă ghicire), deci fotografia nu „vede” zona corpului, simptomele sau durata. (2) Erorile sunt corelate: pe cazurile greșite de fotografie, modelul cu chestionar are dreptate doar în 42,6% dintre ele, față de 48,2% în general, deci cazurile grele sunt grele pentru ambele modele. (3) Semnalul este slab și concentrat: ascunderea zonei corpului scade modelul cu chestionar cu 0,125, a duratei cu 0,057 și a simptomelor cu 0,053, iar vârsta și tipul de piele declarat aproape nu contează.</w:t>
       </w:r>
     </w:p>
     <w:p>
@@ -8857,7 +8887,7 @@
         <w:ind w:firstLine="709"/>
       </w:pPr>
       <w:r>
-        <w:t>Pentru a exclude o eroare de metodă, de exemplu ca ramura de imagine să învețe atât de repede încât stratul de fuziune să ignore chestionarul [55], au fost făcute două verificări suplimentare (Tabelul 8.2). Un control pozitiv, adică un test al cărui rezultat corect este cunoscut dinainte, adaugă o întrebare sintetică al cărei răspuns este categoria corectă pentru o proporție a din cazuri și o categorie aleatoare în rest. La a = 0,5, fuziunea câștigă +0,108, deci procedura poate folosi un chestionar informativ; la a = 0,3, când întrebarea are tăria chestionarului real, câștigul este doar +0,005. Stivuirea cu validare încrucișată (</w:t>
+        <w:t>Pentru a exclude o eroare de metodă, de exemplu ca ramura de imagine să învețe atât de repede încât stratul de fuziune să ignore chestionarul [56], au fost făcute două verificări suplimentare (Tabelul 8.2). Un control pozitiv, adică un test al cărui rezultat corect este cunoscut dinainte, adaugă o întrebare sintetică al cărei răspuns este categoria corectă pentru o proporție a din cazuri și o categorie aleatoare în rest. La a = 0,5, fuziunea câștigă +0,108, deci procedura poate folosi un chestionar informativ; la a = 0,3, când întrebarea are tăria chestionarului real, câștigul este doar +0,005. Stivuirea cu validare încrucișată (</w:t>
       </w:r>
       <w:r>
         <w:rPr>
@@ -8873,7 +8903,7 @@
         <w:t>stacking</w:t>
       </w:r>
       <w:r>
-        <w:t>) [56] combină printr-o regresie logistică răspunsurile cu predicțiile fotografiei făcute de modele care nu au văzut cazul respectiv; nici ea nu câștigă din chestionar (−0,005 [−0,020; +0,011]). Chiar o întrebare de aceeași tărie, dar complet independentă de fotografie, ar aduce cel mult +0,017 ± 0,036.</w:t>
+        <w:t>) [57] combină printr-o regresie logistică răspunsurile cu predicțiile fotografiei făcute de modele care nu au văzut cazul respectiv; nici ea nu câștigă din chestionar (−0,005 [−0,020; +0,011]). Chiar o întrebare de aceeași tărie, dar complet independentă de fotografie, ar aduce cel mult +0,017 ± 0,036.</w:t>
       </w:r>
     </w:p>
     <w:p>
@@ -9280,7 +9310,7 @@
       <w:pPr>
         <w:pStyle w:val="Heading2"/>
       </w:pPr>
-      <w:bookmarkStart w:id="35" w:name="_Toc244034984"/>
+      <w:bookmarkStart w:id="35" w:name="_Toc244063714"/>
       <w:r>
         <w:lastRenderedPageBreak/>
         <w:t>8.3 Răspunsuri lipsă (E2)</w:t>
@@ -9813,7 +9843,7 @@
       <w:pPr>
         <w:pStyle w:val="Heading2"/>
       </w:pPr>
-      <w:bookmarkStart w:id="38" w:name="_Toc244034985"/>
+      <w:bookmarkStart w:id="38" w:name="_Toc244063715"/>
       <w:r>
         <w:t>8.4 Date suplimentare și test extern (E7)</w:t>
       </w:r>
@@ -10117,7 +10147,7 @@
       <w:pPr>
         <w:pStyle w:val="Heading2"/>
       </w:pPr>
-      <w:bookmarkStart w:id="40" w:name="_Toc244034986"/>
+      <w:bookmarkStart w:id="40" w:name="_Toc244063716"/>
       <w:r>
         <w:t>8.5 Encodere preantrenate (E5)</w:t>
       </w:r>
@@ -10621,7 +10651,7 @@
       <w:pPr>
         <w:pStyle w:val="Heading2"/>
       </w:pPr>
-      <w:bookmarkStart w:id="42" w:name="_Toc244034987"/>
+      <w:bookmarkStart w:id="42" w:name="_Toc244063717"/>
       <w:r>
         <w:t>8.6 Calibrarea încrederii și abținerea (E4)</w:t>
       </w:r>
@@ -11991,7 +12021,7 @@
         <w:ind w:firstLine="709"/>
       </w:pPr>
       <w:r>
-        <w:t>Pentru a corecta această limită a fost testat un detector de imagini din afara domeniului (out-of-distribution detection; ml/ood_detect.py): un scor care spune cât de diferită este o fotografie de toate cazurile de antrenare, calculat înainte ca modelul să aleagă o categorie. Pe trăsăturile DINOv2 au fost comparate trei scoruri: probabilitatea maximă calibrată, folosită ca referință [57]; distanța Mahalanobis până la cea mai apropiată medie de categorie, o distanță care ține cont de cât variază trăsăturile și de cât de corelate sunt, cu o matrice de covarianță comună stabilizată prin metoda Ledoit-Wolf [58, 59]; și distanța cosinus până la al 10-lea cel mai apropiat caz de antrenare (k-NN) [60], detectorul principal, fixat înainte de rulare. Pragul fiecărui seed este ales pe validare astfel încât doar 5% dintre cazurile SCIN obișnuite să fie semnalate; o fotografie primește o categorie doar dacă nu este semnalată și încrederea ei depășește τ. Pe lângă Fitzpatrick17k și DDI, a fost construit un set de control din SCIN: 463 de cazuri ale căror diagnostice diferențiale se află toate în afara celor patru categorii (de exemplu impetigo, herpes zoster, tinea, purpură), fotografiate cu aceleași telefoane (ml/labels/scin_near_ood.csv).</w:t>
+        <w:t>Pentru a corecta această limită a fost testat un detector de imagini din afara domeniului (out-of-distribution detection; ml/ood_detect.py): un scor care spune cât de diferită este o fotografie de toate cazurile de antrenare, calculat înainte ca modelul să aleagă o categorie. Pe trăsăturile DINOv2 au fost comparate trei scoruri: probabilitatea maximă calibrată, folosită ca referință [58]; distanța Mahalanobis până la cea mai apropiată medie de categorie, o distanță care ține cont de cât variază trăsăturile și de cât de corelate sunt, cu o matrice de covarianță comună stabilizată prin metoda Ledoit-Wolf [59, 60]; și distanța cosinus până la al 10-lea cel mai apropiat caz de antrenare (k-NN) [61], detectorul principal, fixat înainte de rulare. Pragul fiecărui seed este ales pe validare astfel încât doar 5% dintre cazurile SCIN obișnuite să fie semnalate; o fotografie primește o categorie doar dacă nu este semnalată și încrederea ei depășește τ. Pe lângă Fitzpatrick17k și DDI, a fost construit un set de control din SCIN: 463 de cazuri ale căror diagnostice diferențiale se află toate în afara celor patru categorii (de exemplu impetigo, herpes zoster, tinea, purpură), fotografiate cu aceleași telefoane (ml/labels/scin_near_ood.csv).</w:t>
       </w:r>
     </w:p>
     <w:p>
@@ -12520,7 +12550,7 @@
       <w:pPr>
         <w:pStyle w:val="Heading2"/>
       </w:pPr>
-      <w:bookmarkStart w:id="48" w:name="_Toc244034988"/>
+      <w:bookmarkStart w:id="48" w:name="_Toc244063718"/>
       <w:r>
         <w:t>8.7 Explicabilitate (Grad-CAM)</w:t>
       </w:r>
@@ -12531,7 +12561,7 @@
         <w:ind w:firstLine="709"/>
       </w:pPr>
       <w:r>
-        <w:t>Pe cele 2.708 cazuri de test ale fiecărui model (Tabelul 8.10), ambele modele trec în medie verificarea prin randomizare (corelații 0,02–0,10), dar DINOv2 o trece mai consecvent: la 77,5% dintre cazuri corelația după randomizarea clasificatorului este sub 0,3 în valoare absolută, față de 41,7% la EfficientNet-B0. Hărțile DINOv2 sunt mai concentrate, dar privesc mai mult bordura neagră (mediană 0,67 față de 0,25), un efect cunoscut al Vision Transformer-ilor fără token-uri de registru, care stochează informație globală în patch-uri fără conținut [61]. Concentrarea hărților nu diferă între tonurile de piele. În aplicație, harta este afișată doar ca indicație generală; completarea prin reflexie în locul bordurii negre sau varianta DINOv2 cu registre sunt îmbunătățiri propuse.</w:t>
+        <w:t>Pe cele 2.708 cazuri de test ale fiecărui model (Tabelul 8.10), ambele modele trec în medie verificarea prin randomizare (corelații 0,02–0,10), dar DINOv2 o trece mai consecvent: la 77,5% dintre cazuri corelația după randomizarea clasificatorului este sub 0,3 în valoare absolută, față de 41,7% la EfficientNet-B0. Hărțile DINOv2 sunt mai concentrate, dar privesc mai mult bordura neagră (mediană 0,67 față de 0,25), un efect cunoscut al Vision Transformer-ilor fără token-uri de registru, care stochează informație globală în patch-uri fără conținut [62]. Concentrarea hărților nu diferă între tonurile de piele. În aplicație, harta este afișată doar ca indicație generală; completarea prin reflexie în locul bordurii negre sau varianta DINOv2 cu registre sunt îmbunătățiri propuse.</w:t>
       </w:r>
     </w:p>
     <w:p>
@@ -12822,7 +12852,7 @@
       <w:pPr>
         <w:pStyle w:val="Heading2"/>
       </w:pPr>
-      <w:bookmarkStart w:id="50" w:name="_Toc244034989"/>
+      <w:bookmarkStart w:id="50" w:name="_Toc244063719"/>
       <w:r>
         <w:t>8.8 Sinteza rezultatelor și modelul ales pentru aplicație</w:t>
       </w:r>
@@ -13442,7 +13472,7 @@
       <w:pPr>
         <w:pStyle w:val="Heading1"/>
       </w:pPr>
-      <w:bookmarkStart w:id="52" w:name="_Toc244034990"/>
+      <w:bookmarkStart w:id="52" w:name="_Toc244063720"/>
       <w:r>
         <w:lastRenderedPageBreak/>
         <w:t>Capitolul 9. Concluzii și direcții viitoare</w:t>
@@ -13461,7 +13491,7 @@
       <w:pPr>
         <w:pStyle w:val="Heading1"/>
       </w:pPr>
-      <w:bookmarkStart w:id="53" w:name="_Toc244034991"/>
+      <w:bookmarkStart w:id="53" w:name="_Toc244063721"/>
       <w:r>
         <w:lastRenderedPageBreak/>
         <w:t>Anexe</w:t>
@@ -13480,7 +13510,7 @@
       <w:pPr>
         <w:pStyle w:val="Heading2"/>
       </w:pPr>
-      <w:bookmarkStart w:id="54" w:name="_Toc244034992"/>
+      <w:bookmarkStart w:id="54" w:name="_Toc244063722"/>
       <w:r>
         <w:t>Anexa A. Planificarea proiectului: enunțul domeniului, WBS și riscurile</w:t>
       </w:r>
@@ -13491,7 +13521,7 @@
         <w:ind w:firstLine="709"/>
       </w:pPr>
       <w:r>
-        <w:t>Proiectul a fost planificat după procesele de management al domeniului din ghidul PMBOK [62]. Domeniul proiectului înseamnă tot lucrul necesar pentru a produce livrabilele, și numai acesta. Enunțul domeniului (</w:t>
+        <w:t>Proiectul a fost planificat după procesele de management al domeniului din ghidul PMBOK [63]. Domeniul proiectului înseamnă tot lucrul necesar pentru a produce livrabilele, și numai acesta. Enunțul domeniului (</w:t>
       </w:r>
       <w:r>
         <w:rPr>
@@ -13537,7 +13567,7 @@
         <w:t>docs/WBS_Giotina.docx</w:t>
       </w:r>
       <w:r>
-        <w:t>) împarte proiectul ierarhic în livrabile, nu în activități [63]. Nivelul 2 conține livrabilele majore, iar ultimul nivel conține pachetele de lucru, elementele pentru care efortul se estimează, se atribuie unui responsabil și se verifică printr-un rezultat clar. Cele 60 de pachete au între 6 și 40 de ore, conform regulii 8/80, iar efortul total de 1.290 de ore, dintre care 280 pentru componenta ML, este egal cu bugetul din enunț; aceasta este regula 100%, în care fiecare lucru apare o singură dată. Toate pachetele au un singur responsabil, autoarea.</w:t>
+        <w:t>) împarte proiectul ierarhic în livrabile, nu în activități [64]. Nivelul 2 conține livrabilele majore, iar ultimul nivel conține pachetele de lucru, elementele pentru care efortul se estimează, se atribuie unui responsabil și se verifică printr-un rezultat clar. Cele 60 de pachete au între 6 și 40 de ore, conform regulii 8/80, iar efortul total de 1.290 de ore, dintre care 280 pentru componenta ML, este egal cu bugetul din enunț; aceasta este regula 100%, în care fiecare lucru apare o singură dată. Toate pachetele au un singur responsabil, autoarea.</w:t>
       </w:r>
     </w:p>
     <w:p>
@@ -13812,7 +13842,7 @@
       <w:pPr>
         <w:pStyle w:val="Heading1"/>
       </w:pPr>
-      <w:bookmarkStart w:id="58" w:name="_Toc244034993"/>
+      <w:bookmarkStart w:id="58" w:name="_Toc244063723"/>
       <w:r>
         <w:lastRenderedPageBreak/>
         <w:t>Bibliografie</w:t>
@@ -14329,7 +14359,7 @@
         <w:jc w:val="left"/>
       </w:pPr>
       <w:r>
-        <w:t>[51] Microsoft, ONNX Runtime: motor de inferență pentru modele ONNX, documentație. https://onnxruntime.ai/docs/</w:t>
+        <w:t>[51] S. Ramírez, FastAPI: framework web pentru construirea de API-uri cu Python, documentație. https://fastapi.tiangolo.com/</w:t>
       </w:r>
     </w:p>
     <w:p>
@@ -14339,7 +14369,7 @@
         <w:jc w:val="left"/>
       </w:pPr>
       <w:r>
-        <w:t>[52] M. Mitchell, S. Wu, A. Zaldivar, P. Barnes, L. Vasserman, B. Hutchinson, E. Spitzer, I. D. Raji, T. Gebru, Model Cards for Model Reporting, FAT* 2019, 220-229. https://doi.org/10.1145/3287560.3287596</w:t>
+        <w:t>[52] Microsoft, ONNX Runtime: motor de inferență pentru modele ONNX, documentație. https://onnxruntime.ai/docs/</w:t>
       </w:r>
     </w:p>
     <w:p>
@@ -14349,7 +14379,7 @@
         <w:jc w:val="left"/>
       </w:pPr>
       <w:r>
-        <w:t>[53] A. Ward, J. Li, J. Wang et al., Crowdsourcing Dermatology Images with Google Search Ads: Creating a Real-World Skin Condition Dataset, JAMA Network Open 2024. https://arxiv.org/abs/2402.18545</w:t>
+        <w:t>[53] M. Mitchell, S. Wu, A. Zaldivar, P. Barnes, L. Vasserman, B. Hutchinson, E. Spitzer, I. D. Raji, T. Gebru, Model Cards for Model Reporting, FAT* 2019, 220-229. https://doi.org/10.1145/3287560.3287596</w:t>
       </w:r>
     </w:p>
     <w:p>
@@ -14359,7 +14389,7 @@
         <w:jc w:val="left"/>
       </w:pPr>
       <w:r>
-        <w:t>[54] T. Fawcett, An introduction to ROC analysis, Pattern Recognition Letters 27(8), 2006. https://doi.org/10.1016/j.patrec.2005.10.010</w:t>
+        <w:t>[54] A. Ward, J. Li, J. Wang et al., Crowdsourcing Dermatology Images with Google Search Ads: Creating a Real-World Skin Condition Dataset, JAMA Network Open 2024. https://arxiv.org/abs/2402.18545</w:t>
       </w:r>
     </w:p>
     <w:p>
@@ -14369,7 +14399,7 @@
         <w:jc w:val="left"/>
       </w:pPr>
       <w:r>
-        <w:t>[55] W. Wang, D. Tran, M. Feiszli, What Makes Training Multi-Modal Classification Networks Hard?, CVPR 2020. https://arxiv.org/abs/1905.12681</w:t>
+        <w:t>[55] T. Fawcett, An introduction to ROC analysis, Pattern Recognition Letters 27(8), 2006. https://doi.org/10.1016/j.patrec.2005.10.010</w:t>
       </w:r>
     </w:p>
     <w:p>
@@ -14379,7 +14409,7 @@
         <w:jc w:val="left"/>
       </w:pPr>
       <w:r>
-        <w:t>[56] D. H. Wolpert, Stacked generalization, Neural Networks 5(2), 1992. https://doi.org/10.1016/S0893-6080(05)80023-1</w:t>
+        <w:t>[56] W. Wang, D. Tran, M. Feiszli, What Makes Training Multi-Modal Classification Networks Hard?, CVPR 2020. https://arxiv.org/abs/1905.12681</w:t>
       </w:r>
     </w:p>
     <w:p>
@@ -14389,7 +14419,7 @@
         <w:jc w:val="left"/>
       </w:pPr>
       <w:r>
-        <w:t>[57] D. Hendrycks, K. Gimpel, A Baseline for Detecting Misclassified and Out-of-Distribution Examples in Neural Networks, ICLR 2017. https://arxiv.org/abs/1610.02136</w:t>
+        <w:t>[57] D. H. Wolpert, Stacked generalization, Neural Networks 5(2), 1992. https://doi.org/10.1016/S0893-6080(05)80023-1</w:t>
       </w:r>
     </w:p>
     <w:p>
@@ -14399,7 +14429,7 @@
         <w:jc w:val="left"/>
       </w:pPr>
       <w:r>
-        <w:t>[58] K. Lee, K. Lee, H. Lee, J. Shin, A Simple Unified Framework for Detecting Out-of-Distribution Samples and Adversarial Attacks, NeurIPS 2018. https://arxiv.org/abs/1807.03888</w:t>
+        <w:t>[58] D. Hendrycks, K. Gimpel, A Baseline for Detecting Misclassified and Out-of-Distribution Examples in Neural Networks, ICLR 2017. https://arxiv.org/abs/1610.02136</w:t>
       </w:r>
     </w:p>
     <w:p>
@@ -14409,7 +14439,7 @@
         <w:jc w:val="left"/>
       </w:pPr>
       <w:r>
-        <w:t>[59] O. Ledoit, M. Wolf, A well-conditioned estimator for large-dimensional covariance matrices, Journal of Multivariate Analysis 88(2), 2004. https://doi.org/10.1016/S0047-259X(03)00096-4</w:t>
+        <w:t>[59] K. Lee, K. Lee, H. Lee, J. Shin, A Simple Unified Framework for Detecting Out-of-Distribution Samples and Adversarial Attacks, NeurIPS 2018. https://arxiv.org/abs/1807.03888</w:t>
       </w:r>
     </w:p>
     <w:p>
@@ -14419,7 +14449,7 @@
         <w:jc w:val="left"/>
       </w:pPr>
       <w:r>
-        <w:t>[60] Y. Sun, Y. Ming, X. Zhu, Y. Li, Out-of-Distribution Detection with Deep Nearest Neighbors, ICML 2022. https://arxiv.org/abs/2204.06507</w:t>
+        <w:t>[60] O. Ledoit, M. Wolf, A well-conditioned estimator for large-dimensional covariance matrices, Journal of Multivariate Analysis 88(2), 2004. https://doi.org/10.1016/S0047-259X(03)00096-4</w:t>
       </w:r>
     </w:p>
     <w:p>
@@ -14429,7 +14459,7 @@
         <w:jc w:val="left"/>
       </w:pPr>
       <w:r>
-        <w:t>[61] T. Darcet, M. Oquab, J. Mairal, P. Bojanowski, Vision Transformers Need Registers, ICLR 2024. https://arxiv.org/abs/2309.16588</w:t>
+        <w:t>[61] Y. Sun, Y. Ming, X. Zhu, Y. Li, Out-of-Distribution Detection with Deep Nearest Neighbors, ICML 2022. https://arxiv.org/abs/2204.06507</w:t>
       </w:r>
     </w:p>
     <w:p>
@@ -14439,7 +14469,7 @@
         <w:jc w:val="left"/>
       </w:pPr>
       <w:r>
-        <w:t>[62] Project Management Institute, A Guide to the Project Management Body of Knowledge (PMBOK Guide), ediția a 6-a, 2017. https://www.pmi.org/pmbok-guide-standards/foundational/pmbok</w:t>
+        <w:t>[62] T. Darcet, M. Oquab, J. Mairal, P. Bojanowski, Vision Transformers Need Registers, ICLR 2024. https://arxiv.org/abs/2309.16588</w:t>
       </w:r>
     </w:p>
     <w:p>
@@ -14449,7 +14479,17 @@
         <w:jc w:val="left"/>
       </w:pPr>
       <w:r>
-        <w:t>[63] K. Schwalbe, Information Technology Project Management, ediția a 9-a, Cengage Learning, 2019</w:t>
+        <w:t>[63] Project Management Institute, A Guide to the Project Management Body of Knowledge (PMBOK Guide), ediția a 6-a, 2017. https://www.pmi.org/pmbok-guide-standards/foundational/pmbok</w:t>
+      </w:r>
+    </w:p>
+    <w:p>
+      <w:pPr>
+        <w:spacing w:line="276" w:lineRule="auto"/>
+        <w:ind w:left="567" w:hanging="567"/>
+        <w:jc w:val="left"/>
+      </w:pPr>
+      <w:r>
+        <w:t>[64] K. Schwalbe, Information Technology Project Management, ediția a 9-a, Cengage Learning, 2019</w:t>
       </w:r>
     </w:p>
     <w:sectPr>

</xml_diff>

<commit_message>
fix(api): read the uploaded photo in memory with a size cap, never on disk
The multipart form spooled photos over 1 MB to a temporary file on disk
and parsed the whole body before the size check. The photo is now the raw
request body, read in chunks into memory and refused as soon as it passes
the limit, also without a Content-Length header; the service key is checked
before the body is read, and decoding and inference run in a worker thread.
Test added for a chunked body over the limit; thesis 6.1 and journal updated.
</commit_message>
<xml_diff>
--- a/docs/Teza_Licenta.docx
+++ b/docs/Teza_Licenta.docx
@@ -299,7 +299,7 @@
         </w:rPr>
         <w:fldChar w:fldCharType="separate"/>
       </w:r>
-      <w:hyperlink w:anchor="_Toc244063687" w:history="1">
+      <w:hyperlink w:anchor="_Toc244063830" w:history="1">
         <w:r>
           <w:rPr>
             <w:rStyle w:val="Hyperlink"/>
@@ -326,7 +326,7 @@
             <w:noProof/>
             <w:webHidden/>
           </w:rPr>
-          <w:instrText xml:space="preserve"> PAGEREF _Toc244063687 \h </w:instrText>
+          <w:instrText xml:space="preserve"> PAGEREF _Toc244063830 \h </w:instrText>
         </w:r>
         <w:r>
           <w:rPr>
@@ -373,7 +373,7 @@
           <w14:ligatures w14:val="standardContextual"/>
         </w:rPr>
       </w:pPr>
-      <w:hyperlink w:anchor="_Toc244063688" w:history="1">
+      <w:hyperlink w:anchor="_Toc244063831" w:history="1">
         <w:r>
           <w:rPr>
             <w:rStyle w:val="Hyperlink"/>
@@ -400,7 +400,7 @@
             <w:noProof/>
             <w:webHidden/>
           </w:rPr>
-          <w:instrText xml:space="preserve"> PAGEREF _Toc244063688 \h </w:instrText>
+          <w:instrText xml:space="preserve"> PAGEREF _Toc244063831 \h </w:instrText>
         </w:r>
         <w:r>
           <w:rPr>
@@ -447,7 +447,7 @@
           <w14:ligatures w14:val="standardContextual"/>
         </w:rPr>
       </w:pPr>
-      <w:hyperlink w:anchor="_Toc244063689" w:history="1">
+      <w:hyperlink w:anchor="_Toc244063832" w:history="1">
         <w:r>
           <w:rPr>
             <w:rStyle w:val="Hyperlink"/>
@@ -474,7 +474,7 @@
             <w:noProof/>
             <w:webHidden/>
           </w:rPr>
-          <w:instrText xml:space="preserve"> PAGEREF _Toc244063689 \h </w:instrText>
+          <w:instrText xml:space="preserve"> PAGEREF _Toc244063832 \h </w:instrText>
         </w:r>
         <w:r>
           <w:rPr>
@@ -521,7 +521,7 @@
           <w14:ligatures w14:val="standardContextual"/>
         </w:rPr>
       </w:pPr>
-      <w:hyperlink w:anchor="_Toc244063690" w:history="1">
+      <w:hyperlink w:anchor="_Toc244063833" w:history="1">
         <w:r>
           <w:rPr>
             <w:rStyle w:val="Hyperlink"/>
@@ -548,7 +548,7 @@
             <w:noProof/>
             <w:webHidden/>
           </w:rPr>
-          <w:instrText xml:space="preserve"> PAGEREF _Toc244063690 \h </w:instrText>
+          <w:instrText xml:space="preserve"> PAGEREF _Toc244063833 \h </w:instrText>
         </w:r>
         <w:r>
           <w:rPr>
@@ -595,7 +595,7 @@
           <w14:ligatures w14:val="standardContextual"/>
         </w:rPr>
       </w:pPr>
-      <w:hyperlink w:anchor="_Toc244063691" w:history="1">
+      <w:hyperlink w:anchor="_Toc244063834" w:history="1">
         <w:r>
           <w:rPr>
             <w:rStyle w:val="Hyperlink"/>
@@ -622,7 +622,7 @@
             <w:noProof/>
             <w:webHidden/>
           </w:rPr>
-          <w:instrText xml:space="preserve"> PAGEREF _Toc244063691 \h </w:instrText>
+          <w:instrText xml:space="preserve"> PAGEREF _Toc244063834 \h </w:instrText>
         </w:r>
         <w:r>
           <w:rPr>
@@ -669,7 +669,7 @@
           <w14:ligatures w14:val="standardContextual"/>
         </w:rPr>
       </w:pPr>
-      <w:hyperlink w:anchor="_Toc244063692" w:history="1">
+      <w:hyperlink w:anchor="_Toc244063835" w:history="1">
         <w:r>
           <w:rPr>
             <w:rStyle w:val="Hyperlink"/>
@@ -696,7 +696,7 @@
             <w:noProof/>
             <w:webHidden/>
           </w:rPr>
-          <w:instrText xml:space="preserve"> PAGEREF _Toc244063692 \h </w:instrText>
+          <w:instrText xml:space="preserve"> PAGEREF _Toc244063835 \h </w:instrText>
         </w:r>
         <w:r>
           <w:rPr>
@@ -743,7 +743,7 @@
           <w14:ligatures w14:val="standardContextual"/>
         </w:rPr>
       </w:pPr>
-      <w:hyperlink w:anchor="_Toc244063693" w:history="1">
+      <w:hyperlink w:anchor="_Toc244063836" w:history="1">
         <w:r>
           <w:rPr>
             <w:rStyle w:val="Hyperlink"/>
@@ -770,7 +770,7 @@
             <w:noProof/>
             <w:webHidden/>
           </w:rPr>
-          <w:instrText xml:space="preserve"> PAGEREF _Toc244063693 \h </w:instrText>
+          <w:instrText xml:space="preserve"> PAGEREF _Toc244063836 \h </w:instrText>
         </w:r>
         <w:r>
           <w:rPr>
@@ -817,7 +817,7 @@
           <w14:ligatures w14:val="standardContextual"/>
         </w:rPr>
       </w:pPr>
-      <w:hyperlink w:anchor="_Toc244063694" w:history="1">
+      <w:hyperlink w:anchor="_Toc244063837" w:history="1">
         <w:r>
           <w:rPr>
             <w:rStyle w:val="Hyperlink"/>
@@ -844,7 +844,7 @@
             <w:noProof/>
             <w:webHidden/>
           </w:rPr>
-          <w:instrText xml:space="preserve"> PAGEREF _Toc244063694 \h </w:instrText>
+          <w:instrText xml:space="preserve"> PAGEREF _Toc244063837 \h </w:instrText>
         </w:r>
         <w:r>
           <w:rPr>
@@ -891,7 +891,7 @@
           <w14:ligatures w14:val="standardContextual"/>
         </w:rPr>
       </w:pPr>
-      <w:hyperlink w:anchor="_Toc244063695" w:history="1">
+      <w:hyperlink w:anchor="_Toc244063838" w:history="1">
         <w:r>
           <w:rPr>
             <w:rStyle w:val="Hyperlink"/>
@@ -918,7 +918,7 @@
             <w:noProof/>
             <w:webHidden/>
           </w:rPr>
-          <w:instrText xml:space="preserve"> PAGEREF _Toc244063695 \h </w:instrText>
+          <w:instrText xml:space="preserve"> PAGEREF _Toc244063838 \h </w:instrText>
         </w:r>
         <w:r>
           <w:rPr>
@@ -965,7 +965,7 @@
           <w14:ligatures w14:val="standardContextual"/>
         </w:rPr>
       </w:pPr>
-      <w:hyperlink w:anchor="_Toc244063696" w:history="1">
+      <w:hyperlink w:anchor="_Toc244063839" w:history="1">
         <w:r>
           <w:rPr>
             <w:rStyle w:val="Hyperlink"/>
@@ -992,7 +992,7 @@
             <w:noProof/>
             <w:webHidden/>
           </w:rPr>
-          <w:instrText xml:space="preserve"> PAGEREF _Toc244063696 \h </w:instrText>
+          <w:instrText xml:space="preserve"> PAGEREF _Toc244063839 \h </w:instrText>
         </w:r>
         <w:r>
           <w:rPr>
@@ -1039,7 +1039,7 @@
           <w14:ligatures w14:val="standardContextual"/>
         </w:rPr>
       </w:pPr>
-      <w:hyperlink w:anchor="_Toc244063697" w:history="1">
+      <w:hyperlink w:anchor="_Toc244063840" w:history="1">
         <w:r>
           <w:rPr>
             <w:rStyle w:val="Hyperlink"/>
@@ -1066,7 +1066,7 @@
             <w:noProof/>
             <w:webHidden/>
           </w:rPr>
-          <w:instrText xml:space="preserve"> PAGEREF _Toc244063697 \h </w:instrText>
+          <w:instrText xml:space="preserve"> PAGEREF _Toc244063840 \h </w:instrText>
         </w:r>
         <w:r>
           <w:rPr>
@@ -1113,7 +1113,7 @@
           <w14:ligatures w14:val="standardContextual"/>
         </w:rPr>
       </w:pPr>
-      <w:hyperlink w:anchor="_Toc244063698" w:history="1">
+      <w:hyperlink w:anchor="_Toc244063841" w:history="1">
         <w:r>
           <w:rPr>
             <w:rStyle w:val="Hyperlink"/>
@@ -1140,7 +1140,7 @@
             <w:noProof/>
             <w:webHidden/>
           </w:rPr>
-          <w:instrText xml:space="preserve"> PAGEREF _Toc244063698 \h </w:instrText>
+          <w:instrText xml:space="preserve"> PAGEREF _Toc244063841 \h </w:instrText>
         </w:r>
         <w:r>
           <w:rPr>
@@ -1187,7 +1187,7 @@
           <w14:ligatures w14:val="standardContextual"/>
         </w:rPr>
       </w:pPr>
-      <w:hyperlink w:anchor="_Toc244063699" w:history="1">
+      <w:hyperlink w:anchor="_Toc244063842" w:history="1">
         <w:r>
           <w:rPr>
             <w:rStyle w:val="Hyperlink"/>
@@ -1214,7 +1214,7 @@
             <w:noProof/>
             <w:webHidden/>
           </w:rPr>
-          <w:instrText xml:space="preserve"> PAGEREF _Toc244063699 \h </w:instrText>
+          <w:instrText xml:space="preserve"> PAGEREF _Toc244063842 \h </w:instrText>
         </w:r>
         <w:r>
           <w:rPr>
@@ -1261,7 +1261,7 @@
           <w14:ligatures w14:val="standardContextual"/>
         </w:rPr>
       </w:pPr>
-      <w:hyperlink w:anchor="_Toc244063700" w:history="1">
+      <w:hyperlink w:anchor="_Toc244063843" w:history="1">
         <w:r>
           <w:rPr>
             <w:rStyle w:val="Hyperlink"/>
@@ -1288,7 +1288,7 @@
             <w:noProof/>
             <w:webHidden/>
           </w:rPr>
-          <w:instrText xml:space="preserve"> PAGEREF _Toc244063700 \h </w:instrText>
+          <w:instrText xml:space="preserve"> PAGEREF _Toc244063843 \h </w:instrText>
         </w:r>
         <w:r>
           <w:rPr>
@@ -1335,7 +1335,7 @@
           <w14:ligatures w14:val="standardContextual"/>
         </w:rPr>
       </w:pPr>
-      <w:hyperlink w:anchor="_Toc244063701" w:history="1">
+      <w:hyperlink w:anchor="_Toc244063844" w:history="1">
         <w:r>
           <w:rPr>
             <w:rStyle w:val="Hyperlink"/>
@@ -1362,7 +1362,7 @@
             <w:noProof/>
             <w:webHidden/>
           </w:rPr>
-          <w:instrText xml:space="preserve"> PAGEREF _Toc244063701 \h </w:instrText>
+          <w:instrText xml:space="preserve"> PAGEREF _Toc244063844 \h </w:instrText>
         </w:r>
         <w:r>
           <w:rPr>
@@ -1409,7 +1409,7 @@
           <w14:ligatures w14:val="standardContextual"/>
         </w:rPr>
       </w:pPr>
-      <w:hyperlink w:anchor="_Toc244063702" w:history="1">
+      <w:hyperlink w:anchor="_Toc244063845" w:history="1">
         <w:r>
           <w:rPr>
             <w:rStyle w:val="Hyperlink"/>
@@ -1436,7 +1436,7 @@
             <w:noProof/>
             <w:webHidden/>
           </w:rPr>
-          <w:instrText xml:space="preserve"> PAGEREF _Toc244063702 \h </w:instrText>
+          <w:instrText xml:space="preserve"> PAGEREF _Toc244063845 \h </w:instrText>
         </w:r>
         <w:r>
           <w:rPr>
@@ -1483,7 +1483,7 @@
           <w14:ligatures w14:val="standardContextual"/>
         </w:rPr>
       </w:pPr>
-      <w:hyperlink w:anchor="_Toc244063703" w:history="1">
+      <w:hyperlink w:anchor="_Toc244063846" w:history="1">
         <w:r>
           <w:rPr>
             <w:rStyle w:val="Hyperlink"/>
@@ -1510,7 +1510,7 @@
             <w:noProof/>
             <w:webHidden/>
           </w:rPr>
-          <w:instrText xml:space="preserve"> PAGEREF _Toc244063703 \h </w:instrText>
+          <w:instrText xml:space="preserve"> PAGEREF _Toc244063846 \h </w:instrText>
         </w:r>
         <w:r>
           <w:rPr>
@@ -1557,7 +1557,7 @@
           <w14:ligatures w14:val="standardContextual"/>
         </w:rPr>
       </w:pPr>
-      <w:hyperlink w:anchor="_Toc244063704" w:history="1">
+      <w:hyperlink w:anchor="_Toc244063847" w:history="1">
         <w:r>
           <w:rPr>
             <w:rStyle w:val="Hyperlink"/>
@@ -1584,7 +1584,7 @@
             <w:noProof/>
             <w:webHidden/>
           </w:rPr>
-          <w:instrText xml:space="preserve"> PAGEREF _Toc244063704 \h </w:instrText>
+          <w:instrText xml:space="preserve"> PAGEREF _Toc244063847 \h </w:instrText>
         </w:r>
         <w:r>
           <w:rPr>
@@ -1631,7 +1631,7 @@
           <w14:ligatures w14:val="standardContextual"/>
         </w:rPr>
       </w:pPr>
-      <w:hyperlink w:anchor="_Toc244063705" w:history="1">
+      <w:hyperlink w:anchor="_Toc244063848" w:history="1">
         <w:r>
           <w:rPr>
             <w:rStyle w:val="Hyperlink"/>
@@ -1658,7 +1658,7 @@
             <w:noProof/>
             <w:webHidden/>
           </w:rPr>
-          <w:instrText xml:space="preserve"> PAGEREF _Toc244063705 \h </w:instrText>
+          <w:instrText xml:space="preserve"> PAGEREF _Toc244063848 \h </w:instrText>
         </w:r>
         <w:r>
           <w:rPr>
@@ -1705,7 +1705,7 @@
           <w14:ligatures w14:val="standardContextual"/>
         </w:rPr>
       </w:pPr>
-      <w:hyperlink w:anchor="_Toc244063706" w:history="1">
+      <w:hyperlink w:anchor="_Toc244063849" w:history="1">
         <w:r>
           <w:rPr>
             <w:rStyle w:val="Hyperlink"/>
@@ -1732,7 +1732,7 @@
             <w:noProof/>
             <w:webHidden/>
           </w:rPr>
-          <w:instrText xml:space="preserve"> PAGEREF _Toc244063706 \h </w:instrText>
+          <w:instrText xml:space="preserve"> PAGEREF _Toc244063849 \h </w:instrText>
         </w:r>
         <w:r>
           <w:rPr>
@@ -1779,7 +1779,7 @@
           <w14:ligatures w14:val="standardContextual"/>
         </w:rPr>
       </w:pPr>
-      <w:hyperlink w:anchor="_Toc244063707" w:history="1">
+      <w:hyperlink w:anchor="_Toc244063850" w:history="1">
         <w:r>
           <w:rPr>
             <w:rStyle w:val="Hyperlink"/>
@@ -1806,7 +1806,7 @@
             <w:noProof/>
             <w:webHidden/>
           </w:rPr>
-          <w:instrText xml:space="preserve"> PAGEREF _Toc244063707 \h </w:instrText>
+          <w:instrText xml:space="preserve"> PAGEREF _Toc244063850 \h </w:instrText>
         </w:r>
         <w:r>
           <w:rPr>
@@ -1853,7 +1853,7 @@
           <w14:ligatures w14:val="standardContextual"/>
         </w:rPr>
       </w:pPr>
-      <w:hyperlink w:anchor="_Toc244063708" w:history="1">
+      <w:hyperlink w:anchor="_Toc244063851" w:history="1">
         <w:r>
           <w:rPr>
             <w:rStyle w:val="Hyperlink"/>
@@ -1880,7 +1880,7 @@
             <w:noProof/>
             <w:webHidden/>
           </w:rPr>
-          <w:instrText xml:space="preserve"> PAGEREF _Toc244063708 \h </w:instrText>
+          <w:instrText xml:space="preserve"> PAGEREF _Toc244063851 \h </w:instrText>
         </w:r>
         <w:r>
           <w:rPr>
@@ -1927,7 +1927,7 @@
           <w14:ligatures w14:val="standardContextual"/>
         </w:rPr>
       </w:pPr>
-      <w:hyperlink w:anchor="_Toc244063709" w:history="1">
+      <w:hyperlink w:anchor="_Toc244063852" w:history="1">
         <w:r>
           <w:rPr>
             <w:rStyle w:val="Hyperlink"/>
@@ -1954,7 +1954,7 @@
             <w:noProof/>
             <w:webHidden/>
           </w:rPr>
-          <w:instrText xml:space="preserve"> PAGEREF _Toc244063709 \h </w:instrText>
+          <w:instrText xml:space="preserve"> PAGEREF _Toc244063852 \h </w:instrText>
         </w:r>
         <w:r>
           <w:rPr>
@@ -2001,7 +2001,7 @@
           <w14:ligatures w14:val="standardContextual"/>
         </w:rPr>
       </w:pPr>
-      <w:hyperlink w:anchor="_Toc244063710" w:history="1">
+      <w:hyperlink w:anchor="_Toc244063853" w:history="1">
         <w:r>
           <w:rPr>
             <w:rStyle w:val="Hyperlink"/>
@@ -2028,7 +2028,7 @@
             <w:noProof/>
             <w:webHidden/>
           </w:rPr>
-          <w:instrText xml:space="preserve"> PAGEREF _Toc244063710 \h </w:instrText>
+          <w:instrText xml:space="preserve"> PAGEREF _Toc244063853 \h </w:instrText>
         </w:r>
         <w:r>
           <w:rPr>
@@ -2075,7 +2075,7 @@
           <w14:ligatures w14:val="standardContextual"/>
         </w:rPr>
       </w:pPr>
-      <w:hyperlink w:anchor="_Toc244063711" w:history="1">
+      <w:hyperlink w:anchor="_Toc244063854" w:history="1">
         <w:r>
           <w:rPr>
             <w:rStyle w:val="Hyperlink"/>
@@ -2102,7 +2102,7 @@
             <w:noProof/>
             <w:webHidden/>
           </w:rPr>
-          <w:instrText xml:space="preserve"> PAGEREF _Toc244063711 \h </w:instrText>
+          <w:instrText xml:space="preserve"> PAGEREF _Toc244063854 \h </w:instrText>
         </w:r>
         <w:r>
           <w:rPr>
@@ -2149,7 +2149,7 @@
           <w14:ligatures w14:val="standardContextual"/>
         </w:rPr>
       </w:pPr>
-      <w:hyperlink w:anchor="_Toc244063712" w:history="1">
+      <w:hyperlink w:anchor="_Toc244063855" w:history="1">
         <w:r>
           <w:rPr>
             <w:rStyle w:val="Hyperlink"/>
@@ -2176,7 +2176,7 @@
             <w:noProof/>
             <w:webHidden/>
           </w:rPr>
-          <w:instrText xml:space="preserve"> PAGEREF _Toc244063712 \h </w:instrText>
+          <w:instrText xml:space="preserve"> PAGEREF _Toc244063855 \h </w:instrText>
         </w:r>
         <w:r>
           <w:rPr>
@@ -2223,7 +2223,7 @@
           <w14:ligatures w14:val="standardContextual"/>
         </w:rPr>
       </w:pPr>
-      <w:hyperlink w:anchor="_Toc244063713" w:history="1">
+      <w:hyperlink w:anchor="_Toc244063856" w:history="1">
         <w:r>
           <w:rPr>
             <w:rStyle w:val="Hyperlink"/>
@@ -2250,7 +2250,7 @@
             <w:noProof/>
             <w:webHidden/>
           </w:rPr>
-          <w:instrText xml:space="preserve"> PAGEREF _Toc244063713 \h </w:instrText>
+          <w:instrText xml:space="preserve"> PAGEREF _Toc244063856 \h </w:instrText>
         </w:r>
         <w:r>
           <w:rPr>
@@ -2297,7 +2297,7 @@
           <w14:ligatures w14:val="standardContextual"/>
         </w:rPr>
       </w:pPr>
-      <w:hyperlink w:anchor="_Toc244063714" w:history="1">
+      <w:hyperlink w:anchor="_Toc244063857" w:history="1">
         <w:r>
           <w:rPr>
             <w:rStyle w:val="Hyperlink"/>
@@ -2324,7 +2324,7 @@
             <w:noProof/>
             <w:webHidden/>
           </w:rPr>
-          <w:instrText xml:space="preserve"> PAGEREF _Toc244063714 \h </w:instrText>
+          <w:instrText xml:space="preserve"> PAGEREF _Toc244063857 \h </w:instrText>
         </w:r>
         <w:r>
           <w:rPr>
@@ -2371,7 +2371,7 @@
           <w14:ligatures w14:val="standardContextual"/>
         </w:rPr>
       </w:pPr>
-      <w:hyperlink w:anchor="_Toc244063715" w:history="1">
+      <w:hyperlink w:anchor="_Toc244063858" w:history="1">
         <w:r>
           <w:rPr>
             <w:rStyle w:val="Hyperlink"/>
@@ -2398,7 +2398,7 @@
             <w:noProof/>
             <w:webHidden/>
           </w:rPr>
-          <w:instrText xml:space="preserve"> PAGEREF _Toc244063715 \h </w:instrText>
+          <w:instrText xml:space="preserve"> PAGEREF _Toc244063858 \h </w:instrText>
         </w:r>
         <w:r>
           <w:rPr>
@@ -2445,7 +2445,7 @@
           <w14:ligatures w14:val="standardContextual"/>
         </w:rPr>
       </w:pPr>
-      <w:hyperlink w:anchor="_Toc244063716" w:history="1">
+      <w:hyperlink w:anchor="_Toc244063859" w:history="1">
         <w:r>
           <w:rPr>
             <w:rStyle w:val="Hyperlink"/>
@@ -2472,7 +2472,7 @@
             <w:noProof/>
             <w:webHidden/>
           </w:rPr>
-          <w:instrText xml:space="preserve"> PAGEREF _Toc244063716 \h </w:instrText>
+          <w:instrText xml:space="preserve"> PAGEREF _Toc244063859 \h </w:instrText>
         </w:r>
         <w:r>
           <w:rPr>
@@ -2519,7 +2519,7 @@
           <w14:ligatures w14:val="standardContextual"/>
         </w:rPr>
       </w:pPr>
-      <w:hyperlink w:anchor="_Toc244063717" w:history="1">
+      <w:hyperlink w:anchor="_Toc244063860" w:history="1">
         <w:r>
           <w:rPr>
             <w:rStyle w:val="Hyperlink"/>
@@ -2546,7 +2546,7 @@
             <w:noProof/>
             <w:webHidden/>
           </w:rPr>
-          <w:instrText xml:space="preserve"> PAGEREF _Toc244063717 \h </w:instrText>
+          <w:instrText xml:space="preserve"> PAGEREF _Toc244063860 \h </w:instrText>
         </w:r>
         <w:r>
           <w:rPr>
@@ -2593,7 +2593,7 @@
           <w14:ligatures w14:val="standardContextual"/>
         </w:rPr>
       </w:pPr>
-      <w:hyperlink w:anchor="_Toc244063718" w:history="1">
+      <w:hyperlink w:anchor="_Toc244063861" w:history="1">
         <w:r>
           <w:rPr>
             <w:rStyle w:val="Hyperlink"/>
@@ -2620,7 +2620,7 @@
             <w:noProof/>
             <w:webHidden/>
           </w:rPr>
-          <w:instrText xml:space="preserve"> PAGEREF _Toc244063718 \h </w:instrText>
+          <w:instrText xml:space="preserve"> PAGEREF _Toc244063861 \h </w:instrText>
         </w:r>
         <w:r>
           <w:rPr>
@@ -2667,7 +2667,7 @@
           <w14:ligatures w14:val="standardContextual"/>
         </w:rPr>
       </w:pPr>
-      <w:hyperlink w:anchor="_Toc244063719" w:history="1">
+      <w:hyperlink w:anchor="_Toc244063862" w:history="1">
         <w:r>
           <w:rPr>
             <w:rStyle w:val="Hyperlink"/>
@@ -2694,7 +2694,7 @@
             <w:noProof/>
             <w:webHidden/>
           </w:rPr>
-          <w:instrText xml:space="preserve"> PAGEREF _Toc244063719 \h </w:instrText>
+          <w:instrText xml:space="preserve"> PAGEREF _Toc244063862 \h </w:instrText>
         </w:r>
         <w:r>
           <w:rPr>
@@ -2741,7 +2741,7 @@
           <w14:ligatures w14:val="standardContextual"/>
         </w:rPr>
       </w:pPr>
-      <w:hyperlink w:anchor="_Toc244063720" w:history="1">
+      <w:hyperlink w:anchor="_Toc244063863" w:history="1">
         <w:r>
           <w:rPr>
             <w:rStyle w:val="Hyperlink"/>
@@ -2768,7 +2768,7 @@
             <w:noProof/>
             <w:webHidden/>
           </w:rPr>
-          <w:instrText xml:space="preserve"> PAGEREF _Toc244063720 \h </w:instrText>
+          <w:instrText xml:space="preserve"> PAGEREF _Toc244063863 \h </w:instrText>
         </w:r>
         <w:r>
           <w:rPr>
@@ -2815,7 +2815,7 @@
           <w14:ligatures w14:val="standardContextual"/>
         </w:rPr>
       </w:pPr>
-      <w:hyperlink w:anchor="_Toc244063721" w:history="1">
+      <w:hyperlink w:anchor="_Toc244063864" w:history="1">
         <w:r>
           <w:rPr>
             <w:rStyle w:val="Hyperlink"/>
@@ -2842,7 +2842,7 @@
             <w:noProof/>
             <w:webHidden/>
           </w:rPr>
-          <w:instrText xml:space="preserve"> PAGEREF _Toc244063721 \h </w:instrText>
+          <w:instrText xml:space="preserve"> PAGEREF _Toc244063864 \h </w:instrText>
         </w:r>
         <w:r>
           <w:rPr>
@@ -2889,7 +2889,7 @@
           <w14:ligatures w14:val="standardContextual"/>
         </w:rPr>
       </w:pPr>
-      <w:hyperlink w:anchor="_Toc244063722" w:history="1">
+      <w:hyperlink w:anchor="_Toc244063865" w:history="1">
         <w:r>
           <w:rPr>
             <w:rStyle w:val="Hyperlink"/>
@@ -2916,7 +2916,7 @@
             <w:noProof/>
             <w:webHidden/>
           </w:rPr>
-          <w:instrText xml:space="preserve"> PAGEREF _Toc244063722 \h </w:instrText>
+          <w:instrText xml:space="preserve"> PAGEREF _Toc244063865 \h </w:instrText>
         </w:r>
         <w:r>
           <w:rPr>
@@ -2963,7 +2963,7 @@
           <w14:ligatures w14:val="standardContextual"/>
         </w:rPr>
       </w:pPr>
-      <w:hyperlink w:anchor="_Toc244063723" w:history="1">
+      <w:hyperlink w:anchor="_Toc244063866" w:history="1">
         <w:r>
           <w:rPr>
             <w:rStyle w:val="Hyperlink"/>
@@ -2990,7 +2990,7 @@
             <w:noProof/>
             <w:webHidden/>
           </w:rPr>
-          <w:instrText xml:space="preserve"> PAGEREF _Toc244063723 \h </w:instrText>
+          <w:instrText xml:space="preserve"> PAGEREF _Toc244063866 \h </w:instrText>
         </w:r>
         <w:r>
           <w:rPr>
@@ -5274,7 +5274,7 @@
       <w:pPr>
         <w:pStyle w:val="Heading1"/>
       </w:pPr>
-      <w:bookmarkStart w:id="0" w:name="_Toc244063687"/>
+      <w:bookmarkStart w:id="0" w:name="_Toc244063830"/>
       <w:r>
         <w:lastRenderedPageBreak/>
         <w:t>Capitolul 1. Introducere</w:t>
@@ -5285,7 +5285,7 @@
       <w:pPr>
         <w:pStyle w:val="Heading2"/>
       </w:pPr>
-      <w:bookmarkStart w:id="1" w:name="_Toc244063688"/>
+      <w:bookmarkStart w:id="1" w:name="_Toc244063831"/>
       <w:r>
         <w:t>1.1 Motivație</w:t>
       </w:r>
@@ -5321,7 +5321,7 @@
       <w:pPr>
         <w:pStyle w:val="Heading2"/>
       </w:pPr>
-      <w:bookmarkStart w:id="2" w:name="_Toc244063689"/>
+      <w:bookmarkStart w:id="2" w:name="_Toc244063832"/>
       <w:r>
         <w:t>1.2 Formularea problemei</w:t>
       </w:r>
@@ -5377,7 +5377,7 @@
       <w:pPr>
         <w:pStyle w:val="Heading2"/>
       </w:pPr>
-      <w:bookmarkStart w:id="3" w:name="_Toc244063690"/>
+      <w:bookmarkStart w:id="3" w:name="_Toc244063833"/>
       <w:r>
         <w:t>1.3 Obiective</w:t>
       </w:r>
@@ -5395,7 +5395,7 @@
       <w:pPr>
         <w:pStyle w:val="Heading2"/>
       </w:pPr>
-      <w:bookmarkStart w:id="4" w:name="_Toc244063691"/>
+      <w:bookmarkStart w:id="4" w:name="_Toc244063834"/>
       <w:r>
         <w:t>1.4 Contribuții</w:t>
       </w:r>
@@ -5413,7 +5413,7 @@
       <w:pPr>
         <w:pStyle w:val="Heading2"/>
       </w:pPr>
-      <w:bookmarkStart w:id="5" w:name="_Toc244063692"/>
+      <w:bookmarkStart w:id="5" w:name="_Toc244063835"/>
       <w:r>
         <w:t>1.5 Structura lucrării</w:t>
       </w:r>
@@ -5431,7 +5431,7 @@
       <w:pPr>
         <w:pStyle w:val="Heading1"/>
       </w:pPr>
-      <w:bookmarkStart w:id="6" w:name="_Toc244063693"/>
+      <w:bookmarkStart w:id="6" w:name="_Toc244063836"/>
       <w:r>
         <w:lastRenderedPageBreak/>
         <w:t>Capitolul 2. Fundamente teoretice și lucrări conexe</w:t>
@@ -5450,7 +5450,7 @@
       <w:pPr>
         <w:pStyle w:val="Heading1"/>
       </w:pPr>
-      <w:bookmarkStart w:id="7" w:name="_Toc244063694"/>
+      <w:bookmarkStart w:id="7" w:name="_Toc244063837"/>
       <w:r>
         <w:lastRenderedPageBreak/>
         <w:t>Capitolul 3. Cerințe</w:t>
@@ -5469,7 +5469,7 @@
       <w:pPr>
         <w:pStyle w:val="Heading1"/>
       </w:pPr>
-      <w:bookmarkStart w:id="8" w:name="_Toc244063695"/>
+      <w:bookmarkStart w:id="8" w:name="_Toc244063838"/>
       <w:r>
         <w:lastRenderedPageBreak/>
         <w:t>Capitolul 4. Proiectarea sistemului și arhitectura</w:t>
@@ -5488,7 +5488,7 @@
       <w:pPr>
         <w:pStyle w:val="Heading2"/>
       </w:pPr>
-      <w:bookmarkStart w:id="9" w:name="_Toc244063696"/>
+      <w:bookmarkStart w:id="9" w:name="_Toc244063839"/>
       <w:r>
         <w:t>4.1 Modelul conceptual al datelor: diagrama Entitate-Legătură extinsă (EER)</w:t>
       </w:r>
@@ -5772,7 +5772,7 @@
       <w:pPr>
         <w:pStyle w:val="Heading2"/>
       </w:pPr>
-      <w:bookmarkStart w:id="12" w:name="_Toc244063697"/>
+      <w:bookmarkStart w:id="12" w:name="_Toc244063840"/>
       <w:r>
         <w:t>4.2 Interfața utilizator</w:t>
       </w:r>
@@ -6188,7 +6188,7 @@
       <w:pPr>
         <w:pStyle w:val="Heading1"/>
       </w:pPr>
-      <w:bookmarkStart w:id="15" w:name="_Toc244063698"/>
+      <w:bookmarkStart w:id="15" w:name="_Toc244063841"/>
       <w:r>
         <w:lastRenderedPageBreak/>
         <w:t>Capitolul 5. Metodologia AI/ML</w:t>
@@ -6207,7 +6207,7 @@
       <w:pPr>
         <w:pStyle w:val="Heading2"/>
       </w:pPr>
-      <w:bookmarkStart w:id="16" w:name="_Toc244063699"/>
+      <w:bookmarkStart w:id="16" w:name="_Toc244063842"/>
       <w:r>
         <w:t>5.1 Setul de date SCIN și scalele de ton al pielii</w:t>
       </w:r>
@@ -6290,7 +6290,7 @@
       <w:pPr>
         <w:pStyle w:val="Heading2"/>
       </w:pPr>
-      <w:bookmarkStart w:id="17" w:name="_Toc244063700"/>
+      <w:bookmarkStart w:id="17" w:name="_Toc244063843"/>
       <w:r>
         <w:lastRenderedPageBreak/>
         <w:t>5.2 Auditul datelor</w:t>
@@ -6890,7 +6890,7 @@
       <w:pPr>
         <w:pStyle w:val="Heading2"/>
       </w:pPr>
-      <w:bookmarkStart w:id="19" w:name="_Toc244063701"/>
+      <w:bookmarkStart w:id="19" w:name="_Toc244063844"/>
       <w:r>
         <w:t>5.3 Categoriile țintă</w:t>
       </w:r>
@@ -7571,7 +7571,7 @@
       <w:pPr>
         <w:pStyle w:val="Heading2"/>
       </w:pPr>
-      <w:bookmarkStart w:id="21" w:name="_Toc244063702"/>
+      <w:bookmarkStart w:id="21" w:name="_Toc244063845"/>
       <w:r>
         <w:t>5.4 Codificarea chestionarului și masca de valori lipsă</w:t>
       </w:r>
@@ -7589,7 +7589,7 @@
       <w:pPr>
         <w:pStyle w:val="Heading2"/>
       </w:pPr>
-      <w:bookmarkStart w:id="22" w:name="_Toc244063703"/>
+      <w:bookmarkStart w:id="22" w:name="_Toc244063846"/>
       <w:r>
         <w:lastRenderedPageBreak/>
         <w:t>5.5 Împărțirea și preprocesarea datelor</w:t>
@@ -7634,7 +7634,7 @@
       <w:pPr>
         <w:pStyle w:val="Heading2"/>
       </w:pPr>
-      <w:bookmarkStart w:id="23" w:name="_Toc244063704"/>
+      <w:bookmarkStart w:id="23" w:name="_Toc244063847"/>
       <w:r>
         <w:t>5.6 Modelele</w:t>
       </w:r>
@@ -7739,7 +7739,7 @@
       <w:pPr>
         <w:pStyle w:val="Heading2"/>
       </w:pPr>
-      <w:bookmarkStart w:id="24" w:name="_Toc244063705"/>
+      <w:bookmarkStart w:id="24" w:name="_Toc244063848"/>
       <w:r>
         <w:lastRenderedPageBreak/>
         <w:t>5.7 Protocolul de evaluare</w:t>
@@ -7804,7 +7804,7 @@
       <w:pPr>
         <w:pStyle w:val="Heading2"/>
       </w:pPr>
-      <w:bookmarkStart w:id="25" w:name="_Toc244063706"/>
+      <w:bookmarkStart w:id="25" w:name="_Toc244063849"/>
       <w:r>
         <w:t>5.8 Date externe și encodere preantrenate</w:t>
       </w:r>
@@ -7875,7 +7875,7 @@
       <w:pPr>
         <w:pStyle w:val="Heading2"/>
       </w:pPr>
-      <w:bookmarkStart w:id="26" w:name="_Toc244063707"/>
+      <w:bookmarkStart w:id="26" w:name="_Toc244063850"/>
       <w:r>
         <w:lastRenderedPageBreak/>
         <w:t>5.9 Explicabilitate (Grad-CAM)</w:t>
@@ -7894,7 +7894,7 @@
       <w:pPr>
         <w:pStyle w:val="Heading1"/>
       </w:pPr>
-      <w:bookmarkStart w:id="27" w:name="_Toc244063708"/>
+      <w:bookmarkStart w:id="27" w:name="_Toc244063851"/>
       <w:r>
         <w:lastRenderedPageBreak/>
         <w:t>Capitolul 6. Implementare</w:t>
@@ -7913,7 +7913,7 @@
       <w:pPr>
         <w:pStyle w:val="Heading2"/>
       </w:pPr>
-      <w:bookmarkStart w:id="28" w:name="_Toc244063709"/>
+      <w:bookmarkStart w:id="28" w:name="_Toc244063852"/>
       <w:r>
         <w:t>6.1 Serviciul ML: modelul exportat</w:t>
       </w:r>
@@ -8320,14 +8320,14 @@
         <w:t>POST /v1/analyze</w:t>
       </w:r>
       <w:r>
-        <w:t xml:space="preserve"> primește o fotografie, o decodează doar în memorie (fără scriere pe disc și fără jurnalizarea imaginii), o rotește după orientarea EXIF (metadatele prin care telefonul notează cum a fost ținut) și întoarce decizia, probabilitățile, amprenta fișierului modelului și avertismentul permanent că rezultatul este informativ. Sunt refuzate fișierele mai mari de 10 MB, imaginile de peste 40 de milioane de pixeli (protecție împotriva fișierelor construite pentru a epuiza memoria), alte formate decât JPEG, PNG și WebP și cererile fără cheia secretă partajată cu backend-ul. Opt teste automate verifică aceste reguli, iar unul dintre ele rulează modelul real cap la cap.</w:t>
+        <w:t xml:space="preserve"> primește o fotografie, o decodează doar în memorie (fără scriere pe disc și fără jurnalizarea imaginii), o rotește după orientarea EXIF (metadatele prin care telefonul notează cum a fost ținut) și întoarce decizia, probabilitățile, amprenta fișierului modelului și avertismentul permanent că rezultatul este informativ. Sunt refuzate fișierele mai mari de 10 MB, imaginile de peste 40 de milioane de pixeli (protecție împotriva fișierelor construite pentru a epuiza memoria), alte formate decât JPEG, PNG și WebP și cererile fără cheia secretă partajată cu backend-ul. Fotografia este trimisă direct ca fișier, nu ca formular, iar corpul cererii este citit în bucăți și respins imediat ce depășește limita: un parser de formulare ar scrie fișierele mari pe disc înainte de orice verificare. Nouă teste automate verifică aceste reguli, iar unul dintre ele rulează modelul real cap la cap.</w:t>
       </w:r>
     </w:p>
     <w:p>
       <w:pPr>
         <w:pStyle w:val="Heading1"/>
       </w:pPr>
-      <w:bookmarkStart w:id="29" w:name="_Toc244063710"/>
+      <w:bookmarkStart w:id="29" w:name="_Toc244063853"/>
       <w:r>
         <w:lastRenderedPageBreak/>
         <w:t>Capitolul 7. Securitate și GDPR</w:t>
@@ -8346,7 +8346,7 @@
       <w:pPr>
         <w:pStyle w:val="Heading1"/>
       </w:pPr>
-      <w:bookmarkStart w:id="30" w:name="_Toc244063711"/>
+      <w:bookmarkStart w:id="30" w:name="_Toc244063854"/>
       <w:r>
         <w:lastRenderedPageBreak/>
         <w:t>Capitolul 8. Testare și evaluare</w:t>
@@ -8365,7 +8365,7 @@
       <w:pPr>
         <w:pStyle w:val="Heading2"/>
       </w:pPr>
-      <w:bookmarkStart w:id="31" w:name="_Toc244063712"/>
+      <w:bookmarkStart w:id="31" w:name="_Toc244063855"/>
       <w:r>
         <w:t>8.1 Aduce chestionarul un câștig? (E1)</w:t>
       </w:r>
@@ -8868,7 +8868,7 @@
       <w:pPr>
         <w:pStyle w:val="Heading2"/>
       </w:pPr>
-      <w:bookmarkStart w:id="33" w:name="_Toc244063713"/>
+      <w:bookmarkStart w:id="33" w:name="_Toc244063856"/>
       <w:r>
         <w:t>8.2 De ce nu ajută chestionarul?</w:t>
       </w:r>
@@ -9310,7 +9310,7 @@
       <w:pPr>
         <w:pStyle w:val="Heading2"/>
       </w:pPr>
-      <w:bookmarkStart w:id="35" w:name="_Toc244063714"/>
+      <w:bookmarkStart w:id="35" w:name="_Toc244063857"/>
       <w:r>
         <w:lastRenderedPageBreak/>
         <w:t>8.3 Răspunsuri lipsă (E2)</w:t>
@@ -9843,7 +9843,7 @@
       <w:pPr>
         <w:pStyle w:val="Heading2"/>
       </w:pPr>
-      <w:bookmarkStart w:id="38" w:name="_Toc244063715"/>
+      <w:bookmarkStart w:id="38" w:name="_Toc244063858"/>
       <w:r>
         <w:t>8.4 Date suplimentare și test extern (E7)</w:t>
       </w:r>
@@ -10147,7 +10147,7 @@
       <w:pPr>
         <w:pStyle w:val="Heading2"/>
       </w:pPr>
-      <w:bookmarkStart w:id="40" w:name="_Toc244063716"/>
+      <w:bookmarkStart w:id="40" w:name="_Toc244063859"/>
       <w:r>
         <w:t>8.5 Encodere preantrenate (E5)</w:t>
       </w:r>
@@ -10651,7 +10651,7 @@
       <w:pPr>
         <w:pStyle w:val="Heading2"/>
       </w:pPr>
-      <w:bookmarkStart w:id="42" w:name="_Toc244063717"/>
+      <w:bookmarkStart w:id="42" w:name="_Toc244063860"/>
       <w:r>
         <w:t>8.6 Calibrarea încrederii și abținerea (E4)</w:t>
       </w:r>
@@ -12550,7 +12550,7 @@
       <w:pPr>
         <w:pStyle w:val="Heading2"/>
       </w:pPr>
-      <w:bookmarkStart w:id="48" w:name="_Toc244063718"/>
+      <w:bookmarkStart w:id="48" w:name="_Toc244063861"/>
       <w:r>
         <w:t>8.7 Explicabilitate (Grad-CAM)</w:t>
       </w:r>
@@ -12852,7 +12852,7 @@
       <w:pPr>
         <w:pStyle w:val="Heading2"/>
       </w:pPr>
-      <w:bookmarkStart w:id="50" w:name="_Toc244063719"/>
+      <w:bookmarkStart w:id="50" w:name="_Toc244063862"/>
       <w:r>
         <w:t>8.8 Sinteza rezultatelor și modelul ales pentru aplicație</w:t>
       </w:r>
@@ -13472,7 +13472,7 @@
       <w:pPr>
         <w:pStyle w:val="Heading1"/>
       </w:pPr>
-      <w:bookmarkStart w:id="52" w:name="_Toc244063720"/>
+      <w:bookmarkStart w:id="52" w:name="_Toc244063863"/>
       <w:r>
         <w:lastRenderedPageBreak/>
         <w:t>Capitolul 9. Concluzii și direcții viitoare</w:t>
@@ -13491,7 +13491,7 @@
       <w:pPr>
         <w:pStyle w:val="Heading1"/>
       </w:pPr>
-      <w:bookmarkStart w:id="53" w:name="_Toc244063721"/>
+      <w:bookmarkStart w:id="53" w:name="_Toc244063864"/>
       <w:r>
         <w:lastRenderedPageBreak/>
         <w:t>Anexe</w:t>
@@ -13510,7 +13510,7 @@
       <w:pPr>
         <w:pStyle w:val="Heading2"/>
       </w:pPr>
-      <w:bookmarkStart w:id="54" w:name="_Toc244063722"/>
+      <w:bookmarkStart w:id="54" w:name="_Toc244063865"/>
       <w:r>
         <w:t>Anexa A. Planificarea proiectului: enunțul domeniului, WBS și riscurile</w:t>
       </w:r>
@@ -13842,7 +13842,7 @@
       <w:pPr>
         <w:pStyle w:val="Heading1"/>
       </w:pPr>
-      <w:bookmarkStart w:id="58" w:name="_Toc244063723"/>
+      <w:bookmarkStart w:id="58" w:name="_Toc244063866"/>
       <w:r>
         <w:lastRenderedPageBreak/>
         <w:t>Bibliografie</w:t>

</xml_diff>

<commit_message>
docs(db): add the EER-to-relational mapping sheet
Add a third draw.io page that shows the EER model and the BCNF
relational schema on one sheet, so the derivation of every table can
be followed:

- coloured badges T1-T26 on each EER element that became a table,
  repeated on the table it produced
- dashed FK->Tn badges on the 11 relationships that became foreign keys
- a mapping table with the construct and the mapping rule (R1-R10)

Exported as docs/Schema_ER_relational_Giotina.pdf and
docs/diagrams/eer_to_relational.png. Thesis section 4.1 points to the
attachment.
</commit_message>
<xml_diff>
--- a/docs/Teza_Licenta.docx
+++ b/docs/Teza_Licenta.docx
@@ -299,7 +299,7 @@
         </w:rPr>
         <w:fldChar w:fldCharType="separate"/>
       </w:r>
-      <w:hyperlink w:anchor="_Toc244063830" w:history="1">
+      <w:hyperlink w:anchor="_Toc244189214" w:history="1">
         <w:r>
           <w:rPr>
             <w:rStyle w:val="Hyperlink"/>
@@ -326,7 +326,7 @@
             <w:noProof/>
             <w:webHidden/>
           </w:rPr>
-          <w:instrText xml:space="preserve"> PAGEREF _Toc244063830 \h </w:instrText>
+          <w:instrText xml:space="preserve"> PAGEREF _Toc244189214 \h </w:instrText>
         </w:r>
         <w:r>
           <w:rPr>
@@ -373,7 +373,7 @@
           <w14:ligatures w14:val="standardContextual"/>
         </w:rPr>
       </w:pPr>
-      <w:hyperlink w:anchor="_Toc244063831" w:history="1">
+      <w:hyperlink w:anchor="_Toc244189215" w:history="1">
         <w:r>
           <w:rPr>
             <w:rStyle w:val="Hyperlink"/>
@@ -400,7 +400,7 @@
             <w:noProof/>
             <w:webHidden/>
           </w:rPr>
-          <w:instrText xml:space="preserve"> PAGEREF _Toc244063831 \h </w:instrText>
+          <w:instrText xml:space="preserve"> PAGEREF _Toc244189215 \h </w:instrText>
         </w:r>
         <w:r>
           <w:rPr>
@@ -447,7 +447,7 @@
           <w14:ligatures w14:val="standardContextual"/>
         </w:rPr>
       </w:pPr>
-      <w:hyperlink w:anchor="_Toc244063832" w:history="1">
+      <w:hyperlink w:anchor="_Toc244189216" w:history="1">
         <w:r>
           <w:rPr>
             <w:rStyle w:val="Hyperlink"/>
@@ -474,7 +474,7 @@
             <w:noProof/>
             <w:webHidden/>
           </w:rPr>
-          <w:instrText xml:space="preserve"> PAGEREF _Toc244063832 \h </w:instrText>
+          <w:instrText xml:space="preserve"> PAGEREF _Toc244189216 \h </w:instrText>
         </w:r>
         <w:r>
           <w:rPr>
@@ -521,7 +521,7 @@
           <w14:ligatures w14:val="standardContextual"/>
         </w:rPr>
       </w:pPr>
-      <w:hyperlink w:anchor="_Toc244063833" w:history="1">
+      <w:hyperlink w:anchor="_Toc244189217" w:history="1">
         <w:r>
           <w:rPr>
             <w:rStyle w:val="Hyperlink"/>
@@ -548,7 +548,7 @@
             <w:noProof/>
             <w:webHidden/>
           </w:rPr>
-          <w:instrText xml:space="preserve"> PAGEREF _Toc244063833 \h </w:instrText>
+          <w:instrText xml:space="preserve"> PAGEREF _Toc244189217 \h </w:instrText>
         </w:r>
         <w:r>
           <w:rPr>
@@ -595,7 +595,7 @@
           <w14:ligatures w14:val="standardContextual"/>
         </w:rPr>
       </w:pPr>
-      <w:hyperlink w:anchor="_Toc244063834" w:history="1">
+      <w:hyperlink w:anchor="_Toc244189218" w:history="1">
         <w:r>
           <w:rPr>
             <w:rStyle w:val="Hyperlink"/>
@@ -622,7 +622,7 @@
             <w:noProof/>
             <w:webHidden/>
           </w:rPr>
-          <w:instrText xml:space="preserve"> PAGEREF _Toc244063834 \h </w:instrText>
+          <w:instrText xml:space="preserve"> PAGEREF _Toc244189218 \h </w:instrText>
         </w:r>
         <w:r>
           <w:rPr>
@@ -669,7 +669,7 @@
           <w14:ligatures w14:val="standardContextual"/>
         </w:rPr>
       </w:pPr>
-      <w:hyperlink w:anchor="_Toc244063835" w:history="1">
+      <w:hyperlink w:anchor="_Toc244189219" w:history="1">
         <w:r>
           <w:rPr>
             <w:rStyle w:val="Hyperlink"/>
@@ -696,7 +696,7 @@
             <w:noProof/>
             <w:webHidden/>
           </w:rPr>
-          <w:instrText xml:space="preserve"> PAGEREF _Toc244063835 \h </w:instrText>
+          <w:instrText xml:space="preserve"> PAGEREF _Toc244189219 \h </w:instrText>
         </w:r>
         <w:r>
           <w:rPr>
@@ -743,7 +743,7 @@
           <w14:ligatures w14:val="standardContextual"/>
         </w:rPr>
       </w:pPr>
-      <w:hyperlink w:anchor="_Toc244063836" w:history="1">
+      <w:hyperlink w:anchor="_Toc244189220" w:history="1">
         <w:r>
           <w:rPr>
             <w:rStyle w:val="Hyperlink"/>
@@ -770,7 +770,7 @@
             <w:noProof/>
             <w:webHidden/>
           </w:rPr>
-          <w:instrText xml:space="preserve"> PAGEREF _Toc244063836 \h </w:instrText>
+          <w:instrText xml:space="preserve"> PAGEREF _Toc244189220 \h </w:instrText>
         </w:r>
         <w:r>
           <w:rPr>
@@ -817,7 +817,7 @@
           <w14:ligatures w14:val="standardContextual"/>
         </w:rPr>
       </w:pPr>
-      <w:hyperlink w:anchor="_Toc244063837" w:history="1">
+      <w:hyperlink w:anchor="_Toc244189221" w:history="1">
         <w:r>
           <w:rPr>
             <w:rStyle w:val="Hyperlink"/>
@@ -844,7 +844,7 @@
             <w:noProof/>
             <w:webHidden/>
           </w:rPr>
-          <w:instrText xml:space="preserve"> PAGEREF _Toc244063837 \h </w:instrText>
+          <w:instrText xml:space="preserve"> PAGEREF _Toc244189221 \h </w:instrText>
         </w:r>
         <w:r>
           <w:rPr>
@@ -891,7 +891,7 @@
           <w14:ligatures w14:val="standardContextual"/>
         </w:rPr>
       </w:pPr>
-      <w:hyperlink w:anchor="_Toc244063838" w:history="1">
+      <w:hyperlink w:anchor="_Toc244189222" w:history="1">
         <w:r>
           <w:rPr>
             <w:rStyle w:val="Hyperlink"/>
@@ -918,7 +918,7 @@
             <w:noProof/>
             <w:webHidden/>
           </w:rPr>
-          <w:instrText xml:space="preserve"> PAGEREF _Toc244063838 \h </w:instrText>
+          <w:instrText xml:space="preserve"> PAGEREF _Toc244189222 \h </w:instrText>
         </w:r>
         <w:r>
           <w:rPr>
@@ -965,7 +965,7 @@
           <w14:ligatures w14:val="standardContextual"/>
         </w:rPr>
       </w:pPr>
-      <w:hyperlink w:anchor="_Toc244063839" w:history="1">
+      <w:hyperlink w:anchor="_Toc244189223" w:history="1">
         <w:r>
           <w:rPr>
             <w:rStyle w:val="Hyperlink"/>
@@ -992,7 +992,7 @@
             <w:noProof/>
             <w:webHidden/>
           </w:rPr>
-          <w:instrText xml:space="preserve"> PAGEREF _Toc244063839 \h </w:instrText>
+          <w:instrText xml:space="preserve"> PAGEREF _Toc244189223 \h </w:instrText>
         </w:r>
         <w:r>
           <w:rPr>
@@ -1039,7 +1039,7 @@
           <w14:ligatures w14:val="standardContextual"/>
         </w:rPr>
       </w:pPr>
-      <w:hyperlink w:anchor="_Toc244063840" w:history="1">
+      <w:hyperlink w:anchor="_Toc244189224" w:history="1">
         <w:r>
           <w:rPr>
             <w:rStyle w:val="Hyperlink"/>
@@ -1066,7 +1066,7 @@
             <w:noProof/>
             <w:webHidden/>
           </w:rPr>
-          <w:instrText xml:space="preserve"> PAGEREF _Toc244063840 \h </w:instrText>
+          <w:instrText xml:space="preserve"> PAGEREF _Toc244189224 \h </w:instrText>
         </w:r>
         <w:r>
           <w:rPr>
@@ -1113,7 +1113,7 @@
           <w14:ligatures w14:val="standardContextual"/>
         </w:rPr>
       </w:pPr>
-      <w:hyperlink w:anchor="_Toc244063841" w:history="1">
+      <w:hyperlink w:anchor="_Toc244189225" w:history="1">
         <w:r>
           <w:rPr>
             <w:rStyle w:val="Hyperlink"/>
@@ -1140,7 +1140,7 @@
             <w:noProof/>
             <w:webHidden/>
           </w:rPr>
-          <w:instrText xml:space="preserve"> PAGEREF _Toc244063841 \h </w:instrText>
+          <w:instrText xml:space="preserve"> PAGEREF _Toc244189225 \h </w:instrText>
         </w:r>
         <w:r>
           <w:rPr>
@@ -1187,7 +1187,7 @@
           <w14:ligatures w14:val="standardContextual"/>
         </w:rPr>
       </w:pPr>
-      <w:hyperlink w:anchor="_Toc244063842" w:history="1">
+      <w:hyperlink w:anchor="_Toc244189226" w:history="1">
         <w:r>
           <w:rPr>
             <w:rStyle w:val="Hyperlink"/>
@@ -1214,7 +1214,7 @@
             <w:noProof/>
             <w:webHidden/>
           </w:rPr>
-          <w:instrText xml:space="preserve"> PAGEREF _Toc244063842 \h </w:instrText>
+          <w:instrText xml:space="preserve"> PAGEREF _Toc244189226 \h </w:instrText>
         </w:r>
         <w:r>
           <w:rPr>
@@ -1261,7 +1261,7 @@
           <w14:ligatures w14:val="standardContextual"/>
         </w:rPr>
       </w:pPr>
-      <w:hyperlink w:anchor="_Toc244063843" w:history="1">
+      <w:hyperlink w:anchor="_Toc244189227" w:history="1">
         <w:r>
           <w:rPr>
             <w:rStyle w:val="Hyperlink"/>
@@ -1288,7 +1288,7 @@
             <w:noProof/>
             <w:webHidden/>
           </w:rPr>
-          <w:instrText xml:space="preserve"> PAGEREF _Toc244063843 \h </w:instrText>
+          <w:instrText xml:space="preserve"> PAGEREF _Toc244189227 \h </w:instrText>
         </w:r>
         <w:r>
           <w:rPr>
@@ -1335,7 +1335,7 @@
           <w14:ligatures w14:val="standardContextual"/>
         </w:rPr>
       </w:pPr>
-      <w:hyperlink w:anchor="_Toc244063844" w:history="1">
+      <w:hyperlink w:anchor="_Toc244189228" w:history="1">
         <w:r>
           <w:rPr>
             <w:rStyle w:val="Hyperlink"/>
@@ -1362,7 +1362,7 @@
             <w:noProof/>
             <w:webHidden/>
           </w:rPr>
-          <w:instrText xml:space="preserve"> PAGEREF _Toc244063844 \h </w:instrText>
+          <w:instrText xml:space="preserve"> PAGEREF _Toc244189228 \h </w:instrText>
         </w:r>
         <w:r>
           <w:rPr>
@@ -1409,7 +1409,7 @@
           <w14:ligatures w14:val="standardContextual"/>
         </w:rPr>
       </w:pPr>
-      <w:hyperlink w:anchor="_Toc244063845" w:history="1">
+      <w:hyperlink w:anchor="_Toc244189229" w:history="1">
         <w:r>
           <w:rPr>
             <w:rStyle w:val="Hyperlink"/>
@@ -1436,7 +1436,7 @@
             <w:noProof/>
             <w:webHidden/>
           </w:rPr>
-          <w:instrText xml:space="preserve"> PAGEREF _Toc244063845 \h </w:instrText>
+          <w:instrText xml:space="preserve"> PAGEREF _Toc244189229 \h </w:instrText>
         </w:r>
         <w:r>
           <w:rPr>
@@ -1483,7 +1483,7 @@
           <w14:ligatures w14:val="standardContextual"/>
         </w:rPr>
       </w:pPr>
-      <w:hyperlink w:anchor="_Toc244063846" w:history="1">
+      <w:hyperlink w:anchor="_Toc244189230" w:history="1">
         <w:r>
           <w:rPr>
             <w:rStyle w:val="Hyperlink"/>
@@ -1510,7 +1510,7 @@
             <w:noProof/>
             <w:webHidden/>
           </w:rPr>
-          <w:instrText xml:space="preserve"> PAGEREF _Toc244063846 \h </w:instrText>
+          <w:instrText xml:space="preserve"> PAGEREF _Toc244189230 \h </w:instrText>
         </w:r>
         <w:r>
           <w:rPr>
@@ -1557,7 +1557,7 @@
           <w14:ligatures w14:val="standardContextual"/>
         </w:rPr>
       </w:pPr>
-      <w:hyperlink w:anchor="_Toc244063847" w:history="1">
+      <w:hyperlink w:anchor="_Toc244189231" w:history="1">
         <w:r>
           <w:rPr>
             <w:rStyle w:val="Hyperlink"/>
@@ -1584,7 +1584,7 @@
             <w:noProof/>
             <w:webHidden/>
           </w:rPr>
-          <w:instrText xml:space="preserve"> PAGEREF _Toc244063847 \h </w:instrText>
+          <w:instrText xml:space="preserve"> PAGEREF _Toc244189231 \h </w:instrText>
         </w:r>
         <w:r>
           <w:rPr>
@@ -1631,7 +1631,7 @@
           <w14:ligatures w14:val="standardContextual"/>
         </w:rPr>
       </w:pPr>
-      <w:hyperlink w:anchor="_Toc244063848" w:history="1">
+      <w:hyperlink w:anchor="_Toc244189232" w:history="1">
         <w:r>
           <w:rPr>
             <w:rStyle w:val="Hyperlink"/>
@@ -1658,7 +1658,7 @@
             <w:noProof/>
             <w:webHidden/>
           </w:rPr>
-          <w:instrText xml:space="preserve"> PAGEREF _Toc244063848 \h </w:instrText>
+          <w:instrText xml:space="preserve"> PAGEREF _Toc244189232 \h </w:instrText>
         </w:r>
         <w:r>
           <w:rPr>
@@ -1705,7 +1705,7 @@
           <w14:ligatures w14:val="standardContextual"/>
         </w:rPr>
       </w:pPr>
-      <w:hyperlink w:anchor="_Toc244063849" w:history="1">
+      <w:hyperlink w:anchor="_Toc244189233" w:history="1">
         <w:r>
           <w:rPr>
             <w:rStyle w:val="Hyperlink"/>
@@ -1732,7 +1732,7 @@
             <w:noProof/>
             <w:webHidden/>
           </w:rPr>
-          <w:instrText xml:space="preserve"> PAGEREF _Toc244063849 \h </w:instrText>
+          <w:instrText xml:space="preserve"> PAGEREF _Toc244189233 \h </w:instrText>
         </w:r>
         <w:r>
           <w:rPr>
@@ -1779,7 +1779,7 @@
           <w14:ligatures w14:val="standardContextual"/>
         </w:rPr>
       </w:pPr>
-      <w:hyperlink w:anchor="_Toc244063850" w:history="1">
+      <w:hyperlink w:anchor="_Toc244189234" w:history="1">
         <w:r>
           <w:rPr>
             <w:rStyle w:val="Hyperlink"/>
@@ -1806,7 +1806,7 @@
             <w:noProof/>
             <w:webHidden/>
           </w:rPr>
-          <w:instrText xml:space="preserve"> PAGEREF _Toc244063850 \h </w:instrText>
+          <w:instrText xml:space="preserve"> PAGEREF _Toc244189234 \h </w:instrText>
         </w:r>
         <w:r>
           <w:rPr>
@@ -1853,7 +1853,7 @@
           <w14:ligatures w14:val="standardContextual"/>
         </w:rPr>
       </w:pPr>
-      <w:hyperlink w:anchor="_Toc244063851" w:history="1">
+      <w:hyperlink w:anchor="_Toc244189235" w:history="1">
         <w:r>
           <w:rPr>
             <w:rStyle w:val="Hyperlink"/>
@@ -1880,7 +1880,7 @@
             <w:noProof/>
             <w:webHidden/>
           </w:rPr>
-          <w:instrText xml:space="preserve"> PAGEREF _Toc244063851 \h </w:instrText>
+          <w:instrText xml:space="preserve"> PAGEREF _Toc244189235 \h </w:instrText>
         </w:r>
         <w:r>
           <w:rPr>
@@ -1927,7 +1927,7 @@
           <w14:ligatures w14:val="standardContextual"/>
         </w:rPr>
       </w:pPr>
-      <w:hyperlink w:anchor="_Toc244063852" w:history="1">
+      <w:hyperlink w:anchor="_Toc244189236" w:history="1">
         <w:r>
           <w:rPr>
             <w:rStyle w:val="Hyperlink"/>
@@ -1954,7 +1954,7 @@
             <w:noProof/>
             <w:webHidden/>
           </w:rPr>
-          <w:instrText xml:space="preserve"> PAGEREF _Toc244063852 \h </w:instrText>
+          <w:instrText xml:space="preserve"> PAGEREF _Toc244189236 \h </w:instrText>
         </w:r>
         <w:r>
           <w:rPr>
@@ -2001,7 +2001,7 @@
           <w14:ligatures w14:val="standardContextual"/>
         </w:rPr>
       </w:pPr>
-      <w:hyperlink w:anchor="_Toc244063853" w:history="1">
+      <w:hyperlink w:anchor="_Toc244189237" w:history="1">
         <w:r>
           <w:rPr>
             <w:rStyle w:val="Hyperlink"/>
@@ -2028,7 +2028,7 @@
             <w:noProof/>
             <w:webHidden/>
           </w:rPr>
-          <w:instrText xml:space="preserve"> PAGEREF _Toc244063853 \h </w:instrText>
+          <w:instrText xml:space="preserve"> PAGEREF _Toc244189237 \h </w:instrText>
         </w:r>
         <w:r>
           <w:rPr>
@@ -2075,7 +2075,7 @@
           <w14:ligatures w14:val="standardContextual"/>
         </w:rPr>
       </w:pPr>
-      <w:hyperlink w:anchor="_Toc244063854" w:history="1">
+      <w:hyperlink w:anchor="_Toc244189238" w:history="1">
         <w:r>
           <w:rPr>
             <w:rStyle w:val="Hyperlink"/>
@@ -2102,7 +2102,7 @@
             <w:noProof/>
             <w:webHidden/>
           </w:rPr>
-          <w:instrText xml:space="preserve"> PAGEREF _Toc244063854 \h </w:instrText>
+          <w:instrText xml:space="preserve"> PAGEREF _Toc244189238 \h </w:instrText>
         </w:r>
         <w:r>
           <w:rPr>
@@ -2149,7 +2149,7 @@
           <w14:ligatures w14:val="standardContextual"/>
         </w:rPr>
       </w:pPr>
-      <w:hyperlink w:anchor="_Toc244063855" w:history="1">
+      <w:hyperlink w:anchor="_Toc244189239" w:history="1">
         <w:r>
           <w:rPr>
             <w:rStyle w:val="Hyperlink"/>
@@ -2176,7 +2176,7 @@
             <w:noProof/>
             <w:webHidden/>
           </w:rPr>
-          <w:instrText xml:space="preserve"> PAGEREF _Toc244063855 \h </w:instrText>
+          <w:instrText xml:space="preserve"> PAGEREF _Toc244189239 \h </w:instrText>
         </w:r>
         <w:r>
           <w:rPr>
@@ -2223,7 +2223,7 @@
           <w14:ligatures w14:val="standardContextual"/>
         </w:rPr>
       </w:pPr>
-      <w:hyperlink w:anchor="_Toc244063856" w:history="1">
+      <w:hyperlink w:anchor="_Toc244189240" w:history="1">
         <w:r>
           <w:rPr>
             <w:rStyle w:val="Hyperlink"/>
@@ -2250,7 +2250,7 @@
             <w:noProof/>
             <w:webHidden/>
           </w:rPr>
-          <w:instrText xml:space="preserve"> PAGEREF _Toc244063856 \h </w:instrText>
+          <w:instrText xml:space="preserve"> PAGEREF _Toc244189240 \h </w:instrText>
         </w:r>
         <w:r>
           <w:rPr>
@@ -2297,7 +2297,7 @@
           <w14:ligatures w14:val="standardContextual"/>
         </w:rPr>
       </w:pPr>
-      <w:hyperlink w:anchor="_Toc244063857" w:history="1">
+      <w:hyperlink w:anchor="_Toc244189241" w:history="1">
         <w:r>
           <w:rPr>
             <w:rStyle w:val="Hyperlink"/>
@@ -2324,7 +2324,7 @@
             <w:noProof/>
             <w:webHidden/>
           </w:rPr>
-          <w:instrText xml:space="preserve"> PAGEREF _Toc244063857 \h </w:instrText>
+          <w:instrText xml:space="preserve"> PAGEREF _Toc244189241 \h </w:instrText>
         </w:r>
         <w:r>
           <w:rPr>
@@ -2371,7 +2371,7 @@
           <w14:ligatures w14:val="standardContextual"/>
         </w:rPr>
       </w:pPr>
-      <w:hyperlink w:anchor="_Toc244063858" w:history="1">
+      <w:hyperlink w:anchor="_Toc244189242" w:history="1">
         <w:r>
           <w:rPr>
             <w:rStyle w:val="Hyperlink"/>
@@ -2398,7 +2398,7 @@
             <w:noProof/>
             <w:webHidden/>
           </w:rPr>
-          <w:instrText xml:space="preserve"> PAGEREF _Toc244063858 \h </w:instrText>
+          <w:instrText xml:space="preserve"> PAGEREF _Toc244189242 \h </w:instrText>
         </w:r>
         <w:r>
           <w:rPr>
@@ -2445,7 +2445,7 @@
           <w14:ligatures w14:val="standardContextual"/>
         </w:rPr>
       </w:pPr>
-      <w:hyperlink w:anchor="_Toc244063859" w:history="1">
+      <w:hyperlink w:anchor="_Toc244189243" w:history="1">
         <w:r>
           <w:rPr>
             <w:rStyle w:val="Hyperlink"/>
@@ -2472,7 +2472,7 @@
             <w:noProof/>
             <w:webHidden/>
           </w:rPr>
-          <w:instrText xml:space="preserve"> PAGEREF _Toc244063859 \h </w:instrText>
+          <w:instrText xml:space="preserve"> PAGEREF _Toc244189243 \h </w:instrText>
         </w:r>
         <w:r>
           <w:rPr>
@@ -2519,7 +2519,7 @@
           <w14:ligatures w14:val="standardContextual"/>
         </w:rPr>
       </w:pPr>
-      <w:hyperlink w:anchor="_Toc244063860" w:history="1">
+      <w:hyperlink w:anchor="_Toc244189244" w:history="1">
         <w:r>
           <w:rPr>
             <w:rStyle w:val="Hyperlink"/>
@@ -2546,7 +2546,7 @@
             <w:noProof/>
             <w:webHidden/>
           </w:rPr>
-          <w:instrText xml:space="preserve"> PAGEREF _Toc244063860 \h </w:instrText>
+          <w:instrText xml:space="preserve"> PAGEREF _Toc244189244 \h </w:instrText>
         </w:r>
         <w:r>
           <w:rPr>
@@ -2593,7 +2593,7 @@
           <w14:ligatures w14:val="standardContextual"/>
         </w:rPr>
       </w:pPr>
-      <w:hyperlink w:anchor="_Toc244063861" w:history="1">
+      <w:hyperlink w:anchor="_Toc244189245" w:history="1">
         <w:r>
           <w:rPr>
             <w:rStyle w:val="Hyperlink"/>
@@ -2620,7 +2620,7 @@
             <w:noProof/>
             <w:webHidden/>
           </w:rPr>
-          <w:instrText xml:space="preserve"> PAGEREF _Toc244063861 \h </w:instrText>
+          <w:instrText xml:space="preserve"> PAGEREF _Toc244189245 \h </w:instrText>
         </w:r>
         <w:r>
           <w:rPr>
@@ -2667,7 +2667,7 @@
           <w14:ligatures w14:val="standardContextual"/>
         </w:rPr>
       </w:pPr>
-      <w:hyperlink w:anchor="_Toc244063862" w:history="1">
+      <w:hyperlink w:anchor="_Toc244189246" w:history="1">
         <w:r>
           <w:rPr>
             <w:rStyle w:val="Hyperlink"/>
@@ -2694,7 +2694,7 @@
             <w:noProof/>
             <w:webHidden/>
           </w:rPr>
-          <w:instrText xml:space="preserve"> PAGEREF _Toc244063862 \h </w:instrText>
+          <w:instrText xml:space="preserve"> PAGEREF _Toc244189246 \h </w:instrText>
         </w:r>
         <w:r>
           <w:rPr>
@@ -2741,7 +2741,7 @@
           <w14:ligatures w14:val="standardContextual"/>
         </w:rPr>
       </w:pPr>
-      <w:hyperlink w:anchor="_Toc244063863" w:history="1">
+      <w:hyperlink w:anchor="_Toc244189247" w:history="1">
         <w:r>
           <w:rPr>
             <w:rStyle w:val="Hyperlink"/>
@@ -2768,7 +2768,7 @@
             <w:noProof/>
             <w:webHidden/>
           </w:rPr>
-          <w:instrText xml:space="preserve"> PAGEREF _Toc244063863 \h </w:instrText>
+          <w:instrText xml:space="preserve"> PAGEREF _Toc244189247 \h </w:instrText>
         </w:r>
         <w:r>
           <w:rPr>
@@ -2815,7 +2815,7 @@
           <w14:ligatures w14:val="standardContextual"/>
         </w:rPr>
       </w:pPr>
-      <w:hyperlink w:anchor="_Toc244063864" w:history="1">
+      <w:hyperlink w:anchor="_Toc244189248" w:history="1">
         <w:r>
           <w:rPr>
             <w:rStyle w:val="Hyperlink"/>
@@ -2842,7 +2842,7 @@
             <w:noProof/>
             <w:webHidden/>
           </w:rPr>
-          <w:instrText xml:space="preserve"> PAGEREF _Toc244063864 \h </w:instrText>
+          <w:instrText xml:space="preserve"> PAGEREF _Toc244189248 \h </w:instrText>
         </w:r>
         <w:r>
           <w:rPr>
@@ -2889,7 +2889,7 @@
           <w14:ligatures w14:val="standardContextual"/>
         </w:rPr>
       </w:pPr>
-      <w:hyperlink w:anchor="_Toc244063865" w:history="1">
+      <w:hyperlink w:anchor="_Toc244189249" w:history="1">
         <w:r>
           <w:rPr>
             <w:rStyle w:val="Hyperlink"/>
@@ -2916,7 +2916,7 @@
             <w:noProof/>
             <w:webHidden/>
           </w:rPr>
-          <w:instrText xml:space="preserve"> PAGEREF _Toc244063865 \h </w:instrText>
+          <w:instrText xml:space="preserve"> PAGEREF _Toc244189249 \h </w:instrText>
         </w:r>
         <w:r>
           <w:rPr>
@@ -2963,7 +2963,7 @@
           <w14:ligatures w14:val="standardContextual"/>
         </w:rPr>
       </w:pPr>
-      <w:hyperlink w:anchor="_Toc244063866" w:history="1">
+      <w:hyperlink w:anchor="_Toc244189250" w:history="1">
         <w:r>
           <w:rPr>
             <w:rStyle w:val="Hyperlink"/>
@@ -2990,7 +2990,7 @@
             <w:noProof/>
             <w:webHidden/>
           </w:rPr>
-          <w:instrText xml:space="preserve"> PAGEREF _Toc244063866 \h </w:instrText>
+          <w:instrText xml:space="preserve"> PAGEREF _Toc244189250 \h </w:instrText>
         </w:r>
         <w:r>
           <w:rPr>
@@ -3063,7 +3063,7 @@
       <w:r>
         <w:fldChar w:fldCharType="separate"/>
       </w:r>
-      <w:hyperlink w:anchor="_Toc243941013" w:history="1">
+      <w:hyperlink w:anchor="_Toc244189251" w:history="1">
         <w:r>
           <w:rPr>
             <w:rStyle w:val="Hyperlink"/>
@@ -3090,7 +3090,7 @@
             <w:noProof/>
             <w:webHidden/>
           </w:rPr>
-          <w:instrText xml:space="preserve"> PAGEREF _Toc243941013 \h </w:instrText>
+          <w:instrText xml:space="preserve"> PAGEREF _Toc244189251 \h </w:instrText>
         </w:r>
         <w:r>
           <w:rPr>
@@ -3137,7 +3137,7 @@
           <w14:ligatures w14:val="standardContextual"/>
         </w:rPr>
       </w:pPr>
-      <w:hyperlink w:anchor="_Toc243941014" w:history="1">
+      <w:hyperlink w:anchor="_Toc244189252" w:history="1">
         <w:r>
           <w:rPr>
             <w:rStyle w:val="Hyperlink"/>
@@ -3164,7 +3164,7 @@
             <w:noProof/>
             <w:webHidden/>
           </w:rPr>
-          <w:instrText xml:space="preserve"> PAGEREF _Toc243941014 \h </w:instrText>
+          <w:instrText xml:space="preserve"> PAGEREF _Toc244189252 \h </w:instrText>
         </w:r>
         <w:r>
           <w:rPr>
@@ -3211,7 +3211,7 @@
           <w14:ligatures w14:val="standardContextual"/>
         </w:rPr>
       </w:pPr>
-      <w:hyperlink w:anchor="_Toc243941015" w:history="1">
+      <w:hyperlink w:anchor="_Toc244189253" w:history="1">
         <w:r>
           <w:rPr>
             <w:rStyle w:val="Hyperlink"/>
@@ -3238,7 +3238,7 @@
             <w:noProof/>
             <w:webHidden/>
           </w:rPr>
-          <w:instrText xml:space="preserve"> PAGEREF _Toc243941015 \h </w:instrText>
+          <w:instrText xml:space="preserve"> PAGEREF _Toc244189253 \h </w:instrText>
         </w:r>
         <w:r>
           <w:rPr>
@@ -3285,7 +3285,7 @@
           <w14:ligatures w14:val="standardContextual"/>
         </w:rPr>
       </w:pPr>
-      <w:hyperlink w:anchor="_Toc243941016" w:history="1">
+      <w:hyperlink w:anchor="_Toc244189254" w:history="1">
         <w:r>
           <w:rPr>
             <w:rStyle w:val="Hyperlink"/>
@@ -3312,7 +3312,7 @@
             <w:noProof/>
             <w:webHidden/>
           </w:rPr>
-          <w:instrText xml:space="preserve"> PAGEREF _Toc243941016 \h </w:instrText>
+          <w:instrText xml:space="preserve"> PAGEREF _Toc244189254 \h </w:instrText>
         </w:r>
         <w:r>
           <w:rPr>
@@ -3359,7 +3359,7 @@
           <w14:ligatures w14:val="standardContextual"/>
         </w:rPr>
       </w:pPr>
-      <w:hyperlink w:anchor="_Toc243941017" w:history="1">
+      <w:hyperlink w:anchor="_Toc244189255" w:history="1">
         <w:r>
           <w:rPr>
             <w:rStyle w:val="Hyperlink"/>
@@ -3386,7 +3386,7 @@
             <w:noProof/>
             <w:webHidden/>
           </w:rPr>
-          <w:instrText xml:space="preserve"> PAGEREF _Toc243941017 \h </w:instrText>
+          <w:instrText xml:space="preserve"> PAGEREF _Toc244189255 \h </w:instrText>
         </w:r>
         <w:r>
           <w:rPr>
@@ -3433,7 +3433,7 @@
           <w14:ligatures w14:val="standardContextual"/>
         </w:rPr>
       </w:pPr>
-      <w:hyperlink w:anchor="_Toc243941018" w:history="1">
+      <w:hyperlink w:anchor="_Toc244189256" w:history="1">
         <w:r>
           <w:rPr>
             <w:rStyle w:val="Hyperlink"/>
@@ -3460,7 +3460,7 @@
             <w:noProof/>
             <w:webHidden/>
           </w:rPr>
-          <w:instrText xml:space="preserve"> PAGEREF _Toc243941018 \h </w:instrText>
+          <w:instrText xml:space="preserve"> PAGEREF _Toc244189256 \h </w:instrText>
         </w:r>
         <w:r>
           <w:rPr>
@@ -3507,7 +3507,7 @@
           <w14:ligatures w14:val="standardContextual"/>
         </w:rPr>
       </w:pPr>
-      <w:hyperlink w:anchor="_Toc243941019" w:history="1">
+      <w:hyperlink w:anchor="_Toc244189257" w:history="1">
         <w:r>
           <w:rPr>
             <w:rStyle w:val="Hyperlink"/>
@@ -3534,7 +3534,7 @@
             <w:noProof/>
             <w:webHidden/>
           </w:rPr>
-          <w:instrText xml:space="preserve"> PAGEREF _Toc243941019 \h </w:instrText>
+          <w:instrText xml:space="preserve"> PAGEREF _Toc244189257 \h </w:instrText>
         </w:r>
         <w:r>
           <w:rPr>
@@ -3581,7 +3581,7 @@
           <w14:ligatures w14:val="standardContextual"/>
         </w:rPr>
       </w:pPr>
-      <w:hyperlink w:anchor="_Toc243941020" w:history="1">
+      <w:hyperlink w:anchor="_Toc244189258" w:history="1">
         <w:r>
           <w:rPr>
             <w:rStyle w:val="Hyperlink"/>
@@ -3608,7 +3608,7 @@
             <w:noProof/>
             <w:webHidden/>
           </w:rPr>
-          <w:instrText xml:space="preserve"> PAGEREF _Toc243941020 \h </w:instrText>
+          <w:instrText xml:space="preserve"> PAGEREF _Toc244189258 \h </w:instrText>
         </w:r>
         <w:r>
           <w:rPr>
@@ -3655,7 +3655,7 @@
           <w14:ligatures w14:val="standardContextual"/>
         </w:rPr>
       </w:pPr>
-      <w:hyperlink w:anchor="_Toc243941021" w:history="1">
+      <w:hyperlink w:anchor="_Toc244189259" w:history="1">
         <w:r>
           <w:rPr>
             <w:rStyle w:val="Hyperlink"/>
@@ -3682,7 +3682,7 @@
             <w:noProof/>
             <w:webHidden/>
           </w:rPr>
-          <w:instrText xml:space="preserve"> PAGEREF _Toc243941021 \h </w:instrText>
+          <w:instrText xml:space="preserve"> PAGEREF _Toc244189259 \h </w:instrText>
         </w:r>
         <w:r>
           <w:rPr>
@@ -3729,7 +3729,7 @@
           <w14:ligatures w14:val="standardContextual"/>
         </w:rPr>
       </w:pPr>
-      <w:hyperlink w:anchor="_Toc243941022" w:history="1">
+      <w:hyperlink w:anchor="_Toc244189260" w:history="1">
         <w:r>
           <w:rPr>
             <w:rStyle w:val="Hyperlink"/>
@@ -3756,7 +3756,7 @@
             <w:noProof/>
             <w:webHidden/>
           </w:rPr>
-          <w:instrText xml:space="preserve"> PAGEREF _Toc243941022 \h </w:instrText>
+          <w:instrText xml:space="preserve"> PAGEREF _Toc244189260 \h </w:instrText>
         </w:r>
         <w:r>
           <w:rPr>
@@ -3803,7 +3803,7 @@
           <w14:ligatures w14:val="standardContextual"/>
         </w:rPr>
       </w:pPr>
-      <w:hyperlink w:anchor="_Toc243941023" w:history="1">
+      <w:hyperlink w:anchor="_Toc244189261" w:history="1">
         <w:r>
           <w:rPr>
             <w:rStyle w:val="Hyperlink"/>
@@ -3830,7 +3830,7 @@
             <w:noProof/>
             <w:webHidden/>
           </w:rPr>
-          <w:instrText xml:space="preserve"> PAGEREF _Toc243941023 \h </w:instrText>
+          <w:instrText xml:space="preserve"> PAGEREF _Toc244189261 \h </w:instrText>
         </w:r>
         <w:r>
           <w:rPr>
@@ -3877,7 +3877,7 @@
           <w14:ligatures w14:val="standardContextual"/>
         </w:rPr>
       </w:pPr>
-      <w:hyperlink w:anchor="_Toc243941024" w:history="1">
+      <w:hyperlink w:anchor="_Toc244189262" w:history="1">
         <w:r>
           <w:rPr>
             <w:rStyle w:val="Hyperlink"/>
@@ -3904,7 +3904,7 @@
             <w:noProof/>
             <w:webHidden/>
           </w:rPr>
-          <w:instrText xml:space="preserve"> PAGEREF _Toc243941024 \h </w:instrText>
+          <w:instrText xml:space="preserve"> PAGEREF _Toc244189262 \h </w:instrText>
         </w:r>
         <w:r>
           <w:rPr>
@@ -3951,7 +3951,7 @@
           <w14:ligatures w14:val="standardContextual"/>
         </w:rPr>
       </w:pPr>
-      <w:hyperlink w:anchor="_Toc243941025" w:history="1">
+      <w:hyperlink w:anchor="_Toc244189263" w:history="1">
         <w:r>
           <w:rPr>
             <w:rStyle w:val="Hyperlink"/>
@@ -3978,7 +3978,7 @@
             <w:noProof/>
             <w:webHidden/>
           </w:rPr>
-          <w:instrText xml:space="preserve"> PAGEREF _Toc243941025 \h </w:instrText>
+          <w:instrText xml:space="preserve"> PAGEREF _Toc244189263 \h </w:instrText>
         </w:r>
         <w:r>
           <w:rPr>
@@ -4025,7 +4025,7 @@
           <w14:ligatures w14:val="standardContextual"/>
         </w:rPr>
       </w:pPr>
-      <w:hyperlink w:anchor="_Toc243941026" w:history="1">
+      <w:hyperlink w:anchor="_Toc244189264" w:history="1">
         <w:r>
           <w:rPr>
             <w:rStyle w:val="Hyperlink"/>
@@ -4052,7 +4052,7 @@
             <w:noProof/>
             <w:webHidden/>
           </w:rPr>
-          <w:instrText xml:space="preserve"> PAGEREF _Toc243941026 \h </w:instrText>
+          <w:instrText xml:space="preserve"> PAGEREF _Toc244189264 \h </w:instrText>
         </w:r>
         <w:r>
           <w:rPr>
@@ -4125,7 +4125,7 @@
       <w:r>
         <w:fldChar w:fldCharType="separate"/>
       </w:r>
-      <w:hyperlink w:anchor="_Toc243941027" w:history="1">
+      <w:hyperlink w:anchor="_Toc244189265" w:history="1">
         <w:r>
           <w:rPr>
             <w:rStyle w:val="Hyperlink"/>
@@ -4152,7 +4152,7 @@
             <w:noProof/>
             <w:webHidden/>
           </w:rPr>
-          <w:instrText xml:space="preserve"> PAGEREF _Toc243941027 \h </w:instrText>
+          <w:instrText xml:space="preserve"> PAGEREF _Toc244189265 \h </w:instrText>
         </w:r>
         <w:r>
           <w:rPr>
@@ -4199,7 +4199,7 @@
           <w14:ligatures w14:val="standardContextual"/>
         </w:rPr>
       </w:pPr>
-      <w:hyperlink w:anchor="_Toc243941028" w:history="1">
+      <w:hyperlink w:anchor="_Toc244189266" w:history="1">
         <w:r>
           <w:rPr>
             <w:rStyle w:val="Hyperlink"/>
@@ -4226,7 +4226,7 @@
             <w:noProof/>
             <w:webHidden/>
           </w:rPr>
-          <w:instrText xml:space="preserve"> PAGEREF _Toc243941028 \h </w:instrText>
+          <w:instrText xml:space="preserve"> PAGEREF _Toc244189266 \h </w:instrText>
         </w:r>
         <w:r>
           <w:rPr>
@@ -4273,7 +4273,7 @@
           <w14:ligatures w14:val="standardContextual"/>
         </w:rPr>
       </w:pPr>
-      <w:hyperlink w:anchor="_Toc243941029" w:history="1">
+      <w:hyperlink w:anchor="_Toc244189267" w:history="1">
         <w:r>
           <w:rPr>
             <w:rStyle w:val="Hyperlink"/>
@@ -4300,7 +4300,7 @@
             <w:noProof/>
             <w:webHidden/>
           </w:rPr>
-          <w:instrText xml:space="preserve"> PAGEREF _Toc243941029 \h </w:instrText>
+          <w:instrText xml:space="preserve"> PAGEREF _Toc244189267 \h </w:instrText>
         </w:r>
         <w:r>
           <w:rPr>
@@ -4320,7 +4320,7 @@
             <w:noProof/>
             <w:webHidden/>
           </w:rPr>
-          <w:t>10</w:t>
+          <w:t>11</w:t>
         </w:r>
         <w:r>
           <w:rPr>
@@ -4347,7 +4347,7 @@
           <w14:ligatures w14:val="standardContextual"/>
         </w:rPr>
       </w:pPr>
-      <w:hyperlink w:anchor="_Toc243941030" w:history="1">
+      <w:hyperlink w:anchor="_Toc244189268" w:history="1">
         <w:r>
           <w:rPr>
             <w:rStyle w:val="Hyperlink"/>
@@ -4374,7 +4374,7 @@
             <w:noProof/>
             <w:webHidden/>
           </w:rPr>
-          <w:instrText xml:space="preserve"> PAGEREF _Toc243941030 \h </w:instrText>
+          <w:instrText xml:space="preserve"> PAGEREF _Toc244189268 \h </w:instrText>
         </w:r>
         <w:r>
           <w:rPr>
@@ -4421,7 +4421,7 @@
           <w14:ligatures w14:val="standardContextual"/>
         </w:rPr>
       </w:pPr>
-      <w:hyperlink w:anchor="_Toc243941031" w:history="1">
+      <w:hyperlink w:anchor="_Toc244189269" w:history="1">
         <w:r>
           <w:rPr>
             <w:rStyle w:val="Hyperlink"/>
@@ -4448,7 +4448,7 @@
             <w:noProof/>
             <w:webHidden/>
           </w:rPr>
-          <w:instrText xml:space="preserve"> PAGEREF _Toc243941031 \h </w:instrText>
+          <w:instrText xml:space="preserve"> PAGEREF _Toc244189269 \h </w:instrText>
         </w:r>
         <w:r>
           <w:rPr>
@@ -4495,7 +4495,7 @@
           <w14:ligatures w14:val="standardContextual"/>
         </w:rPr>
       </w:pPr>
-      <w:hyperlink w:anchor="_Toc243941032" w:history="1">
+      <w:hyperlink w:anchor="_Toc244189270" w:history="1">
         <w:r>
           <w:rPr>
             <w:rStyle w:val="Hyperlink"/>
@@ -4522,7 +4522,7 @@
             <w:noProof/>
             <w:webHidden/>
           </w:rPr>
-          <w:instrText xml:space="preserve"> PAGEREF _Toc243941032 \h </w:instrText>
+          <w:instrText xml:space="preserve"> PAGEREF _Toc244189270 \h </w:instrText>
         </w:r>
         <w:r>
           <w:rPr>
@@ -4569,7 +4569,7 @@
           <w14:ligatures w14:val="standardContextual"/>
         </w:rPr>
       </w:pPr>
-      <w:hyperlink w:anchor="_Toc243941033" w:history="1">
+      <w:hyperlink w:anchor="_Toc244189271" w:history="1">
         <w:r>
           <w:rPr>
             <w:rStyle w:val="Hyperlink"/>
@@ -4596,7 +4596,7 @@
             <w:noProof/>
             <w:webHidden/>
           </w:rPr>
-          <w:instrText xml:space="preserve"> PAGEREF _Toc243941033 \h </w:instrText>
+          <w:instrText xml:space="preserve"> PAGEREF _Toc244189271 \h </w:instrText>
         </w:r>
         <w:r>
           <w:rPr>
@@ -4643,7 +4643,7 @@
           <w14:ligatures w14:val="standardContextual"/>
         </w:rPr>
       </w:pPr>
-      <w:hyperlink w:anchor="_Toc243941034" w:history="1">
+      <w:hyperlink w:anchor="_Toc244189272" w:history="1">
         <w:r>
           <w:rPr>
             <w:rStyle w:val="Hyperlink"/>
@@ -4670,7 +4670,7 @@
             <w:noProof/>
             <w:webHidden/>
           </w:rPr>
-          <w:instrText xml:space="preserve"> PAGEREF _Toc243941034 \h </w:instrText>
+          <w:instrText xml:space="preserve"> PAGEREF _Toc244189272 \h </w:instrText>
         </w:r>
         <w:r>
           <w:rPr>
@@ -5274,7 +5274,7 @@
       <w:pPr>
         <w:pStyle w:val="Heading1"/>
       </w:pPr>
-      <w:bookmarkStart w:id="0" w:name="_Toc244063830"/>
+      <w:bookmarkStart w:id="0" w:name="_Toc244189214"/>
       <w:r>
         <w:lastRenderedPageBreak/>
         <w:t>Capitolul 1. Introducere</w:t>
@@ -5285,7 +5285,7 @@
       <w:pPr>
         <w:pStyle w:val="Heading2"/>
       </w:pPr>
-      <w:bookmarkStart w:id="1" w:name="_Toc244063831"/>
+      <w:bookmarkStart w:id="1" w:name="_Toc244189215"/>
       <w:r>
         <w:t>1.1 Motivație</w:t>
       </w:r>
@@ -5321,7 +5321,7 @@
       <w:pPr>
         <w:pStyle w:val="Heading2"/>
       </w:pPr>
-      <w:bookmarkStart w:id="2" w:name="_Toc244063832"/>
+      <w:bookmarkStart w:id="2" w:name="_Toc244189216"/>
       <w:r>
         <w:t>1.2 Formularea problemei</w:t>
       </w:r>
@@ -5377,7 +5377,7 @@
       <w:pPr>
         <w:pStyle w:val="Heading2"/>
       </w:pPr>
-      <w:bookmarkStart w:id="3" w:name="_Toc244063833"/>
+      <w:bookmarkStart w:id="3" w:name="_Toc244189217"/>
       <w:r>
         <w:t>1.3 Obiective</w:t>
       </w:r>
@@ -5395,7 +5395,7 @@
       <w:pPr>
         <w:pStyle w:val="Heading2"/>
       </w:pPr>
-      <w:bookmarkStart w:id="4" w:name="_Toc244063834"/>
+      <w:bookmarkStart w:id="4" w:name="_Toc244189218"/>
       <w:r>
         <w:t>1.4 Contribuții</w:t>
       </w:r>
@@ -5413,7 +5413,7 @@
       <w:pPr>
         <w:pStyle w:val="Heading2"/>
       </w:pPr>
-      <w:bookmarkStart w:id="5" w:name="_Toc244063835"/>
+      <w:bookmarkStart w:id="5" w:name="_Toc244189219"/>
       <w:r>
         <w:t>1.5 Structura lucrării</w:t>
       </w:r>
@@ -5431,7 +5431,7 @@
       <w:pPr>
         <w:pStyle w:val="Heading1"/>
       </w:pPr>
-      <w:bookmarkStart w:id="6" w:name="_Toc244063836"/>
+      <w:bookmarkStart w:id="6" w:name="_Toc244189220"/>
       <w:r>
         <w:lastRenderedPageBreak/>
         <w:t>Capitolul 2. Fundamente teoretice și lucrări conexe</w:t>
@@ -5450,7 +5450,7 @@
       <w:pPr>
         <w:pStyle w:val="Heading1"/>
       </w:pPr>
-      <w:bookmarkStart w:id="7" w:name="_Toc244063837"/>
+      <w:bookmarkStart w:id="7" w:name="_Toc244189221"/>
       <w:r>
         <w:lastRenderedPageBreak/>
         <w:t>Capitolul 3. Cerințe</w:t>
@@ -5469,7 +5469,7 @@
       <w:pPr>
         <w:pStyle w:val="Heading1"/>
       </w:pPr>
-      <w:bookmarkStart w:id="8" w:name="_Toc244063838"/>
+      <w:bookmarkStart w:id="8" w:name="_Toc244189222"/>
       <w:r>
         <w:lastRenderedPageBreak/>
         <w:t>Capitolul 4. Proiectarea sistemului și arhitectura</w:t>
@@ -5488,7 +5488,7 @@
       <w:pPr>
         <w:pStyle w:val="Heading2"/>
       </w:pPr>
-      <w:bookmarkStart w:id="9" w:name="_Toc244063839"/>
+      <w:bookmarkStart w:id="9" w:name="_Toc244189223"/>
       <w:r>
         <w:t>4.1 Modelul conceptual al datelor: diagrama Entitate-Legătură extinsă (EER)</w:t>
       </w:r>
@@ -5589,7 +5589,7 @@
         <w:pStyle w:val="Caption"/>
         <w:jc w:val="center"/>
       </w:pPr>
-      <w:bookmarkStart w:id="10" w:name="_Toc243941027"/>
+      <w:bookmarkStart w:id="10" w:name="_Toc244189265"/>
       <w:r>
         <w:t>Figura 4.</w:t>
       </w:r>
@@ -5695,7 +5695,7 @@
         <w:pStyle w:val="Caption"/>
         <w:jc w:val="center"/>
       </w:pPr>
-      <w:bookmarkStart w:id="11" w:name="_Toc243941028"/>
+      <w:bookmarkStart w:id="11" w:name="_Toc244189266"/>
       <w:r>
         <w:t>Figura 4.</w:t>
       </w:r>
@@ -5736,7 +5736,7 @@
         <w:t>crow's foot</w:t>
       </w:r>
       <w:r>
-        <w:t>, liniuța înseamnă exact unu, cercul înseamnă opțional, iar bifurcația înseamnă mai mulți. Fiecare entitate devine un tabel, o legătură 1:N devine o cheie străină pe partea N, legăturile M:N și atributele multivalorate devin tabele separate, entitatea slabă primește cheia compusă (routine_id, step_no), iar specializarea devine câte un tabel pentru superclasă și pentru fiecare subclasă, cu photo_id simultan cheie primară și cheie străină.</w:t>
+        <w:t>, liniuța înseamnă exact unu, cercul înseamnă opțional, iar bifurcația înseamnă mai mulți. Fiecare entitate devine un tabel, o legătură 1:N devine o cheie străină pe partea N, legăturile M:N și atributele multivalorate devin tabele separate, entitatea slabă primește cheia compusă (routine_id, step_no), iar specializarea devine câte un tabel pentru superclasă și pentru fiecare subclasă, cu photo_id simultan cheie primară și cheie străină. Corespondența completă dintre cele două modele este dată în schema atașată Schema_ER_relational_Giotina.pdf, realizată tot în draw.io: fiecare element EER care devine tabel poartă același număr (T1–T26) ca tabelul obținut din el, iar fiecare legătură transformată în cheie străină indică tabelul care o conține, împreună cu regula de transformare aplicată.</w:t>
       </w:r>
     </w:p>
     <w:p>
@@ -5744,11 +5744,11 @@
         <w:ind w:firstLine="709"/>
       </w:pPr>
       <w:r>
-        <w:t xml:space="preserve">Schema a fost apoi normalizată până la forma normală Boyce-Codd (FNBC) [4]. Normalizarea elimină redundanța pornind de la dependențele funcționale: X → Y înseamnă că valorile coloanelor X determină valorile coloanelor Y. Un tabel este în FNBC dacă în orice dependență netrivială X este o supercheie, adică un set de coloane care identifică unic rândul; FNBC include primele trei forme normale (valori atomice, fără dependențe de o parte a cheii și fără dependențe tranzitive). Analiza, făcută tabel cu tabel în documentul atașat Normalizare_bazei_de_date_Giotina.docx, a impus trei descompuneri: răspunsurile la întrebările cu mai multe variante se rețin câte un rând pe variantă (FN1), familia de token-uri </w:t>
+        <w:t xml:space="preserve">Schema a fost apoi normalizată până la forma normală Boyce-Codd (FNBC) [4]. Normalizarea elimină redundanța pornind de la dependențele funcționale: X → Y înseamnă că valorile coloanelor X determină valorile coloanelor Y. Un tabel este în FNBC dacă în orice dependență netrivială X este o supercheie, adică un set de coloane care identifică unic rândul; </w:t>
       </w:r>
       <w:r>
         <w:lastRenderedPageBreak/>
-        <w:t>de autentificare devine tabelul TOKEN_FAMILY, deoarece family_id → user_id (FN3), iar legătura opțională dintre o rutină și analiza din care provine devine tabelul ROUTINE_SOURCE, deoarece analysis_id → user_id (FN3). Încrederea globală a analizei și rangul predicțiilor se calculează din probabilități și nu se mai stochează. Rezultă 26 de tabele, toate în FNBC.</w:t>
+        <w:t>FNBC include primele trei forme normale (valori atomice, fără dependențe de o parte a cheii și fără dependențe tranzitive). Analiza, făcută tabel cu tabel în documentul atașat Normalizare_bazei_de_date_Giotina.docx, a impus trei descompuneri: răspunsurile la întrebările cu mai multe variante se rețin câte un rând pe variantă (FN1), familia de token-uri de autentificare devine tabelul TOKEN_FAMILY, deoarece family_id → user_id (FN3), iar legătura opțională dintre o rutină și analiza din care provine devine tabelul ROUTINE_SOURCE, deoarece analysis_id → user_id (FN3). Încrederea globală a analizei și rangul predicțiilor se calculează din probabilități și nu se mai stochează. Rezultă 26 de tabele, toate în FNBC.</w:t>
       </w:r>
     </w:p>
     <w:p>
@@ -5772,7 +5772,7 @@
       <w:pPr>
         <w:pStyle w:val="Heading2"/>
       </w:pPr>
-      <w:bookmarkStart w:id="12" w:name="_Toc244063840"/>
+      <w:bookmarkStart w:id="12" w:name="_Toc244189224"/>
       <w:r>
         <w:t>4.2 Interfața utilizator</w:t>
       </w:r>
@@ -5809,7 +5809,11 @@
         <w:ind w:firstLine="709"/>
       </w:pPr>
       <w:r>
-        <w:t>Identitatea vizuală este roz și caldă, dar ordonată. Un singur accent, „Peony” #BF3F68, marchează acțiunile și elementele selectate. O familie de culori pastelate (roz, piersică, galben pal, mentă, lila și albastru pal) codifică un sens, nu decorează: tipul problemei din rezultat, categoria pasului din rutină, funcția ingredientului și starea pielii din jurnal. Toate combinațiile de text au fost verificate cu raportul de contrast din WCAG 2.2 [5], adică raportul dintre luminanțele relative a două culori (de la 1:1 la 21:1); nivelul AA cere cel puțin 4,5:1 pentru textul normal, iar toate perechile folosite îl depășesc (accentul pe alb 5,09:1, perechile pastelate 5,45–6,27:1). Titlurile folosesc fontul Young Serif [6], iar restul textului Hanken Grotesk [7], ambele cu licența SIL Open Font License. Fotografiile arată persoane cu tonuri de piele diferite, în acord cu tema de echitate a lucrării, iar navigarea principală este o bară cu cinci file (Today, Skin, Scan, Routine, Me) [8], cu butonul de scanare evidențiat.</w:t>
+        <w:t xml:space="preserve">Identitatea vizuală este roz și caldă, dar ordonată. Un singur accent, „Peony” #BF3F68, marchează acțiunile și elementele selectate. O familie de culori pastelate (roz, piersică, galben pal, mentă, lila și albastru pal) codifică un sens, nu decorează: tipul problemei din rezultat, categoria pasului din rutină, funcția ingredientului și starea pielii din jurnal. Toate combinațiile de text au fost verificate cu raportul de contrast din WCAG 2.2 [5], adică raportul dintre luminanțele relative a două culori (de la 1:1 la 21:1); nivelul AA cere cel puțin 4,5:1 pentru textul normal, iar toate perechile folosite îl depășesc (accentul pe alb 5,09:1, perechile pastelate 5,45–6,27:1). Titlurile folosesc fontul Young Serif [6], iar restul textului Hanken Grotesk [7], ambele cu licența SIL Open Font License. Fotografiile arată persoane cu </w:t>
+      </w:r>
+      <w:r>
+        <w:lastRenderedPageBreak/>
+        <w:t>tonuri de piele diferite, în acord cu tema de echitate a lucrării, iar navigarea principală este o bară cu cinci file (Today, Skin, Scan, Routine, Me) [8], cu butonul de scanare evidențiat.</w:t>
       </w:r>
     </w:p>
     <w:p>
@@ -5826,18 +5830,14 @@
         <w:t>landmarks</w:t>
       </w:r>
       <w:r>
-        <w:t xml:space="preserve">) detectate de MediaPipe Face </w:t>
-      </w:r>
-      <w:r>
-        <w:lastRenderedPageBreak/>
-        <w:t>Landmarker [9], harta Grad-CAM (secțiunea 5.9) și etichete care numesc zonele cu influență mare asupra rezultatului; încrederea calibrată apare sub forma unui inel. Nu sunt afișate scoruri inventate de tipul „hidratare 72%”, pe care modelul nu le măsoară. Produsele apar decupate din fotografii cu biblioteca rembg [10] și ies din conturul cardurilor. Tabelul 4.1 arată cum acoperă ecranele cerințele MVP, iar Figura 4.3 prezintă opt ecrane reprezentative.</w:t>
+        <w:t>) detectate de MediaPipe Face Landmarker [9], harta Grad-CAM (secțiunea 5.9) și etichete care numesc zonele cu influență mare asupra rezultatului; încrederea calibrată apare sub forma unui inel. Nu sunt afișate scoruri inventate de tipul „hidratare 72%”, pe care modelul nu le măsoară. Produsele apar decupate din fotografii cu biblioteca rembg [10] și ies din conturul cardurilor. Tabelul 4.1 arată cum acoperă ecranele cerințele MVP, iar Figura 4.3 prezintă opt ecrane reprezentative.</w:t>
       </w:r>
     </w:p>
     <w:p>
       <w:pPr>
         <w:pStyle w:val="Caption"/>
       </w:pPr>
-      <w:bookmarkStart w:id="13" w:name="_Toc243941013"/>
+      <w:bookmarkStart w:id="13" w:name="_Toc244189251"/>
       <w:r>
         <w:t>Tabelul 4.</w:t>
       </w:r>
@@ -6039,7 +6039,11 @@
           </w:tcPr>
           <w:p>
             <w:r>
-              <w:t>rutină de dimineață și de seară pe trei niveluri, jurnal zilnic, fotografii de progres (neanalizate), memento-uri locale</w:t>
+              <w:t xml:space="preserve">rutină de dimineață și de seară pe trei niveluri, jurnal </w:t>
+            </w:r>
+            <w:r>
+              <w:lastRenderedPageBreak/>
+              <w:t>zilnic, fotografii de progres (neanalizate), memento-uri locale</w:t>
             </w:r>
           </w:p>
         </w:tc>
@@ -6051,11 +6055,8 @@
           </w:tcPr>
           <w:p>
             <w:r>
-              <w:t xml:space="preserve">Profil, confidențialitate, </w:t>
-            </w:r>
-            <w:r>
               <w:lastRenderedPageBreak/>
-              <w:t>legal</w:t>
+              <w:t>Profil, confidențialitate, legal</w:t>
             </w:r>
           </w:p>
         </w:tc>
@@ -6065,7 +6066,6 @@
           </w:tcPr>
           <w:p>
             <w:r>
-              <w:lastRenderedPageBreak/>
               <w:t>50-53</w:t>
             </w:r>
           </w:p>
@@ -6076,11 +6076,7 @@
           </w:tcPr>
           <w:p>
             <w:r>
-              <w:t xml:space="preserve">retragerea consimțământului, </w:t>
-            </w:r>
-            <w:r>
-              <w:lastRenderedPageBreak/>
-              <w:t>export JSON, ștergerea contului, avertismentul non-medical și limitările modelului</w:t>
+              <w:t>retragerea consimțământului, export JSON, ștergerea contului, avertismentul non-medical și limitările modelului</w:t>
             </w:r>
           </w:p>
         </w:tc>
@@ -6094,7 +6090,6 @@
         <w:rPr>
           <w:noProof/>
         </w:rPr>
-        <w:lastRenderedPageBreak/>
         <w:drawing>
           <wp:inline distT="0" distB="0" distL="0" distR="0" wp14:anchorId="0E84266A" wp14:editId="7EC2597D">
             <wp:extent cx="5400000" cy="5854091"/>
@@ -6137,8 +6132,9 @@
         <w:pStyle w:val="Caption"/>
         <w:jc w:val="center"/>
       </w:pPr>
-      <w:bookmarkStart w:id="14" w:name="_Toc243941029"/>
-      <w:r>
+      <w:bookmarkStart w:id="14" w:name="_Toc244189267"/>
+      <w:r>
+        <w:lastRenderedPageBreak/>
         <w:t>Figura 4.</w:t>
       </w:r>
       <w:r>
@@ -6169,11 +6165,7 @@
         <w:ind w:firstLine="709"/>
       </w:pPr>
       <w:r>
-        <w:t xml:space="preserve">Trei ecrane vin direct din rezultatele experimentale. Ecranul 21 aplică regula de abținere: sub pragul de încredere aplicația nu afișează o categorie și recomandă consultarea unui specialist (secțiunea 8.6). Ecranul 23 oprește analiza dacă fotografia este neclară sau prea întunecată, deoarece imaginile a 38,3% dintre cazurile SCIN au fost considerate de calitate insuficientă (secțiunea 5.2). Ecranul 24 nu afișează niciun scor și trimite utilizatorul la medic </w:t>
-      </w:r>
-      <w:r>
-        <w:lastRenderedPageBreak/>
-        <w:t>pentru leziuni din afara celor patru categorii, deoarece încrederea modelului s-a dovedit a nu fi un filtru de siguranță (secțiunea 8.6). Textele nu folosesc cuvintele „diagnostic” sau „tratament”: un rezultat „poate indica” o problemă, iar fiecare ecran de rezultat amintește că aplicația nu este un dispozitiv medical.</w:t>
+        <w:t>Trei ecrane vin direct din rezultatele experimentale. Ecranul 21 aplică regula de abținere: sub pragul de încredere aplicația nu afișează o categorie și recomandă consultarea unui specialist (secțiunea 8.6). Ecranul 23 oprește analiza dacă fotografia este neclară sau prea întunecată, deoarece imaginile a 38,3% dintre cazurile SCIN au fost considerate de calitate insuficientă (secțiunea 5.2). Ecranul 24 nu afișează niciun scor și trimite utilizatorul la medic pentru leziuni din afara celor patru categorii, deoarece încrederea modelului s-a dovedit a nu fi un filtru de siguranță (secțiunea 8.6). Textele nu folosesc cuvintele „diagnostic” sau „tratament”: un rezultat „poate indica” o problemă, iar fiecare ecran de rezultat amintește că aplicația nu este un dispozitiv medical.</w:t>
       </w:r>
     </w:p>
     <w:p>
@@ -6188,7 +6180,7 @@
       <w:pPr>
         <w:pStyle w:val="Heading1"/>
       </w:pPr>
-      <w:bookmarkStart w:id="15" w:name="_Toc244063841"/>
+      <w:bookmarkStart w:id="15" w:name="_Toc244189225"/>
       <w:r>
         <w:lastRenderedPageBreak/>
         <w:t>Capitolul 5. Metodologia AI/ML</w:t>
@@ -6207,7 +6199,7 @@
       <w:pPr>
         <w:pStyle w:val="Heading2"/>
       </w:pPr>
-      <w:bookmarkStart w:id="16" w:name="_Toc244063842"/>
+      <w:bookmarkStart w:id="16" w:name="_Toc244189226"/>
       <w:r>
         <w:t>5.1 Setul de date SCIN și scalele de ton al pielii</w:t>
       </w:r>
@@ -6290,7 +6282,7 @@
       <w:pPr>
         <w:pStyle w:val="Heading2"/>
       </w:pPr>
-      <w:bookmarkStart w:id="17" w:name="_Toc244063843"/>
+      <w:bookmarkStart w:id="17" w:name="_Toc244189227"/>
       <w:r>
         <w:lastRenderedPageBreak/>
         <w:t>5.2 Auditul datelor</w:t>
@@ -6329,7 +6321,7 @@
       <w:pPr>
         <w:pStyle w:val="Caption"/>
       </w:pPr>
-      <w:bookmarkStart w:id="18" w:name="_Toc243941014"/>
+      <w:bookmarkStart w:id="18" w:name="_Toc244189252"/>
       <w:r>
         <w:t>Tabelul 5.</w:t>
       </w:r>
@@ -6890,7 +6882,7 @@
       <w:pPr>
         <w:pStyle w:val="Heading2"/>
       </w:pPr>
-      <w:bookmarkStart w:id="19" w:name="_Toc244063844"/>
+      <w:bookmarkStart w:id="19" w:name="_Toc244189228"/>
       <w:r>
         <w:t>5.3 Categoriile țintă</w:t>
       </w:r>
@@ -6932,7 +6924,7 @@
       <w:pPr>
         <w:pStyle w:val="Caption"/>
       </w:pPr>
-      <w:bookmarkStart w:id="20" w:name="_Toc243941015"/>
+      <w:bookmarkStart w:id="20" w:name="_Toc244189253"/>
       <w:r>
         <w:t>Tabelul 5.</w:t>
       </w:r>
@@ -7571,7 +7563,7 @@
       <w:pPr>
         <w:pStyle w:val="Heading2"/>
       </w:pPr>
-      <w:bookmarkStart w:id="21" w:name="_Toc244063845"/>
+      <w:bookmarkStart w:id="21" w:name="_Toc244189229"/>
       <w:r>
         <w:t>5.4 Codificarea chestionarului și masca de valori lipsă</w:t>
       </w:r>
@@ -7589,7 +7581,7 @@
       <w:pPr>
         <w:pStyle w:val="Heading2"/>
       </w:pPr>
-      <w:bookmarkStart w:id="22" w:name="_Toc244063846"/>
+      <w:bookmarkStart w:id="22" w:name="_Toc244189230"/>
       <w:r>
         <w:lastRenderedPageBreak/>
         <w:t>5.5 Împărțirea și preprocesarea datelor</w:t>
@@ -7634,7 +7626,7 @@
       <w:pPr>
         <w:pStyle w:val="Heading2"/>
       </w:pPr>
-      <w:bookmarkStart w:id="23" w:name="_Toc244063847"/>
+      <w:bookmarkStart w:id="23" w:name="_Toc244189231"/>
       <w:r>
         <w:t>5.6 Modelele</w:t>
       </w:r>
@@ -7739,7 +7731,7 @@
       <w:pPr>
         <w:pStyle w:val="Heading2"/>
       </w:pPr>
-      <w:bookmarkStart w:id="24" w:name="_Toc244063848"/>
+      <w:bookmarkStart w:id="24" w:name="_Toc244189232"/>
       <w:r>
         <w:lastRenderedPageBreak/>
         <w:t>5.7 Protocolul de evaluare</w:t>
@@ -7804,7 +7796,7 @@
       <w:pPr>
         <w:pStyle w:val="Heading2"/>
       </w:pPr>
-      <w:bookmarkStart w:id="25" w:name="_Toc244063849"/>
+      <w:bookmarkStart w:id="25" w:name="_Toc244189233"/>
       <w:r>
         <w:t>5.8 Date externe și encodere preantrenate</w:t>
       </w:r>
@@ -7875,7 +7867,7 @@
       <w:pPr>
         <w:pStyle w:val="Heading2"/>
       </w:pPr>
-      <w:bookmarkStart w:id="26" w:name="_Toc244063850"/>
+      <w:bookmarkStart w:id="26" w:name="_Toc244189234"/>
       <w:r>
         <w:lastRenderedPageBreak/>
         <w:t>5.9 Explicabilitate (Grad-CAM)</w:t>
@@ -7894,7 +7886,7 @@
       <w:pPr>
         <w:pStyle w:val="Heading1"/>
       </w:pPr>
-      <w:bookmarkStart w:id="27" w:name="_Toc244063851"/>
+      <w:bookmarkStart w:id="27" w:name="_Toc244189235"/>
       <w:r>
         <w:lastRenderedPageBreak/>
         <w:t>Capitolul 6. Implementare</w:t>
@@ -7913,7 +7905,7 @@
       <w:pPr>
         <w:pStyle w:val="Heading2"/>
       </w:pPr>
-      <w:bookmarkStart w:id="28" w:name="_Toc244063852"/>
+      <w:bookmarkStart w:id="28" w:name="_Toc244189236"/>
       <w:r>
         <w:t>6.1 Serviciul ML: modelul exportat</w:t>
       </w:r>
@@ -8327,7 +8319,7 @@
       <w:pPr>
         <w:pStyle w:val="Heading1"/>
       </w:pPr>
-      <w:bookmarkStart w:id="29" w:name="_Toc244063853"/>
+      <w:bookmarkStart w:id="29" w:name="_Toc244189237"/>
       <w:r>
         <w:lastRenderedPageBreak/>
         <w:t>Capitolul 7. Securitate și GDPR</w:t>
@@ -8346,7 +8338,7 @@
       <w:pPr>
         <w:pStyle w:val="Heading1"/>
       </w:pPr>
-      <w:bookmarkStart w:id="30" w:name="_Toc244063854"/>
+      <w:bookmarkStart w:id="30" w:name="_Toc244189238"/>
       <w:r>
         <w:lastRenderedPageBreak/>
         <w:t>Capitolul 8. Testare și evaluare</w:t>
@@ -8365,7 +8357,7 @@
       <w:pPr>
         <w:pStyle w:val="Heading2"/>
       </w:pPr>
-      <w:bookmarkStart w:id="31" w:name="_Toc244063855"/>
+      <w:bookmarkStart w:id="31" w:name="_Toc244189239"/>
       <w:r>
         <w:t>8.1 Aduce chestionarul un câștig? (E1)</w:t>
       </w:r>
@@ -8383,7 +8375,7 @@
       <w:pPr>
         <w:pStyle w:val="Caption"/>
       </w:pPr>
-      <w:bookmarkStart w:id="32" w:name="_Toc243941016"/>
+      <w:bookmarkStart w:id="32" w:name="_Toc244189254"/>
       <w:r>
         <w:t>Tabelul 8.</w:t>
       </w:r>
@@ -8868,7 +8860,7 @@
       <w:pPr>
         <w:pStyle w:val="Heading2"/>
       </w:pPr>
-      <w:bookmarkStart w:id="33" w:name="_Toc244063856"/>
+      <w:bookmarkStart w:id="33" w:name="_Toc244189240"/>
       <w:r>
         <w:t>8.2 De ce nu ajută chestionarul?</w:t>
       </w:r>
@@ -8910,7 +8902,7 @@
       <w:pPr>
         <w:pStyle w:val="Caption"/>
       </w:pPr>
-      <w:bookmarkStart w:id="34" w:name="_Toc243941017"/>
+      <w:bookmarkStart w:id="34" w:name="_Toc244189255"/>
       <w:r>
         <w:t>Tabelul 8.</w:t>
       </w:r>
@@ -9310,7 +9302,7 @@
       <w:pPr>
         <w:pStyle w:val="Heading2"/>
       </w:pPr>
-      <w:bookmarkStart w:id="35" w:name="_Toc244063857"/>
+      <w:bookmarkStart w:id="35" w:name="_Toc244189241"/>
       <w:r>
         <w:lastRenderedPageBreak/>
         <w:t>8.3 Răspunsuri lipsă (E2)</w:t>
@@ -9329,7 +9321,7 @@
       <w:pPr>
         <w:pStyle w:val="Caption"/>
       </w:pPr>
-      <w:bookmarkStart w:id="36" w:name="_Toc243941018"/>
+      <w:bookmarkStart w:id="36" w:name="_Toc244189256"/>
       <w:r>
         <w:t>Tabelul 8.</w:t>
       </w:r>
@@ -9804,7 +9796,7 @@
         <w:pStyle w:val="Caption"/>
         <w:jc w:val="center"/>
       </w:pPr>
-      <w:bookmarkStart w:id="37" w:name="_Toc243941030"/>
+      <w:bookmarkStart w:id="37" w:name="_Toc244189268"/>
       <w:r>
         <w:t>Figura 8.</w:t>
       </w:r>
@@ -9843,7 +9835,7 @@
       <w:pPr>
         <w:pStyle w:val="Heading2"/>
       </w:pPr>
-      <w:bookmarkStart w:id="38" w:name="_Toc244063858"/>
+      <w:bookmarkStart w:id="38" w:name="_Toc244189242"/>
       <w:r>
         <w:t>8.4 Date suplimentare și test extern (E7)</w:t>
       </w:r>
@@ -9870,7 +9862,7 @@
       <w:pPr>
         <w:pStyle w:val="Caption"/>
       </w:pPr>
-      <w:bookmarkStart w:id="39" w:name="_Toc243941019"/>
+      <w:bookmarkStart w:id="39" w:name="_Toc244189257"/>
       <w:r>
         <w:lastRenderedPageBreak/>
         <w:t>Tabelul 8.</w:t>
@@ -10147,7 +10139,7 @@
       <w:pPr>
         <w:pStyle w:val="Heading2"/>
       </w:pPr>
-      <w:bookmarkStart w:id="40" w:name="_Toc244063859"/>
+      <w:bookmarkStart w:id="40" w:name="_Toc244189243"/>
       <w:r>
         <w:t>8.5 Encodere preantrenate (E5)</w:t>
       </w:r>
@@ -10165,7 +10157,7 @@
       <w:pPr>
         <w:pStyle w:val="Caption"/>
       </w:pPr>
-      <w:bookmarkStart w:id="41" w:name="_Toc243941020"/>
+      <w:bookmarkStart w:id="41" w:name="_Toc244189258"/>
       <w:r>
         <w:lastRenderedPageBreak/>
         <w:t>Tabelul 8.</w:t>
@@ -10651,7 +10643,7 @@
       <w:pPr>
         <w:pStyle w:val="Heading2"/>
       </w:pPr>
-      <w:bookmarkStart w:id="42" w:name="_Toc244063860"/>
+      <w:bookmarkStart w:id="42" w:name="_Toc244189244"/>
       <w:r>
         <w:t>8.6 Calibrarea încrederii și abținerea (E4)</w:t>
       </w:r>
@@ -10669,7 +10661,7 @@
       <w:pPr>
         <w:pStyle w:val="Caption"/>
       </w:pPr>
-      <w:bookmarkStart w:id="43" w:name="_Toc243941021"/>
+      <w:bookmarkStart w:id="43" w:name="_Toc244189259"/>
       <w:r>
         <w:t>Tabelul 8.</w:t>
       </w:r>
@@ -11152,7 +11144,7 @@
         <w:pStyle w:val="Caption"/>
         <w:jc w:val="center"/>
       </w:pPr>
-      <w:bookmarkStart w:id="44" w:name="_Toc243941031"/>
+      <w:bookmarkStart w:id="44" w:name="_Toc244189269"/>
       <w:r>
         <w:t>Figura 8.</w:t>
       </w:r>
@@ -11191,7 +11183,7 @@
       <w:pPr>
         <w:pStyle w:val="Caption"/>
       </w:pPr>
-      <w:bookmarkStart w:id="45" w:name="_Toc243941022"/>
+      <w:bookmarkStart w:id="45" w:name="_Toc244189260"/>
       <w:r>
         <w:t>Tabelul 8.</w:t>
       </w:r>
@@ -11636,7 +11628,7 @@
       <w:pPr>
         <w:pStyle w:val="Caption"/>
       </w:pPr>
-      <w:bookmarkStart w:id="46" w:name="_Toc243941023"/>
+      <w:bookmarkStart w:id="46" w:name="_Toc244189261"/>
       <w:r>
         <w:t>Tabelul 8.</w:t>
       </w:r>
@@ -12040,7 +12032,7 @@
       <w:pPr>
         <w:pStyle w:val="Caption"/>
       </w:pPr>
-      <w:bookmarkStart w:id="47" w:name="_Toc243941024"/>
+      <w:bookmarkStart w:id="47" w:name="_Toc244189262"/>
       <w:r>
         <w:t>Tabelul 8.</w:t>
       </w:r>
@@ -12550,7 +12542,7 @@
       <w:pPr>
         <w:pStyle w:val="Heading2"/>
       </w:pPr>
-      <w:bookmarkStart w:id="48" w:name="_Toc244063861"/>
+      <w:bookmarkStart w:id="48" w:name="_Toc244189245"/>
       <w:r>
         <w:t>8.7 Explicabilitate (Grad-CAM)</w:t>
       </w:r>
@@ -12568,7 +12560,7 @@
       <w:pPr>
         <w:pStyle w:val="Caption"/>
       </w:pPr>
-      <w:bookmarkStart w:id="49" w:name="_Toc243941025"/>
+      <w:bookmarkStart w:id="49" w:name="_Toc244189263"/>
       <w:r>
         <w:t>Tabelul 8.</w:t>
       </w:r>
@@ -12852,7 +12844,7 @@
       <w:pPr>
         <w:pStyle w:val="Heading2"/>
       </w:pPr>
-      <w:bookmarkStart w:id="50" w:name="_Toc244063862"/>
+      <w:bookmarkStart w:id="50" w:name="_Toc244189246"/>
       <w:r>
         <w:t>8.8 Sinteza rezultatelor și modelul ales pentru aplicație</w:t>
       </w:r>
@@ -12879,7 +12871,7 @@
       <w:pPr>
         <w:pStyle w:val="Caption"/>
       </w:pPr>
-      <w:bookmarkStart w:id="51" w:name="_Toc243941026"/>
+      <w:bookmarkStart w:id="51" w:name="_Toc244189264"/>
       <w:r>
         <w:t>Tabelul 8.</w:t>
       </w:r>
@@ -13472,7 +13464,7 @@
       <w:pPr>
         <w:pStyle w:val="Heading1"/>
       </w:pPr>
-      <w:bookmarkStart w:id="52" w:name="_Toc244063863"/>
+      <w:bookmarkStart w:id="52" w:name="_Toc244189247"/>
       <w:r>
         <w:lastRenderedPageBreak/>
         <w:t>Capitolul 9. Concluzii și direcții viitoare</w:t>
@@ -13491,7 +13483,7 @@
       <w:pPr>
         <w:pStyle w:val="Heading1"/>
       </w:pPr>
-      <w:bookmarkStart w:id="53" w:name="_Toc244063864"/>
+      <w:bookmarkStart w:id="53" w:name="_Toc244189248"/>
       <w:r>
         <w:lastRenderedPageBreak/>
         <w:t>Anexe</w:t>
@@ -13510,7 +13502,7 @@
       <w:pPr>
         <w:pStyle w:val="Heading2"/>
       </w:pPr>
-      <w:bookmarkStart w:id="54" w:name="_Toc244063865"/>
+      <w:bookmarkStart w:id="54" w:name="_Toc244189249"/>
       <w:r>
         <w:t>Anexa A. Planificarea proiectului: enunțul domeniului, WBS și riscurile</w:t>
       </w:r>
@@ -13620,7 +13612,7 @@
         <w:pStyle w:val="Caption"/>
         <w:jc w:val="center"/>
       </w:pPr>
-      <w:bookmarkStart w:id="55" w:name="_Toc243941032"/>
+      <w:bookmarkStart w:id="55" w:name="_Toc244189270"/>
       <w:r>
         <w:lastRenderedPageBreak/>
         <w:t>Figura A.</w:t>
@@ -13725,7 +13717,7 @@
         <w:pStyle w:val="Caption"/>
         <w:jc w:val="center"/>
       </w:pPr>
-      <w:bookmarkStart w:id="56" w:name="_Toc243941033"/>
+      <w:bookmarkStart w:id="56" w:name="_Toc244189271"/>
       <w:r>
         <w:t>Figura A.</w:t>
       </w:r>
@@ -13811,7 +13803,7 @@
         <w:pStyle w:val="Caption"/>
         <w:jc w:val="center"/>
       </w:pPr>
-      <w:bookmarkStart w:id="57" w:name="_Toc243941034"/>
+      <w:bookmarkStart w:id="57" w:name="_Toc244189272"/>
       <w:r>
         <w:t>Figura A.</w:t>
       </w:r>
@@ -13842,7 +13834,7 @@
       <w:pPr>
         <w:pStyle w:val="Heading1"/>
       </w:pPr>
-      <w:bookmarkStart w:id="58" w:name="_Toc244063866"/>
+      <w:bookmarkStart w:id="58" w:name="_Toc244189250"/>
       <w:r>
         <w:lastRenderedPageBreak/>
         <w:t>Bibliografie</w:t>

</xml_diff>